<commit_message>
Thesis 1.2: drop the 5.8 GHz analog video paragraph, describe Wi-Fi 2.4 GHz as the compared video link
Co-Authored-By: Claude Opus 5.5 <noreply@anthropic.com>
Claude-Session: https://claude.ai/code/session_01F7zWgPWK1QF4RLkRPrjcGv
</commit_message>
<xml_diff>
--- a/docs/vkr/Osnovnaya_chast_HaLow.docx
+++ b/docs/vkr/Osnovnaya_chast_HaLow.docx
@@ -263,12 +263,7 @@
     </w:p>
     <w:p>
       <w:r>
-        <w:t>Видео традиционно передаётся отдельным аналоговым передатчиком диапазона 5,8 ГГц. Такой канал не контролирует ошибки, не переносит IP-трафик и быстро теряет сигнал за препятствиями: на частоте 5,8 ГГц потери растут, а огибание препятствий слабое [13].</w:t>
-      </w:r>
-    </w:p>
-    <w:p>
-      <w:r>
-        <w:t>Сети Wi-Fi стандартов IEEE 802.11n/ac/ax дают десятки и сотни мегабит в секунду [6], но рассчитаны на расстояния в десятки метров. С серийными антеннами связь на открытой местности сохраняется на сотнях метров, а за препятствиями — много меньше.</w:t>
+        <w:t>Видео с малых аппаратов передают по Wi-Fi стандарта IEEE 802.11 в диапазоне 2,4 ГГц. Такой канал даёт единицы и десятки мегабит в секунду и переносит IP-трафик [6], но рассчитан на расстояния в десятки метров. С серийными антеннами связь на открытой местности сохраняется на сотнях метров, а за препятствиями — много меньше: на частоте 2,4 ГГц потери в свободном пространстве на 9 дБ больше, чем на частоте 867 МГц, а огибание препятствий слабее [13].</w:t>
       </w:r>
     </w:p>
     <w:p>

</xml_diff>

<commit_message>
Thesis: Wi-Fi claims without unsourced ranges; platform range limited by camera-board noise (27 dB above thermal: 44-220 m)
Co-Authored-By: Claude Opus 5.5 <noreply@anthropic.com>
Claude-Session: https://claude.ai/code/session_01F7zWgPWK1QF4RLkRPrjcGv
</commit_message>
<xml_diff>
--- a/docs/vkr/Osnovnaya_chast_HaLow.docx
+++ b/docs/vkr/Osnovnaya_chast_HaLow.docx
@@ -51,17 +51,17 @@
     </w:p>
     <w:p>
       <w:r>
-        <w:t>Существующие каналы связи решают эту задачу лишь частично. Технологии семейства LoRa обеспечивают дальность в километры, но их скорость составляет от 0,3 до 37,5 кбит/с [4, 5] — этого достаточно для телеметрии, но не для видео. Сети Wi-Fi стандарта IEEE 802.11 в диапазонах 2,4 и 5 ГГц дают десятки мегабит в секунду [6], однако на расстояниях в сотни метров и за препятствиями связь теряется. Сотовые сети зависят от наземной инфраструктуры, которой нет над лесом и в удалённых районах, а полосы, выделенные для беспилотных систем, требуют разрешительных процедур [3].</w:t>
+        <w:t>Существующие каналы связи решают эту задачу лишь частично. Технологии семейства LoRa обеспечивают дальность в километры, но их скорость составляет от 0,3 до 37,5 кбит/с [4, 5] — этого достаточно для телеметрии, но не для видео. Сети Wi-Fi стандарта IEEE 802.11 в диапазоне 2,4 ГГц дают единицы и десятки мегабит в секунду [6], но на более высокой частоте при той же мощности сигнал ослабевает сильнее и хуже огибает препятствия [7]. Сотовые сети зависят от наземной инфраструктуры, которой нет над лесом и в удалённых районах, а полосы, выделенные для беспилотных систем, требуют разрешительных процедур [3].</w:t>
       </w:r>
     </w:p>
     <w:p>
       <w:r>
-        <w:t>Технология Wi-Fi HaLow (IEEE 802.11ah) [7, 8] занимает промежуточное положение. Она работает в нелицензируемом диапазоне ниже 1 ГГц, где радиоволны распространяются дальше и лучше огибают препятствия, и при этом сохраняет стек протоколов Wi-Fi. Среди нелицензируемых технологий диапазона ниже 1 ГГц Wi-Fi HaLow — единственная, которая переносит IP-трафик со скоростью, достаточной для видео, и работает без наземной инфраструктуры.</w:t>
+        <w:t>Технология Wi-Fi HaLow (IEEE 802.11ah) [8, 9] занимает промежуточное положение. Она работает в нелицензируемом диапазоне ниже 1 ГГц, где радиоволны распространяются дальше и лучше огибают препятствия, и при этом сохраняет стек протоколов Wi-Fi. Среди нелицензируемых технологий диапазона ниже 1 ГГц Wi-Fi HaLow — единственная, которая переносит IP-трафик со скоростью, достаточной для видео, и работает без наземной инфраструктуры.</w:t>
       </w:r>
     </w:p>
     <w:p>
       <w:r>
-        <w:t>Доступное оборудование Wi-Fi HaLow появилось лишь в 2024–2025 годах. Большинство опубликованных оценок технологии получено аналитически или средствами имитационного моделирования [9, 10], а натурных измерений на серийном оборудовании немного [11]. Поэтому практическая проверка характеристик Wi-Fi HaLow на оборудовании, доступном в Российской Федерации, и разработка на её основе предложений по увеличению дальности и надёжности передачи данных с борта БПЛА являются актуальной задачей.</w:t>
+        <w:t>Доступное оборудование Wi-Fi HaLow появилось лишь в 2024–2025 годах. Большинство опубликованных оценок технологии получено аналитически или средствами имитационного моделирования [10, 11], а натурных измерений на серийном оборудовании немного [12]. Поэтому практическая проверка характеристик Wi-Fi HaLow на оборудовании, доступном в Российской Федерации, и разработка на её основе предложений по увеличению дальности и надёжности передачи данных с борта БПЛА являются актуальной задачей.</w:t>
       </w:r>
     </w:p>
     <w:p>
@@ -258,12 +258,12 @@
     </w:p>
     <w:p>
       <w:r>
-        <w:t>Каналы управления и телеметрии большинства современных аппаратов строятся на модуляции LoRa в диапазонах 868/915 МГц и 2,4 ГГц [12]. Расширение спектра даёт высокую чувствительность приёмника и дальность в километры, но ценой скорости: от 0,3 до 37,5 кбит/с [4, 5]. Видео по такому каналу не передать.</w:t>
+        <w:t>Каналы управления и телеметрии большинства современных аппаратов строятся на модуляции LoRa в диапазонах 868/915 МГц и 2,4 ГГц [13]. Расширение спектра даёт высокую чувствительность приёмника и дальность в километры, но ценой скорости: от 0,3 до 37,5 кбит/с [4, 5]. Видео по такому каналу не передать.</w:t>
       </w:r>
     </w:p>
     <w:p>
       <w:r>
-        <w:t>Видео с малых аппаратов передают по Wi-Fi стандарта IEEE 802.11 в диапазоне 2,4 ГГц. Такой канал даёт единицы и десятки мегабит в секунду и переносит IP-трафик [6], но рассчитан на расстояния в десятки метров. С серийными антеннами связь на открытой местности сохраняется на сотнях метров, а за препятствиями — много меньше: на частоте 2,4 ГГц потери в свободном пространстве на 9 дБ больше, чем на частоте 867 МГц, а огибание препятствий слабее [13].</w:t>
+        <w:t>Видео с малых аппаратов передают по Wi-Fi стандарта IEEE 802.11 в диапазоне 2,4 ГГц. Такой канал даёт единицы и десятки мегабит в секунду и переносит IP-трафик [6]; его ограничение — частота: на 2,4 ГГц потери в свободном пространстве на 9 дБ больше, чем на частоте 867 МГц, а огибание препятствий слабее [7].</w:t>
       </w:r>
     </w:p>
     <w:p>
@@ -570,7 +570,7 @@
     </w:p>
     <w:p>
       <w:r>
-        <w:t>Канал Wi-Fi шириной 20 МГц собирает шум −101,0 дБм, канал Wi-Fi HaLow шириной 2 МГц — −111,0 дБм: ещё 10,0 дБ в пользу узкого канала. При равной мощности и одинаковых антеннах суммарный энергетический выигрыш составляет 19,0 дБ, что в свободном пространстве соответствует увеличению дальности в 8,9 раза. Проектная дальность Wi-Fi HaLow — около 1 км [10, 15]. Производитель радиомодуля платформы указывает для канала 2 МГц при мощности +20 дБм дальность 1200 м со скоростью TCP более 2 Мбит/с в условиях без препятствий [16]. Нормы Российской Федерации ограничивают мощность Wi-Fi HaLow сильнее, чем мощность Wi-Fi 2,4 ГГц (см. «Регулирование»): с учётом этого выигрыш сокращается до 15,1 дБ.</w:t>
+        <w:t>Канал Wi-Fi шириной 20 МГц собирает шум −101,0 дБм, канал Wi-Fi HaLow шириной 2 МГц — −111,0 дБм: ещё 10,0 дБ в пользу узкого канала. При равной мощности и одинаковых антеннах суммарный энергетический выигрыш составляет 19,0 дБ, что в свободном пространстве соответствует увеличению дальности в 8,9 раза. Проектная дальность Wi-Fi HaLow — около 1 км [11, 15]. Производитель радиомодуля платформы указывает для канала 2 МГц при мощности +20 дБм дальность 1200 м со скоростью TCP более 2 Мбит/с в условиях без препятствий [16]. Нормы Российской Федерации ограничивают мощность Wi-Fi HaLow сильнее, чем мощность Wi-Fi 2,4 ГГц (см. «Регулирование»): с учётом этого выигрыш сокращается до 15,1 дБ.</w:t>
       </w:r>
     </w:p>
     <w:p>
@@ -581,7 +581,7 @@
         <w:t xml:space="preserve">Проникающая способность. </w:t>
       </w:r>
       <w:r>
-        <w:t>Радиоволны диапазона ниже 1 ГГц лучше огибают препятствия и слабее затухают в растительности и стенах, чем волны 2,4 и 5 ГГц [13]. По модели потерь проникновения 3GPP TR 38.901 (бетон: 5 + 4f дБ, f в ГГц) бетонная стена ослабляет сигнал на 8,5 дБ на частоте 867 МГц, на 14,8 дБ на 2,44 ГГц и на 27,0 дБ на 5,5 ГГц [17]. Для БПЛА, работающих над лесом, за рельефом и строениями, это главное преимущество диапазона ниже 1 ГГц.</w:t>
+        <w:t>Радиоволны диапазона ниже 1 ГГц лучше огибают препятствия и слабее затухают в растительности и стенах, чем волны 2,4 и 5 ГГц [7]. По модели потерь проникновения 3GPP TR 38.901 (бетон: 5 + 4f дБ, f в ГГц) бетонная стена ослабляет сигнал на 8,5 дБ на частоте 867 МГц, на 14,8 дБ на 2,44 ГГц и на 27,0 дБ на 5,5 ГГц [17]. Для БПЛА, работающих над лесом, за рельефом и строениями, это главное преимущество диапазона ниже 1 ГГц.</w:t>
       </w:r>
     </w:p>
     <w:p>
@@ -614,7 +614,7 @@
         <w:t xml:space="preserve">Энергопотребление. </w:t>
       </w:r>
       <w:r>
-        <w:t>Стандарт IEEE 802.11ah содержит механизмы для устройств с батарейным питанием: целевое время пробуждения (TWT) и окно ограниченного доступа (RAW) [10, 15]. Радиомодуль TX-AH потребляет при передаче на +20 дБм 300 мА, при приёме 55–100 мА [16]; Wi-Fi ESP32-S3 — 283–340 мА при передаче и 88–91 мА при приёме [20]; приёмопередатчик LoRa RFM95 — от 66 до 396 мВт при мощности от −4 до +20 дБм [21]. Токи Wi-Fi HaLow и Wi-Fi 2,4 ГГц сопоставимы; LoRa экономичнее при малых объёмах данных. Для БПЛА энергопотребление радиоканала мало по сравнению с потреблением двигателей, поэтому этот критерий важнее для наземных датчиков. Механизмы TWT и RAW проявляются в сетях из многих станций и в двухузловой конфигурации этой работы не исследуются.</w:t>
+        <w:t>Стандарт IEEE 802.11ah содержит механизмы для устройств с батарейным питанием: целевое время пробуждения (TWT) и окно ограниченного доступа (RAW) [11, 15]. Радиомодуль TX-AH потребляет при передаче на +20 дБм 300 мА, при приёме 55–100 мА [16]; Wi-Fi ESP32-S3 — 283–340 мА при передаче и 88–91 мА при приёме [20]; приёмопередатчик LoRa RFM95 — от 66 до 396 мВт при мощности от −4 до +20 дБм [21]. Токи Wi-Fi HaLow и Wi-Fi 2,4 ГГц сопоставимы; LoRa экономичнее при малых объёмах данных. Для БПЛА энергопотребление радиоканала мало по сравнению с потреблением двигателей, поэтому этот критерий важнее для наземных датчиков. Механизмы TWT и RAW проявляются в сетях из многих станций и в двухузловой конфигурации этой работы не исследуются.</w:t>
       </w:r>
     </w:p>
     <w:p>
@@ -1663,7 +1663,7 @@
         <w:t xml:space="preserve">– </w:t>
       </w:r>
       <w:r>
-        <w:t>передача видео для ситуационной осведомлённости оператора на расстояниях от сотен метров до единиц километров, в том числе вне прямой видимости; на платформе этой работы получено 1063 кбит/с полезного видео 480 × 320 точек при 5 кадр/с (глава 3);</w:t>
+        <w:t>передача видео для ситуационной осведомлённости оператора на расстояниях от сотен метров до единиц километров, в том числе вне прямой видимости (на плате этой работы — после устранения помех камеры, раздел 3.6); на платформе этой работы получено 1063 кбит/с полезного видео 480 × 320 точек при 5 кадр/с (глава 3);</w:t>
       </w:r>
     </w:p>
     <w:p>
@@ -1967,7 +1967,7 @@
     </w:p>
     <w:p>
       <w:r>
-        <w:t>В реальной среде потери растут быстрее. Логарифмическая модель описывает их через показатель затухания n и случайную составляющую затенения [13]:</w:t>
+        <w:t>В реальной среде потери растут быстрее. Логарифмическая модель описывает их через показатель затухания n и случайную составляющую затенения [7]:</w:t>
       </w:r>
     </w:p>
     <w:tbl>
@@ -2373,7 +2373,7 @@
         <w:ind w:firstLine="0"/>
       </w:pPr>
       <w:r>
-        <w:t>где h₁, h₂ — высоты антенн над землёй, потери растут не на 20, а на 40 дБ на декаду расстояния [13]. Для антенн на высоте 1,5 м над землёй излом наступает уже на 26 м. Если одна антенна поднята на борту БПЛА на 50 м, излом отодвигается до 868 м, на 100 м — до 1735 м. Высоты 50 и 100 м взяты как примеры рабочей высоты полёта при мониторинге, а не как измеренные или нормативные значения: при наземной антенне на 1,5 м точка излома растёт линейно — на 17,4 м на каждый метр высоты антенны на борту, поэтому для любой другой высоты её легко пересчитать. Отсюда важное для методики следствие: испытания с обеими антеннами у земли дают заметно более пессимистичную картину, чем полёт, и высоту антенн при сопоставлении с натурными данными необходимо фиксировать и указывать. Для БПЛА вертолётного типа, способного зависать на заданной высоте, высота антенны на борту — управляемый параметр дальности.</w:t>
+        <w:t>где h₁, h₂ — высоты антенн над землёй, потери растут не на 20, а на 40 дБ на декаду расстояния [7]. Для антенн на высоте 1,5 м над землёй излом наступает уже на 26 м. Если одна антенна поднята на борту БПЛА на 50 м, излом отодвигается до 868 м, на 100 м — до 1735 м. Высоты 50 и 100 м взяты как примеры рабочей высоты полёта при мониторинге, а не как измеренные или нормативные значения: при наземной антенне на 1,5 м точка излома растёт линейно — на 17,4 м на каждый метр высоты антенны на борту, поэтому для любой другой высоты её легко пересчитать. Отсюда важное для методики следствие: испытания с обеими антеннами у земли дают заметно более пессимистичную картину, чем полёт, и высоту антенн при сопоставлении с натурными данными необходимо фиксировать и указывать. Для БПЛА вертолётного типа, способного зависать на заданной высоте, высота антенны на борту — управляемый параметр дальности.</w:t>
       </w:r>
     </w:p>
     <w:p>
@@ -2756,7 +2756,7 @@
     </w:p>
     <w:p>
       <w:r>
-        <w:t xml:space="preserve">Реальные скорости Wi-Fi HaLow задаются схемами модуляции и кодирования (MCS) стандарта [7]. Для одного пространственного потока и длинного защитного интервала в каналах, помещающихся в полосу 866–868 МГц, они приведены в таблице </w:t>
+        <w:t xml:space="preserve">Реальные скорости Wi-Fi HaLow задаются схемами модуляции и кодирования (MCS) стандарта [8]. Для одного пространственного потока и длинного защитного интервала в каналах, помещающихся в полосу 866–868 МГц, они приведены в таблице </w:t>
       </w:r>
       <w:r>
         <w:t>2.1</w:t>
@@ -3784,7 +3784,7 @@
         <w:t xml:space="preserve">Доплеровский сдвиг. </w:t>
       </w:r>
       <w:r>
-        <w:t>При движении БПЛА со скоростью v частота принимаемого сигнала смещается на [13]</w:t>
+        <w:t>При движении БПЛА со скоростью v частота принимаемого сигнала смещается на [7]</w:t>
       </w:r>
     </w:p>
     <w:tbl>
@@ -4116,12 +4116,12 @@
         <w:ind w:firstLine="0"/>
       </w:pPr>
       <w:r>
-        <w:t>Разнос поднесущих Wi-Fi HaLow — 31,25 кГц [7], в 10 раз меньше, чем у Wi-Fi 2,4 ГГц, и всё же доплеровский сдвиг составляет лишь 0,3 % от него, а мощность межподнесущих помех на 46 дБ ниже мощности сигнала. Даже при отношении сигнал/шум 25 дБ эти помехи остаются на 21 дБ ниже шума, то есть практически отсутствуют.</w:t>
+        <w:t>Разнос поднесущих Wi-Fi HaLow — 31,25 кГц [8], в 10 раз меньше, чем у Wi-Fi 2,4 ГГц, и всё же доплеровский сдвиг составляет лишь 0,3 % от него, а мощность межподнесущих помех на 46 дБ ниже мощности сигнала. Даже при отношении сигнал/шум 25 дБ эти помехи остаются на 21 дБ ниже шума, то есть практически отсутствуют.</w:t>
       </w:r>
     </w:p>
     <w:p>
       <w:r>
-        <w:t>Движение сказывается иначе: канал изменяется за время когерентности Tк ≈ 0,423/fд [13], при 30 м/с — около 5 мс. Кадр с фрагментом 1400 байт длится около 2 мс на MCS 7 и около 18 мс на MCS 0, поэтому на нижних MCS оценка канала, сделанная по преамбуле, к концу кадра устаревает. Для этого случая в стандарт IEEE 802.11ah введены бегущие пилоты — пилотные поднесущие, положение которых меняется от символа к символу, что позволяет приёмнику уточнять оценку канала в течение кадра [7]; в программном обеспечении радиомодуля TX-AH они предусмотрены (команда AT+TX_TRV_PILOT_EN). Таким образом, при скоростях БПЛА вертолётного типа доплеровский сдвиг на работу канала практически не влияет и отдельного экспериментального исследования не требует.</w:t>
+        <w:t>Движение сказывается иначе: канал изменяется за время когерентности Tк ≈ 0,423/fд [7], при 30 м/с — около 5 мс. Кадр с фрагментом 1400 байт длится около 2 мс на MCS 7 и около 18 мс на MCS 0, поэтому на нижних MCS оценка канала, сделанная по преамбуле, к концу кадра устаревает. Для этого случая в стандарт IEEE 802.11ah введены бегущие пилоты — пилотные поднесущие, положение которых меняется от символа к символу, что позволяет приёмнику уточнять оценку канала в течение кадра [8]; в программном обеспечении радиомодуля TX-AH они предусмотрены (команда AT+TX_TRV_PILOT_EN). Таким образом, при скоростях БПЛА вертолётного типа доплеровский сдвиг на работу канала практически не влияет и отдельного экспериментального исследования не требует.</w:t>
       </w:r>
     </w:p>
     <w:p>
@@ -4670,7 +4670,7 @@
     </w:p>
     <w:p>
       <w:r>
-        <w:t>Модели с коэффициентами, измеренными в других условиях, существуют: от таблиц показателя затухания для типовых сред [13] до моделей потерь, предложенных для IEEE 802.11ah на частоте 900 МГц [26]. Измерения они не отменяют по трём причинам. Первая — коэффициенты опубликованы диапазонами, а не значениями: для городской застройки n = 2,7–3,5 [13], и при одних и тех же допустимых потерях (80 дБ сверх потерь на опорном расстоянии 1 м) дальность составит около 920 м при n = 2,7 и около 190 м при n = 3,5. Вторая — каждая модель выведена для своей геометрии. Модели для IEEE 802.11ah предполагают антенну точки доступа на 15 м выше крыш (L = 8 + 37,6 lg d) или на уровне крыш (L = 23,3 + 36,7 lg d), d в метрах [26]. На 1 км они дают 121 и 133 дБ — 12 дБ расхождения между двумя моделями для одной технологии, а свободное пространство — 91 дБ. Для антенн на высоте 1,5 м над землёй ни одна из них не выводилась. Третья — даже подходящая модель даёт среднее значение с разбросом σ, то есть сама признаёт, что значение для конкретной трассы не предсказывает. Поэтому опубликованные модели служат в работе эталоном для сравнения, а какая из них описывает конкретную трассу и с каким разбросом, устанавливает измерение.</w:t>
+        <w:t>Модели с коэффициентами, измеренными в других условиях, существуют: от таблиц показателя затухания для типовых сред [7] до моделей потерь, предложенных для IEEE 802.11ah на частоте 900 МГц [26]. Измерения они не отменяют по трём причинам. Первая — коэффициенты опубликованы диапазонами, а не значениями: для городской застройки n = 2,7–3,5 [7], и при одних и тех же допустимых потерях (80 дБ сверх потерь на опорном расстоянии 1 м) дальность составит около 920 м при n = 2,7 и около 190 м при n = 3,5. Вторая — каждая модель выведена для своей геометрии. Модели для IEEE 802.11ah предполагают антенну точки доступа на 15 м выше крыш (L = 8 + 37,6 lg d) или на уровне крыш (L = 23,3 + 36,7 lg d), d в метрах [26]. На 1 км они дают 121 и 133 дБ — 12 дБ расхождения между двумя моделями для одной технологии, а свободное пространство — 91 дБ. Для антенн на высоте 1,5 м над землёй ни одна из них не выводилась. Третья — даже подходящая модель даёт среднее значение с разбросом σ, то есть сама признаёт, что значение для конкретной трассы не предсказывает. Поэтому опубликованные модели служат в работе эталоном для сравнения, а какая из них описывает конкретную трассу и с каким разбросом, устанавливает измерение.</w:t>
       </w:r>
     </w:p>
     <w:p>
@@ -12080,6 +12080,17 @@
     </w:p>
     <w:p>
       <w:r>
+        <w:t xml:space="preserve">Четвёртый вывод — главный для данной платформы. Таблица </w:t>
+      </w:r>
+      <w:r>
+        <w:t>3.9</w:t>
+      </w:r>
+      <w:r>
+        <w:t xml:space="preserve"> считает шум приёмника тепловым, а у платы с камерой измеренный фон на 27 дБ выше (−60 против −87 дБм, раздел 2.2). Плата с камерой принимает подтверждения и квитанции, поэтому её фон ограничивает весь канал: уже на трассе 5 м отношение сигнал/шум на ней проседало до 12–20 дБ, а регулятор поднимал мощность до 11–13 дБм из 14 возможных (08.10). Если уменьшить допустимые потери на 27 дБ, граница в свободном пространстве сокращается в 22 раза — до 44 м на MCS 7 и 220 м на MCS 0. Следовательно, дальности таблицы — возможности радиомодуля, а на плате T-HaLow в исходном исполнении связь ограничена сотнями метров, пока помехи камеры не устранены разнесением и экранированием (предложения в заключении).</w:t>
+      </w:r>
+    </w:p>
+    <w:p>
+      <w:r>
         <w:t xml:space="preserve">Опубликованные натурные данные производителя радиомодуля (таблица </w:t>
       </w:r>
       <w:r>
@@ -12639,7 +12650,7 @@
         <w:t>3.9</w:t>
       </w:r>
       <w:r>
-        <w:t xml:space="preserve"> сравнивает их при нормах мощности Российской Федерации. При равной скорости физического уровня 6,5 Мбит/с (Wi-Fi HaLow 2 МГц MCS 7 и Wi-Fi 802.11n MCS 0) дальности в свободном пространстве сопоставимы — 0,98 и 1,32 км: выигрыш Wi-Fi HaLow на затухании (9,0 дБ) компенсируется меньшей разрешённой мощностью (на 6,0 дБ ниже у стенда) и оценочной чувствительностью. Wi-Fi HaLow выигрывает на малых скоростях, которых у 802.11n нет: на MCS 0 (0,65 Мбит/с) — 4,90 км против 2,58 км у 802.11b на 1 Мбит/с, — и за препятствиями: бетонная стена ослабляет сигнал 867 МГц на 6,3 дБ меньше, чем 2,4 ГГц [17]. У земли за точкой излома потери двухлучевой модели от частоты не зависят, и частотное преимущество исчезает; модель при этом не учитывает дифракцию и затухание в растительности, где диапазон ниже 1 ГГц выигрывает [13]. Скорость Wi-Fi 2,4 ГГц выше на порядок: ESP32-S3 передаёт в эфире 20–30 Мбит/с [19], а модуль ESP32-CAM (процессор ESP32, камера OV2640) передаёт по Wi-Fi видео 480 × 320 с частотой 20,9 видеокадра в секунду (лаборатория, расстояние не указано) [35] — против 5 видеокадров в секунду и 1063 кбит/с на Wi-Fi HaLow.</w:t>
+        <w:t xml:space="preserve"> сравнивает их при нормах мощности Российской Федерации. При равной скорости физического уровня 6,5 Мбит/с (Wi-Fi HaLow 2 МГц MCS 7 и Wi-Fi 802.11n MCS 0) дальности в свободном пространстве сопоставимы — 0,98 и 1,32 км: выигрыш Wi-Fi HaLow на затухании (9,0 дБ) компенсируется меньшей разрешённой мощностью (на 6,0 дБ ниже у стенда) и оценочной чувствительностью. Wi-Fi HaLow выигрывает на малых скоростях, которых у 802.11n нет: на MCS 0 (0,65 Мбит/с) — 4,90 км против 2,58 км у 802.11b на 1 Мбит/с, — и за препятствиями: бетонная стена ослабляет сигнал 867 МГц на 6,3 дБ меньше, чем 2,4 ГГц [17]. У земли за точкой излома потери двухлучевой модели от частоты не зависят, и частотное преимущество исчезает; модель при этом не учитывает дифракцию и затухание в растительности, где диапазон ниже 1 ГГц выигрывает [7]. Скорость Wi-Fi 2,4 ГГц выше на порядок: ESP32-S3 передаёт в эфире 20–30 Мбит/с [19], а модуль ESP32-CAM (процессор ESP32, камера OV2640) передаёт по Wi-Fi видео 480 × 320 с частотой 20,9 видеокадра в секунду (лаборатория, расстояние не указано) [35] — против 5 видеокадров в секунду и 1063 кбит/с на Wi-Fi HaLow.</w:t>
       </w:r>
     </w:p>
     <w:p>
@@ -12722,7 +12733,7 @@
         <w:t>3.3</w:t>
       </w:r>
       <w:r>
-        <w:t>: для каждого расстояния указана наибольшая скорость, при которой связь сохраняется. У земли (антенны на 1,5 м) за точкой излома потери от частоты не зависят, и все технологии теряют дальность в разы; антенна на борту на высоте 50 м возвращает Wi-Fi HaLow скорость 650 кбит/с на 1–2 км, а Wi-Fi 2,4 ГГц — 1–6,5 Мбит/с до 2 км. Скорость не ниже видеопотока стенда 1063 кбит/с (выделено жирным) в свободном пространстве и с антенной на борту по расчёту сохраняется у Wi-Fi 2,4 ГГц до 1 км, у Wi-Fi HaLow — до 0,5 км на сетке расстояний рисунка (граница MCS 7 — 0,98 км). Для промежуточных режимов Wi-Fi HaLow (MCS 1–6, 1,3–5,85 Мбит/с) паспорт чувствительности не приводит, поэтому граница видеосвязи Wi-Fi HaLow по расчёту занижена; её уточнение — задача натурных испытаний.</w:t>
+        <w:t>: для каждого расстояния указана наибольшая скорость, при которой связь сохраняется. У земли (антенны на 1,5 м) за точкой излома потери от частоты не зависят, и все технологии теряют дальность в разы; антенна на борту на высоте 50 м возвращает Wi-Fi HaLow скорость 650 кбит/с на 1–2 км, а Wi-Fi 2,4 ГГц — 1–6,5 Мбит/с до 2 км. Скорость не ниже видеопотока стенда 1063 кбит/с (выделено жирным) в свободном пространстве и с антенной на борту по расчёту сохраняется у Wi-Fi 2,4 ГГц до 1 км, у Wi-Fi HaLow — до 0,5 км на сетке расстояний рисунка (граница MCS 7 — 0,98 км). Для промежуточных режимов Wi-Fi HaLow (MCS 1–6, 1,3–5,85 Мбит/с) паспорт чувствительности не приводит, поэтому граница видеосвязи Wi-Fi HaLow по расчёту занижена; её уточнение — задача натурных испытаний. Все дальности рисунков — возможности радиотрактов при тепловом шуме; для платы с камерой они сокращаются в 22 раза из-за её фона (раздел 3.6).</w:t>
       </w:r>
     </w:p>
     <w:p>
@@ -13019,7 +13030,7 @@
               <w:rPr>
                 <w:sz w:val="20"/>
               </w:rPr>
-              <w:t>1200 м, &gt; 2 Мбит/с при +20 дБм [16]; расчёт при 14 дБм: 0,98–4,90 км в своб. простр. (табл. 3.9)</w:t>
+              <w:t>1200 м, &gt; 2 Мбит/с при +20 дБм [16]; расчёт при 14 дБм: 0,98–4,90 км в своб. простр. (табл. 3.9); с фоном платы с камерой — 44–220 м</w:t>
             </w:r>
           </w:p>
         </w:tc>
@@ -13722,7 +13733,7 @@
     </w:p>
     <w:p>
       <w:r>
-        <w:t>6. Расчётная граница связи Wi-Fi HaLow при мощности 14 дБм и запасе 10 дБ — от 0,98 до 4,90 км в свободном пространстве; у наземных антенн она сокращается в несколько раз, антенна на борту на высоте 50 м её возвращает. Опубликованные данные производителя модуля (1200 м и более 2 Мбит/с в канале 2 МГц при +20 дБм; уровень сигнала на 300 и 600 м в пределах 2 дБ от расчёта) согласуются с расчётом; при норме 14 дБм это около 600 м.</w:t>
+        <w:t>6. Расчётная граница связи Wi-Fi HaLow при мощности 14 дБм и запасе 10 дБ — от 0,98 до 4,90 км в свободном пространстве; у наземных антенн она сокращается в несколько раз, антенна на борту на высоте 50 м её возвращает. Опубликованные данные производителя модуля (1200 м и более 2 Мбит/с в канале 2 МГц при +20 дБм; уровень сигнала на 300 и 600 м в пределах 2 дБ от расчёта) согласуются с расчётом; при норме 14 дБм это около 600 м. Это возможности радиомодуля; на плате с камерой её фон, на 27 дБ выше теплового, сокращает границу до 44–220 м, пока помехи не устранены.</w:t>
       </w:r>
     </w:p>
     <w:p>
@@ -13761,7 +13772,7 @@
         <w:t xml:space="preserve">3. Серия стендовых экспериментов установила, что после устранения программных ограничений платформы пропускную способность ограничивает радиоканал между платами — около трети первых передач теряется даже при сильном сигнале, а эфир почти полностью занят повторами; интерфейс UART задаёт архитектурный предел 3,92 Мбит/с. Доработки программного обеспечения подняли полезную скорость со 121 до 1063 кбит/с (видео 480 × 320, 5 видеокадров в секунду, трасса 5 м). На трассе 5 м уровень сигнала составил −53 дБм, задержка по квитанции в медиане 0,34–0,50 с, потери видеокадров 1,4 %. Разработаны и проверены парными опытами гибрид помехоустойчивого кодирования и досылки, инерция управления качеством и нижняя граница модуляции по уровню сигнала; реализован и проверен регулятор мощности в пределах 1–14 дБм. Найдена причина искажения изображения — наводка собственного передатчика — и устранена программными средствами. </w:t>
       </w:r>
       <w:r>
-        <w:t>Расчёт бюджета канала по паспорту радиомодуля дал границу связи 0,98–4,90 км в свободном пространстве при 14 дБм и согласуется с опубликованными натурными данными производителя. Сравнение показало, что при нормах мощности Российской Федерации Wi-Fi HaLow выигрывает у Wi-Fi 2,4 ГГц на малых скоростях и за препятствиями, уступает ему в скорости на порядок и превосходит LoRa по скорости на два–три порядка.</w:t>
+        <w:t>Расчёт бюджета канала по паспорту радиомодуля дал границу связи 0,98–4,90 км в свободном пространстве при 14 дБм и согласуется с опубликованными натурными данными производителя; на плате с камерой из-за её фона, на 27 дБ выше теплового, граница сокращается до 44–220 м, поэтому для бортового применения помехи камеры необходимо устранить. Сравнение показало, что при нормах мощности Российской Федерации Wi-Fi HaLow выигрывает у Wi-Fi 2,4 ГГц на малых скоростях и за препятствиями, уступает ему в скорости на порядок и превосходит LoRa по скорости на два–три порядка.</w:t>
       </w:r>
     </w:p>
     <w:p>
@@ -13889,7 +13900,7 @@
         <w:jc w:val="left"/>
       </w:pPr>
       <w:r>
-        <w:t>7. IEEE Std 802.11ah-2016. IEEE Standard for Information technology — Telecommunications and information exchange between systems. Local and metropolitan area networks — Specific requirements. Part 11: Wireless LAN Medium Access Control (MAC) and Physical Layer (PHY) Specifications. Amendment 2: Sub 1 GHz License Exempt Operation. – New York : IEEE, 2017. – 594 p. – DOI 10.1109/IEEESTD.2017.7920364. – Текст : электронный // IEEE Xplore : [сайт]. – URL: https://ieeexplore.ieee.org/document/7920364 (дата обращения: 08.10.2026).</w:t>
+        <w:t>7. Rappaport, T. S. Wireless Communications : Principles and Practice / T. S. Rappaport. – 2nd ed. – Upper Saddle River : Prentice Hall PTR, 2002. – XXIII, 707 p. – ISBN 0-13-042232-0. – Текст : непосредственный.</w:t>
       </w:r>
     </w:p>
     <w:p>
@@ -13898,7 +13909,7 @@
         <w:jc w:val="left"/>
       </w:pPr>
       <w:r>
-        <w:t>8. Wi-Fi HaLow. – Текст : электронный // Wi-Fi Alliance : [сайт]. – URL: https://www.wi-fi.org/discover-wi-fi/wi-fi-halow (дата обращения: 24.09.2026).</w:t>
+        <w:t>8. IEEE Std 802.11ah-2016. IEEE Standard for Information technology — Telecommunications and information exchange between systems. Local and metropolitan area networks — Specific requirements. Part 11: Wireless LAN Medium Access Control (MAC) and Physical Layer (PHY) Specifications. Amendment 2: Sub 1 GHz License Exempt Operation. – New York : IEEE, 2017. – 594 p. – DOI 10.1109/IEEESTD.2017.7920364. – Текст : электронный // IEEE Xplore : [сайт]. – URL: https://ieeexplore.ieee.org/document/7920364 (дата обращения: 08.10.2026).</w:t>
       </w:r>
     </w:p>
     <w:p>
@@ -13907,7 +13918,7 @@
         <w:jc w:val="left"/>
       </w:pPr>
       <w:r>
-        <w:t>9. Wi-Fi HaLow for the Internet of Things : An up-to-date survey on IEEE 802.11ah research / L. Tian, S. Santi, A. Seferagić [et al.] // Journal of Network and Computer Applications. – 2021. – Vol. 182. – Art. 103036. – Текст : электронный.</w:t>
+        <w:t>9. Wi-Fi HaLow. – Текст : электронный // Wi-Fi Alliance : [сайт]. – URL: https://www.wi-fi.org/discover-wi-fi/wi-fi-halow (дата обращения: 24.09.2026).</w:t>
       </w:r>
     </w:p>
     <w:p>
@@ -13916,7 +13927,7 @@
         <w:jc w:val="left"/>
       </w:pPr>
       <w:r>
-        <w:t>10. A survey on IEEE 802.11ah : An enabling networking technology for smart cities / E. Khorov, A. Lyakhov, A. Krotov [et al.] // Computer Communications. – 2015. – Vol. 58. – P. 53–69. – Текст : электронный.</w:t>
+        <w:t>10. Wi-Fi HaLow for the Internet of Things : An up-to-date survey on IEEE 802.11ah research / L. Tian, S. Santi, A. Seferagić [et al.] // Journal of Network and Computer Applications. – 2021. – Vol. 182. – Art. 103036. – Текст : электронный.</w:t>
       </w:r>
     </w:p>
     <w:p>
@@ -13925,7 +13936,7 @@
         <w:jc w:val="left"/>
       </w:pPr>
       <w:r>
-        <w:t>11. Chounos, K. Scalability and Performance Evaluation of IEEE 802.11ah IoT Deployments : A Testbed Approach / K. Chounos, K. Kyriakou, T. Korakis. – 2025. – arXiv:2508.03146. – Текст : электронный // arXiv.org : [сайт]. – URL: https://arxiv.org/abs/2508.03146 (дата обращения: 27.09.2026).</w:t>
+        <w:t>11. A survey on IEEE 802.11ah : An enabling networking technology for smart cities / E. Khorov, A. Lyakhov, A. Krotov [et al.] // Computer Communications. – 2015. – Vol. 58. – P. 53–69. – Текст : электронный.</w:t>
       </w:r>
     </w:p>
     <w:p>
@@ -13934,7 +13945,7 @@
         <w:jc w:val="left"/>
       </w:pPr>
       <w:r>
-        <w:t>12. ExpressLRS : open source radio link for RC applications. – Текст : электронный // ExpressLRS : [сайт]. – URL: https://www.expresslrs.org (дата обращения: 27.09.2026).</w:t>
+        <w:t>12. Chounos, K. Scalability and Performance Evaluation of IEEE 802.11ah IoT Deployments : A Testbed Approach / K. Chounos, K. Kyriakou, T. Korakis. – 2025. – arXiv:2508.03146. – Текст : электронный // arXiv.org : [сайт]. – URL: https://arxiv.org/abs/2508.03146 (дата обращения: 27.09.2026).</w:t>
       </w:r>
     </w:p>
     <w:p>
@@ -13943,7 +13954,7 @@
         <w:jc w:val="left"/>
       </w:pPr>
       <w:r>
-        <w:t>13. Rappaport, T. S. Wireless Communications : Principles and Practice / T. S. Rappaport. – 2nd ed. – Upper Saddle River : Prentice Hall PTR, 2002. – XXIII, 707 p. – ISBN 0-13-042232-0. – Текст : непосредственный.</w:t>
+        <w:t>13. ExpressLRS : open source radio link for RC applications. – Текст : электронный // ExpressLRS : [сайт]. – URL: https://www.expresslrs.org (дата обращения: 27.09.2026).</w:t>
       </w:r>
     </w:p>
     <w:p>

</xml_diff>

<commit_message>
Thesis: camera-board noise is variable (-60 dBm Aug-Sep, -90 by time of day, -101 on 05.10); 44-220 m is the worst case, not the platform limit
Co-Authored-By: Claude Opus 5.5 <noreply@anthropic.com>
Claude-Session: https://claude.ai/code/session_01F7zWgPWK1QF4RLkRPrjcGv
</commit_message>
<xml_diff>
--- a/docs/vkr/Osnovnaya_chast_HaLow.docx
+++ b/docs/vkr/Osnovnaya_chast_HaLow.docx
@@ -1663,7 +1663,7 @@
         <w:t xml:space="preserve">– </w:t>
       </w:r>
       <w:r>
-        <w:t>передача видео для ситуационной осведомлённости оператора на расстояниях от сотен метров до единиц километров, в том числе вне прямой видимости (на плате этой работы — после устранения помех камеры, раздел 3.6); на платформе этой работы получено 1063 кбит/с полезного видео 480 × 320 точек при 5 кадр/с (глава 3);</w:t>
+        <w:t>передача видео для ситуационной осведомлённости оператора на расстояниях от сотен метров до единиц километров, в том числе вне прямой видимости (для платы этой работы — с оговоркой раздела 3.6); на платформе этой работы получено 1063 кбит/с полезного видео 480 × 320 точек при 5 кадр/с (глава 3);</w:t>
       </w:r>
     </w:p>
     <w:p>
@@ -4313,7 +4313,7 @@
               <w:rPr>
                 <w:sz w:val="22"/>
               </w:rPr>
-              <w:t>−85…−88 дБм у приёмника, около −60 дБм у платы с камерой</w:t>
+              <w:t>−85…−102 дБм у приёмника; у платы с камерой около −60 дБм (27.08–15.09), в другое время до −90…−101 дБм</w:t>
             </w:r>
           </w:p>
         </w:tc>
@@ -4332,7 +4332,7 @@
               <w:rPr>
                 <w:sz w:val="22"/>
               </w:rPr>
-              <w:t>помехи электроники платы: шина камеры, PSRAM, тактовый сигнал</w:t>
+              <w:t>помехи электроники платы (шина камеры, PSRAM, тактовый сигнал) и, вероятно, внешние помехи диапазона; значение непостоянно</w:t>
             </w:r>
           </w:p>
         </w:tc>
@@ -4680,7 +4680,7 @@
     </w:p>
     <w:p>
       <w:r>
-        <w:t>Во-вторых, допущения теоретической оценки на реальной платформе выполняются не всегда, а проверить их можно только измерением. Расчёт считает шум приёмника тепловым: по формуле (1.2) в канале 2 МГц это −111 дБм плюс коэффициент шума приёмника. Модуль приёмника измерял фон −85…−88 дБм, а такой же модуль на плате с камерой — около −60 дБм: шина камеры, память PSRAM и тактовый сигнал камеры шумят в сантиметрах от антенны. Следствие оказалось качественным, а не количественным. По расчёту на расстоянии 5 м сигнал превышает тепловой шум более чем на 60 дБ, а на стенде связь не устанавливалась: приёмник по своему порогу занятости канала считал эфир занятым почти всегда, и видеокадры ждали отправки до 134 с. Расчёт также связывает ошибки передачи с отношением сигнал/шум, а на стенде при отношении сигнал/шум 40–45 дБ доля неудачных попыток передачи (PER) составила 68–73 % одинаково на MCS 3, 5 и 7 (28.09). Опыт с ограничением числа попыток передачи (07.10) показал, что при одной попытке до приёмника не доходит 38 % фрагментов видеокадров при отношении сигнал/шум 26–36 дБ: потери происходят в эфире и в обе стороны — теряется около трети первых передач, а у части дошедших передатчик не слышит подтверждения. Вероятная причина — помехи платы с камерой. При этом протокол доступа к среде добавлял свои потери: отказ от обмена запросом и разрешением на передачу (RTS/CTS) увеличил скорость видеопотока в 1,8–2,2 раза при том же канале (29.09).</w:t>
+        <w:t>Во-вторых, допущения теоретической оценки на реальной платформе выполняются не всегда, а проверить их можно только измерением. Расчёт считает шум приёмника тепловым: по формуле (1.2) в канале 2 МГц это −111 дБм плюс коэффициент шума приёмника. Модуль приёмника измерял фон −85…−88 дБм, а такой же модуль на плате с камерой — около −60 дБм (27.08): шина камеры, память PSRAM и тактовый сигнал камеры шумят в сантиметрах от антенны. Фон к тому же непостоянен: в течение суток он менялся от −60 до −90 дБм (15.09), а 05.10 на плате с камерой составил −101 дБм. Следствие оказалось качественным, а не количественным. По расчёту на расстоянии 5 м сигнал превышает тепловой шум более чем на 60 дБ, а на стенде связь не устанавливалась: приёмник по своему порогу занятости канала считал эфир занятым почти всегда, и видеокадры ждали отправки до 134 с. Расчёт также связывает ошибки передачи с отношением сигнал/шум, а на стенде при отношении сигнал/шум 40–45 дБ доля неудачных попыток передачи (PER) составила 68–73 % одинаково на MCS 3, 5 и 7 (28.09). Опыт с ограничением числа попыток передачи (07.10) показал, что при одной попытке до приёмника не доходит 38 % фрагментов видеокадров при отношении сигнал/шум 26–36 дБ: потери происходят в эфире и в обе стороны — теряется около трети первых передач, а у части дошедших передатчик не слышит подтверждения. Вероятная причина — помехи платы с камерой. При этом протокол доступа к среде добавлял свои потери: отказ от обмена запросом и разрешением на передачу (RTS/CTS) увеличил скорость видеопотока в 1,8–2,2 раза при том же канале (29.09).</w:t>
       </w:r>
     </w:p>
     <w:p>
@@ -6092,7 +6092,7 @@
     </w:p>
     <w:p>
       <w:r>
-        <w:t>1) Порог занятости канала. Модуль перед передачей оценивает занятость эфира по уровню фона. У платы с камерой фон оказался на 25 дБ выше (−60 против −85…−88 дБм): шина DVP, память PSRAM и тактовый сигнал камеры электрически шумят. Приёмник со своим низким порогом считал канал занятым почти всегда, накапливал очередь и не успевал ответить на запрос подключения. Запас порога 20 дБ на точке доступа (команда AT+BGRSSI_MARGIN=20) устранил отказ (28.08).</w:t>
+        <w:t>1) Порог занятости канала. Модуль перед передачей оценивает занятость эфира по уровню фона. У платы с камерой фон оказался на 25 дБ выше (−60 против −85…−88 дБм, 27.08): шина DVP, память PSRAM и тактовый сигнал камеры электрически шумят. Приёмник со своим низким порогом считал канал занятым почти всегда, накапливал очередь и не успевал ответить на запрос подключения. Запас порога 20 дБ на точке доступа (команда AT+BGRSSI_MARGIN=20) устранил отказ (28.08).</w:t>
       </w:r>
     </w:p>
     <w:p>
@@ -7777,7 +7777,7 @@
         <w:t xml:space="preserve">Ограничивающее звено — радиоканал. </w:t>
       </w:r>
       <w:r>
-        <w:t>После этих доработок ни интерфейс, ни процессоры не ограничивают поток. Скорость подачи данных в модуль ни в одном опыте не превышала примерно 1 Мбит/с при пределе интерфейса около 1,65 Мбит/с с паузой 2 мс (29.09). При передаче видеопотока процессор модуля простаивает 92–93 % времени (07.10), поэтому приём UART через прямой доступ к памяти и скорость 4,8 Мбод проверены и отвергнуты. Ограничивает поток радиоканал между платами. По полному отчёту радиоуровня модуля камеры (07.10, 5 м) эфир занят передачей к приёмнику 99 % времени, PER — 60 %, на 57 % агрегированных кадров MAC блочное подтверждение не получено, и в эфир уходит около 2,4 байта на каждый доставленный. Опыт с ограничением числа попыток передачи показал, что потери происходят в эфире: при одной попытке до приёмника не доходит 38 % фрагментов, при двух — 17,7 %, при заводских семи — 6,6 % при отношении сигнал/шум 26–36 дБ (07.10). Около трети первых передач теряется даже при сильном сигнале; вероятная причина — помехи платы с камерой (фон −60 дБм против −87 дБм у приёмника). Это и задаёт потолок около 1 Мбит/с полезного видео на данной паре плат.</w:t>
+        <w:t>После этих доработок ни интерфейс, ни процессоры не ограничивают поток. Скорость подачи данных в модуль ни в одном опыте не превышала примерно 1 Мбит/с при пределе интерфейса около 1,65 Мбит/с с паузой 2 мс (29.09). При передаче видеопотока процессор модуля простаивает 92–93 % времени (07.10), поэтому приём UART через прямой доступ к памяти и скорость 4,8 Мбод проверены и отвергнуты. Ограничивает поток радиоканал между платами. По полному отчёту радиоуровня модуля камеры (07.10, 5 м) эфир занят передачей к приёмнику 99 % времени, PER — 60 %, на 57 % агрегированных кадров MAC блочное подтверждение не получено, и в эфир уходит около 2,4 байта на каждый доставленный. Опыт с ограничением числа попыток передачи показал, что потери происходят в эфире: при одной попытке до приёмника не доходит 38 % фрагментов, при двух — 17,7 %, при заводских семи — 6,6 % при отношении сигнал/шум 26–36 дБ (07.10). Около трети первых передач теряется даже при сильном сигнале. Причина не установлена: одна из версий — помехи платы с камерой, фон которой в августе — сентябре доходил до −60 дБм против −87 дБм у приёмника, однако 05.10 он составлял −101 дБм. Эти потери и задают потолок около 1 Мбит/с полезного видео на данной паре плат.</w:t>
       </w:r>
     </w:p>
     <w:p>
@@ -12080,13 +12080,13 @@
     </w:p>
     <w:p>
       <w:r>
-        <w:t xml:space="preserve">Четвёртый вывод — главный для данной платформы. Таблица </w:t>
+        <w:t xml:space="preserve">Четвёртый вывод — оговорка для данной платформы. Таблица </w:t>
       </w:r>
       <w:r>
         <w:t>3.9</w:t>
       </w:r>
       <w:r>
-        <w:t xml:space="preserve"> считает шум приёмника тепловым, а у платы с камерой измеренный фон на 27 дБ выше (−60 против −87 дБм, раздел 2.2). Плата с камерой принимает подтверждения и квитанции, поэтому её фон ограничивает весь канал: уже на трассе 5 м отношение сигнал/шум на ней проседало до 12–20 дБ, а регулятор поднимал мощность до 11–13 дБм из 14 возможных (08.10). Если уменьшить допустимые потери на 27 дБ, граница в свободном пространстве сокращается в 22 раза — до 44 м на MCS 7 и 220 м на MCS 0. Следовательно, дальности таблицы — возможности радиомодуля, а на плате T-HaLow в исходном исполнении связь ограничена сотнями метров, пока помехи камеры не устранены разнесением и экранированием (предложения в заключении).</w:t>
+        <w:t xml:space="preserve"> считает шум приёмника тепловым. Фон, который оценивает сам радиомодуль, на плате с камерой в августе — сентябре составлял около −60 дБм, на 27 дБ выше, чем у приёмника; при этом он менялся в течение суток (−60 против −90 дБм, 15.09), а 05.10 составил −101 дБм (раздел 2.2). Плата с камерой принимает подтверждения и квитанции, поэтому в худшем случае её фон ограничивает весь канал: допустимые потери уменьшаются на 27 дБ, и граница в свободном пространстве сокращается в 22 раза — до 44 м на MCS 7 и 220 м на MCS 0. На трассе 5 м отношение сигнал/шум временами проседало до 12–20 дБ, а регулятор поднимал мощность до 11–13 дБм из 14 возможных (08.10). Следовательно, дальности таблицы — возможности радиомодуля, а граница связи данной пары плат лежит между ними и оценкой худшего случая и должна быть установлена измерением.</w:t>
       </w:r>
     </w:p>
     <w:p>
@@ -12733,7 +12733,7 @@
         <w:t>3.3</w:t>
       </w:r>
       <w:r>
-        <w:t>: для каждого расстояния указана наибольшая скорость, при которой связь сохраняется. У земли (антенны на 1,5 м) за точкой излома потери от частоты не зависят, и все технологии теряют дальность в разы; антенна на борту на высоте 50 м возвращает Wi-Fi HaLow скорость 650 кбит/с на 1–2 км, а Wi-Fi 2,4 ГГц — 1–6,5 Мбит/с до 2 км. Скорость не ниже видеопотока стенда 1063 кбит/с (выделено жирным) в свободном пространстве и с антенной на борту по расчёту сохраняется у Wi-Fi 2,4 ГГц до 1 км, у Wi-Fi HaLow — до 0,5 км на сетке расстояний рисунка (граница MCS 7 — 0,98 км). Для промежуточных режимов Wi-Fi HaLow (MCS 1–6, 1,3–5,85 Мбит/с) паспорт чувствительности не приводит, поэтому граница видеосвязи Wi-Fi HaLow по расчёту занижена; её уточнение — задача натурных испытаний. Все дальности рисунков — возможности радиотрактов при тепловом шуме; для платы с камерой они сокращаются в 22 раза из-за её фона (раздел 3.6).</w:t>
+        <w:t>: для каждого расстояния указана наибольшая скорость, при которой связь сохраняется. У земли (антенны на 1,5 м) за точкой излома потери от частоты не зависят, и все технологии теряют дальность в разы; антенна на борту на высоте 50 м возвращает Wi-Fi HaLow скорость 650 кбит/с на 1–2 км, а Wi-Fi 2,4 ГГц — 1–6,5 Мбит/с до 2 км. Скорость не ниже видеопотока стенда 1063 кбит/с (выделено жирным) в свободном пространстве и с антенной на борту по расчёту сохраняется у Wi-Fi 2,4 ГГц до 1 км, у Wi-Fi HaLow — до 0,5 км на сетке расстояний рисунка (граница MCS 7 — 0,98 км). Для промежуточных режимов Wi-Fi HaLow (MCS 1–6, 1,3–5,85 Мбит/с) паспорт чувствительности не приводит, поэтому граница видеосвязи Wi-Fi HaLow по расчёту занижена; её уточнение — задача натурных испытаний. Все дальности рисунков — возможности радиотрактов при тепловом шуме; при фоне платы с камерой −60 дБм они сократились бы в 22 раза (раздел 3.6).</w:t>
       </w:r>
     </w:p>
     <w:p>
@@ -13030,7 +13030,7 @@
               <w:rPr>
                 <w:sz w:val="20"/>
               </w:rPr>
-              <w:t>1200 м, &gt; 2 Мбит/с при +20 дБм [16]; расчёт при 14 дБм: 0,98–4,90 км в своб. простр. (табл. 3.9); с фоном платы с камерой — 44–220 м</w:t>
+              <w:t>1200 м, &gt; 2 Мбит/с при +20 дБм [16]; расчёт при 14 дБм: 0,98–4,90 км в своб. простр. (табл. 3.9); при фоне платы с камерой −60 дБм — 44–220 м</w:t>
             </w:r>
           </w:p>
         </w:tc>
@@ -13733,7 +13733,7 @@
     </w:p>
     <w:p>
       <w:r>
-        <w:t>6. Расчётная граница связи Wi-Fi HaLow при мощности 14 дБм и запасе 10 дБ — от 0,98 до 4,90 км в свободном пространстве; у наземных антенн она сокращается в несколько раз, антенна на борту на высоте 50 м её возвращает. Опубликованные данные производителя модуля (1200 м и более 2 Мбит/с в канале 2 МГц при +20 дБм; уровень сигнала на 300 и 600 м в пределах 2 дБ от расчёта) согласуются с расчётом; при норме 14 дБм это около 600 м. Это возможности радиомодуля; на плате с камерой её фон, на 27 дБ выше теплового, сокращает границу до 44–220 м, пока помехи не устранены.</w:t>
+        <w:t>6. Расчётная граница связи Wi-Fi HaLow при мощности 14 дБм и запасе 10 дБ — от 0,98 до 4,90 км в свободном пространстве; у наземных антенн она сокращается в несколько раз, антенна на борту на высоте 50 м её возвращает. Опубликованные данные производителя модуля (1200 м и более 2 Мбит/с в канале 2 МГц при +20 дБм; уровень сигнала на 300 и 600 м в пределах 2 дБ от расчёта) согласуются с расчётом; при норме 14 дБм это около 600 м. Это возможности радиомодуля; при фоне платы с камерой −60 дБм, наблюдавшемся в августе — сентябре, граница сократилась бы до 44–220 м. Фон непостоянен (до −101 дБм), поэтому границу данной пары плат должно установить измерение.</w:t>
       </w:r>
     </w:p>
     <w:p>
@@ -13772,7 +13772,7 @@
         <w:t xml:space="preserve">3. Серия стендовых экспериментов установила, что после устранения программных ограничений платформы пропускную способность ограничивает радиоканал между платами — около трети первых передач теряется даже при сильном сигнале, а эфир почти полностью занят повторами; интерфейс UART задаёт архитектурный предел 3,92 Мбит/с. Доработки программного обеспечения подняли полезную скорость со 121 до 1063 кбит/с (видео 480 × 320, 5 видеокадров в секунду, трасса 5 м). На трассе 5 м уровень сигнала составил −53 дБм, задержка по квитанции в медиане 0,34–0,50 с, потери видеокадров 1,4 %. Разработаны и проверены парными опытами гибрид помехоустойчивого кодирования и досылки, инерция управления качеством и нижняя граница модуляции по уровню сигнала; реализован и проверен регулятор мощности в пределах 1–14 дБм. Найдена причина искажения изображения — наводка собственного передатчика — и устранена программными средствами. </w:t>
       </w:r>
       <w:r>
-        <w:t>Расчёт бюджета канала по паспорту радиомодуля дал границу связи 0,98–4,90 км в свободном пространстве при 14 дБм и согласуется с опубликованными натурными данными производителя; на плате с камерой из-за её фона, на 27 дБ выше теплового, граница сокращается до 44–220 м, поэтому для бортового применения помехи камеры необходимо устранить. Сравнение показало, что при нормах мощности Российской Федерации Wi-Fi HaLow выигрывает у Wi-Fi 2,4 ГГц на малых скоростях и за препятствиями, уступает ему в скорости на порядок и превосходит LoRa по скорости на два–три порядка.</w:t>
+        <w:t>Расчёт бюджета канала по паспорту радиомодуля дал границу связи 0,98–4,90 км в свободном пространстве при 14 дБм и согласуется с опубликованными натурными данными производителя; при фоне платы с камерой −60 дБм, наблюдавшемся в августе — сентябре, граница сократилась бы до 44–220 м, поэтому для бортового применения помехи камеры необходимо устранить, а границу данной пары плат — измерить. Сравнение показало, что при нормах мощности Российской Федерации Wi-Fi HaLow выигрывает у Wi-Fi 2,4 ГГц на малых скоростях и за препятствиями, уступает ему в скорости на порядок и превосходит LoRa по скорости на два–три порядка.</w:t>
       </w:r>
     </w:p>
     <w:p>
@@ -13801,7 +13801,7 @@
     </w:p>
     <w:p>
       <w:r>
-        <w:t>2) размещать радиомодуль и его антенну вдали от камеры, памяти и их шин и экранировать шлейф камеры: помехи платы поднимают фон приёмника камеры до −60 дБм и являются вероятной причиной потери трети первых передач, а излучение передатчика искажает захват изображения;</w:t>
+        <w:t>2) размещать радиомодуль и его антенну вдали от камеры, памяти и их шин и экранировать шлейф камеры: помехи платы поднимали фон приёмника камеры до −60 дБм и являются одной из версий потери трети первых передач, а излучение передатчика искажает захват изображения;</w:t>
       </w:r>
     </w:p>
     <w:p>

</xml_diff>

<commit_message>
Thesis 1.3: derive the thermal noise formula (1.2) from N = kTB
Co-Authored-By: Claude Opus 5.5 <noreply@anthropic.com>
Claude-Session: https://claude.ai/code/session_01F7zWgPWK1QF4RLkRPrjcGv
</commit_message>
<xml_diff>
--- a/docs/vkr/Osnovnaya_chast_HaLow.docx
+++ b/docs/vkr/Osnovnaya_chast_HaLow.docx
@@ -566,6 +566,11 @@
       </w:r>
       <w:r>
         <w:t>N — мощность шума, дБм; B — полоса, Гц; NF — коэффициент шума приёмника, дБ.</w:t>
+      </w:r>
+    </w:p>
+    <w:p>
+      <w:r>
+        <w:t>Формула получена из мощности теплового шума N = kTB [7], где k = 1,38·10⁻²³ Дж/К — постоянная Больцмана, T — шумовая температура. При стандартной температуре T₀ = 290 К спектральная плотность шума kT₀ = 4·10⁻²¹ Вт/Гц, что составляет −204 дБВт/Гц, или −174 дБм/Гц; слагаемое 10 lg B переводит плотность в мощность в полосе B, а коэффициент шума NF учитывает собственные шумы приёмника.</w:t>
       </w:r>
     </w:p>
     <w:p>

</xml_diff>

<commit_message>
Wi-Fi 2.4 GHz comparison test on the same T-HaLow boards: camera and receiver sketches, viewer parses WIFI line, test procedure
Thesis: 2 MHz channel width justified by the Russian band plan.

Co-Authored-By: Claude Opus 5.5 <noreply@anthropic.com>
Claude-Session: https://claude.ai/code/session_01F7zWgPWK1QF4RLkRPrjcGv
</commit_message>
<xml_diff>
--- a/docs/vkr/Osnovnaya_chast_HaLow.docx
+++ b/docs/vkr/Osnovnaya_chast_HaLow.docx
@@ -575,7 +575,7 @@
     </w:p>
     <w:p>
       <w:r>
-        <w:t>Канал Wi-Fi шириной 20 МГц собирает шум −101,0 дБм, канал Wi-Fi HaLow шириной 2 МГц — −111,0 дБм: ещё 10,0 дБ в пользу узкого канала. При равной мощности и одинаковых антеннах суммарный энергетический выигрыш составляет 19,0 дБ, что в свободном пространстве соответствует увеличению дальности в 8,9 раза. Проектная дальность Wi-Fi HaLow — около 1 км [11, 15]. Производитель радиомодуля платформы указывает для канала 2 МГц при мощности +20 дБм дальность 1200 м со скоростью TCP более 2 Мбит/с в условиях без препятствий [16]. Нормы Российской Федерации ограничивают мощность Wi-Fi HaLow сильнее, чем мощность Wi-Fi 2,4 ГГц (см. «Регулирование»): с учётом этого выигрыш сокращается до 15,1 дБ.</w:t>
+        <w:t>Канал Wi-Fi шириной 20 МГц собирает шум −101,0 дБм, канал Wi-Fi HaLow шириной 2 МГц — −111,0 дБм: ещё 10,0 дБ в пользу узкого канала. Ширина 2 МГц выбрана не произвольно: в Российской Федерации для таких устройств выделены полосы 864–865 и 866–868 МГц [15], и канал шире 2 МГц в них не помещается. Канал 8 МГц, допустимый стандартом, дал бы скорость до четырёх раз выше, но собирал бы на 6,0 дБ больше шума и требовал бы полосы, которой в Российской Федерации нет. При равной мощности и одинаковых антеннах суммарный энергетический выигрыш составляет 19,0 дБ, что в свободном пространстве соответствует увеличению дальности в 8,9 раза. Проектная дальность Wi-Fi HaLow — около 1 км [11, 16]. Производитель радиомодуля платформы указывает для канала 2 МГц при мощности +20 дБм дальность 1200 м со скоростью TCP более 2 Мбит/с в условиях без препятствий [17]. Нормы Российской Федерации ограничивают мощность Wi-Fi HaLow сильнее, чем мощность Wi-Fi 2,4 ГГц (см. «Регулирование»): с учётом этого выигрыш сокращается до 15,1 дБ.</w:t>
       </w:r>
     </w:p>
     <w:p>
@@ -586,7 +586,7 @@
         <w:t xml:space="preserve">Проникающая способность. </w:t>
       </w:r>
       <w:r>
-        <w:t>Радиоволны диапазона ниже 1 ГГц лучше огибают препятствия и слабее затухают в растительности и стенах, чем волны 2,4 и 5 ГГц [7]. По модели потерь проникновения 3GPP TR 38.901 (бетон: 5 + 4f дБ, f в ГГц) бетонная стена ослабляет сигнал на 8,5 дБ на частоте 867 МГц, на 14,8 дБ на 2,44 ГГц и на 27,0 дБ на 5,5 ГГц [17]. Для БПЛА, работающих над лесом, за рельефом и строениями, это главное преимущество диапазона ниже 1 ГГц.</w:t>
+        <w:t>Радиоволны диапазона ниже 1 ГГц лучше огибают препятствия и слабее затухают в растительности и стенах, чем волны 2,4 и 5 ГГц [7]. По модели потерь проникновения 3GPP TR 38.901 (бетон: 5 + 4f дБ, f в ГГц) бетонная стена ослабляет сигнал на 8,5 дБ на частоте 867 МГц, на 14,8 дБ на 2,44 ГГц и на 27,0 дБ на 5,5 ГГц [18]. Для БПЛА, работающих над лесом, за рельефом и строениями, это главное преимущество диапазона ниже 1 ГГц.</w:t>
       </w:r>
     </w:p>
     <w:p>
@@ -597,7 +597,7 @@
         <w:t xml:space="preserve">Пропускная способность. </w:t>
       </w:r>
       <w:r>
-        <w:t>Скорость на физическом уровне Wi-Fi HaLow составляет от 150 кбит/с в канале 1 МГц до 346,7 Мбит/с в канале 16 МГц с четырьмя пространственными потоками [15]. В каналах 1–2 МГц, которые помещаются в разрешённые полосы 864–865 и 866–868 МГц, скорость одного потока по стандарту — от 0,15 до 7,8 Мбит/с (таблица 2.1) [18]; радиомодуль платформы этой работы в канале 2 МГц использует схемы MCS 0–7, то есть до 6,5 Мбит/с. Wi-Fi 2,4 ГГц на процессоре ESP32-S3 той же платы передаёт в эфире в лабораторных условиях 20 Мбит/с по TCP и 30 Мбит/с по UDP [19]. LoRa в канале 125 кГц даёт от 293 до 5468 бит/с в зависимости от коэффициента расширения спектра [4], а наибольшая скорость приёмопередатчиков SX127x — 37,5 кбит/с [5]: видео по такому каналу не передать.</w:t>
+        <w:t>Скорость на физическом уровне Wi-Fi HaLow составляет от 150 кбит/с в канале 1 МГц до 346,7 Мбит/с в канале 16 МГц с четырьмя пространственными потоками [16]. В каналах 1–2 МГц, которые помещаются в разрешённые полосы 864–865 и 866–868 МГц, скорость одного потока по стандарту — от 0,15 до 7,8 Мбит/с (таблица 2.1) [19]; радиомодуль платформы этой работы в канале 2 МГц использует схемы MCS 0–7, то есть до 6,5 Мбит/с. Wi-Fi 2,4 ГГц на процессоре ESP32-S3 той же платы передаёт в эфире в лабораторных условиях 20 Мбит/с по TCP и 30 Мбит/с по UDP [20]. LoRa в канале 125 кГц даёт от 293 до 5468 бит/с в зависимости от коэффициента расширения спектра [4], а наибольшая скорость приёмопередатчиков SX127x — 37,5 кбит/с [5]: видео по такому каналу не передать.</w:t>
       </w:r>
     </w:p>
     <w:p>
@@ -608,7 +608,7 @@
         <w:t xml:space="preserve">Чувствительность. </w:t>
       </w:r>
       <w:r>
-        <w:t>По паспорту радиомодуля TX-AH чувствительность (при доле ошибочных пакетов 10 %) составляет −105 дБм в канале 1 МГц на MCS 10, −95 дБм в канале 8 МГц на MCS 0 и −81 дБм на MCS 7 [16]; для канала 2 МГц паспорт значений не даёт, и в работе они оценены сдвигом на 10 lg(8/2) = 6 дБ: около −101 дБм на MCS 0 и −87 дБм на MCS 7. У Wi-Fi 2,4 ГГц процессора ESP32-S3 — от −98,4 дБм (802.11b, 1 Мбит/с) до −74,2 дБм (802.11n, MCS 7) [20], у LoRa — от −123 до −137 дБм [4].</w:t>
+        <w:t>По паспорту радиомодуля TX-AH чувствительность (при доле ошибочных пакетов 10 %) составляет −105 дБм в канале 1 МГц на MCS 10, −95 дБм в канале 8 МГц на MCS 0 и −81 дБм на MCS 7 [17]; для канала 2 МГц паспорт значений не даёт, и в работе они оценены сдвигом на 10 lg(8/2) = 6 дБ: около −101 дБм на MCS 0 и −87 дБм на MCS 7. У Wi-Fi 2,4 ГГц процессора ESP32-S3 — от −98,4 дБм (802.11b, 1 Мбит/с) до −74,2 дБм (802.11n, MCS 7) [21], у LoRa — от −123 до −137 дБм [4].</w:t>
       </w:r>
     </w:p>
     <w:p>
@@ -619,7 +619,7 @@
         <w:t xml:space="preserve">Энергопотребление. </w:t>
       </w:r>
       <w:r>
-        <w:t>Стандарт IEEE 802.11ah содержит механизмы для устройств с батарейным питанием: целевое время пробуждения (TWT) и окно ограниченного доступа (RAW) [11, 15]. Радиомодуль TX-AH потребляет при передаче на +20 дБм 300 мА, при приёме 55–100 мА [16]; Wi-Fi ESP32-S3 — 283–340 мА при передаче и 88–91 мА при приёме [20]; приёмопередатчик LoRa RFM95 — от 66 до 396 мВт при мощности от −4 до +20 дБм [21]. Токи Wi-Fi HaLow и Wi-Fi 2,4 ГГц сопоставимы; LoRa экономичнее при малых объёмах данных. Для БПЛА энергопотребление радиоканала мало по сравнению с потреблением двигателей, поэтому этот критерий важнее для наземных датчиков. Механизмы TWT и RAW проявляются в сетях из многих станций и в двухузловой конфигурации этой работы не исследуются.</w:t>
+        <w:t>Стандарт IEEE 802.11ah содержит механизмы для устройств с батарейным питанием: целевое время пробуждения (TWT) и окно ограниченного доступа (RAW) [11, 16]. Радиомодуль TX-AH потребляет при передаче на +20 дБм 300 мА, при приёме 55–100 мА [17]; Wi-Fi ESP32-S3 — 283–340 мА при передаче и 88–91 мА при приёме [21]; приёмопередатчик LoRa RFM95 — от 66 до 396 мВт при мощности от −4 до +20 дБм [22]. Токи Wi-Fi HaLow и Wi-Fi 2,4 ГГц сопоставимы; LoRa экономичнее при малых объёмах данных. Для БПЛА энергопотребление радиоканала мало по сравнению с потреблением двигателей, поэтому этот критерий важнее для наземных датчиков. Механизмы TWT и RAW проявляются в сетях из многих станций и в двухузловой конфигурации этой работы не исследуются.</w:t>
       </w:r>
     </w:p>
     <w:p>
@@ -630,7 +630,7 @@
         <w:t xml:space="preserve">Регулирование. </w:t>
       </w:r>
       <w:r>
-        <w:t>Решением ГКРЧ от 07.05.2007 № 07-20-03-001 (в редакции от 24.12.2018) [22] в приложении 11 «Неспециализированные (любого назначения) устройства» выделены полосы 864–865 МГц (эффективная излучаемая мощность, ЭИМ, не более 25 мВт, рабочий цикл не более 0,1 % или режим прослушивания перед излучением, LBT) и 866–868 МГц. Полоса 866–868 МГц введена решением ГКРЧ № 18-46-03-1 [23]: ЭИМ не более 25 мВт при спектральной плотности ЭИМ не более 1000 мВт/МГц (оба условия выполняются одновременно), рабочий цикл не более 1 % или режим LBT. В обеих полосах использование запрещено в пределах аэропортов (аэродромов), что для БПЛА существенно: на территории аэродрома канал этого диапазона применять нельзя. В полосе 2400–2483,5 МГц (приложение 2 того же решения) устройствам с расширением спектра и другими видами модуляции разрешена эквивалентная изотропно излучаемая мощность (ЭИИМ) до 100 мВт при спектральной плотности ЭИИМ не более 10 мВт/МГц [22]. Мощность 25 мВт ЭИМ соответствует 14 дБм ЭИМ, или 16,15 дБм ЭИИМ; стенд с мощностью на выходе модуля не более 14 дБм укладывается в эту норму при усилении антенны не более 2,15 дБи. Wi-Fi HaLow перед передачей прослушивает эфир (CSMA/CA), что соответствует режиму LBT; канал шириной 1 или 2 МГц целиком помещается в полосу 866–868 МГц (в работе — канал 2 МГц с центром 867,0 МГц), более широкие каналы — нет.</w:t>
+        <w:t>Решением ГКРЧ от 07.05.2007 № 07-20-03-001 (в редакции от 24.12.2018) [15] в приложении 11 «Неспециализированные (любого назначения) устройства» выделены полосы 864–865 МГц (эффективная излучаемая мощность, ЭИМ, не более 25 мВт, рабочий цикл не более 0,1 % или режим прослушивания перед излучением, LBT) и 866–868 МГц. Полоса 866–868 МГц введена решением ГКРЧ № 18-46-03-1 [23]: ЭИМ не более 25 мВт при спектральной плотности ЭИМ не более 1000 мВт/МГц (оба условия выполняются одновременно), рабочий цикл не более 1 % или режим LBT. В обеих полосах использование запрещено в пределах аэропортов (аэродромов), что для БПЛА существенно: на территории аэродрома канал этого диапазона применять нельзя. В полосе 2400–2483,5 МГц (приложение 2 того же решения) устройствам с расширением спектра и другими видами модуляции разрешена эквивалентная изотропно излучаемая мощность (ЭИИМ) до 100 мВт при спектральной плотности ЭИИМ не более 10 мВт/МГц [15]. Мощность 25 мВт ЭИМ соответствует 14 дБм ЭИМ, или 16,15 дБм ЭИИМ; стенд с мощностью на выходе модуля не более 14 дБм укладывается в эту норму при усилении антенны не более 2,15 дБи. Wi-Fi HaLow перед передачей прослушивает эфир (CSMA/CA), что соответствует режиму LBT; канал шириной 1 или 2 МГц целиком помещается в полосу 866–868 МГц (в работе — канал 2 МГц с центром 867,0 МГц), более широкие каналы — нет.</w:t>
       </w:r>
     </w:p>
     <w:p>
@@ -1684,7 +1684,7 @@
         <w:t xml:space="preserve">– </w:t>
       </w:r>
       <w:r>
-        <w:t>сеть из нескольких удалённых объектов с одним наземным пунктом: одна точка доступа IEEE 802.11ah обслуживает до 8191 станции [15].</w:t>
+        <w:t>сеть из нескольких удалённых объектов с одним наземным пунктом: одна точка доступа IEEE 802.11ah обслуживает до 8191 станции [16].</w:t>
       </w:r>
     </w:p>
     <w:p>
@@ -4695,7 +4695,7 @@
     </w:p>
     <w:p>
       <w:r>
-        <w:t>В-четвёртых, совпадение средних значений не гарантирует связь: случайные провалы уровня сигнала уходят под порог приёма, и связь прерывается при среднем уровне, достаточном по расчёту. На стенде на неизменной трассе 5 м отношение сигнал/шум временами проседало до 12–20 дБ, и регулятор мощности поднимал мощность передатчика с 1 до 11–13 дБм (08.10). Паспорт радиомодуля приводит чувствительность только для каналов 1 и 8 МГц [16], для канала 2 МГц её приходится оценивать, поэтому энергетический бюджет канала остаётся оценкой, а границу связи в измерениях определяют по доле успешных передач.</w:t>
+        <w:t>В-четвёртых, совпадение средних значений не гарантирует связь: случайные провалы уровня сигнала уходят под порог приёма, и связь прерывается при среднем уровне, достаточном по расчёту. На стенде на неизменной трассе 5 м отношение сигнал/шум временами проседало до 12–20 дБ, и регулятор мощности поднимал мощность передатчика с 1 до 11–13 дБм (08.10). Паспорт радиомодуля приводит чувствительность только для каналов 1 и 8 МГц [17], для канала 2 МГц её приходится оценивать, поэтому энергетический бюджет канала остаётся оценкой, а границу связи в измерениях определяют по доле успешных передач.</w:t>
       </w:r>
     </w:p>
     <w:p>
@@ -4705,7 +4705,7 @@
     </w:p>
     <w:p>
       <w:r>
-        <w:t>В-шестых, опубликованные данные о дальности и скорости получены в других условиях и непосредственно к задаче не переносятся. Натурные данные производителя радиомодуля сняты при мощности +20 дБм [16, 27], пропускная способность Wi-Fi ESP32-S3 по данным производителя — в лаборатории и в экранированной камере [19]; в разрешённом в Российской Федерации режиме (канал 2 МГц, мощность не более 14 дБм) их нужно проверять. Кроме того, эффект каждой доработки канала доказывается только опытом: канал на одной и той же трассе меняется в разы по времени суток, поэтому варианты сравниваются парными опытами в одном включении питания. Так установлено, что граница MCS по уровню сигнала повышает полезную скорость в 1,5–2 раза при меньших потерях видеокадров (08.10), — расчёт этого эффекта не предсказывает, потому что не учитывает алгоритм выбора MCS радиомодуля.</w:t>
+        <w:t>В-шестых, опубликованные данные о дальности и скорости получены в других условиях и непосредственно к задаче не переносятся. Натурные данные производителя радиомодуля сняты при мощности +20 дБм [17, 27], пропускная способность Wi-Fi ESP32-S3 по данным производителя — в лаборатории и в экранированной камере [20]; в разрешённом в Российской Федерации режиме (канал 2 МГц, мощность не более 14 дБм) их нужно проверять. Кроме того, эффект каждой доработки канала доказывается только опытом: канал на одной и той же трассе меняется в разы по времени суток, поэтому варианты сравниваются парными опытами в одном включении питания. Так установлено, что граница MCS по уровню сигнала повышает полезную скорость в 1,5–2 раза при меньших потерях видеокадров (08.10), — расчёт этого эффекта не предсказывает, потому что не учитывает алгоритм выбора MCS радиомодуля.</w:t>
       </w:r>
     </w:p>
     <w:p>
@@ -5963,7 +5963,7 @@
     </w:p>
     <w:p>
       <w:r>
-        <w:t>Плата построена на модуле ESP32-S3-WROOM-1-N16R8 (два ядра Xtensa LX7 до 240 МГц, 16 МБ флеш-памяти, 8 МБ PSRAM, встроенный Wi-Fi 2,4 ГГц стандарта IEEE 802.11b/g/n) [20] и радиомодуле Wi-Fi HaLow Taixin TX-AH-R900P диапазона 859–894 МГц (далее — модуль). Камера OV5640 подключается шлейфом по параллельному интерфейсу DVP; на плате есть также разъём microSD и порт Ethernet, подключённый к модулю.</w:t>
+        <w:t>Плата построена на модуле ESP32-S3-WROOM-1-N16R8 (два ядра Xtensa LX7 до 240 МГц, 16 МБ флеш-памяти, 8 МБ PSRAM, встроенный Wi-Fi 2,4 ГГц стандарта IEEE 802.11b/g/n) [21] и радиомодуле Wi-Fi HaLow Taixin TX-AH-R900P диапазона 859–894 МГц (далее — модуль). Камера OV5640 подключается шлейфом по параллельному интерфейсу DVP; на плате есть также разъём microSD и порт Ethernet, подключённый к модулю.</w:t>
       </w:r>
     </w:p>
     <w:p>
@@ -6183,7 +6183,7 @@
         <w:t xml:space="preserve">Лабораторный этап (до 28.09). </w:t>
       </w:r>
       <w:r>
-        <w:t>Платы располагались в помещении на расстоянии до 5 м. Канал — заводской, шириной 4 МГц с центром 866,0 МГц, мощность передатчика до 20 дБм; оба параметра выходят за рамки решений ГКРЧ [22, 23], и эти условия рассматриваются только как лабораторные. Камера снимала видеокадры 240 × 176 точек, сжатие JPEG с качеством 60. На таком расстоянии приёмник перегружен: при мощности 20 дБм уровень на его входе составлял около 0 дБм при рабочем диапазоне −60…−90 дБм. Поэтому результаты этапа характеризуют платформу, а не канал.</w:t>
+        <w:t>Платы располагались в помещении на расстоянии до 5 м. Канал — заводской, шириной 4 МГц с центром 866,0 МГц, мощность передатчика до 20 дБм; оба параметра выходят за рамки решений ГКРЧ [15, 23], и эти условия рассматриваются только как лабораторные. Камера снимала видеокадры 240 × 176 точек, сжатие JPEG с качеством 60. На таком расстоянии приёмник перегружен: при мощности 20 дБм уровень на его входе составлял около 0 дБм при рабочем диапазоне −60…−90 дБм. Поэтому результаты этапа характеризуют платформу, а не канал.</w:t>
       </w:r>
     </w:p>
     <w:p>
@@ -10924,7 +10924,7 @@
     </w:p>
     <w:p>
       <w:r>
-        <w:t>Бюджет рассчитан для мощности стенда 14 дБм и антенн 0 дБи (ЭИИМ 14 дБм, в пределах нормы 16,15 дБм) с запасом на замирания M = 10 дБ. Чувствительность для канала 2 МГц — оценка (раздел 1.3), для канала 1 МГц на MCS 10 — паспортная [16]. Для сравнения на идентичной аппаратной платформе в тот же расчёт включён радиотракт Wi-Fi 2,4 ГГц процессора ESP32-S3 той же платы: ЭИИМ 20 дБм (100 мВт — норма для 2,4 ГГц), паспортная чувствительность [20]. Результаты — в таблице 3.9; это расчёт автора, а не измерение.</w:t>
+        <w:t>Бюджет рассчитан для мощности стенда 14 дБм и антенн 0 дБи (ЭИИМ 14 дБм, в пределах нормы 16,15 дБм) с запасом на замирания M = 10 дБ. Чувствительность для канала 2 МГц — оценка (раздел 1.3), для канала 1 МГц на MCS 10 — паспортная [17]. Для сравнения на идентичной аппаратной платформе в тот же расчёт включён радиотракт Wi-Fi 2,4 ГГц процессора ESP32-S3 той же платы: ЭИИМ 20 дБм (100 мВт — норма для 2,4 ГГц), паспортная чувствительность [21]. Результаты — в таблице 3.9; это расчёт автора, а не измерение.</w:t>
       </w:r>
     </w:p>
     <w:p>
@@ -12102,7 +12102,7 @@
         <w:t>3.10</w:t>
       </w:r>
       <w:r>
-        <w:t>) получены на мосте и над водой при мощности +20 дБм на частотах 890 и 906 МГц; ширина канала в руководстве не указана, по скорости на 300 м — вероятно, 8 МГц [27]. Паспорт модуля для канала 2 МГц при +20 дБм указывает 1200 м и скорость TCP более 2 Мбит/с [16]. Расчётный уровень приёма в таблице получен по формуле (1.1) для 890 МГц при мощности 20 дБм и антеннах 0 дБи (усиление антенн в руководстве не указано).</w:t>
+        <w:t>) получены на мосте и над водой при мощности +20 дБм на частотах 890 и 906 МГц; ширина канала в руководстве не указана, по скорости на 300 м — вероятно, 8 МГц [27]. Паспорт модуля для канала 2 МГц при +20 дБм указывает 1200 м и скорость TCP более 2 Мбит/с [17]. Расчётный уровень приёма в таблице получен по формуле (1.1) для 890 МГц при мощности 20 дБм и антеннах 0 дБи (усиление антенн в руководстве не указано).</w:t>
       </w:r>
     </w:p>
     <w:p>
@@ -12655,7 +12655,7 @@
         <w:t>3.9</w:t>
       </w:r>
       <w:r>
-        <w:t xml:space="preserve"> сравнивает их при нормах мощности Российской Федерации. При равной скорости физического уровня 6,5 Мбит/с (Wi-Fi HaLow 2 МГц MCS 7 и Wi-Fi 802.11n MCS 0) дальности в свободном пространстве сопоставимы — 0,98 и 1,32 км: выигрыш Wi-Fi HaLow на затухании (9,0 дБ) компенсируется меньшей разрешённой мощностью (на 6,0 дБ ниже у стенда) и оценочной чувствительностью. Wi-Fi HaLow выигрывает на малых скоростях, которых у 802.11n нет: на MCS 0 (0,65 Мбит/с) — 4,90 км против 2,58 км у 802.11b на 1 Мбит/с, — и за препятствиями: бетонная стена ослабляет сигнал 867 МГц на 6,3 дБ меньше, чем 2,4 ГГц [17]. У земли за точкой излома потери двухлучевой модели от частоты не зависят, и частотное преимущество исчезает; модель при этом не учитывает дифракцию и затухание в растительности, где диапазон ниже 1 ГГц выигрывает [7]. Скорость Wi-Fi 2,4 ГГц выше на порядок: ESP32-S3 передаёт в эфире 20–30 Мбит/с [19], а модуль ESP32-CAM (процессор ESP32, камера OV2640) передаёт по Wi-Fi видео 480 × 320 с частотой 20,9 видеокадра в секунду (лаборатория, расстояние не указано) [35] — против 5 видеокадров в секунду и 1063 кбит/с на Wi-Fi HaLow.</w:t>
+        <w:t xml:space="preserve"> сравнивает их при нормах мощности Российской Федерации. При равной скорости физического уровня 6,5 Мбит/с (Wi-Fi HaLow 2 МГц MCS 7 и Wi-Fi 802.11n MCS 0) дальности в свободном пространстве сопоставимы — 0,98 и 1,32 км: выигрыш Wi-Fi HaLow на затухании (9,0 дБ) компенсируется меньшей разрешённой мощностью (на 6,0 дБ ниже у стенда) и оценочной чувствительностью. Wi-Fi HaLow выигрывает на малых скоростях, которых у 802.11n нет: на MCS 0 (0,65 Мбит/с) — 4,90 км против 2,58 км у 802.11b на 1 Мбит/с, — и за препятствиями: бетонная стена ослабляет сигнал 867 МГц на 6,3 дБ меньше, чем 2,4 ГГц [18]. У земли за точкой излома потери двухлучевой модели от частоты не зависят, и частотное преимущество исчезает; модель при этом не учитывает дифракцию и затухание в растительности, где диапазон ниже 1 ГГц выигрывает [7]. Скорость Wi-Fi 2,4 ГГц выше на порядок: ESP32-S3 передаёт в эфире 20–30 Мбит/с [20], а модуль ESP32-CAM (процессор ESP32, камера OV2640) передаёт по Wi-Fi видео 480 × 320 с частотой 20,9 видеокадра в секунду (лаборатория, расстояние не указано) [35] — против 5 видеокадров в секунду и 1063 кбит/с на Wi-Fi HaLow.</w:t>
       </w:r>
     </w:p>
     <w:p>
@@ -12799,7 +12799,7 @@
         <w:t>3.4</w:t>
       </w:r>
       <w:r>
-        <w:t xml:space="preserve"> по модели 3GPP TR 38.901 [17]: бетонная стена ослабляет сигнал 867 МГц на 8,5 дБ, 2,44 ГГц — на 14,8 дБ, 5,5 ГГц — на 27,0 дБ. Разница в 6,3 дБ относительно Wi-Fi 2,4 ГГц эквивалентна увеличению дальности примерно вдвое в свободном пространстве.</w:t>
+        <w:t xml:space="preserve"> по модели 3GPP TR 38.901 [18]: бетонная стена ослабляет сигнал 867 МГц на 8,5 дБ, 2,44 ГГц — на 14,8 дБ, 5,5 ГГц — на 27,0 дБ. Разница в 6,3 дБ относительно Wi-Fi 2,4 ГГц эквивалентна увеличению дальности примерно вдвое в свободном пространстве.</w:t>
       </w:r>
     </w:p>
     <w:p>
@@ -13035,7 +13035,7 @@
               <w:rPr>
                 <w:sz w:val="20"/>
               </w:rPr>
-              <w:t>1200 м, &gt; 2 Мбит/с при +20 дБм [16]; расчёт при 14 дБм: 0,98–4,90 км в своб. простр. (табл. 3.9); при фоне платы с камерой −60 дБм — 44–220 м</w:t>
+              <w:t>1200 м, &gt; 2 Мбит/с при +20 дБм [17]; расчёт при 14 дБм: 0,98–4,90 км в своб. простр. (табл. 3.9); при фоне платы с камерой −60 дБм — 44–220 м</w:t>
             </w:r>
           </w:p>
         </w:tc>
@@ -13054,7 +13054,7 @@
               <w:rPr>
                 <w:sz w:val="20"/>
               </w:rPr>
-              <w:t>расчёт при 20 дБм: 0,16–2,58 км в своб. простр. (табл. 3.9); собственный режим Espressif LR — до 1 км [19]</w:t>
+              <w:t>расчёт при 20 дБм: 0,16–2,58 км в своб. простр. (табл. 3.9); собственный режим Espressif LR — до 1 км [20]</w:t>
             </w:r>
           </w:p>
         </w:tc>
@@ -13135,7 +13135,7 @@
               <w:rPr>
                 <w:sz w:val="20"/>
               </w:rPr>
-              <w:t>−53 дБм на 5 м (стенд); −59…−69 дБм на 300–1200 м [27]; чувствит. −105 дБм (1 МГц) [16]</w:t>
+              <w:t>−53 дБм на 5 м (стенд); −59…−69 дБм на 300–1200 м [27]; чувствит. −105 дБм (1 МГц) [17]</w:t>
             </w:r>
           </w:p>
         </w:tc>
@@ -13154,7 +13154,7 @@
               <w:rPr>
                 <w:sz w:val="20"/>
               </w:rPr>
-              <w:t>чувствит. −98,4…−74,2 дБм [20]</w:t>
+              <w:t>чувствит. −98,4…−74,2 дБм [21]</w:t>
             </w:r>
           </w:p>
         </w:tc>
@@ -13392,7 +13392,7 @@
               <w:rPr>
                 <w:sz w:val="20"/>
               </w:rPr>
-              <w:t>0 % на 1180 м, 10 % на 1350 м [4]; доставка 80 % в помещении на 115 м [21]</w:t>
+              <w:t>0 % на 1180 м, 10 % на 1350 м [4]; доставка 80 % в помещении на 115 м [22]</w:t>
             </w:r>
           </w:p>
         </w:tc>
@@ -13454,7 +13454,7 @@
               <w:rPr>
                 <w:sz w:val="20"/>
               </w:rPr>
-              <w:t>20–30 Мбит/с в эфире [19]</w:t>
+              <w:t>20–30 Мбит/с в эфире [20]</w:t>
             </w:r>
           </w:p>
         </w:tc>
@@ -13473,7 +13473,7 @@
               <w:rPr>
                 <w:sz w:val="20"/>
               </w:rPr>
-              <w:t>ESP32-C5: 20–30 Мбит/с [19]</w:t>
+              <w:t>ESP32-C5: 20–30 Мбит/с [20]</w:t>
             </w:r>
           </w:p>
         </w:tc>
@@ -13535,7 +13535,7 @@
               <w:rPr>
                 <w:sz w:val="20"/>
               </w:rPr>
-              <w:t>передача 300 мА, приём 55–100 мА [16]</w:t>
+              <w:t>передача 300 мА, приём 55–100 мА [17]</w:t>
             </w:r>
           </w:p>
         </w:tc>
@@ -13554,7 +13554,7 @@
               <w:rPr>
                 <w:sz w:val="20"/>
               </w:rPr>
-              <w:t>передача 283–340 мА, приём 88–91 мА [20]</w:t>
+              <w:t>передача 283–340 мА, приём 88–91 мА [21]</w:t>
             </w:r>
           </w:p>
         </w:tc>
@@ -13592,7 +13592,7 @@
               <w:rPr>
                 <w:sz w:val="20"/>
               </w:rPr>
-              <w:t>66–396 мВт [21]</w:t>
+              <w:t>66–396 мВт [22]</w:t>
             </w:r>
           </w:p>
         </w:tc>
@@ -13633,7 +13633,7 @@
               <w:rPr>
                 <w:sz w:val="20"/>
               </w:rPr>
-              <w:t>8,5 дБ [17]</w:t>
+              <w:t>8,5 дБ [18]</w:t>
             </w:r>
           </w:p>
         </w:tc>
@@ -13651,7 +13651,7 @@
               <w:rPr>
                 <w:sz w:val="20"/>
               </w:rPr>
-              <w:t>14,8 дБ [17]</w:t>
+              <w:t>14,8 дБ [18]</w:t>
             </w:r>
           </w:p>
         </w:tc>
@@ -13669,7 +13669,7 @@
               <w:rPr>
                 <w:sz w:val="20"/>
               </w:rPr>
-              <w:t>27,0 дБ [17]</w:t>
+              <w:t>27,0 дБ [18]</w:t>
             </w:r>
           </w:p>
         </w:tc>
@@ -13977,7 +13977,7 @@
         <w:jc w:val="left"/>
       </w:pPr>
       <w:r>
-        <w:t>15. IEEE 802.11AH : the WiFi approach for M2M communications / T. Adame, A. Bel, B. Bellalta [et al.] // IEEE Wireless Communications. – 2014. – Vol. 21, no. 6. – P. 144–152. – DOI 10.1109/MWC.2014.7000982. – Текст : электронный.</w:t>
+        <w:t>15. О выделении полос радиочастот устройствам малого радиуса действия : решение ГКРЧ при Мининформсвязи России от 07.05.2007 № 07-20-03-001 (ред. от 24.12.2018). – Текст : электронный // ГАРАНТ.РУ : информационно-правовой портал. – URL: https://base.garant.ru/192210/ (дата обращения: 08.10.2026).</w:t>
       </w:r>
     </w:p>
     <w:p>
@@ -13986,7 +13986,7 @@
         <w:jc w:val="left"/>
       </w:pPr>
       <w:r>
-        <w:t>16. 泰芯 802.11ah TX-AH-Rx00P 系列模组技术规格书 [Технические характеристики модулей серии TX-AH-Rx00P] : версия V6.2 от 16.11.2023 / Zhuhai Taixin Semiconductor Co., Ltd. – Текст : электронный // GitHub : репозиторий Xinyuan-LilyGO/T-Halow. – URL: https://github.com/Xinyuan-LilyGO/T-Halow/tree/master/hardware/TX_AH (дата обращения: 08.10.2026).</w:t>
+        <w:t>16. IEEE 802.11AH : the WiFi approach for M2M communications / T. Adame, A. Bel, B. Bellalta [et al.] // IEEE Wireless Communications. – 2014. – Vol. 21, no. 6. – P. 144–152. – DOI 10.1109/MWC.2014.7000982. – Текст : электронный.</w:t>
       </w:r>
     </w:p>
     <w:p>
@@ -13995,7 +13995,7 @@
         <w:jc w:val="left"/>
       </w:pPr>
       <w:r>
-        <w:t>17. Sionna : src/sionna/phy/channel/tr38901/lsp.py (модель потерь проникновения 3GPP TR 38.901, п. 7.4.3.1) / NVIDIA (NVlabs). – Текст : электронный // GitHub : [сайт]. – URL: https://github.com/NVlabs/sionna (дата обращения: 08.10.2026).</w:t>
+        <w:t>17. 泰芯 802.11ah TX-AH-Rx00P 系列模组技术规格书 [Технические характеристики модулей серии TX-AH-Rx00P] : версия V6.2 от 16.11.2023 / Zhuhai Taixin Semiconductor Co., Ltd. – Текст : электронный // GitHub : репозиторий Xinyuan-LilyGO/T-Halow. – URL: https://github.com/Xinyuan-LilyGO/T-Halow/tree/master/hardware/TX_AH (дата обращения: 08.10.2026).</w:t>
       </w:r>
     </w:p>
     <w:p>
@@ -14004,7 +14004,7 @@
         <w:jc w:val="left"/>
       </w:pPr>
       <w:r>
-        <w:t>18. Linux kernel source tree : net/wireless/util.c, функция cfg80211_calculate_bitrate_s1g / L. Torvalds [и др.]. – Текст : электронный // GitHub : [сайт]. – URL: https://github.com/torvalds/linux/blob/master/net/wireless/util.c (дата обращения: 08.10.2026).</w:t>
+        <w:t>18. Sionna : src/sionna/phy/channel/tr38901/lsp.py (модель потерь проникновения 3GPP TR 38.901, п. 7.4.3.1) / NVIDIA (NVlabs). – Текст : электронный // GitHub : [сайт]. – URL: https://github.com/NVlabs/sionna (дата обращения: 08.10.2026).</w:t>
       </w:r>
     </w:p>
     <w:p>
@@ -14013,7 +14013,7 @@
         <w:jc w:val="left"/>
       </w:pPr>
       <w:r>
-        <w:t>19. ESP-IDF Programming Guide v5.5.5. Wi-Fi Driver : разделы «ESP32-S3 Wi-Fi Throughput», «Long Range (LR)» / Espressif Systems. – Текст : электронный // GitHub : espressif/esp-idf, docs/en/api-guides/wifi.rst. – URL: https://github.com/espressif/esp-idf/blob/v5.5.5/docs/en/api-guides/wifi.rst (дата обращения: 08.10.2026).</w:t>
+        <w:t>19. Linux kernel source tree : net/wireless/util.c, функция cfg80211_calculate_bitrate_s1g / L. Torvalds [и др.]. – Текст : электронный // GitHub : [сайт]. – URL: https://github.com/torvalds/linux/blob/master/net/wireless/util.c (дата обращения: 08.10.2026).</w:t>
       </w:r>
     </w:p>
     <w:p>
@@ -14022,7 +14022,7 @@
         <w:jc w:val="left"/>
       </w:pPr>
       <w:r>
-        <w:t>20. ESP32-S3 Series Datasheet : version 1.1 / Espressif Systems. – 2022. – Текст : электронный // GitHub : копия в репозитории Xinyuan-LilyGO/T-Display-S3-AMOLED (doc/esp32-s3_datasheet_en.pdf). – URL: https://github.com/Xinyuan-LilyGO/T-Display-S3-AMOLED/blob/main/doc/esp32-s3_datasheet_en.pdf (дата обращения: 08.10.2026).</w:t>
+        <w:t>20. ESP-IDF Programming Guide v5.5.5. Wi-Fi Driver : разделы «ESP32-S3 Wi-Fi Throughput», «Long Range (LR)» / Espressif Systems. – Текст : электронный // GitHub : espressif/esp-idf, docs/en/api-guides/wifi.rst. – URL: https://github.com/espressif/esp-idf/blob/v5.5.5/docs/en/api-guides/wifi.rst (дата обращения: 08.10.2026).</w:t>
       </w:r>
     </w:p>
     <w:p>
@@ -14031,7 +14031,7 @@
         <w:jc w:val="left"/>
       </w:pPr>
       <w:r>
-        <w:t>21. Cattani, M. An Experimental Evaluation of the Reliability of LoRa Long-Range Low-Power Wireless Communication / M. Cattani, C. A. Boano, K. Römer // Journal of Sensor and Actuator Networks. – 2017. – Vol. 6, no. 2. – Art. 7. – DOI 10.3390/jsan6020007. – Текст : электронный.</w:t>
+        <w:t>21. ESP32-S3 Series Datasheet : version 1.1 / Espressif Systems. – 2022. – Текст : электронный // GitHub : копия в репозитории Xinyuan-LilyGO/T-Display-S3-AMOLED (doc/esp32-s3_datasheet_en.pdf). – URL: https://github.com/Xinyuan-LilyGO/T-Display-S3-AMOLED/blob/main/doc/esp32-s3_datasheet_en.pdf (дата обращения: 08.10.2026).</w:t>
       </w:r>
     </w:p>
     <w:p>
@@ -14040,7 +14040,7 @@
         <w:jc w:val="left"/>
       </w:pPr>
       <w:r>
-        <w:t>22. О выделении полос радиочастот устройствам малого радиуса действия : решение ГКРЧ при Мининформсвязи России от 07.05.2007 № 07-20-03-001 (ред. от 24.12.2018). – Текст : электронный // ГАРАНТ.РУ : информационно-правовой портал. – URL: https://base.garant.ru/192210/ (дата обращения: 08.10.2026).</w:t>
+        <w:t>22. Cattani, M. An Experimental Evaluation of the Reliability of LoRa Long-Range Low-Power Wireless Communication / M. Cattani, C. A. Boano, K. Römer // Journal of Sensor and Actuator Networks. – 2017. – Vol. 6, no. 2. – Art. 7. – DOI 10.3390/jsan6020007. – Текст : электронный.</w:t>
       </w:r>
     </w:p>
     <w:p>

</xml_diff>

<commit_message>
Thesis: replace the idealised 19 dB with datasheet-based gains (11.6 dB at low rates, 7.7 dB under RF norms, comparable at 6.5 Mbit/s)
Co-Authored-By: Claude Opus 5.5 <noreply@anthropic.com>
Claude-Session: https://claude.ai/code/session_01F7zWgPWK1QF4RLkRPrjcGv
</commit_message>
<xml_diff>
--- a/docs/vkr/Osnovnaya_chast_HaLow.docx
+++ b/docs/vkr/Osnovnaya_chast_HaLow.docx
@@ -208,7 +208,7 @@
         <w:t xml:space="preserve">Пояснительная записка состоит из введения, пяти глав, заключения и списка использованных источников. В первой главе выполнен сравнительный анализ Wi-Fi HaLow с другими вариантами канала связи с БПЛА, во второй — обоснование эксперимента, его методика, выбор и настройка средств, в третьей приведены результаты серии экспериментов и сравнение с другими протоколами. Четвёртая глава содержит экономическую часть, пятая — раздел охраны труда и окружающей среды. В заключении сформулированы основные результаты и предложения по интеграции разработанных решений в существующие модели БПЛА. </w:t>
       </w:r>
       <w:r>
-        <w:t>Пояснительная записка: 99 с., 9 рис., 33 табл., 71 источн.</w:t>
+        <w:t>Пояснительная записка: 100 с., 9 рис., 33 табл., 71 источн.</w:t>
       </w:r>
     </w:p>
     <w:p>
@@ -575,7 +575,7 @@
     </w:p>
     <w:p>
       <w:r>
-        <w:t>Канал Wi-Fi шириной 20 МГц собирает шум −101,0 дБм, канал Wi-Fi HaLow шириной 2 МГц — −111,0 дБм: ещё 10,0 дБ в пользу узкого канала. Ширина 2 МГц выбрана не произвольно: в Российской Федерации для таких устройств выделены полосы 864–865 и 866–868 МГц [15], и канал шире 2 МГц в них не помещается. Канал 8 МГц, допустимый стандартом, дал бы скорость до четырёх раз выше, но собирал бы на 6,0 дБ больше шума и требовал бы полосы, которой в Российской Федерации нет. При равной мощности и одинаковых антеннах суммарный энергетический выигрыш составляет 19,0 дБ, что в свободном пространстве соответствует увеличению дальности в 8,9 раза. Проектная дальность Wi-Fi HaLow — около 1 км [11, 16]. Производитель радиомодуля платформы указывает для канала 2 МГц при мощности +20 дБм дальность 1200 м со скоростью TCP более 2 Мбит/с в условиях без препятствий [17]. Нормы Российской Федерации ограничивают мощность Wi-Fi HaLow сильнее, чем мощность Wi-Fi 2,4 ГГц (см. «Регулирование»): с учётом этого выигрыш сокращается до 15,1 дБ.</w:t>
+        <w:t>Канал Wi-Fi шириной 20 МГц собирает шум −101,0 дБм, канал Wi-Fi HaLow шириной 2 МГц — −111,0 дБм: ещё 10,0 дБ в пользу узкого канала. Ширина 2 МГц выбрана не произвольно: в Российской Федерации для таких устройств выделены полосы 864–865 и 866–868 МГц [15], и канал шире 2 МГц в них не помещается. Канал 8 МГц, допустимый стандартом, дал бы скорость до четырёх раз выше, но собирал бы на 6,0 дБ больше шума и требовал бы полосы, которой в Российской Федерации нет. Сумма 9,0 + 10,0 = 19,0 дБ — идеализированная оценка: она предполагает одинаковые требования к отношению сигнал/шум, а узкому каналу для той же скорости нужна более сложная модуляция и большее отношение сигнал/шум. По паспортным чувствительностям (см. «Чувствительность») при равной мощности выигрыш Wi-Fi HaLow на малых скоростях (MCS 0, 0,65 Мбит/с, против 802.11b, 1 Мбит/с) составляет 11,6 дБ, а при равной скорости 6,5 Мбит/с (MCS 7 против 802.11n MCS 0) — лишь 3,4 дБ. Проектная дальность Wi-Fi HaLow — около 1 км [11, 16]. Производитель радиомодуля платформы указывает для канала 2 МГц при мощности +20 дБм дальность 1200 м со скоростью TCP более 2 Мбит/с в условиях без препятствий [17]. Нормы Российской Федерации ограничивают мощность Wi-Fi HaLow сильнее, чем мощность Wi-Fi 2,4 ГГц (см. «Регулирование»): с учётом этого выигрыш на малых скоростях сокращается до 7,7 дБ (дальность в свободном пространстве в 2,4 раза больше), а при равной скорости дальности сопоставимы.</w:t>
       </w:r>
     </w:p>
     <w:p>
@@ -1707,7 +1707,7 @@
     </w:p>
     <w:p>
       <w:r>
-        <w:t>2. Wi-Fi HaLow закрывает эту нишу: при равных мощности и антеннах энергетический выигрыш перед Wi-Fi 2,4 ГГц составляет около 19 дБ, с учётом норм мощности Российской Федерации — около 15 дБ; бетонная стена ослабляет сигнал 867 МГц на 6,3 дБ меньше, чем 2,4 ГГц; пропускной способности канала 2 МГц (до 6,5 Мбит/с на физическом уровне) достаточно для видео пониженного разрешения.</w:t>
+        <w:t>2. Wi-Fi HaLow закрывает эту нишу на малых скоростях и за препятствиями: по паспортным чувствительностям при нормах мощности Российской Федерации его запас по затуханию на наименьшей скорости на 7,7 дБ больше, чем у Wi-Fi 2,4 ГГц (дальность в свободном пространстве в 2,4 раза больше), а при равной скорости 6,5 Мбит/с дальности сопоставимы; бетонная стена ослабляет сигнал 867 МГц на 6,3 дБ меньше, чем 2,4 ГГц; пропускной способности канала 2 МГц (до 6,5 Мбит/с на физическом уровне) достаточно для видео пониженного разрешения.</w:t>
       </w:r>
     </w:p>
     <w:p>
@@ -13764,7 +13764,7 @@
     </w:p>
     <w:p>
       <w:r>
-        <w:t>1. Выполнен сравнительный анализ каналов связи с БПЛА: LoRa даёт дальность без скорости, Wi-Fi 2,4/5 ГГц — скорость без дальности. Wi-Fi HaLow закрывает эту нишу: энергетический выигрыш перед Wi-Fi 2,4 ГГц около 19 дБ при равной мощности (около 15 дБ при нормах мощности Российской Федерации), меньшее затухание в препятствиях и пропускная способность, достаточная для видео пониженного разрешения.</w:t>
+        <w:t>1. Выполнен сравнительный анализ каналов связи с БПЛА: LoRa даёт дальность без скорости, Wi-Fi 2,4/5 ГГц — скорость без дальности. Wi-Fi HaLow закрывает эту нишу: по паспортным данным при нормах мощности Российской Федерации запас по затуханию на наименьшей скорости на 7,7 дБ больше, чем у Wi-Fi 2,4 ГГц, меньшее затухание в препятствиях и пропускная способность, достаточная для видео пониженного разрешения; при равной скорости 6,5 Мбит/с дальности сопоставимы.</w:t>
       </w:r>
     </w:p>
     <w:p>

</xml_diff>

<commit_message>
Thesis: no Fresnel zone, n and sigma ranges from channel models, first reason for the experiment merged, ESP32-S3 radio explained, lab-stage conditions clarified, distortion section shortened
Co-Authored-By: Claude Opus 5.5 <noreply@anthropic.com>
Claude-Session: https://claude.ai/code/session_01F7zWgPWK1QF4RLkRPrjcGv
</commit_message>
<xml_diff>
--- a/docs/vkr/Osnovnaya_chast_HaLow.docx
+++ b/docs/vkr/Osnovnaya_chast_HaLow.docx
@@ -208,7 +208,7 @@
         <w:t xml:space="preserve">Пояснительная записка состоит из введения, пяти глав, заключения и списка использованных источников. В первой главе выполнен сравнительный анализ Wi-Fi HaLow с другими вариантами канала связи с БПЛА, во второй — обоснование эксперимента, его методика, выбор и настройка средств, в третьей приведены результаты серии экспериментов и сравнение с другими протоколами. Четвёртая глава содержит экономическую часть, пятая — раздел охраны труда и окружающей среды. В заключении сформулированы основные результаты и предложения по интеграции разработанных решений в существующие модели БПЛА. </w:t>
       </w:r>
       <w:r>
-        <w:t>Пояснительная записка: 100 с., 9 рис., 33 табл., 71 источн.</w:t>
+        <w:t>Пояснительная записка: 100 с., 9 рис., 32 табл., 71 источн.</w:t>
       </w:r>
     </w:p>
     <w:p>
@@ -2203,7 +2203,7 @@
     </w:p>
     <w:p>
       <w:r>
-        <w:t>Показатель n и отклонение σ для конкретной среды заранее неизвестны: это числа, которые определяются только измерением.</w:t>
+        <w:t>Для типовых сред модели каналов дают диапазоны этих величин: n = 2 в свободном пространстве, 2,7–3,5 в городской застройке, 3–5 на затенённых городских трассах [7]; отклонение σ в моделях 3GPP составляет от 3 до 8 дБ в зависимости от сценария и наличия прямой видимости [18]. Какое значение из диапазона соответствует конкретной трассе, устанавливается измерением.</w:t>
       </w:r>
     </w:p>
     <w:p>
@@ -2440,144 +2440,6 @@
       </w:pPr>
       <w:r>
         <w:t>Рисунок 2.1 – Теоретическая зависимость потерь на трассе от расстояния</w:t>
-      </w:r>
-    </w:p>
-    <w:p>
-      <w:r>
-        <w:rPr>
-          <w:b/>
-        </w:rPr>
-        <w:t xml:space="preserve">Зона Френеля. </w:t>
-      </w:r>
-      <w:r>
-        <w:t>Для распространения без дополнительных потерь в прямой видимости должна быть свободна от препятствий первая зона Френеля. Её радиус в середине трассы длиной d</w:t>
-      </w:r>
-    </w:p>
-    <w:tbl>
-      <w:tblPr>
-        <w:tblW w:type="auto" w:w="0"/>
-        <w:jc w:val="center"/>
-        <w:tblLayout w:type="fixed"/>
-        <w:tblLook w:firstColumn="1" w:firstRow="1" w:lastColumn="0" w:lastRow="0" w:noHBand="0" w:noVBand="1" w:val="04A0"/>
-        <w:tblBorders>
-          <w:top w:val="nil"/>
-          <w:left w:val="nil"/>
-          <w:bottom w:val="nil"/>
-          <w:right w:val="nil"/>
-          <w:insideH w:val="nil"/>
-          <w:insideV w:val="nil"/>
-        </w:tblBorders>
-      </w:tblPr>
-      <w:tblGrid>
-        <w:gridCol w:w="1020"/>
-        <w:gridCol w:w="7313"/>
-        <w:gridCol w:w="1020"/>
-      </w:tblGrid>
-      <w:tr>
-        <w:tc>
-          <w:tcPr>
-            <w:tcW w:type="dxa" w:w="1020"/>
-            <w:vAlign w:val="center"/>
-          </w:tcPr>
-          <w:p>
-            <w:pPr>
-              <w:pStyle w:val="Formula"/>
-            </w:pPr>
-          </w:p>
-        </w:tc>
-        <w:tc>
-          <w:tcPr>
-            <w:tcW w:type="dxa" w:w="7313"/>
-            <w:vAlign w:val="center"/>
-          </w:tcPr>
-          <w:p>
-            <w:pPr>
-              <w:pStyle w:val="Formula"/>
-              <w:jc w:val="center"/>
-            </w:pPr>
-            <m:oMath>
-              <m:r>
-                <w:rPr>
-                  <w:rFonts w:ascii="Cambria Math" w:hAnsi="Cambria Math"/>
-                </w:rPr>
-                <m:t xml:space="preserve">r</m:t>
-              </m:r>
-              <m:r>
-                <m:rPr>
-                  <m:sty m:val="p"/>
-                </m:rPr>
-                <w:rPr>
-                  <w:rFonts w:ascii="Cambria Math" w:hAnsi="Cambria Math"/>
-                </w:rPr>
-                <m:t xml:space="preserve"> = </m:t>
-              </m:r>
-              <m:rad>
-                <m:radPr>
-                  <m:degHide m:val="1"/>
-                </m:radPr>
-                <m:deg/>
-                <m:e>
-                  <m:f>
-                    <m:num>
-                      <m:r>
-                        <w:rPr>
-                          <w:rFonts w:ascii="Cambria Math" w:hAnsi="Cambria Math"/>
-                        </w:rPr>
-                        <m:t xml:space="preserve">λ</m:t>
-                      </m:r>
-                      <m:r>
-                        <w:rPr>
-                          <w:rFonts w:ascii="Cambria Math" w:hAnsi="Cambria Math"/>
-                        </w:rPr>
-                        <m:t xml:space="preserve">d</m:t>
-                      </m:r>
-                    </m:num>
-                    <m:den>
-                      <m:r>
-                        <m:rPr>
-                          <m:sty m:val="p"/>
-                        </m:rPr>
-                        <w:rPr>
-                          <w:rFonts w:ascii="Cambria Math" w:hAnsi="Cambria Math"/>
-                        </w:rPr>
-                        <m:t xml:space="preserve">4</m:t>
-                      </m:r>
-                    </m:den>
-                  </m:f>
-                </m:e>
-              </m:rad>
-              <m:r>
-                <m:rPr>
-                  <m:sty m:val="p"/>
-                </m:rPr>
-                <w:rPr>
-                  <w:rFonts w:ascii="Cambria Math" w:hAnsi="Cambria Math"/>
-                </w:rPr>
-                <m:t xml:space="preserve">,</m:t>
-              </m:r>
-            </m:oMath>
-          </w:p>
-        </w:tc>
-        <w:tc>
-          <w:tcPr>
-            <w:tcW w:type="dxa" w:w="1020"/>
-            <w:vAlign w:val="center"/>
-          </w:tcPr>
-          <w:p>
-            <w:pPr>
-              <w:pStyle w:val="Formula"/>
-              <w:jc w:val="right"/>
-            </w:pPr>
-            <w:r>
-              <w:t>(2.4)</w:t>
-            </w:r>
-          </w:p>
-        </w:tc>
-      </w:tr>
-    </w:tbl>
-    <w:p>
-      <w:r>
-        <w:t>на трассе 1 км составляет 9,3 м на частоте 867 МГц и 5,5 м на частоте 2437 МГц. Длинная волна Wi-Fi HaLow требует большего просвета: при антеннах на высоте 1,5 м земля перекрывает зону Френеля уже на сотнях метров — это второе объяснение, почему наземные испытания пессимистичнее полёта.</w:t>
       </w:r>
     </w:p>
     <w:p>
@@ -2742,7 +2604,7 @@
               <w:jc w:val="right"/>
             </w:pPr>
             <w:r>
-              <w:t>(2.5)</w:t>
+              <w:t>(2.4)</w:t>
             </w:r>
           </w:p>
         </w:tc>
@@ -3906,7 +3768,7 @@
               <w:jc w:val="right"/>
             </w:pPr>
             <w:r>
-              <w:t>(2.6)</w:t>
+              <w:t>(2.5)</w:t>
             </w:r>
           </w:p>
         </w:tc>
@@ -4110,7 +3972,7 @@
               <w:jc w:val="right"/>
             </w:pPr>
             <w:r>
-              <w:t>(2.7)</w:t>
+              <w:t>(2.6)</w:t>
             </w:r>
           </w:p>
         </w:tc>
@@ -4139,7 +4001,7 @@
     </w:p>
     <w:p>
       <w:r>
-        <w:t xml:space="preserve">Теоретическая оценка раздела 2.1 в работе выполняется и используется: по ней оценивается дальность, выбираются условия сопоставления с опубликованными натурными данными (высота антенн, просвет первой зоны Френеля), относительно неё выражаются результаты. Заменить эксперимент она, однако, не может. Теория задаёт форму зависимостей, эксперимент даёт её параметры и проверяет допущения. Необходимость эксперимента следует из шести обстоятельств, и каждое подтвердилось на испытаниях стенда (глава 3). Сводка расхождений приведена в таблице </w:t>
+        <w:t xml:space="preserve">Теоретическая оценка раздела 2.1 в работе выполняется и используется: по ней оценивается дальность, выбираются условия сопоставления с опубликованными натурными данными (высота антенн), относительно неё выражаются результаты. Заменить эксперимент она, однако, не может. Теория задаёт форму зависимостей, эксперимент даёт её параметры и проверяет допущения. Необходимость эксперимента следует из шести обстоятельств, и каждое подтвердилось на испытаниях стенда (глава 3). Сводка расхождений приведена в таблице </w:t>
       </w:r>
       <w:r>
         <w:t>2.2</w:t>
@@ -4670,12 +4532,7 @@
     </w:p>
     <w:p>
       <w:r>
-        <w:t>Во-первых, эмпирические коэффициенты моделей — показатель затухания n и разброс σ в формуле (2.2) — для конкретной среды неизвестны и определяются только измерением. От них зависит результат: при n = 3 вместо 2 потери на 1 км вырастают на 30 дБ (при d₀ = 1 м).</w:t>
-      </w:r>
-    </w:p>
-    <w:p>
-      <w:r>
-        <w:t>Модели с коэффициентами, измеренными в других условиях, существуют: от таблиц показателя затухания для типовых сред [7] до моделей потерь, предложенных для IEEE 802.11ah на частоте 900 МГц [26]. Измерения они не отменяют по трём причинам. Первая — коэффициенты опубликованы диапазонами, а не значениями: для городской застройки n = 2,7–3,5 [7], и при одних и тех же допустимых потерях (80 дБ сверх потерь на опорном расстоянии 1 м) дальность составит около 920 м при n = 2,7 и около 190 м при n = 3,5. Вторая — каждая модель выведена для своей геометрии. Модели для IEEE 802.11ah предполагают антенну точки доступа на 15 м выше крыш (L = 8 + 37,6 lg d) или на уровне крыш (L = 23,3 + 36,7 lg d), d в метрах [26]. На 1 км они дают 121 и 133 дБ — 12 дБ расхождения между двумя моделями для одной технологии, а свободное пространство — 91 дБ. Для антенн на высоте 1,5 м над землёй ни одна из них не выводилась. Третья — даже подходящая модель даёт среднее значение с разбросом σ, то есть сама признаёт, что значение для конкретной трассы не предсказывает. Поэтому опубликованные модели служат в работе эталоном для сравнения, а какая из них описывает конкретную трассу и с каким разбросом, устанавливает измерение.</w:t>
+        <w:t>Во-первых, модели каналов задают коэффициенты диапазонами и для своей геометрии. Для городской застройки n = 2,7–3,5 [7], и при одних и тех же допустимых потерях (80 дБ сверх потерь на опорном расстоянии 1 м) дальность составит около 920 м при n = 2,7 и около 190 м при n = 3,5. Модели потерь, предложенные для IEEE 802.11ah на частоте 900 МГц, предполагают антенну точки доступа на 15 м выше крыш (L = 8 + 37,6 lg d) или на уровне крыш (L = 23,3 + 36,7 lg d), d в метрах [26]. На 1 км они дают 121 и 133 дБ — 12 дБ расхождения между двумя моделями для одной технологии, а свободное пространство — 91 дБ. Для антенн на высоте 1,5 м над землёй ни одна из них не выводилась. Поэтому опубликованные модели служат в работе эталоном для сравнения, а какое значение из диапазона соответствует трассе, устанавливает измерение.</w:t>
       </w:r>
     </w:p>
     <w:p>
@@ -5334,7 +5191,7 @@
               <w:jc w:val="right"/>
             </w:pPr>
             <w:r>
-              <w:t>(2.8)</w:t>
+              <w:t>(2.7)</w:t>
             </w:r>
           </w:p>
         </w:tc>
@@ -5476,7 +5333,7 @@
               <w:jc w:val="right"/>
             </w:pPr>
             <w:r>
-              <w:t>(2.9)</w:t>
+              <w:t>(2.8)</w:t>
             </w:r>
           </w:p>
         </w:tc>
@@ -5495,7 +5352,7 @@
     </w:p>
     <w:p>
       <w:r>
-        <w:t>Интервал характеризует точность оценки среднего, а не разброс отдельных замеров; его ширина убывает как 1/√n. На границе дальности распределение показателей несимметрично, и вместо среднего используется доля успешных передач (например, «связь установилась в 6 попытках из 10»).</w:t>
+        <w:t>Интервал характеризует точность оценки среднего, а не разброс отдельных замеров; его ширина убывает как 1/√n.</w:t>
       </w:r>
     </w:p>
     <w:p>
@@ -5973,7 +5830,7 @@
     </w:p>
     <w:p>
       <w:r>
-        <w:t>Встроенный радиотракт Wi-Fi 2,4 ГГц процессора ESP32-S3 даёт второй радиоканал на той же плате, то есть платформа пригодна для сравнения Wi-Fi HaLow с IEEE 802.11 на идентичной аппаратной части. В работе это сравнение выполнено по расчёту и опубликованным данным (раздел 3.7).</w:t>
+        <w:t>Микроконтроллер ESP32-S3 — система на кристалле: помимо процессорных ядер он содержит приёмопередатчик Wi-Fi 2,4 ГГц (IEEE 802.11b/g/n) и Bluetooth LE [21]. Поэтому на той же плате есть второй радиоканал, не зависящий от модуля TX-AH, и платформа пригодна для сравнения Wi-Fi HaLow с IEEE 802.11 на идентичной аппаратной части. В работе это сравнение выполнено по расчёту и опубликованным данным (раздел 3.7).</w:t>
       </w:r>
     </w:p>
     <w:p>
@@ -6183,7 +6040,7 @@
         <w:t xml:space="preserve">Лабораторный этап (до 28.09). </w:t>
       </w:r>
       <w:r>
-        <w:t>Платы располагались в помещении на расстоянии до 5 м. Канал — заводской, шириной 4 МГц с центром 866,0 МГц, мощность передатчика до 20 дБм; оба параметра выходят за рамки решений ГКРЧ [15, 23], и эти условия рассматриваются только как лабораторные. Камера снимала видеокадры 240 × 176 точек, сжатие JPEG с качеством 60. На таком расстоянии приёмник перегружен: при мощности 20 дБм уровень на его входе составлял около 0 дБм при рабочем диапазоне −60…−90 дБм. Поэтому результаты этапа характеризуют платформу, а не канал.</w:t>
+        <w:t>Платы располагались в помещении на расстоянии до 5 м. Канал — заводской, шириной 4 МГц с центром 866,0 МГц, мощность передатчика до 20 дБм; оба параметра выходят за рамки решений ГКРЧ [15, 23], и эти условия рассматриваются только как лабораторные. Камера снимала видеокадры 240 × 176 точек, качество сжатия JPEG было постоянным — 60 (автоматическое управление качеством введено 06.10). При мощности 20 дБм на расстоянии до 5 м сигнал на входе приёмника был заведомо сильным — модуль сообщал уровень до −5 дБм, поэтому результаты этапа характеризуют платформу, а не дальность.</w:t>
       </w:r>
     </w:p>
     <w:p>
@@ -8899,7 +8756,7 @@
         <w:t xml:space="preserve">Механизм. </w:t>
       </w:r>
       <w:r>
-        <w:t>Часть видеокадров приходила с характерными цветными полосами. Анализ несжатых видеокадров, сохранённых до кодирования, показал, что искажение возникает ещё до сжатия: в потоке RGB565 с некоторого смещения теряется один байт, после чего до конца видеокадра старший и младший байты точек меняются ролями. Строки при этом целы, поэтому проверки на разрывы искажения не обнаруживали.</w:t>
+        <w:t>Часть видеокадров приходила с цветными полосами («радугой») при целой доставке: контрольные суммы фрагментов и всего видеокадра сходились. Чтобы найти место искажения, несжатые видеокадры выгружались по USB до кодирования и разбирались на компьютере (24–26.09). Оказалось, что искажение возникает ещё до сжатия: в потоке RGB565 с некоторого смещения теряется один байт, после чего до конца видеокадра старший и младший байты точек меняются ролями; при чтении со сдвигом на один байт картинка восстанавливается. Причину потери байта установил опыт с мощностью передатчика (ниже).</w:t>
       </w:r>
     </w:p>
     <w:p>
@@ -8910,12 +8767,7 @@
         <w:t xml:space="preserve">Программное исправление. </w:t>
       </w:r>
       <w:r>
-        <w:t>Для каждой строки сравниваются две величины одного и того же участка: средняя разность соседних точек при обычном чтении и при чтении со сдвигом на один байт. В целой части видеокадра обычное чтение даёт более гладкую картину, в сдвинутой — наоборот. Мерой повреждения служит число строк, уверенно читающихся со сдвигом. Место потери находится делением пополам с последующим уточнением, туда вставляется один байт. Вставка принимается, только если число сдвинутых строк уменьшилось и видеокадр в целом не стал грубее; иначе выполняется точный откат, для которого достаточно сохранить один вытесненный байт.</w:t>
-      </w:r>
-    </w:p>
-    <w:p>
-      <w:r>
-        <w:t>Сравнение двух чтений одного участка не требует порогов, поэтому контрастный сюжет, повышающий обе величины одновременно, решения не меняет. Две предыдущие версии алгоритма с абсолютным порогом портили здоровые видеокадры именно на контрастных сюжетах.</w:t>
+        <w:t>Для каждой строки видеокадра сравнивается гладкость изображения при обычном чтении и при чтении со сдвигом на один байт; место потери находится делением пополам, и туда вставляется один байт. В контрольном опыте (26.09, лабораторный этап) исправление снизило долю повреждённых видеокадров с 46,1 до 8,9 % и почти вдвое увеличило число целых видеокадров в секунду — 14,8 против 8,1.</w:t>
       </w:r>
     </w:p>
     <w:p>
@@ -8923,21 +8775,16 @@
         <w:rPr>
           <w:b/>
         </w:rPr>
-        <w:t xml:space="preserve">Проверка. </w:t>
-      </w:r>
-      <w:r>
-        <w:t>Алгоритм проверен на 30 сохранённых видеокадрах прошлых опытов по независимой метрике — вертикальной гладкости, которую алгоритм не оптимизирует: 16 целых видеокадров не изменены ни одним байтом, 12 исправлены полностью (например, вертикальная разность 25,05 → 4,81), 2 многократно повреждённых улучшены, испорченных нет. Отдельная проверочная программа, буквально повторяющая функции встроенной программы, выявила в реализации ошибку порядка байтов, при которой 20 видеокадров из 30 портились, — до установки на плату.</w:t>
-      </w:r>
-    </w:p>
-    <w:p>
-      <w:r>
-        <w:t xml:space="preserve">Контрольный опыт с отключённым исправлением на том же сюжете (26.09, лабораторный этап; таблица </w:t>
+        <w:t xml:space="preserve">Причина. </w:t>
+      </w:r>
+      <w:r>
+        <w:t xml:space="preserve">Качество захвата менялось от включения к включению без видимой причины. Сравнение двух опытов, различающихся только мощностью передатчика, установило причину (таблица </w:t>
       </w:r>
       <w:r>
         <w:t>3.6</w:t>
       </w:r>
       <w:r>
-        <w:t>) показал, что исправление даёт ту же картинку при меньшем на 25 % видеокадре и почти вдвое большем числе целых видеокадров. Дополнительное время на исправление (9 мс на видеокадр) полностью возвращается за счёт более короткой передачи.</w:t>
+        <w:t>). Опыты выполнены на лабораторном этапе: помещение, расстояние до 5 м, канал 4 МГц на 866 МГц, мощность 20 дБм — вне рамок решения ГКРЧ.</w:t>
       </w:r>
     </w:p>
     <w:p>
@@ -8946,7 +8793,7 @@
         <w:ind w:firstLine="0"/>
       </w:pPr>
       <w:r>
-        <w:t>Таблица 3.6 – Контрольный опыт: исправление видеокадров включено и выключено (лабораторный этап)</w:t>
+        <w:t>Таблица 3.6 – Влияние мощности передатчика на захват изображения (лабораторный этап, 26.09, автоподстройка мощности выключена)</w:t>
       </w:r>
     </w:p>
     <w:tbl>
@@ -9007,7 +8854,7 @@
                 <w:b/>
                 <w:sz w:val="22"/>
               </w:rPr>
-              <w:t>Исправление включено</w:t>
+              <w:t>1 дБм</w:t>
             </w:r>
           </w:p>
         </w:tc>
@@ -9027,7 +8874,7 @@
                 <w:b/>
                 <w:sz w:val="22"/>
               </w:rPr>
-              <w:t>Исправление выключено</w:t>
+              <w:t>20 дБм</w:t>
             </w:r>
           </w:p>
         </w:tc>
@@ -9051,7 +8898,7 @@
               <w:rPr>
                 <w:sz w:val="22"/>
               </w:rPr>
-              <w:t>Размер видеокадра, Б</w:t>
+              <w:t>Доля повреждённых видеокадров, %</w:t>
             </w:r>
           </w:p>
         </w:tc>
@@ -9070,7 +8917,7 @@
               <w:rPr>
                 <w:sz w:val="22"/>
               </w:rPr>
-              <w:t>5032</w:t>
+              <w:t>0,0 (0 из 720)</w:t>
             </w:r>
           </w:p>
         </w:tc>
@@ -9089,7 +8936,7 @@
               <w:rPr>
                 <w:sz w:val="22"/>
               </w:rPr>
-              <w:t>6750</w:t>
+              <w:t>44,4 (512 из 1151)</w:t>
             </w:r>
           </w:p>
         </w:tc>
@@ -9113,7 +8960,7 @@
               <w:rPr>
                 <w:sz w:val="22"/>
               </w:rPr>
-              <w:t>Доля повреждённых видеокадров, %</w:t>
+              <w:t>Размер видеокадра, Б</w:t>
             </w:r>
           </w:p>
         </w:tc>
@@ -9132,7 +8979,7 @@
               <w:rPr>
                 <w:sz w:val="22"/>
               </w:rPr>
-              <w:t>8,9</w:t>
+              <w:t>4163</w:t>
             </w:r>
           </w:p>
         </w:tc>
@@ -9151,7 +8998,7 @@
               <w:rPr>
                 <w:sz w:val="22"/>
               </w:rPr>
-              <w:t>46,1</w:t>
+              <w:t>7089</w:t>
             </w:r>
           </w:p>
         </w:tc>
@@ -9194,7 +9041,7 @@
               <w:rPr>
                 <w:sz w:val="22"/>
               </w:rPr>
-              <w:t>16,2</w:t>
+              <w:t>19,8</w:t>
             </w:r>
           </w:p>
         </w:tc>
@@ -9213,7 +9060,7 @@
               <w:rPr>
                 <w:sz w:val="22"/>
               </w:rPr>
-              <w:t>15,0</w:t>
+              <w:t>12,8</w:t>
             </w:r>
           </w:p>
         </w:tc>
@@ -9230,14 +9077,13 @@
           <w:p>
             <w:pPr>
               <w:pStyle w:val="TableText"/>
-              <w:keepNext/>
               <w:jc w:val="left"/>
             </w:pPr>
             <w:r>
               <w:rPr>
                 <w:sz w:val="22"/>
               </w:rPr>
-              <w:t>Целых видеокадров в секунду</w:t>
+              <w:t>Время передачи видеокадра по UART, мс</w:t>
             </w:r>
           </w:p>
         </w:tc>
@@ -9249,14 +9095,13 @@
           <w:p>
             <w:pPr>
               <w:pStyle w:val="TableText"/>
-              <w:keepNext/>
               <w:jc w:val="center"/>
             </w:pPr>
             <w:r>
               <w:rPr>
                 <w:sz w:val="22"/>
               </w:rPr>
-              <w:t>14,8</w:t>
+              <w:t>38</w:t>
             </w:r>
           </w:p>
         </w:tc>
@@ -9268,135 +9113,13 @@
           <w:p>
             <w:pPr>
               <w:pStyle w:val="TableText"/>
-              <w:keepNext/>
               <w:jc w:val="center"/>
             </w:pPr>
             <w:r>
               <w:rPr>
                 <w:sz w:val="22"/>
               </w:rPr>
-              <w:t>8,1</w:t>
-            </w:r>
-          </w:p>
-        </w:tc>
-      </w:tr>
-      <w:tr>
-        <w:trPr>
-          <w:cantSplit/>
-        </w:trPr>
-        <w:tc>
-          <w:tcPr>
-            <w:tcW w:type="dxa" w:w="4252"/>
-            <w:vAlign w:val="center"/>
-          </w:tcPr>
-          <w:p>
-            <w:pPr>
-              <w:pStyle w:val="TableText"/>
-              <w:keepNext/>
-              <w:jc w:val="left"/>
-            </w:pPr>
-            <w:r>
-              <w:rPr>
-                <w:sz w:val="22"/>
-              </w:rPr>
-              <w:t>Пропускная способность, кбит/с</w:t>
-            </w:r>
-          </w:p>
-        </w:tc>
-        <w:tc>
-          <w:tcPr>
-            <w:tcW w:type="dxa" w:w="2551"/>
-            <w:vAlign w:val="center"/>
-          </w:tcPr>
-          <w:p>
-            <w:pPr>
-              <w:pStyle w:val="TableText"/>
-              <w:keepNext/>
-              <w:jc w:val="center"/>
-            </w:pPr>
-            <w:r>
-              <w:rPr>
-                <w:sz w:val="22"/>
-              </w:rPr>
-              <w:t>729</w:t>
-            </w:r>
-          </w:p>
-        </w:tc>
-        <w:tc>
-          <w:tcPr>
-            <w:tcW w:type="dxa" w:w="2551"/>
-            <w:vAlign w:val="center"/>
-          </w:tcPr>
-          <w:p>
-            <w:pPr>
-              <w:pStyle w:val="TableText"/>
-              <w:keepNext/>
-              <w:jc w:val="center"/>
-            </w:pPr>
-            <w:r>
-              <w:rPr>
-                <w:sz w:val="22"/>
-              </w:rPr>
-              <w:t>902</w:t>
-            </w:r>
-          </w:p>
-        </w:tc>
-      </w:tr>
-      <w:tr>
-        <w:trPr>
-          <w:cantSplit/>
-        </w:trPr>
-        <w:tc>
-          <w:tcPr>
-            <w:tcW w:type="dxa" w:w="4252"/>
-            <w:vAlign w:val="center"/>
-          </w:tcPr>
-          <w:p>
-            <w:pPr>
-              <w:pStyle w:val="TableText"/>
-              <w:jc w:val="left"/>
-            </w:pPr>
-            <w:r>
-              <w:rPr>
-                <w:sz w:val="22"/>
-              </w:rPr>
-              <w:t>Потери фрагментов, %</w:t>
-            </w:r>
-          </w:p>
-        </w:tc>
-        <w:tc>
-          <w:tcPr>
-            <w:tcW w:type="dxa" w:w="2551"/>
-            <w:vAlign w:val="center"/>
-          </w:tcPr>
-          <w:p>
-            <w:pPr>
-              <w:pStyle w:val="TableText"/>
-              <w:jc w:val="center"/>
-            </w:pPr>
-            <w:r>
-              <w:rPr>
-                <w:sz w:val="22"/>
-              </w:rPr>
-              <w:t>2,16</w:t>
-            </w:r>
-          </w:p>
-        </w:tc>
-        <w:tc>
-          <w:tcPr>
-            <w:tcW w:type="dxa" w:w="2551"/>
-            <w:vAlign w:val="center"/>
-          </w:tcPr>
-          <w:p>
-            <w:pPr>
-              <w:pStyle w:val="TableText"/>
-              <w:jc w:val="center"/>
-            </w:pPr>
-            <w:r>
-              <w:rPr>
-                <w:sz w:val="22"/>
-              </w:rPr>
-              <w:t>2,02</w:t>
+              <w:t>76</w:t>
             </w:r>
           </w:p>
         </w:tc>
@@ -9409,371 +9132,6 @@
     </w:p>
     <w:p>
       <w:r>
-        <w:t>Строка «пропускная способность» иллюстрирует положение методики из раздела 2.4: без исправления поток в байтах выше, но это раздутые повреждением видеокадры, а не полезная информация.</w:t>
-      </w:r>
-    </w:p>
-    <w:p>
-      <w:r>
-        <w:rPr>
-          <w:b/>
-        </w:rPr>
-        <w:t xml:space="preserve">Причина. </w:t>
-      </w:r>
-      <w:r>
-        <w:t xml:space="preserve">Качество захвата менялось от включения к включению без видимой причины. Сравнение двух опытов, различающихся только мощностью передатчика, установило причину (таблица </w:t>
-      </w:r>
-      <w:r>
-        <w:t>3.7</w:t>
-      </w:r>
-      <w:r>
-        <w:t>). Опыты выполнены на лабораторном этапе: помещение, расстояние до 5 м, канал 4 МГц на 866 МГц, мощность 20 дБм — вне рамок решения ГКРЧ.</w:t>
-      </w:r>
-    </w:p>
-    <w:p>
-      <w:pPr>
-        <w:pStyle w:val="TableCaption"/>
-        <w:ind w:firstLine="0"/>
-      </w:pPr>
-      <w:r>
-        <w:t>Таблица 3.7 – Влияние мощности передатчика на захват изображения (лабораторный этап, 26.09, автоподстройка мощности выключена)</w:t>
-      </w:r>
-    </w:p>
-    <w:tbl>
-      <w:tblPr>
-        <w:tblStyle w:val="TableGrid"/>
-        <w:tblW w:type="auto" w:w="0"/>
-        <w:jc w:val="center"/>
-        <w:tblLayout w:type="fixed"/>
-        <w:tblLook w:firstColumn="1" w:firstRow="1" w:lastColumn="0" w:lastRow="0" w:noHBand="0" w:noVBand="1" w:val="04A0"/>
-        <w:tblCellMar>
-          <w:left w:w="57" w:type="dxa"/>
-          <w:right w:w="57" w:type="dxa"/>
-        </w:tblCellMar>
-      </w:tblPr>
-      <w:tblGrid>
-        <w:gridCol w:w="4251"/>
-        <w:gridCol w:w="2551"/>
-        <w:gridCol w:w="2551"/>
-      </w:tblGrid>
-      <w:tr>
-        <w:trPr>
-          <w:cantSplit/>
-          <w:tblHeader w:val="true"/>
-        </w:trPr>
-        <w:tc>
-          <w:tcPr>
-            <w:tcW w:type="dxa" w:w="4252"/>
-            <w:vAlign w:val="center"/>
-          </w:tcPr>
-          <w:p>
-            <w:pPr>
-              <w:pStyle w:val="TableText"/>
-              <w:keepNext/>
-              <w:jc w:val="center"/>
-            </w:pPr>
-            <w:r>
-              <w:rPr>
-                <w:b/>
-                <w:sz w:val="22"/>
-              </w:rPr>
-              <w:t>Показатель</w:t>
-            </w:r>
-          </w:p>
-        </w:tc>
-        <w:tc>
-          <w:tcPr>
-            <w:tcW w:type="dxa" w:w="2551"/>
-            <w:vAlign w:val="center"/>
-          </w:tcPr>
-          <w:p>
-            <w:pPr>
-              <w:pStyle w:val="TableText"/>
-              <w:keepNext/>
-              <w:jc w:val="center"/>
-            </w:pPr>
-            <w:r>
-              <w:rPr>
-                <w:b/>
-                <w:sz w:val="22"/>
-              </w:rPr>
-              <w:t>1 дБм</w:t>
-            </w:r>
-          </w:p>
-        </w:tc>
-        <w:tc>
-          <w:tcPr>
-            <w:tcW w:type="dxa" w:w="2551"/>
-            <w:vAlign w:val="center"/>
-          </w:tcPr>
-          <w:p>
-            <w:pPr>
-              <w:pStyle w:val="TableText"/>
-              <w:keepNext/>
-              <w:jc w:val="center"/>
-            </w:pPr>
-            <w:r>
-              <w:rPr>
-                <w:b/>
-                <w:sz w:val="22"/>
-              </w:rPr>
-              <w:t>20 дБм</w:t>
-            </w:r>
-          </w:p>
-        </w:tc>
-      </w:tr>
-      <w:tr>
-        <w:trPr>
-          <w:cantSplit/>
-        </w:trPr>
-        <w:tc>
-          <w:tcPr>
-            <w:tcW w:type="dxa" w:w="4252"/>
-            <w:vAlign w:val="center"/>
-          </w:tcPr>
-          <w:p>
-            <w:pPr>
-              <w:pStyle w:val="TableText"/>
-              <w:keepNext/>
-              <w:jc w:val="left"/>
-            </w:pPr>
-            <w:r>
-              <w:rPr>
-                <w:sz w:val="22"/>
-              </w:rPr>
-              <w:t>Доля повреждённых видеокадров, %</w:t>
-            </w:r>
-          </w:p>
-        </w:tc>
-        <w:tc>
-          <w:tcPr>
-            <w:tcW w:type="dxa" w:w="2551"/>
-            <w:vAlign w:val="center"/>
-          </w:tcPr>
-          <w:p>
-            <w:pPr>
-              <w:pStyle w:val="TableText"/>
-              <w:keepNext/>
-              <w:jc w:val="center"/>
-            </w:pPr>
-            <w:r>
-              <w:rPr>
-                <w:sz w:val="22"/>
-              </w:rPr>
-              <w:t>0,0 (0 из 720)</w:t>
-            </w:r>
-          </w:p>
-        </w:tc>
-        <w:tc>
-          <w:tcPr>
-            <w:tcW w:type="dxa" w:w="2551"/>
-            <w:vAlign w:val="center"/>
-          </w:tcPr>
-          <w:p>
-            <w:pPr>
-              <w:pStyle w:val="TableText"/>
-              <w:keepNext/>
-              <w:jc w:val="center"/>
-            </w:pPr>
-            <w:r>
-              <w:rPr>
-                <w:sz w:val="22"/>
-              </w:rPr>
-              <w:t>44,4 (512 из 1151)</w:t>
-            </w:r>
-          </w:p>
-        </w:tc>
-      </w:tr>
-      <w:tr>
-        <w:trPr>
-          <w:cantSplit/>
-        </w:trPr>
-        <w:tc>
-          <w:tcPr>
-            <w:tcW w:type="dxa" w:w="4252"/>
-            <w:vAlign w:val="center"/>
-          </w:tcPr>
-          <w:p>
-            <w:pPr>
-              <w:pStyle w:val="TableText"/>
-              <w:keepNext/>
-              <w:jc w:val="left"/>
-            </w:pPr>
-            <w:r>
-              <w:rPr>
-                <w:sz w:val="22"/>
-              </w:rPr>
-              <w:t>Размер видеокадра, Б</w:t>
-            </w:r>
-          </w:p>
-        </w:tc>
-        <w:tc>
-          <w:tcPr>
-            <w:tcW w:type="dxa" w:w="2551"/>
-            <w:vAlign w:val="center"/>
-          </w:tcPr>
-          <w:p>
-            <w:pPr>
-              <w:pStyle w:val="TableText"/>
-              <w:keepNext/>
-              <w:jc w:val="center"/>
-            </w:pPr>
-            <w:r>
-              <w:rPr>
-                <w:sz w:val="22"/>
-              </w:rPr>
-              <w:t>4163</w:t>
-            </w:r>
-          </w:p>
-        </w:tc>
-        <w:tc>
-          <w:tcPr>
-            <w:tcW w:type="dxa" w:w="2551"/>
-            <w:vAlign w:val="center"/>
-          </w:tcPr>
-          <w:p>
-            <w:pPr>
-              <w:pStyle w:val="TableText"/>
-              <w:keepNext/>
-              <w:jc w:val="center"/>
-            </w:pPr>
-            <w:r>
-              <w:rPr>
-                <w:sz w:val="22"/>
-              </w:rPr>
-              <w:t>7089</w:t>
-            </w:r>
-          </w:p>
-        </w:tc>
-      </w:tr>
-      <w:tr>
-        <w:trPr>
-          <w:cantSplit/>
-        </w:trPr>
-        <w:tc>
-          <w:tcPr>
-            <w:tcW w:type="dxa" w:w="4252"/>
-            <w:vAlign w:val="center"/>
-          </w:tcPr>
-          <w:p>
-            <w:pPr>
-              <w:pStyle w:val="TableText"/>
-              <w:keepNext/>
-              <w:jc w:val="left"/>
-            </w:pPr>
-            <w:r>
-              <w:rPr>
-                <w:sz w:val="22"/>
-              </w:rPr>
-              <w:t>Видеокадров в секунду на приёмнике</w:t>
-            </w:r>
-          </w:p>
-        </w:tc>
-        <w:tc>
-          <w:tcPr>
-            <w:tcW w:type="dxa" w:w="2551"/>
-            <w:vAlign w:val="center"/>
-          </w:tcPr>
-          <w:p>
-            <w:pPr>
-              <w:pStyle w:val="TableText"/>
-              <w:keepNext/>
-              <w:jc w:val="center"/>
-            </w:pPr>
-            <w:r>
-              <w:rPr>
-                <w:sz w:val="22"/>
-              </w:rPr>
-              <w:t>19,8</w:t>
-            </w:r>
-          </w:p>
-        </w:tc>
-        <w:tc>
-          <w:tcPr>
-            <w:tcW w:type="dxa" w:w="2551"/>
-            <w:vAlign w:val="center"/>
-          </w:tcPr>
-          <w:p>
-            <w:pPr>
-              <w:pStyle w:val="TableText"/>
-              <w:keepNext/>
-              <w:jc w:val="center"/>
-            </w:pPr>
-            <w:r>
-              <w:rPr>
-                <w:sz w:val="22"/>
-              </w:rPr>
-              <w:t>12,8</w:t>
-            </w:r>
-          </w:p>
-        </w:tc>
-      </w:tr>
-      <w:tr>
-        <w:trPr>
-          <w:cantSplit/>
-        </w:trPr>
-        <w:tc>
-          <w:tcPr>
-            <w:tcW w:type="dxa" w:w="4252"/>
-            <w:vAlign w:val="center"/>
-          </w:tcPr>
-          <w:p>
-            <w:pPr>
-              <w:pStyle w:val="TableText"/>
-              <w:jc w:val="left"/>
-            </w:pPr>
-            <w:r>
-              <w:rPr>
-                <w:sz w:val="22"/>
-              </w:rPr>
-              <w:t>Время передачи видеокадра по UART, мс</w:t>
-            </w:r>
-          </w:p>
-        </w:tc>
-        <w:tc>
-          <w:tcPr>
-            <w:tcW w:type="dxa" w:w="2551"/>
-            <w:vAlign w:val="center"/>
-          </w:tcPr>
-          <w:p>
-            <w:pPr>
-              <w:pStyle w:val="TableText"/>
-              <w:jc w:val="center"/>
-            </w:pPr>
-            <w:r>
-              <w:rPr>
-                <w:sz w:val="22"/>
-              </w:rPr>
-              <w:t>38</w:t>
-            </w:r>
-          </w:p>
-        </w:tc>
-        <w:tc>
-          <w:tcPr>
-            <w:tcW w:type="dxa" w:w="2551"/>
-            <w:vAlign w:val="center"/>
-          </w:tcPr>
-          <w:p>
-            <w:pPr>
-              <w:pStyle w:val="TableText"/>
-              <w:jc w:val="center"/>
-            </w:pPr>
-            <w:r>
-              <w:rPr>
-                <w:sz w:val="22"/>
-              </w:rPr>
-              <w:t>76</w:t>
-            </w:r>
-          </w:p>
-        </w:tc>
-      </w:tr>
-    </w:tbl>
-    <w:p>
-      <w:pPr>
-        <w:spacing w:line="240" w:lineRule="auto"/>
-      </w:pPr>
-    </w:p>
-    <w:p>
-      <w:r>
         <w:t>Повреждения захвата вызваны наводкой собственного передатчика: антенна модуля находится в нескольких сантиметрах от шлейфа камеры, и излучение сбивает тактирование линий DVP. Опыт с попеременными пятисекундными фазами передачи и тишины подтвердил, что сдвиг возникает только во время излучения (28.09). Эффект сохраняется и в разрешённых пределах мощности: на трассе 5 м доля искажённых видеокадров при 240 × 176 составила около 15 % при 12 дБм и около 60 % при 14 дБм, при 320 × 240 — 40–60 % уже при 10 дБм (29.09). Для БПЛА из этого следует важный вывод: на границе дальности передатчик работает с максимальной мощностью, и именно там наводка на камеру сильнее всего, поэтому захват должен выдерживать максимальную мощность системы.</w:t>
       </w:r>
     </w:p>
@@ -9828,7 +9186,7 @@
         <w:t xml:space="preserve">Мощность и качество канала на малом расстоянии. </w:t>
       </w:r>
       <w:r>
-        <w:t>В паре опытов таблицы 3.7 (лабораторный этап) PER по статистике модуля составил в среднем 38,3 % при 1 дБм и 43,1 % при 20 дБм, а потери фрагментов на приёмнике — 0,83 и 0,25 % соответственно: снижение мощности немного уменьшило PER, но не уменьшило потери; более раннее наблюдение на расстоянии 2 м давало снижение PER с 52 до 38 %. В разрешённой конфигурации большая мощность также не ускоряет канал: на трассе 5 м при постоянной мощности 14 дБм синтетический поток составил 763 кбит/с против 987 кбит/с с регулятором (1 дБм), а видео — 313 против 734 кбит/с из-за пауз съёмки (29.09). Повышение мощности приёмника до 14 дБм улучшило показатели лишь на величину порядка разброса канала (30.09). Главный эффект мощности на малом расстоянии — наводка на камеру, а не качество канала; мощность нужна на дальности, и её выбор поручен регулятору.</w:t>
+        <w:t>В паре опытов таблицы 3.6 (лабораторный этап) PER по статистике модуля составил в среднем 38,3 % при 1 дБм и 43,1 % при 20 дБм, а потери фрагментов на приёмнике — 0,83 и 0,25 % соответственно: снижение мощности немного уменьшило PER, но не уменьшило потери; более раннее наблюдение на расстоянии 2 м давало снижение PER с 52 до 38 %. В разрешённой конфигурации большая мощность также не ускоряет канал: на трассе 5 м при постоянной мощности 14 дБм синтетический поток составил 763 кбит/с против 987 кбит/с с регулятором (1 дБм), а видео — 313 против 734 кбит/с из-за пауз съёмки (29.09). Повышение мощности приёмника до 14 дБм улучшило показатели лишь на величину порядка разброса канала (30.09). Главный эффект мощности на малом расстоянии — наводка на камеру, а не качество канала; мощность нужна на дальности, и её выбор поручен регулятору.</w:t>
       </w:r>
     </w:p>
     <w:p>
@@ -10070,7 +9428,7 @@
     </w:p>
     <w:p>
       <w:r>
-        <w:t>Расчётные потери по формуле (1.1) для свободного пространства и по двухлучевой модели (формула (2.3)) для наземных антенн на высоте 1,5 м и для антенны на борту БПЛА на высоте 50 м приведены в таблице 3.8.</w:t>
+        <w:t>Расчётные потери по формуле (1.1) для свободного пространства и по двухлучевой модели (формула (2.3)) для наземных антенн на высоте 1,5 м и для антенны на борту БПЛА на высоте 50 м приведены в таблице 3.7.</w:t>
       </w:r>
     </w:p>
     <w:p>
@@ -10079,7 +9437,7 @@
         <w:ind w:firstLine="0"/>
       </w:pPr>
       <w:r>
-        <w:t>Таблица 3.8 – Расчётные потери на трассе, 867 МГц</w:t>
+        <w:t>Таблица 3.7 – Расчётные потери на трассе, 867 МГц</w:t>
       </w:r>
     </w:p>
     <w:tbl>
@@ -10924,7 +10282,7 @@
     </w:p>
     <w:p>
       <w:r>
-        <w:t>Бюджет рассчитан для мощности стенда 14 дБм и антенн 0 дБи (ЭИИМ 14 дБм, в пределах нормы 16,15 дБм) с запасом на замирания M = 10 дБ. Чувствительность для канала 2 МГц — оценка (раздел 1.3), для канала 1 МГц на MCS 10 — паспортная [17]. Для сравнения на идентичной аппаратной платформе в тот же расчёт включён радиотракт Wi-Fi 2,4 ГГц процессора ESP32-S3 той же платы: ЭИИМ 20 дБм (100 мВт — норма для 2,4 ГГц), паспортная чувствительность [21]. Результаты — в таблице 3.9; это расчёт автора, а не измерение.</w:t>
+        <w:t>Бюджет рассчитан для мощности стенда 14 дБм и антенн 0 дБи (ЭИИМ 14 дБм, в пределах нормы 16,15 дБм) с запасом на замирания M = 10 дБ. Чувствительность для канала 2 МГц — оценка (раздел 1.3), для канала 1 МГц на MCS 10 — паспортная [17]. Для сравнения на идентичной аппаратной платформе в тот же расчёт включён радиотракт Wi-Fi 2,4 ГГц процессора ESP32-S3 той же платы: ЭИИМ 20 дБм (100 мВт — норма для 2,4 ГГц), паспортная чувствительность [21]. Результаты — в таблице 3.8; это расчёт автора, а не измерение.</w:t>
       </w:r>
     </w:p>
     <w:p>
@@ -10933,7 +10291,7 @@
         <w:ind w:firstLine="0"/>
       </w:pPr>
       <w:r>
-        <w:t>Таблица 3.9 – Энергетический бюджет и расчётная дальность на одной плате T-HaLow (запас 10 дБ)</w:t>
+        <w:t>Таблица 3.8 – Энергетический бюджет и расчётная дальность на одной плате T-HaLow (запас 10 дБ)</w:t>
       </w:r>
     </w:p>
     <w:tbl>
@@ -12088,7 +11446,7 @@
         <w:t xml:space="preserve">Четвёртый вывод — оговорка для данной платформы. Таблица </w:t>
       </w:r>
       <w:r>
-        <w:t>3.9</w:t>
+        <w:t>3.8</w:t>
       </w:r>
       <w:r>
         <w:t xml:space="preserve"> считает шум приёмника тепловым. Фон, который оценивает сам радиомодуль, на плате с камерой в августе — сентябре составлял около −60 дБм, на 27 дБ выше, чем у приёмника; при этом он менялся в течение суток (−60 против −90 дБм, 15.09), а 05.10 составил −101 дБм (раздел 2.2). Плата с камерой принимает подтверждения и квитанции, поэтому в худшем случае её фон ограничивает весь канал: допустимые потери уменьшаются на 27 дБ, и граница в свободном пространстве сокращается в 22 раза — до 44 м на MCS 7 и 220 м на MCS 0. На трассе 5 м отношение сигнал/шум временами проседало до 12–20 дБ, а регулятор поднимал мощность до 11–13 дБм из 14 возможных (08.10). Следовательно, дальности таблицы — возможности радиомодуля, а граница связи данной пары плат лежит между ними и оценкой худшего случая и должна быть установлена измерением.</w:t>
@@ -12099,7 +11457,7 @@
         <w:t xml:space="preserve">Опубликованные натурные данные производителя радиомодуля (таблица </w:t>
       </w:r>
       <w:r>
-        <w:t>3.10</w:t>
+        <w:t>3.9</w:t>
       </w:r>
       <w:r>
         <w:t>) получены на мосте и над водой при мощности +20 дБм на частотах 890 и 906 МГц; ширина канала в руководстве не указана, по скорости на 300 м — вероятно, 8 МГц [27]. Паспорт модуля для канала 2 МГц при +20 дБм указывает 1200 м и скорость TCP более 2 Мбит/с [17]. Расчётный уровень приёма в таблице получен по формуле (1.1) для 890 МГц при мощности 20 дБм и антеннах 0 дБи (усиление антенн в руководстве не указано).</w:t>
@@ -12111,7 +11469,7 @@
         <w:ind w:firstLine="0"/>
       </w:pPr>
       <w:r>
-        <w:t>Таблица 3.10 – Натурные данные производителя радиомодуля TX-AH [27] и расчёт</w:t>
+        <w:t>Таблица 3.9 – Натурные данные производителя радиомодуля TX-AH [27] и расчёт</w:t>
       </w:r>
     </w:p>
     <w:tbl>
@@ -12635,7 +11993,7 @@
         <w:t xml:space="preserve">Сравнение по критериям задания — дальности, уровню сигнала, задержке и потерям пакетов, — а также по пропускной способности, энергопотреблению и проникающей способности выполнено по результатам стенда для Wi-Fi HaLow, расчёту на одной плате (таблица </w:t>
       </w:r>
       <w:r>
-        <w:t>3.9</w:t>
+        <w:t>3.8</w:t>
       </w:r>
       <w:r>
         <w:t>) и опубликованным данным для других протоколов. Опубликованных измерений задержки и потерь для Wi-Fi HaLow и для Wi-Fi на ESP32 в доступных источниках нет, поэтому для Wi-Fi HaLow приведены собственные измерения.</w:t>
@@ -12652,7 +12010,7 @@
         <w:t xml:space="preserve">Плата T-HaLow несёт оба радиотракта, и расчёт таблицы </w:t>
       </w:r>
       <w:r>
-        <w:t>3.9</w:t>
+        <w:t>3.8</w:t>
       </w:r>
       <w:r>
         <w:t xml:space="preserve"> сравнивает их при нормах мощности Российской Федерации. При равной скорости физического уровня 6,5 Мбит/с (Wi-Fi HaLow 2 МГц MCS 7 и Wi-Fi 802.11n MCS 0) дальности в свободном пространстве сопоставимы — 0,98 и 1,32 км: выигрыш Wi-Fi HaLow на затухании (9,0 дБ) компенсируется меньшей разрешённой мощностью (на 6,0 дБ ниже у стенда) и оценочной чувствительностью. Wi-Fi HaLow выигрывает на малых скоростях, которых у 802.11n нет: на MCS 0 (0,65 Мбит/с) — 4,90 км против 2,58 км у 802.11b на 1 Мбит/с, — и за препятствиями: бетонная стена ослабляет сигнал 867 МГц на 6,3 дБ меньше, чем 2,4 ГГц [18]. У земли за точкой излома потери двухлучевой модели от частоты не зависят, и частотное преимущество исчезает; модель при этом не учитывает дифракцию и затухание в растительности, где диапазон ниже 1 ГГц выигрывает [7]. Скорость Wi-Fi 2,4 ГГц выше на порядок: ESP32-S3 передаёт в эфире 20–30 Мбит/с [20], а модуль ESP32-CAM (процессор ESP32, камера OV2640) передаёт по Wi-Fi видео 480 × 320 с частотой 20,9 видеокадра в секунду (лаборатория, расстояние не указано) [35] — против 5 видеокадров в секунду и 1063 кбит/с на Wi-Fi HaLow.</w:t>
@@ -12857,7 +12215,7 @@
         <w:t xml:space="preserve">Сводка по критериям приведена в таблице </w:t>
       </w:r>
       <w:r>
-        <w:t>3.11</w:t>
+        <w:t>3.10</w:t>
       </w:r>
       <w:r>
         <w:t>.</w:t>
@@ -12869,7 +12227,7 @@
         <w:ind w:firstLine="0"/>
       </w:pPr>
       <w:r>
-        <w:t>Таблица 3.11 – Сравнение Wi-Fi HaLow с Wi-Fi 2,4/5 ГГц и LoRa по критериям</w:t>
+        <w:t>Таблица 3.10 – Сравнение Wi-Fi HaLow с Wi-Fi 2,4/5 ГГц и LoRa по критериям</w:t>
       </w:r>
     </w:p>
     <w:tbl>
@@ -13035,7 +12393,7 @@
               <w:rPr>
                 <w:sz w:val="20"/>
               </w:rPr>
-              <w:t>1200 м, &gt; 2 Мбит/с при +20 дБм [17]; расчёт при 14 дБм: 0,98–4,90 км в своб. простр. (табл. 3.9); при фоне платы с камерой −60 дБм — 44–220 м</w:t>
+              <w:t>1200 м, &gt; 2 Мбит/с при +20 дБм [17]; расчёт при 14 дБм: 0,98–4,90 км в своб. простр. (табл. 3.8); при фоне платы с камерой −60 дБм — 44–220 м</w:t>
             </w:r>
           </w:p>
         </w:tc>
@@ -13054,7 +12412,7 @@
               <w:rPr>
                 <w:sz w:val="20"/>
               </w:rPr>
-              <w:t>расчёт при 20 дБм: 0,16–2,58 км в своб. простр. (табл. 3.9); собственный режим Espressif LR — до 1 км [20]</w:t>
+              <w:t>расчёт при 20 дБм: 0,16–2,58 км в своб. простр. (табл. 3.8); собственный режим Espressif LR — до 1 км [20]</w:t>
             </w:r>
           </w:p>
         </w:tc>

</xml_diff>

<commit_message>
Thesis: plainer chapters 1-2, factory setting as manufacturer's example, software and FEC explained
- Introduction and 1.1-1.4 per the user's review: monitoring wording, criteria include rate,
  simpler novelty items, functional differences of task groups, UART/SPI limit of the platform.
- 2.1: what the ground-reflection breakpoint is, shorter Doppler without OFDM details.
- 2.2: the six reasons for the experiment rewritten plainly.
- 2.3-2.4: work volume, lab stage as a test of the manufacturer's example setting [txfreq],
  PER item, link establishment and retention defined, comparison stages explained.
- 2.6: what each program does and why, role choice (camera is the access point) explained.
- 3.4: XOR control fragments as an erasure code on top of PHY coding and MAC retries.
- 85 sheets, 70 sources.

Co-Authored-By: Claude Opus 5.5 <noreply@anthropic.com>
</commit_message>
<xml_diff>
--- a/docs/vkr/Osnovnaya_chast_HaLow.docx
+++ b/docs/vkr/Osnovnaya_chast_HaLow.docx
@@ -149,7 +149,7 @@
       <w:r>
         <w:t>2.2 Обоснование необходимости экспериментального исследования</w:t>
         <w:tab/>
-        <w:t>17</w:t>
+        <w:t>16</w:t>
       </w:r>
     </w:p>
     <w:p>
@@ -163,7 +163,7 @@
       <w:r>
         <w:t>2.3 Программа экспериментальных исследований</w:t>
         <w:tab/>
-        <w:t>20</w:t>
+        <w:t>19</w:t>
       </w:r>
     </w:p>
     <w:p>
@@ -177,7 +177,7 @@
       <w:r>
         <w:t>2.4 Методика измерений и обработки результатов</w:t>
         <w:tab/>
-        <w:t>22</w:t>
+        <w:t>20</w:t>
       </w:r>
     </w:p>
     <w:p>
@@ -191,7 +191,7 @@
       <w:r>
         <w:t>2.5 Выбор аппаратных средств</w:t>
         <w:tab/>
-        <w:t>23</w:t>
+        <w:t>22</w:t>
       </w:r>
     </w:p>
     <w:p>
@@ -205,7 +205,7 @@
       <w:r>
         <w:t>2.6 Выбор и настройка программных средств</w:t>
         <w:tab/>
-        <w:t>25</w:t>
+        <w:t>23</w:t>
       </w:r>
     </w:p>
     <w:p>
@@ -219,7 +219,7 @@
       <w:r>
         <w:t>2.7 Выводы</w:t>
         <w:tab/>
-        <w:t>27</w:t>
+        <w:t>26</w:t>
       </w:r>
     </w:p>
     <w:p>
@@ -233,7 +233,7 @@
       <w:r>
         <w:t>3 Серия экспериментов на платформе LilyGO T-HaLow и сравнение с другими протоколами</w:t>
         <w:tab/>
-        <w:t>28</w:t>
+        <w:t>27</w:t>
       </w:r>
     </w:p>
     <w:p>
@@ -247,7 +247,7 @@
       <w:r>
         <w:t>3.1 Условия испытаний</w:t>
         <w:tab/>
-        <w:t>28</w:t>
+        <w:t>27</w:t>
       </w:r>
     </w:p>
     <w:p>
@@ -261,7 +261,7 @@
       <w:r>
         <w:t>3.2 Влияние полосы приёма (лабораторный этап)</w:t>
         <w:tab/>
-        <w:t>28</w:t>
+        <w:t>27</w:t>
       </w:r>
     </w:p>
     <w:p>
@@ -275,7 +275,7 @@
       <w:r>
         <w:t>3.3 Пропускная способность платформы и ограничивающее звено</w:t>
         <w:tab/>
-        <w:t>29</w:t>
+        <w:t>28</w:t>
       </w:r>
     </w:p>
     <w:p>
@@ -289,7 +289,7 @@
       <w:r>
         <w:t>3.4 Доработки канала передачи видео и итоговые результаты</w:t>
         <w:tab/>
-        <w:t>32</w:t>
+        <w:t>31</w:t>
       </w:r>
     </w:p>
     <w:p>
@@ -317,7 +317,7 @@
       <w:r>
         <w:t>3.6 Оценка дальности: расчёт бюджета канала и опубликованные натурные данные</w:t>
         <w:tab/>
-        <w:t>37</w:t>
+        <w:t>36</w:t>
       </w:r>
     </w:p>
     <w:p>
@@ -331,7 +331,7 @@
       <w:r>
         <w:t>3.7 Сравнение с IEEE 802.11 (Wi-Fi 2,4 и 5 ГГц) и LoRa</w:t>
         <w:tab/>
-        <w:t>40</w:t>
+        <w:t>39</w:t>
       </w:r>
     </w:p>
     <w:p>
@@ -345,7 +345,7 @@
       <w:r>
         <w:t>3.8 Выводы</w:t>
         <w:tab/>
-        <w:t>45</w:t>
+        <w:t>44</w:t>
       </w:r>
     </w:p>
     <w:p>
@@ -359,7 +359,7 @@
       <w:r>
         <w:t>4 Экономическая часть</w:t>
         <w:tab/>
-        <w:t>47</w:t>
+        <w:t>46</w:t>
       </w:r>
     </w:p>
     <w:p>
@@ -373,7 +373,7 @@
       <w:r>
         <w:t>4.1 Оценка целесообразности проведения исследования</w:t>
         <w:tab/>
-        <w:t>48</w:t>
+        <w:t>47</w:t>
       </w:r>
     </w:p>
     <w:p>
@@ -387,7 +387,7 @@
       <w:r>
         <w:t>4.2 Планирование разработки</w:t>
         <w:tab/>
-        <w:t>51</w:t>
+        <w:t>50</w:t>
       </w:r>
     </w:p>
     <w:p>
@@ -401,7 +401,7 @@
       <w:r>
         <w:t>4.3 Определение затрат, себестоимости и цены разработки</w:t>
         <w:tab/>
-        <w:t>54</w:t>
+        <w:t>53</w:t>
       </w:r>
     </w:p>
     <w:p>
@@ -415,7 +415,7 @@
       <w:r>
         <w:t>4.4 Определение и оценка основных показателей экономической эффективности</w:t>
         <w:tab/>
-        <w:t>57</w:t>
+        <w:t>56</w:t>
       </w:r>
     </w:p>
     <w:p>
@@ -429,7 +429,7 @@
       <w:r>
         <w:t>5 Охрана труда и окружающей среды</w:t>
         <w:tab/>
-        <w:t>61</w:t>
+        <w:t>60</w:t>
       </w:r>
     </w:p>
     <w:p>
@@ -443,7 +443,7 @@
       <w:r>
         <w:t>5.1 Введение</w:t>
         <w:tab/>
-        <w:t>61</w:t>
+        <w:t>60</w:t>
       </w:r>
     </w:p>
     <w:p>
@@ -457,7 +457,7 @@
       <w:r>
         <w:t>5.2 Характеристика рабочего места</w:t>
         <w:tab/>
-        <w:t>61</w:t>
+        <w:t>60</w:t>
       </w:r>
     </w:p>
     <w:p>
@@ -471,7 +471,7 @@
       <w:r>
         <w:t>5.3 Анализ опасных и вредных производственных факторов</w:t>
         <w:tab/>
-        <w:t>64</w:t>
+        <w:t>63</w:t>
       </w:r>
     </w:p>
     <w:p>
@@ -485,7 +485,7 @@
       <w:r>
         <w:t>5.4 Микроклимат рабочего места</w:t>
         <w:tab/>
-        <w:t>65</w:t>
+        <w:t>64</w:t>
       </w:r>
     </w:p>
     <w:p>
@@ -499,7 +499,7 @@
       <w:r>
         <w:t>5.5 Освещение рабочего места</w:t>
         <w:tab/>
-        <w:t>66</w:t>
+        <w:t>65</w:t>
       </w:r>
     </w:p>
     <w:p>
@@ -513,7 +513,7 @@
       <w:r>
         <w:t>5.6 Шум</w:t>
         <w:tab/>
-        <w:t>68</w:t>
+        <w:t>67</w:t>
       </w:r>
     </w:p>
     <w:p>
@@ -527,7 +527,7 @@
       <w:r>
         <w:t>5.7 Электромагнитные поля</w:t>
         <w:tab/>
-        <w:t>69</w:t>
+        <w:t>68</w:t>
       </w:r>
     </w:p>
     <w:p>
@@ -541,7 +541,7 @@
       <w:r>
         <w:t>5.8 Электробезопасность</w:t>
         <w:tab/>
-        <w:t>70</w:t>
+        <w:t>69</w:t>
       </w:r>
     </w:p>
     <w:p>
@@ -555,7 +555,7 @@
       <w:r>
         <w:t>5.9 Пожарная безопасность</w:t>
         <w:tab/>
-        <w:t>71</w:t>
+        <w:t>70</w:t>
       </w:r>
     </w:p>
     <w:p>
@@ -569,7 +569,7 @@
       <w:r>
         <w:t>5.10 Тяжесть и напряжённость трудового процесса</w:t>
         <w:tab/>
-        <w:t>72</w:t>
+        <w:t>71</w:t>
       </w:r>
     </w:p>
     <w:p>
@@ -583,7 +583,7 @@
       <w:r>
         <w:t>5.11 Безопасность при полевых измерениях</w:t>
         <w:tab/>
-        <w:t>74</w:t>
+        <w:t>73</w:t>
       </w:r>
     </w:p>
     <w:p>
@@ -597,7 +597,7 @@
       <w:r>
         <w:t>5.12 Охрана окружающей среды</w:t>
         <w:tab/>
-        <w:t>74</w:t>
+        <w:t>73</w:t>
       </w:r>
     </w:p>
     <w:p>
@@ -611,7 +611,7 @@
       <w:r>
         <w:t>5.13 Класс условий труда</w:t>
         <w:tab/>
-        <w:t>74</w:t>
+        <w:t>73</w:t>
       </w:r>
     </w:p>
     <w:p>
@@ -625,7 +625,7 @@
       <w:r>
         <w:t>5.14 Выводы</w:t>
         <w:tab/>
-        <w:t>75</w:t>
+        <w:t>74</w:t>
       </w:r>
     </w:p>
     <w:p>
@@ -639,7 +639,7 @@
       <w:r>
         <w:t>Заключение</w:t>
         <w:tab/>
-        <w:t>76</w:t>
+        <w:t>75</w:t>
       </w:r>
     </w:p>
     <w:p>
@@ -653,7 +653,7 @@
       <w:r>
         <w:t>Список использованных источников</w:t>
         <w:tab/>
-        <w:t>78</w:t>
+        <w:t>77</w:t>
       </w:r>
     </w:p>
     <w:p>
@@ -836,7 +836,7 @@
         <w:t xml:space="preserve">Пояснительная записка состоит из введения, пяти глав, заключения и списка использованных источников. В первой главе выполнен сравнительный анализ Wi-Fi HaLow с другими вариантами канала связи с БПЛА, во второй — обоснование эксперимента, его методика, выбор и настройка средств, в третьей приведены результаты серии экспериментов и сравнение с другими протоколами. Четвёртая глава содержит экономическую часть, пятая — раздел охраны труда и окружающей среды. В заключении сформулированы основные результаты и предложения по интеграции разработанных решений в существующие модели БПЛА. </w:t>
       </w:r>
       <w:r>
-        <w:t>Пояснительная записка: 86 с., 9 рис., 35 табл., 70 источн.</w:t>
+        <w:t>Пояснительная записка: 85 с., 9 рис., 35 табл., 70 источн.</w:t>
       </w:r>
     </w:p>
     <w:p>
@@ -935,7 +935,7 @@
         <w:t xml:space="preserve">Дальность. </w:t>
       </w:r>
       <w:r>
-        <w:t>Затухание в свободном пространстве растёт с квадратом частоты. В инженерной форме формулы Фрииса [14] потери на трассе составляют</w:t>
+        <w:t>Затухание в свободном пространстве растёт с квадратом частоты. По формуле Фрииса [14] потери на трассе составляют</w:t>
       </w:r>
     </w:p>
     <w:tbl>
@@ -2322,7 +2322,7 @@
     </w:p>
     <w:p>
       <w:r>
-        <w:t>Вне круга задач остаются передача видео высокой чёткости с малой задержкой, требующая десятков мегабит в секунду, и связь на десятки километров, достижимая только со специальными направленными антеннами. Ограничения мощности (25 мВт) и ширины канала (не более 2 МГц) в полосе 866–868 МГц дополнительно сужают достижимые дальность и скорость по сравнению с возможностями стандарта.</w:t>
+        <w:t>Вне круга задач остаются передача видео высокой чёткости с малой задержкой, требующая десятков мегабит в секунду, и связь на десятки километров, достижимая только со специальными направленными антеннами. Ограничения мощности (25 мВт) и ширины канала (не более 2 МГц) в полосе 866–868 МГц дополнительно сужают достижимые дальность и скорость по сравнению с возможностями стандарта. Скорость ограничивает и сама платформа: на плате LilyGO T-HaLow радиомодуль связан с процессором только последовательным интерфейсом UART, без интерфейса SPI, и полезная скорость через него не может превысить 3,92 Мбит/с (подраздел 3.3) — меньше 6,5 Мбит/с, на которые способен канал 2 МГц. Для более высоких скоростей радиомодуль следует подключать к процессору по интерфейсу SPI или SDIO.</w:t>
       </w:r>
     </w:p>
     <w:p>
@@ -2847,7 +2847,7 @@
         <w:t xml:space="preserve">Отражение от земли. </w:t>
       </w:r>
       <w:r>
-        <w:t>Над ровной поверхностью к прямому лучу добавляется отражённый, и за точкой излома</w:t>
+        <w:t>Над ровной поверхностью к прямому лучу добавляется отражённый от земли. С удалением он приходит почти в противофазе и всё сильнее гасит прямой, поэтому начиная с расстояния (точки излома)</w:t>
       </w:r>
     </w:p>
     <w:tbl>
@@ -2986,6 +2986,15 @@
                   </m:r>
                 </m:den>
               </m:f>
+              <m:r>
+                <m:rPr>
+                  <m:sty m:val="p"/>
+                </m:rPr>
+                <w:rPr>
+                  <w:rFonts w:ascii="Cambria Math" w:hAnsi="Cambria Math"/>
+                </w:rPr>
+                <m:t xml:space="preserve">,</m:t>
+              </m:r>
             </m:oMath>
           </w:p>
         </w:tc>
@@ -3011,7 +3020,7 @@
         <w:ind w:firstLine="0"/>
       </w:pPr>
       <w:r>
-        <w:t>где h₁, h₂ — высоты антенн над землёй, потери растут не на 20, а на 40 дБ на декаду расстояния [6]. Для антенн на высоте 1,5 м над землёй излом наступает уже на 26 м. Если одна антенна поднята на борту БПЛА на 50 м, излом отодвигается до 868 м, на 100 м — до 1735 м. Высоты 50 и 100 м взяты как примеры рабочей высоты полёта при мониторинге, а не как измеренные или нормативные значения: при наземной антенне на 1,5 м точка излома растёт линейно — на 17,4 м на каждый метр высоты антенны на борту, поэтому для любой другой высоты её легко пересчитать. Отсюда важное для методики следствие: испытания с обеими антеннами у земли дают заметно более пессимистичную картину, чем полёт, и высоту антенн при сопоставлении с натурными данными необходимо фиксировать и указывать. Для БПЛА вертолётного типа, способного зависать на заданной высоте, высота антенны на борту — управляемый параметр дальности.</w:t>
+        <w:t>где h₁, h₂ — высоты антенн над землёй, потери растут уже не на 20, а на 40 дБ на декаду [6]. Для антенн на высоте 1,5 м излом наступает уже на 26 м, а если одна антенна поднята на борту БПЛА на 50 м — на 868 м, на 100 м — на 1735 м. Поэтому испытания с антеннами у земли дают более пессимистичную картину, чем полёт, а для БПЛА вертолётного типа высота антенны на борту — управляемый параметр дальности.</w:t>
       </w:r>
     </w:p>
     <w:p>
@@ -4412,216 +4421,7 @@
         <w:ind w:firstLine="0"/>
       </w:pPr>
       <w:r>
-        <w:t>Для БПЛА вертолётного типа при скорости до 30 м/с сдвиг на частоте 867 МГц не превышает 87 Гц, то есть 0,1·10⁻⁶ несущей. Для OFDM важен не сам сдвиг, а его доля от разноса поднесущих Δf: сдвиг нарушает их ортогональность и вызывает межподнесущие помехи, относительная мощность которых [25]</w:t>
-      </w:r>
-    </w:p>
-    <w:tbl>
-      <w:tblPr>
-        <w:tblW w:type="auto" w:w="0"/>
-        <w:jc w:val="center"/>
-        <w:tblLayout w:type="fixed"/>
-        <w:tblLook w:firstColumn="1" w:firstRow="1" w:lastColumn="0" w:lastRow="0" w:noHBand="0" w:noVBand="1" w:val="04A0"/>
-        <w:tblBorders>
-          <w:top w:val="nil"/>
-          <w:left w:val="nil"/>
-          <w:bottom w:val="nil"/>
-          <w:right w:val="nil"/>
-          <w:insideH w:val="nil"/>
-          <w:insideV w:val="nil"/>
-        </w:tblBorders>
-      </w:tblPr>
-      <w:tblGrid>
-        <w:gridCol w:w="1020"/>
-        <w:gridCol w:w="7313"/>
-        <w:gridCol w:w="1020"/>
-      </w:tblGrid>
-      <w:tr>
-        <w:tc>
-          <w:tcPr>
-            <w:tcW w:type="dxa" w:w="1020"/>
-            <w:vAlign w:val="center"/>
-          </w:tcPr>
-          <w:p>
-            <w:pPr>
-              <w:pStyle w:val="Formula"/>
-            </w:pPr>
-          </w:p>
-        </w:tc>
-        <w:tc>
-          <w:tcPr>
-            <w:tcW w:type="dxa" w:w="7313"/>
-            <w:vAlign w:val="center"/>
-          </w:tcPr>
-          <w:p>
-            <w:pPr>
-              <w:pStyle w:val="Formula"/>
-              <w:jc w:val="center"/>
-            </w:pPr>
-            <m:oMath>
-              <m:sSub>
-                <m:e>
-                  <m:r>
-                    <w:rPr>
-                      <w:rFonts w:ascii="Cambria Math" w:hAnsi="Cambria Math"/>
-                    </w:rPr>
-                    <m:t xml:space="preserve">P</m:t>
-                  </m:r>
-                </m:e>
-                <m:sub>
-                  <m:r>
-                    <m:rPr>
-                      <m:sty m:val="p"/>
-                    </m:rPr>
-                    <w:rPr>
-                      <w:rFonts w:ascii="Cambria Math" w:hAnsi="Cambria Math"/>
-                    </w:rPr>
-                    <m:t xml:space="preserve">МПП</m:t>
-                  </m:r>
-                </m:sub>
-              </m:sSub>
-              <m:r>
-                <m:rPr>
-                  <m:sty m:val="p"/>
-                </m:rPr>
-                <w:rPr>
-                  <w:rFonts w:ascii="Cambria Math" w:hAnsi="Cambria Math"/>
-                </w:rPr>
-                <m:t xml:space="preserve"> ≈ </m:t>
-              </m:r>
-              <m:f>
-                <m:num>
-                  <m:r>
-                    <m:rPr>
-                      <m:sty m:val="p"/>
-                    </m:rPr>
-                    <w:rPr>
-                      <w:rFonts w:ascii="Cambria Math" w:hAnsi="Cambria Math"/>
-                    </w:rPr>
-                    <m:t xml:space="preserve">1</m:t>
-                  </m:r>
-                </m:num>
-                <m:den>
-                  <m:r>
-                    <m:rPr>
-                      <m:sty m:val="p"/>
-                    </m:rPr>
-                    <w:rPr>
-                      <w:rFonts w:ascii="Cambria Math" w:hAnsi="Cambria Math"/>
-                    </w:rPr>
-                    <m:t xml:space="preserve">3</m:t>
-                  </m:r>
-                </m:den>
-              </m:f>
-              <m:sSup>
-                <m:e>
-                  <m:d>
-                    <m:e>
-                      <m:r>
-                        <m:rPr>
-                          <m:sty m:val="p"/>
-                        </m:rPr>
-                        <w:rPr>
-                          <w:rFonts w:ascii="Cambria Math" w:hAnsi="Cambria Math"/>
-                        </w:rPr>
-                        <m:t xml:space="preserve">π</m:t>
-                      </m:r>
-                      <m:f>
-                        <m:num>
-                          <m:sSub>
-                            <m:e>
-                              <m:r>
-                                <w:rPr>
-                                  <w:rFonts w:ascii="Cambria Math" w:hAnsi="Cambria Math"/>
-                                </w:rPr>
-                                <m:t xml:space="preserve">f</m:t>
-                              </m:r>
-                            </m:e>
-                            <m:sub>
-                              <m:r>
-                                <m:rPr>
-                                  <m:sty m:val="p"/>
-                                </m:rPr>
-                                <w:rPr>
-                                  <w:rFonts w:ascii="Cambria Math" w:hAnsi="Cambria Math"/>
-                                </w:rPr>
-                                <m:t xml:space="preserve">д</m:t>
-                              </m:r>
-                            </m:sub>
-                          </m:sSub>
-                        </m:num>
-                        <m:den>
-                          <m:r>
-                            <m:rPr>
-                              <m:sty m:val="p"/>
-                            </m:rPr>
-                            <w:rPr>
-                              <w:rFonts w:ascii="Cambria Math" w:hAnsi="Cambria Math"/>
-                            </w:rPr>
-                            <m:t xml:space="preserve">Δ</m:t>
-                          </m:r>
-                          <m:r>
-                            <w:rPr>
-                              <w:rFonts w:ascii="Cambria Math" w:hAnsi="Cambria Math"/>
-                            </w:rPr>
-                            <m:t xml:space="preserve">f</m:t>
-                          </m:r>
-                        </m:den>
-                      </m:f>
-                    </m:e>
-                  </m:d>
-                </m:e>
-                <m:sup>
-                  <m:r>
-                    <m:rPr>
-                      <m:sty m:val="p"/>
-                    </m:rPr>
-                    <w:rPr>
-                      <w:rFonts w:ascii="Cambria Math" w:hAnsi="Cambria Math"/>
-                    </w:rPr>
-                    <m:t xml:space="preserve">2</m:t>
-                  </m:r>
-                </m:sup>
-              </m:sSup>
-              <m:r>
-                <m:rPr>
-                  <m:sty m:val="p"/>
-                </m:rPr>
-                <w:rPr>
-                  <w:rFonts w:ascii="Cambria Math" w:hAnsi="Cambria Math"/>
-                </w:rPr>
-                <m:t xml:space="preserve">.</m:t>
-              </m:r>
-            </m:oMath>
-          </w:p>
-        </w:tc>
-        <w:tc>
-          <w:tcPr>
-            <w:tcW w:type="dxa" w:w="1020"/>
-            <w:vAlign w:val="center"/>
-          </w:tcPr>
-          <w:p>
-            <w:pPr>
-              <w:pStyle w:val="Formula"/>
-              <w:jc w:val="right"/>
-            </w:pPr>
-            <w:r>
-              <w:t>(2.6)</w:t>
-            </w:r>
-          </w:p>
-        </w:tc>
-      </w:tr>
-    </w:tbl>
-    <w:p>
-      <w:pPr>
-        <w:ind w:firstLine="0"/>
-      </w:pPr>
-      <w:r>
-        <w:t>Разнос поднесущих Wi-Fi HaLow — 31,25 кГц [7], в 10 раз меньше, чем у Wi-Fi 2,4 ГГц, и всё же доплеровский сдвиг составляет лишь 0,3 % от него, а мощность межподнесущих помех на 46 дБ ниже мощности сигнала. Даже при отношении сигнал/шум 25 дБ эти помехи остаются на 21 дБ ниже шума, то есть практически отсутствуют.</w:t>
-      </w:r>
-    </w:p>
-    <w:p>
-      <w:r>
-        <w:t>Движение сказывается иначе: канал изменяется за время когерентности Tк ≈ 0,423/fд [6], при 30 м/с — около 5 мс. Кадр с фрагментом 1400 байт длится около 2 мс на MCS 7 и около 18 мс на MCS 0, поэтому на нижних MCS оценка канала, сделанная по преамбуле, к концу кадра устаревает. Для этого случая в стандарт IEEE 802.11ah введены бегущие пилоты — пилотные поднесущие, положение которых меняется от символа к символу, что позволяет приёмнику уточнять оценку канала в течение кадра [7]; в программном обеспечении радиомодуля TX-AH они предусмотрены (команда AT+TX_TRV_PILOT_EN). Таким образом, при скоростях БПЛА вертолётного типа доплеровский сдвиг на работу канала практически не влияет и отдельного экспериментального исследования не требует.</w:t>
+        <w:t>Для БПЛА вертолётного типа при скорости до 30 м/с сдвиг на частоте 867 МГц не превышает 87 Гц — около 0,3 % от разноса поднесущих сигнала Wi-Fi HaLow (31,25 кГц) [7]. Такой сдвиг приёмник компенсирует, и на работу канала он практически не влияет, поэтому отдельного экспериментального исследования не требует.</w:t>
       </w:r>
     </w:p>
     <w:p>
@@ -5165,37 +4965,32 @@
     </w:p>
     <w:p>
       <w:r>
-        <w:t>Во-первых, модели каналов задают коэффициенты диапазонами и для своей геометрии. Для городской застройки n = 2,7–3,5 [6], и при одних и тех же допустимых потерях (80 дБ сверх потерь на опорном расстоянии 1 м) дальность составит около 920 м при n = 2,7 и около 190 м при n = 3,5. Модели потерь, предложенные для IEEE 802.11ah на частоте 900 МГц, предполагают антенну точки доступа на 15 м выше крыш (L = 8 + 37,6 lg d) или на уровне крыш (L = 23,3 + 36,7 lg d), d в метрах [26]. На 1 км они дают 121 и 133 дБ — 12 дБ расхождения между двумя моделями для одной технологии, а свободное пространство — 91 дБ. Для антенн на высоте 1,5 м над землёй ни одна из них не выводилась. Поэтому опубликованные модели служат в работе эталоном для сравнения, а какое значение из диапазона соответствует трассе, устанавливает измерение.</w:t>
+        <w:t>Во-первых, модели распространения дают не одно значение, а диапазон. Для городской застройки показатель затухания n = 2,7–3,5 [6], и при одних и тех же допустимых потерях дальность получается от 190 до 920 м. Две модели, предложенные специально для IEEE 802.11ah, на 1 км расходятся на 12 дБ [25], и ни одна не выведена для антенн у земли. Какое значение подходит для конкретной трассы, показывает только измерение. Даже на одной и той же трассе 5 м канал заметно меняется: отношение сигнал/шум за пять минут колебалось от 24 до 40 дБ, а скорость в разное время суток различалась в 3–4 раза.</w:t>
       </w:r>
     </w:p>
     <w:p>
       <w:r>
-        <w:t>Разброс на стенде велик даже без изменения геометрии. При одном и том же расположении плат на расстоянии 5 м и мощности передатчика 1 дБм отношение сигнал/шум за один пятиминутный опыт менялось от 24 до 40 дБ (07.10), а пропускная способность синтетического потока в той же точке в разное время суток — в 3–4 раза, от 250 до 987 кбит/с (29.09).</w:t>
+        <w:t>Во-вторых, расчёт опирается на допущения, которые на реальной плате выполняются не всегда. Он считает, что приёму мешает только тепловой шум — в канале 2 МГц около −111 дБм (формула 1.2). На стенде фон оказался намного выше и к тому же непостоянным: у платы с камерой — от −60 до −101 дБм в разные дни, потому что электроника камеры работает в сантиметрах от антенны. Из-за этого на расстоянии 5 м, где по расчёту сигнал превышает шум более чем на 60 дБ, связь сначала вообще не устанавливалась: приёмник считал эфир постоянно занятым. Расчёт также предсказывает, что при сильном сигнале передачи почти не теряются, а на стенде около трети передач не доходило с первой попытки при любой скорости модуляции. Вероятная причина — те же помехи платы. Подробно эти результаты разобраны в главе 3.</w:t>
       </w:r>
     </w:p>
     <w:p>
       <w:r>
-        <w:t>Во-вторых, допущения теоретической оценки на реальной платформе выполняются не всегда, а проверить их можно только измерением. Расчёт считает шум приёмника тепловым: по формуле (1.2) в канале 2 МГц это −111 дБм плюс коэффициент шума приёмника. Модуль приёмника измерял фон −85…−88 дБм, а такой же модуль на плате с камерой — около −60 дБм (27.08): шина камеры, память PSRAM и тактовый сигнал камеры шумят в сантиметрах от антенны. Фон к тому же непостоянен: в течение суток он менялся от −60 до −90 дБм (15.09), а 05.10 на плате с камерой составил −101 дБм. Следствие оказалось качественным, а не количественным. По расчёту на расстоянии 5 м сигнал превышает тепловой шум более чем на 60 дБ, а на стенде связь не устанавливалась: приёмник по своему порогу занятости канала считал эфир занятым почти всегда, и видеокадры ждали отправки до 134 с. Расчёт также связывает ошибки передачи с отношением сигнал/шум, а на стенде при отношении сигнал/шум 40–45 дБ доля неудачных попыток передачи (PER) составила 68–73 % одинаково на MCS 3, 5 и 7 (28.09). Опыт с ограничением числа попыток передачи (07.10) показал, что при одной попытке до приёмника не доходит 38 % фрагментов видеокадров при отношении сигнал/шум 26–36 дБ: потери происходят в эфире и в обе стороны — теряется около трети первых передач, а у части дошедших передатчик не слышит подтверждения. Вероятная причина — помехи платы с камерой. При этом протокол доступа к среде добавлял свои потери: отказ от обмена запросом и разрешением на передачу (RTS/CTS) увеличил скорость видеопотока в 1,8–2,2 раза при том же канале (29.09).</w:t>
+        <w:t>В-третьих, для части показателей расчёта нет вовсе: задержка, её колебания, восстановление связи после сбоя. Они зависят не от распространения радиоволн, а от программного обеспечения — очередей и алгоритмов управления. Например, пока передатчик не ограничивал число неподтверждённых видеокадров, они копились в очереди, и видео отставало от реального времени на секунду и больше; после ограничения — на 0,1–0,2 с.</w:t>
       </w:r>
     </w:p>
     <w:p>
       <w:r>
-        <w:t>В-третьих, часть показателей не имеет аналитической модели вовсе: задержка и её разброс, время восстановления связи, поведение видеопотока при ухудшении канала. Это свойства программного обеспечения — очередей, алгоритмов выбора MCS и управления качеством, — а не распространения радиоволн. На стенде без ограничения числа неподтверждённых видеокадров очередь накапливалась в модуле передатчика, и возраст видеокадра от съёмки до квитанции составлял в медиане 1,0 с с колебаниями до 3 с; окно в два видеокадра снизило его до 0,1–0,2 с (28.09). Управление качеством сжатия с инерцией снизило медиану задержки с 709 и 880 мс до 343 и 349 мс в одном включении (07.10).</w:t>
+        <w:t>В-четвёртых, расчёт работает со средним уровнем сигнала, а связь рвут кратковременные провалы. Даже на неподвижной трассе 5 м отношение сигнал/шум временами проседало до 12–20 дБ, и регулятор поднимал мощность передатчика с 1 до 11–13 дБм. Кроме того, для канала 2 МГц паспорт радиомодуля не даёт чувствительности [17], её приходится оценивать, поэтому и бюджет канала остаётся оценкой.</w:t>
       </w:r>
     </w:p>
     <w:p>
       <w:r>
-        <w:t>В-четвёртых, совпадение средних значений не гарантирует связь: случайные провалы уровня сигнала уходят под порог приёма, и связь прерывается при среднем уровне, достаточном по расчёту. На стенде на неизменной трассе 5 м отношение сигнал/шум временами проседало до 12–20 дБ, и регулятор мощности поднимал мощность передатчика с 1 до 11–13 дБм (08.10). Паспорт радиомодуля приводит чувствительность только для каналов 1 и 8 МГц [17], для канала 2 МГц её приходится оценивать, поэтому энергетический бюджет канала остаётся оценкой, а границу связи в измерениях определяют по доле успешных передач.</w:t>
+        <w:t>В-пятых, расчёт описывает радиоканал, а не плату. Канал 2 МГц способен на 6,5 Мбит/с (таблица 2.1), а плата сначала передавала только 0,12 Мбит/с: мешали её внутренние интерфейсы. После доработок скорость выросла до 1,06 Мбит/с, и ограничивать стал уже радиоканал. Где узкое место — в радиоканале или в плате, — показывает только эксперимент.</w:t>
       </w:r>
     </w:p>
     <w:p>
       <w:r>
-        <w:t>В-пятых, теоретическая оценка описывает радиоканал, но не платформу. По таблице 2.1 канал 2 МГц обеспечивает до 6,5 Мбит/с, а платформа в исходном состоянии передавала 0,12 Мбит/с: ограничение находилось во внутренних интерфейсах платы. После доработок (глава 3) полезная скорость выросла до 1,06 Мбит/с, и ограничивающим звеном стал радиоканал между платами: повторы передачи занимают эфир почти полностью. Какое звено ограничивает систему — радиоканал или платформа, — может установить только эксперимент.</w:t>
-      </w:r>
-    </w:p>
-    <w:p>
-      <w:r>
-        <w:t>В-шестых, опубликованные данные о дальности и скорости получены в других условиях и непосредственно к задаче не переносятся. Натурные данные производителя радиомодуля сняты при мощности +20 дБм [17, 27], пропускная способность Wi-Fi ESP32-S3 по данным производителя — в лаборатории и в экранированной камере [20]; в разрешённом в Российской Федерации режиме (канал 2 МГц, мощность не более 14 дБм) их нужно проверять. Кроме того, эффект каждой доработки канала доказывается только опытом: канал на одной и той же трассе меняется в разы по времени суток, поэтому варианты сравниваются парными опытами в одном включении питания. Так установлено, что граница MCS по уровню сигнала повышает полезную скорость в 1,5–2 раза при меньших потерях видеокадров (08.10), — расчёт этого эффекта не предсказывает, потому что не учитывает алгоритм выбора MCS радиомодуля.</w:t>
+        <w:t>В-шестых, опубликованные данные получены в других условиях: производитель радиомодуля мерил дальность при мощности +20 дБм [17, 26], а скорость Wi-Fi ESP32-S3 — в лаборатории [20]. В разрешённом в Российской Федерации режиме (канал 2 МГц, не более 14 дБм) их нужно проверять. И наконец, пользу каждой доработки можно доказать только опытом: так установлено, что граница MCS по уровню сигнала повышает скорость в 1,5–2 раза при меньших потерях видеокадров. Поскольку канал меняется в течение суток, варианты сравниваются попеременно в одном включении питания.</w:t>
       </w:r>
     </w:p>
     <w:p>
@@ -5219,7 +5014,7 @@
         <w:t>2.3</w:t>
       </w:r>
       <w:r>
-        <w:t>). Показатели каждого опыта снимаются одновременно, а не отдельными опытами: объём работы определяется числом вариантов и повторов, а не числом показателей.</w:t>
+        <w:t>). Все показатели — скорость, уровень сигнала, задержка и потери — записываются в каждом прогоне одновременно, поэтому их число на объём опытов не влияет. Объём опытов определяется числом сравниваемых вариантов — доработок, каждую из которых проверяют «без неё» и «с ней», и значений варьируемых параметров — и числом повторов каждого варианта.</w:t>
       </w:r>
     </w:p>
     <w:p>
@@ -5587,7 +5382,7 @@
     </w:p>
     <w:p>
       <w:r>
-        <w:t>Лабораторный этап до 28.09 проводился на расстоянии до 5 м в помещении с заводским каналом модуля шириной 4 МГц с центром 866,0 МГц и мощностью до 20 дБм. Такой канал занимает 864–868 МГц и выходит за полосу 866–868 МГц, а мощность — за 25 мВт, поэтому эти условия допустимы только как лабораторные. С 28.09 все испытания выполняются в разрешённой конфигурации: канал 2 МГц с центром 867,0 МГц (866–868 МГц), мощность не более 14 дБм (25 мВт), ограничение заложено во встроенную программу модуля.</w:t>
+        <w:t>Лабораторный этап до 28.09 был проверкой заводской настройки модуля — решения «из коробки», с которым платы поставляет производитель: канал шириной 4 МГц с центром 866,0 МГц (864–868 МГц) и мощность до 20 дБм. Эта настройка — пример производителя, а не настройка для конкретной страны: по документации радиомодуля частоты и ширину канала выбирает разработчик изделия по нормам страны применения [27]. Опыты проводились кратковременно, в помещении на расстоянии до 5 м. Проверка показала, что заводская настройка для Российской Федерации непригодна: канал выходит за полосу 866–868 МГц, а мощность превышает разрешённые 25 мВт. Не лучшая она и по качеству связи: при сужении полосы приёма потери уменьшаются, а канал 2 МГц устанавливает связь не хуже более широких (подраздел 3.2). Поэтому с 28.09 все испытания выполняются в разрешённой конфигурации: канал 2 МГц с центром 867,0 МГц (866–868 МГц), мощность не более 14 дБм (25 мВт), ограничение заложено во встроенную программу модуля. Результаты лабораторного этапа используются только для сравнения вариантов между собой; все итоговые показатели работы получены в разрешённой конфигурации.</w:t>
       </w:r>
     </w:p>
     <w:p>
@@ -5638,7 +5433,7 @@
         <w:t xml:space="preserve">– </w:t>
       </w:r>
       <w:r>
-        <w:t>PER — доля неудачных попыток передачи модуля к приёмнику за интервал отчёта. Неудачной считается каждая попытка без подтверждения в срок: каждый повтор, каждая проба другой схемы модуляции и каждый агрегированный кадр MAC (A-MPDU), на который передатчик не получил блочного подтверждения (Block-ACK), — даже если данные дошли. PER — показатель радиоканала, а не доля потерянных данных;</w:t>
+        <w:t>PER — доля попыток передачи, на которые модуль не получил подтверждения от приёмника. Сюда входят повторы, пробы другой схемы модуляции и попытки, которые до приёмника дошли, но подтверждение на них потерялось. Поэтому PER показывает, насколько трудно работает радиоканал, а не сколько данных потеряно: то, что не дошло после всех повторов, отражают потери фрагментов и видеокадров;</w:t>
       </w:r>
     </w:p>
     <w:p>
@@ -5654,17 +5449,12 @@
         <w:t xml:space="preserve">– </w:t>
       </w:r>
       <w:r>
-        <w:t>задержка — время от конца записи видеокадра в интерфейс UART до прихода квитанции приёмника на этот видеокадр (RTT); она включает очередь в модуле, эфир, обработку на приёмнике и обратный путь квитанции. Используется медиана за секунду и за опыт. Дополнительно регистрируется возраст видеокадра — от начала съёмки до квитанции.</w:t>
+        <w:t>задержка — время от конца записи видеокадра в интерфейс UART до прихода квитанции приёмника на этот видеокадр (RTT); она включает очередь в модуле, эфир, обработку на приёмнике и обратный путь квитанции. Используется медиана за секунду и за опыт. Дополнительно регистрируется время от начала съёмки видеокадра до квитанции.</w:t>
       </w:r>
     </w:p>
     <w:p>
       <w:r>
-        <w:t>Задержка «стекло-стекло» — от события перед объективом до его показа на экране — не измеряется: по решению автора для сравнения конфигураций канала достаточно задержки по квитанции, которая включает все звенья, зависящие от канала, и снимается автоматически в каждом опыте.</w:t>
-      </w:r>
-    </w:p>
-    <w:p>
-      <w:r>
-        <w:t>Вероятность установления связи и удержание связи считаются раздельно. Это разные величины с разными механизмами: на стенде полоса приёма 8 МГц давала подключение в трети включений питания, но однажды установленная связь держалась 98,6 % времени.</w:t>
+        <w:t>Связь характеризуется двумя величинами, которые считаются раздельно. Вероятность установления связи — доля включений питания, после которых связь установилась. Удержание связи — доля секунд опыта, в которые связь была установлена; её дают отметки подключения в ежесекундной записи программы просмотра (строка «Время на связи» в таблице 3.1). Это разные величины, и одна не следует из другой: связь может устанавливаться редко, но, установившись, устойчиво держаться.</w:t>
       </w:r>
     </w:p>
     <w:p>
@@ -5686,7 +5476,7 @@
         <w:t xml:space="preserve">Условия сравнения. </w:t>
       </w:r>
       <w:r>
-        <w:t>Канал на неизменной трассе 5 м меняется в разы по времени суток: 07.10 вечером без нижней границы MCS — от 450 до 936 кбит/с. Поэтому сравниваемые варианты чередуются внутри одного включения питания — этапами по 1–2 мин с переключением по времени или по команде модуля, — а разница между отдельными опытами меньше ±20 % не считается значимой. Опыт засчитывается только при подтверждённом применении настроек модуля: модуль принимает команды настройки лишь в течение первых 30 с после включения питания (раздел 2.6), и опыт без подтверждения в журнале отбрасывается.</w:t>
+        <w:t>Даже на неизменной трассе 5 м скорость канала в течение суток меняется примерно вдвое: вечером 07.10 — от 450 до 936 кбит/с. Если сравнивать варианты в разное время, разница в канале перекроет эффект доработки. Поэтому варианты сравниваются в одном включении питания: стенд поочерёдно переключается между ними каждые 1–2 мин, обычно в четыре этапа «без доработки — с доработкой — без — с», так что каждый вариант проходится дважды; первые 10 с каждого этапа не учитываются. Разница меньше 20 % значимой не считается. Кроме того, модуль принимает команды настройки только в первые 30 с после включения питания (подраздел 2.6), поэтому опыт засчитывается, только если журнал подтверждает, что настройки применились.</w:t>
       </w:r>
     </w:p>
     <w:p>
@@ -5824,7 +5614,7 @@
               <w:jc w:val="right"/>
             </w:pPr>
             <w:r>
-              <w:t>(2.7)</w:t>
+              <w:t>(2.6)</w:t>
             </w:r>
           </w:p>
         </w:tc>
@@ -5966,7 +5756,7 @@
               <w:jc w:val="right"/>
             </w:pPr>
             <w:r>
-              <w:t>(2.8)</w:t>
+              <w:t>(2.7)</w:t>
             </w:r>
           </w:p>
         </w:tc>
@@ -6565,7 +6355,7 @@
         <w:t xml:space="preserve">– </w:t>
       </w:r>
       <w:r>
-        <w:t>программа процессора ESP32-S3 камеры и приёмника — на платформе Arduino (arduino-esp32 2.0.9 на основе ESP-IDF 4.4), сборка средой PlatformIO, драйвер камеры esp32-camera, программный кодер JPEG esp_new_jpeg 1.0.2;</w:t>
+        <w:t>программы процессора ESP32-S3 на языке C++ (платформа Arduino, arduino-esp32 2.0.9 на основе ESP-IDF 4.4, сборка средой PlatformIO). Программа камеры захватывает и проверяет видеокадры, сжимает их, делит на фрагменты, добавляет контрольные фрагменты (суммы XOR чередующихся групп фрагментов), досылает пропавшие фрагменты, управляет качеством сжатия и собирает показатели канала. Программа приёмника передаёт принятые фрагменты в компьютер и отвечает камере квитанциями. Отдельная программа записывает встроенную программу в модуль через процессор платы. Готовыми использованы драйвер камеры esp32-camera и программный кодер JPEG esp_new_jpeg 1.0.2;</w:t>
       </w:r>
     </w:p>
     <w:p>
@@ -6573,7 +6363,7 @@
         <w:t xml:space="preserve">– </w:t>
       </w:r>
       <w:r>
-        <w:t>программа модуля — комплект разработки производителя (TXW8301 WNB 2.4.1.3, компилятор C-SKY) в режиме прозрачного моста uart_p2p, который передаёт в эфир всё, что получает по UART, с доработками автора (см. ниже);</w:t>
+        <w:t>встроенная программа радиомодуля на языке C — на основе комплекта разработки производителя (TXW8301 WNB 2.4.1.3, компилятор C-SKY). Модуль работает как прозрачный мост (режим uart_p2p): всё, что процессор платы передаёт ему по UART, он отправляет в эфир, а принятое из эфира возвращает по UART. В программу внесены изменения: ускорен приём по UART, чтобы модуль не терял данные на входе при скорости 3 Мбод; добавлен регулятор, который держит мощность передатчика минимально достаточной, но не выше 14 дБм, — вблизи это убирает наводку на камеру, а на дальности даёт полную разрешённую мощность; добавлена нижняя граница модуляции по уровню сигнала, которая при хорошем сигнале не даёт модулю опускаться при повторах на медленные MCS и тем повышает скорость; широковещательные кадры передаются на модуляции, выбранной по уровню сигнала, а не на самой медленной. Подробнее — в описании настройки ниже и в разделах 3.3 и 3.4;</w:t>
       </w:r>
     </w:p>
     <w:p>
@@ -6652,7 +6442,7 @@
     </w:p>
     <w:p>
       <w:r>
-        <w:t>Модуль камеры работает в режиме точки доступа (AP), модуль приёмника — в режиме станции (STA). Процессор приёмника передаёт принятые фрагменты по USB в компьютер, где программа просмотра собирает видеокадры, проверяет контрольные суммы, восстанавливает пропавшие фрагменты и показывает видео в браузере. На каждый видеокадр приёмник отправляет камере по обратному каналу квитанцию — какие фрагменты дошли; по квитанциям камера измеряет задержку, досылает пропавшие фрагменты и управляет качеством сжатия.</w:t>
+        <w:t>Модуль камеры работает в режиме точки доступа (AP), модуль приёмника — в режиме станции (STA). Привычная схема обратная, но в сети Wi-Fi станция передаёт только через точку доступа: когда камера была станцией, каждый её кадр шёл сначала точке доступа, а та пересылала его ещё раз на самой медленной модуляции. Поскольку почти весь поток идёт от камеры, точкой доступа сделана она: видео уходит приёмнику напрямую, за одну передачу (раздел 3.4). Процессор приёмника передаёт принятые фрагменты по USB в компьютер, где программа просмотра собирает видеокадры, проверяет контрольные суммы, восстанавливает пропавшие фрагменты и показывает видео в браузере. На каждый видеокадр приёмник отправляет камере по обратному каналу квитанцию — какие фрагменты дошли; по квитанциям камера измеряет задержку, досылает пропавшие фрагменты и управляет качеством сжатия.</w:t>
       </w:r>
     </w:p>
     <w:p>
@@ -8404,7 +8194,7 @@
         <w:t xml:space="preserve">Квитанция на видеокадр и окно. </w:t>
       </w:r>
       <w:r>
-        <w:t>Приёмник подтверждает каждый видеокадр квитанцией, в которой указано, какие фрагменты дошли; тело квитанции сокращено до 20 Б, потому что сообщения от приёмника к камере длиннее 27 Б до камеры не доходили (07.10). Камера допускает не более W отправленных, но не подтверждённых видеокадров, а устаревшие видеокадры из очереди удаляет. Окно W = 2 на стенде снизило медиану возраста видеокадра с 1,0 с до 0,1–0,2 с, потери фрагментов — с 9,9 до 0,5 %, долю подтверждённых видеокадров подняло с 75 до 99,2 % (28.09): очередь в модуле перестала переполняться. В итоговой версии W = 4: после смены ролей при W = 2 окно было закрыто большую часть времени (05.10).</w:t>
+        <w:t>Приёмник подтверждает каждый видеокадр квитанцией, в которой указано, какие фрагменты дошли; тело квитанции сокращено до 20 Б, потому что сообщения от приёмника к камере длиннее 27 Б до камеры не доходили (07.10). Камера допускает не более W отправленных, но не подтверждённых видеокадров, а устаревшие видеокадры из очереди удаляет. Окно W = 2 на стенде снизило медиану времени от съёмки видеокадра до квитанции с 1,0 с до 0,1–0,2 с, потери фрагментов — с 9,9 до 0,5 %, долю подтверждённых видеокадров подняло с 75 до 99,2 % (28.09): очередь в модуле перестала переполняться. В итоговой версии W = 4: после смены ролей при W = 2 окно было закрыто большую часть времени (05.10).</w:t>
       </w:r>
     </w:p>
     <w:p>
@@ -8415,7 +8205,7 @@
         <w:t xml:space="preserve">Гибрид помехоустойчивого кодирования и досылки. </w:t>
       </w:r>
       <w:r>
-        <w:t>Видеокадр из K фрагментов передаётся с M контрольными фрагментами — суммами XOR чередующихся групп, — и серия до M пропавших подряд фрагментов восстанавливается. Число M от 0 до 8 камера раз в 2 с подбирает по последним 48 квитанциям. Что контрольные фрагменты не закрыли, камера досылает один раз, если видеокадр моложе 1,5 с. Программа просмотра восстанавливает данные и показывает видеокадры по порядку с ожиданием до 0,7 с. На трассе 5 м теряется 2–3 % фрагментов, чаще по 1–2 в видеокадре, поэтому подбор держит M около нуля и работает досылка. Постоянная избыточность (4 контрольных фрагмента, 30 % байтов) хуже: 542 кбит/с и 4,6 % потерянных видеокадров — лишняя нагрузка сама поднимает потери (07.10). Алгоритм проверен отдельной проверочной программой: пройдены все 19 проверок.</w:t>
+        <w:t>Видеокадр из K фрагментов передаётся с M контрольными фрагментами — суммами XOR чередующихся групп, — и серия до M пропавших подряд фрагментов восстанавливается. Это код для стираний: он не ищет ошибочные биты, а восстанавливает целиком пропавшие фрагменты, номера которых известны по нумерации. Он дополняет две ступени защиты самого радиоканала — свёрточный код физического уровня, исправляющий битовые ошибки внутри кадра, и повторы MAC — и закрывает фрагменты, не дошедшие даже после повторов. Число M от 0 до 8 камера раз в 2 с подбирает по последним 48 квитанциям. Что контрольные фрагменты не закрыли, камера досылает один раз, если видеокадр моложе 1,5 с. Программа просмотра восстанавливает данные и показывает видеокадры по порядку с ожиданием до 0,7 с. На трассе 5 м теряется 2–3 % фрагментов, чаще по 1–2 в видеокадре, поэтому подбор держит M около нуля и работает досылка. Постоянная избыточность (4 контрольных фрагмента, 30 % байтов) хуже: 542 кбит/с и 4,6 % потерянных видеокадров — лишняя нагрузка сама поднимает потери (07.10). Алгоритм проверен отдельной проверочной программой: пройдены все 19 проверок.</w:t>
       </w:r>
     </w:p>
     <w:p>
@@ -12174,7 +11964,7 @@
         <w:t>3.9</w:t>
       </w:r>
       <w:r>
-        <w:t>) получены на мосте и над водой при мощности +20 дБм на частотах 890 и 906 МГц; ширина канала в руководстве не указана, по скорости на 300 м — вероятно, 8 МГц [27]. Паспорт модуля для канала 2 МГц при +20 дБм указывает 1200 м и скорость TCP более 2 Мбит/с [17]. Расчётный уровень приёма в таблице получен по формуле (1.1) для 890 МГц при мощности 20 дБм и антеннах 0 дБи (усиление антенн в руководстве не указано).</w:t>
+        <w:t>) получены на мосте и над водой при мощности +20 дБм на частотах 890 и 906 МГц; ширина канала в руководстве не указана, по скорости на 300 м — вероятно, 8 МГц [26]. Паспорт модуля для канала 2 МГц при +20 дБм указывает 1200 м и скорость TCP более 2 Мбит/с [17]. Расчётный уровень приёма в таблице получен по формуле (1.1) для 890 МГц при мощности 20 дБм и антеннах 0 дБи (усиление антенн в руководстве не указано).</w:t>
       </w:r>
     </w:p>
     <w:p>
@@ -12183,7 +11973,7 @@
         <w:ind w:firstLine="0"/>
       </w:pPr>
       <w:r>
-        <w:t>Таблица 3.9 – Натурные данные производителя радиомодуля TX-AH [27] и расчёт</w:t>
+        <w:t>Таблица 3.9 – Натурные данные производителя радиомодуля TX-AH [26] и расчёт</w:t>
       </w:r>
     </w:p>
     <w:tbl>
@@ -12691,7 +12481,7 @@
     </w:p>
     <w:p>
       <w:r>
-        <w:t>На 300 и 600 м измеренный уровень сигнала при принятом допущении об антеннах совпадает с расчётом для свободного пространства в пределах 2 дБ, то есть на этих трассах прямой видимости показатель затухания близок к 2. На 1200 м над водой уровень на 6–8 дБ выше расчёта, а скорость зависела от высоты антенны ведомого узла (4,0–4,1 Мбит/с опущенной и 6,5–6,6 Мбит/с поднятой) — прямое подтверждение вывода о высоте антенн. Пересчёт на нормы Российской Федерации: снижение мощности с 20 до 14 дБм (на 6 дБ) вдвое сокращает дальность в свободном пространстве, то есть 1200 м паспорта соответствуют около 600 м при той же скорости. Ретранслятор, по данным производителя, вдвое снижает поток и вдвое увеличивает задержку [27]. Собственная точка стенда — трасса 5 м через стену: уровень сигнала −53 дБм при отношении сигнал/шум 36 дБ (07.10).</w:t>
+        <w:t>На 300 и 600 м измеренный уровень сигнала при принятом допущении об антеннах совпадает с расчётом для свободного пространства в пределах 2 дБ, то есть на этих трассах прямой видимости показатель затухания близок к 2. На 1200 м над водой уровень на 6–8 дБ выше расчёта, а скорость зависела от высоты антенны ведомого узла (4,0–4,1 Мбит/с опущенной и 6,5–6,6 Мбит/с поднятой) — прямое подтверждение вывода о высоте антенн. Пересчёт на нормы Российской Федерации: снижение мощности с 20 до 14 дБм (на 6 дБ) вдвое сокращает дальность в свободном пространстве, то есть 1200 м паспорта соответствуют около 600 м при той же скорости. Ретранслятор, по данным производителя, вдвое снижает поток и вдвое увеличивает задержку [26]. Собственная точка стенда — трасса 5 м через стену: уровень сигнала −53 дБм при отношении сигнал/шум 36 дБ (07.10).</w:t>
       </w:r>
     </w:p>
     <w:p>
@@ -13905,7 +13695,7 @@
               <w:rPr>
                 <w:sz w:val="20"/>
               </w:rPr>
-              <w:t>−53 дБм на 5 м (стенд); −59…−69 дБм на 300–1200 м [27]; чувствит. −105 дБм (1 МГц) [17]</w:t>
+              <w:t>−53 дБм на 5 м (стенд); −59…−69 дБм на 300–1200 м [26]; чувствит. −105 дБм (1 МГц) [17]</w:t>
             </w:r>
           </w:p>
         </w:tc>
@@ -14005,7 +13795,7 @@
               <w:rPr>
                 <w:sz w:val="20"/>
               </w:rPr>
-              <w:t>RTT по квитанции, медиана 0,34–0,50 с (стенд, видео); ретранслятор удваивает [27]</w:t>
+              <w:t>RTT по квитанции, медиана 0,34–0,50 с (стенд, видео); ретранслятор удваивает [26]</w:t>
             </w:r>
           </w:p>
         </w:tc>
@@ -14852,7 +14642,7 @@
         <w:jc w:val="left"/>
       </w:pPr>
       <w:r>
-        <w:t>25. Russell, M. Interchannel interference analysis of OFDM in a mobile environment / M. Russell, G. L. Stüber // 1995 IEEE 45th Vehicular Technology Conference. – IEEE, 1995. – P. 820–824. – Текст : электронный.</w:t>
+        <w:t>25. Aust, S. Sub 1GHz wireless LAN propagation path loss models for urban smart grid applications / S. Aust, T. Ito // 2012 International Conference on Computing, Networking and Communications (ICNC). – Maui : IEEE, 2012. – P. 116–120. – DOI 10.1109/ICCNC.2012.6167392. – Текст : электронный.</w:t>
       </w:r>
     </w:p>
     <w:p>
@@ -14861,7 +14651,7 @@
         <w:jc w:val="left"/>
       </w:pPr>
       <w:r>
-        <w:t>26. Aust, S. Sub 1GHz wireless LAN propagation path loss models for urban smart grid applications / S. Aust, T. Ito // 2012 International Conference on Computing, Networking and Communications (ICNC). – Maui : IEEE, 2012. – P. 116–120. – DOI 10.1109/ICCNC.2012.6167392. – Текст : электронный.</w:t>
+        <w:t>26. 泰芯 AH 网桥使用说明 [Руководство по использованию моста AH] : версия V1.3.4 от 07.09.2023 / Zhuhai Taixin Semiconductor Co., Ltd. – Текст : электронный // GitHub : репозиторий Xinyuan-LilyGO/T-Halow. – URL: https://github.com/Xinyuan-LilyGO/T-Halow/tree/master/hardware/TX_AH (дата обращения: 08.10.2026).</w:t>
       </w:r>
     </w:p>
     <w:p>
@@ -14870,7 +14660,7 @@
         <w:jc w:val="left"/>
       </w:pPr>
       <w:r>
-        <w:t>27. 泰芯 AH 网桥使用说明 [Руководство по использованию моста AH] : версия V1.3.4 от 07.09.2023 / Zhuhai Taixin Semiconductor Co., Ltd. – Текст : электронный // GitHub : репозиторий Xinyuan-LilyGO/T-Halow. – URL: https://github.com/Xinyuan-LilyGO/T-Halow/tree/master/hardware/TX_AH (дата обращения: 08.10.2026).</w:t>
+        <w:t>27. 泰芯 802.11AH 频点设置说明 [Описание настройки частот 802.11ah] : версия V2.0 от 30.11.2023 / Zhuhai Taixin Semiconductor Co., Ltd. – Текст : электронный // GitHub : репозиторий Xinyuan-LilyGO/T-Halow. – URL: https://github.com/Xinyuan-LilyGO/T-Halow/tree/master/hardware/TX_AH (дата обращения: 15.10.2026).</w:t>
       </w:r>
     </w:p>
     <w:p>
@@ -15267,7 +15057,7 @@
       <w:pgMar w:top="1134" w:right="850" w:bottom="1417" w:left="1701" w:header="283" w:footer="283" w:gutter="0"/>
       <w:cols w:space="720"/>
       <w:docGrid w:linePitch="360"/>
-      <w:pgNumType w:start="76"/>
+      <w:pgNumType w:start="75"/>
     </w:sectPr>
   </w:body>
 </w:document>
@@ -16930,7 +16720,7 @@
               <w:sz w:val="18"/>
               <w:szCs w:val="18"/>
             </w:rPr>
-            <w:t xml:space="preserve">86</w:t>
+            <w:t xml:space="preserve">85</w:t>
           </w:r>
         </w:p>
       </w:tc>

</xml_diff>

<commit_message>
Labour safety rewritten, practice journal, main-text remarks fixed
- OT section rebuilt around the lighting task: agreed office plan, 8 panels
  (97 -> 317 lx), workplace area, noise, fire load (paper 30 kg), screens on
  radiators, side-view figure with neck; sources from the lectures
- Practice journal filled from the department template with the system tasks
- User's inline remarks in the main part addressed; stale source keys removed
- Slides read OT figures from calc_ot; review checklist added

Co-Authored-By: Claude Opus 5.5 <noreply@anthropic.com>
</commit_message>
<xml_diff>
--- a/docs/vkr/Osnovnaya_chast_HaLow.docx
+++ b/docs/vkr/Osnovnaya_chast_HaLow.docx
@@ -289,7 +289,7 @@
       <w:r>
         <w:t>3.4 Доработки канала передачи видео и итоговые результаты</w:t>
         <w:tab/>
-        <w:t>31</w:t>
+        <w:t>32</w:t>
       </w:r>
     </w:p>
     <w:p>
@@ -317,7 +317,7 @@
       <w:r>
         <w:t>3.6 Оценка дальности: расчёт бюджета канала и опубликованные натурные данные</w:t>
         <w:tab/>
-        <w:t>36</w:t>
+        <w:t>37</w:t>
       </w:r>
     </w:p>
     <w:p>
@@ -331,7 +331,7 @@
       <w:r>
         <w:t>3.7 Сравнение с IEEE 802.11 (Wi-Fi 2,4 и 5 ГГц) и LoRa</w:t>
         <w:tab/>
-        <w:t>39</w:t>
+        <w:t>40</w:t>
       </w:r>
     </w:p>
     <w:p>
@@ -345,7 +345,7 @@
       <w:r>
         <w:t>3.8 Выводы</w:t>
         <w:tab/>
-        <w:t>44</w:t>
+        <w:t>45</w:t>
       </w:r>
     </w:p>
     <w:p>
@@ -359,7 +359,7 @@
       <w:r>
         <w:t>4 Экономическая часть</w:t>
         <w:tab/>
-        <w:t>46</w:t>
+        <w:t>47</w:t>
       </w:r>
     </w:p>
     <w:p>
@@ -373,7 +373,7 @@
       <w:r>
         <w:t>4.1 Оценка целесообразности проведения исследования</w:t>
         <w:tab/>
-        <w:t>47</w:t>
+        <w:t>48</w:t>
       </w:r>
     </w:p>
     <w:p>
@@ -387,7 +387,7 @@
       <w:r>
         <w:t>4.2 Планирование разработки</w:t>
         <w:tab/>
-        <w:t>50</w:t>
+        <w:t>51</w:t>
       </w:r>
     </w:p>
     <w:p>
@@ -401,7 +401,7 @@
       <w:r>
         <w:t>4.3 Определение затрат, себестоимости и цены разработки</w:t>
         <w:tab/>
-        <w:t>53</w:t>
+        <w:t>54</w:t>
       </w:r>
     </w:p>
     <w:p>
@@ -415,7 +415,7 @@
       <w:r>
         <w:t>4.4 Определение и оценка основных показателей экономической эффективности</w:t>
         <w:tab/>
-        <w:t>56</w:t>
+        <w:t>57</w:t>
       </w:r>
     </w:p>
     <w:p>
@@ -429,7 +429,7 @@
       <w:r>
         <w:t>5 Охрана труда и окружающей среды</w:t>
         <w:tab/>
-        <w:t>60</w:t>
+        <w:t>61</w:t>
       </w:r>
     </w:p>
     <w:p>
@@ -443,7 +443,7 @@
       <w:r>
         <w:t>5.1 Введение</w:t>
         <w:tab/>
-        <w:t>60</w:t>
+        <w:t>61</w:t>
       </w:r>
     </w:p>
     <w:p>
@@ -455,9 +455,9 @@
         <w:jc w:val="left"/>
       </w:pPr>
       <w:r>
-        <w:t>5.2 Характеристика рабочего места</w:t>
+        <w:t>5.2 Характеристика производственного оборудования</w:t>
         <w:tab/>
-        <w:t>60</w:t>
+        <w:t>62</w:t>
       </w:r>
     </w:p>
     <w:p>
@@ -469,7 +469,7 @@
         <w:jc w:val="left"/>
       </w:pPr>
       <w:r>
-        <w:t>5.3 Анализ опасных и вредных производственных факторов</w:t>
+        <w:t>5.3 Характеристика производственного процесса</w:t>
         <w:tab/>
         <w:t>63</w:t>
       </w:r>
@@ -483,9 +483,9 @@
         <w:jc w:val="left"/>
       </w:pPr>
       <w:r>
-        <w:t>5.4 Микроклимат рабочего места</w:t>
+        <w:t>5.4 Оценка условий труда</w:t>
         <w:tab/>
-        <w:t>64</w:t>
+        <w:t>63</w:t>
       </w:r>
     </w:p>
     <w:p>
@@ -497,9 +497,9 @@
         <w:jc w:val="left"/>
       </w:pPr>
       <w:r>
-        <w:t>5.5 Освещение рабочего места</w:t>
+        <w:t>5.5 Оценка условий труда по эргономическим параметрам</w:t>
         <w:tab/>
-        <w:t>65</w:t>
+        <w:t>69</w:t>
       </w:r>
     </w:p>
     <w:p>
@@ -511,9 +511,9 @@
         <w:jc w:val="left"/>
       </w:pPr>
       <w:r>
-        <w:t>5.6 Шум</w:t>
+        <w:t>5.6 Оценка помещения по электроопасности</w:t>
         <w:tab/>
-        <w:t>67</w:t>
+        <w:t>72</w:t>
       </w:r>
     </w:p>
     <w:p>
@@ -525,9 +525,9 @@
         <w:jc w:val="left"/>
       </w:pPr>
       <w:r>
-        <w:t>5.7 Электромагнитные поля</w:t>
+        <w:t>5.7 Классификация помещения по пожароопасности</w:t>
         <w:tab/>
-        <w:t>68</w:t>
+        <w:t>72</w:t>
       </w:r>
     </w:p>
     <w:p>
@@ -539,9 +539,9 @@
         <w:jc w:val="left"/>
       </w:pPr>
       <w:r>
-        <w:t>5.8 Электробезопасность</w:t>
+        <w:t>5.8 Расчёт искусственного освещения</w:t>
         <w:tab/>
-        <w:t>69</w:t>
+        <w:t>74</w:t>
       </w:r>
     </w:p>
     <w:p>
@@ -553,9 +553,9 @@
         <w:jc w:val="left"/>
       </w:pPr>
       <w:r>
-        <w:t>5.9 Пожарная безопасность</w:t>
+        <w:t>5.9 Охрана окружающей среды</w:t>
         <w:tab/>
-        <w:t>70</w:t>
+        <w:t>77</w:t>
       </w:r>
     </w:p>
     <w:p>
@@ -567,65 +567,9 @@
         <w:jc w:val="left"/>
       </w:pPr>
       <w:r>
-        <w:t>5.10 Тяжесть и напряжённость трудового процесса</w:t>
+        <w:t>5.10 Выводы</w:t>
         <w:tab/>
-        <w:t>71</w:t>
-      </w:r>
-    </w:p>
-    <w:p>
-      <w:pPr>
-        <w:tabs>
-          <w:tab w:pos="9354" w:val="right" w:leader="dot"/>
-        </w:tabs>
-        <w:ind w:firstLine="0" w:left="283" w:right="567"/>
-        <w:jc w:val="left"/>
-      </w:pPr>
-      <w:r>
-        <w:t>5.11 Безопасность при полевых измерениях</w:t>
-        <w:tab/>
-        <w:t>73</w:t>
-      </w:r>
-    </w:p>
-    <w:p>
-      <w:pPr>
-        <w:tabs>
-          <w:tab w:pos="9354" w:val="right" w:leader="dot"/>
-        </w:tabs>
-        <w:ind w:firstLine="0" w:left="283" w:right="567"/>
-        <w:jc w:val="left"/>
-      </w:pPr>
-      <w:r>
-        <w:t>5.12 Охрана окружающей среды</w:t>
-        <w:tab/>
-        <w:t>73</w:t>
-      </w:r>
-    </w:p>
-    <w:p>
-      <w:pPr>
-        <w:tabs>
-          <w:tab w:pos="9354" w:val="right" w:leader="dot"/>
-        </w:tabs>
-        <w:ind w:firstLine="0" w:left="283" w:right="567"/>
-        <w:jc w:val="left"/>
-      </w:pPr>
-      <w:r>
-        <w:t>5.13 Класс условий труда</w:t>
-        <w:tab/>
-        <w:t>73</w:t>
-      </w:r>
-    </w:p>
-    <w:p>
-      <w:pPr>
-        <w:tabs>
-          <w:tab w:pos="9354" w:val="right" w:leader="dot"/>
-        </w:tabs>
-        <w:ind w:firstLine="0" w:left="283" w:right="567"/>
-        <w:jc w:val="left"/>
-      </w:pPr>
-      <w:r>
-        <w:t>5.14 Выводы</w:t>
-        <w:tab/>
-        <w:t>74</w:t>
+        <w:t>77</w:t>
       </w:r>
     </w:p>
     <w:p>
@@ -639,7 +583,7 @@
       <w:r>
         <w:t>Заключение</w:t>
         <w:tab/>
-        <w:t>75</w:t>
+        <w:t>79</w:t>
       </w:r>
     </w:p>
     <w:p>
@@ -653,7 +597,7 @@
       <w:r>
         <w:t>Список использованных источников</w:t>
         <w:tab/>
-        <w:t>77</w:t>
+        <w:t>81</w:t>
       </w:r>
     </w:p>
     <w:p>
@@ -836,7 +780,7 @@
         <w:t xml:space="preserve">Пояснительная записка состоит из введения, пяти глав, заключения и списка использованных источников. В первой главе выполнен сравнительный анализ Wi-Fi HaLow с другими вариантами канала связи с БПЛА, во второй — обоснование эксперимента, его методика, выбор и настройка средств, в третьей приведены результаты серии экспериментов и сравнение с другими протоколами. Четвёртая глава содержит экономическую часть, пятая — раздел охраны труда и окружающей среды. В заключении сформулированы основные результаты и предложения по интеграции разработанных решений в существующие модели БПЛА. </w:t>
       </w:r>
       <w:r>
-        <w:t>Пояснительная записка: 85 с., 9 рис., 35 табл., 70 источн.</w:t>
+        <w:t>Пояснительная записка: 90 с., 11 рис., 34 табл., 75 источн.</w:t>
       </w:r>
     </w:p>
     <w:p>
@@ -6473,17 +6417,12 @@
     </w:p>
     <w:p>
       <w:r>
-        <w:t>4) Роли и протокол доступа. Камера — точка доступа, приёмник — станция (переключатель роли модуля на плате, с 05.10). Обмен RTS/CTS выключен командой AT+SET_RTS=1000 в интервале настройки после включения (29.09).</w:t>
+        <w:t>4) Роли и протокол доступа. С 05.10 модуль камеры работает точкой доступа, модуль приёмника — станцией (роль задаёт переключатель на плате). Пока камера была станцией, её широковещательные кадры проходили эфир дважды: сначала модуль отправлял их точке доступа, затем точка рассылала их ещё раз на самой медленной модуляции. В роли точки доступа камера передаёт видео приёмнику один раз, адресно, с подтверждениями и повторами, и на её модуле работают регулятор мощности и нижняя граница модуляции (раздел 3.4). Обмен RTS/CTS — короткие кадры «запрос на передачу» и «разрешение на передачу», которыми передатчик перед длинной посылкой занимает эфир, чтобы её не перебили станции, не слышащие друг друга [5]. В сети из двух узлов таких станций нет, и обмен только тратит эфир; он выключен командой AT+SET_RTS=1000 (29.09), что подняло скорость в 1,8–2,2 раза (раздел 3.4).</w:t>
       </w:r>
     </w:p>
     <w:p>
       <w:r>
-        <w:t>5) Доработки программы модуля. Изменены драйвер UART модуля (чтение всего буфера FIFO за одно прерывание), размер кольцевого буфера моста (с 2048 до 8192 Б, правкой двоичной библиотеки с пересчётом контрольной суммы образа), таймер паузы на входе UART (с 2 мс до 400 мкс) и скорость интерфейса (3 Мбод при рекомендованных производителем 400 кбод [36]). Добавлены команды регулятора мощности по отношению сигнал/шум (AT+PWRCTL), нижней границы модуляции по уровню сигнала (AT+MCSFLR) и модуляции широковещательных кадров (AT+MCSCTL). Результаты — в разделах 3.3 и 3.4.</w:t>
-      </w:r>
-    </w:p>
-    <w:p>
-      <w:r>
-        <w:t>6) Питание. При питании платы с камерой от USB компьютера наблюдались зависания; плата питается от отдельного источника (внешнего аккумулятора).</w:t>
+        <w:t>5) Доработки программы модуля: драйвер UART, буфер моста, таймер паузы и скорость интерфейса 3 Мбод вместо рекомендованных производителем 400 кбод [36]; добавлены команды регулятора мощности (AT+PWRCTL), нижней границы модуляции (AT+MCSFLR) и модуляции широковещательных кадров (AT+MCSCTL). Подробности — в разделах 3.3 и 3.4.</w:t>
       </w:r>
     </w:p>
     <w:p>
@@ -6544,7 +6483,7 @@
         <w:t xml:space="preserve">Лабораторный этап (до 28.09). </w:t>
       </w:r>
       <w:r>
-        <w:t>Платы располагались в помещении на расстоянии до 5 м. Канал — заводской, шириной 4 МГц с центром 866,0 МГц, мощность передатчика до 20 дБм; оба параметра выходят за рамки решений ГКРЧ [15, 23], и эти условия рассматриваются только как лабораторные. Камера снимала видеокадры 240 × 176 точек, качество сжатия JPEG было постоянным — 60 (автоматическое управление качеством введено 06.10). При мощности 20 дБм на расстоянии до 5 м сигнал на входе приёмника был заведомо сильным — модуль сообщал уровень до −5 дБм, поэтому результаты этапа характеризуют платформу, а не дальность.</w:t>
+        <w:t>Платы располагались в помещении на расстоянии до 5 м. Канал — заводской, шириной 4 МГц с центром 866,0 МГц, мощность передатчика до 20 дБм; оба параметра выходят за рамки решений ГКРЧ [15, 23], и эти условия рассматриваются только как лабораторные. Камера снимала видеокадры 240 × 176 точек, качество сжатия JPEG было постоянным — 60 (автоматическое управление качеством введено 06.10). При мощности 20 дБм на расстоянии до 5 м сигнал на входе приёмника был сильным — модуль сообщал уровень до −5 дБм, — поэтому на этом этапе искались ограничения самой платформы (интерфейсов и сжатия видео), а дальность связи не оценивалась.</w:t>
       </w:r>
     </w:p>
     <w:p>
@@ -6555,7 +6494,7 @@
         <w:t xml:space="preserve">Рабочая конфигурация (с 28.09). </w:t>
       </w:r>
       <w:r>
-        <w:t>Канал 2 МГц с центром 867,0 МГц (полоса 866–868 МГц), мощность не более 14 дБм. Камера — в соседней комнате на расстоянии около 5 м от приёмника, питание от внешнего аккумулятора; приёмник подключён к компьютеру по USB. Разрешение — 320 × 240 точек с 29.09 и 480 × 320 с 06.10. С 05.10 модуль камеры работает точкой доступа (AP), модуль приёмника — станцией (STA). Итоговая версия программного обеспечения стенда зафиксирована 08.10.2026.</w:t>
+        <w:t>Канал 2 МГц с центром 867,0 МГц (полоса 866–868 МГц), мощность не более 14 дБм. Камера — в соседней комнате на расстоянии около 5 м от приёмника, питание от внешнего аккумулятора; приёмник подключён к компьютеру по USB. Разрешение — 320 × 240 точек с 29.09 и 480 × 320 с 06.10. С 05.10 модуль камеры работает точкой доступа (AP), модуль приёмника — станцией (STA); причины смены ролей приведены в разделе 2.6 (пункт 4) и в разделе 3.4. Итоговая версия программного обеспечения стенда зафиксирована 08.10.2026.</w:t>
       </w:r>
     </w:p>
     <w:p>
@@ -7114,7 +7053,7 @@
     </w:p>
     <w:p>
       <w:r>
-        <w:t>Потери определяет полоса приёма: её сужение с 8 МГц вдвое снизило их вчетверо, а ширина сигнала при более узкой полосе приёма почти не влияет (1,71 и 1,88 % — в пределах разброса). Механизм следует из формулы (1.2): приёмник с полосой 8 МГц собирает вчетверо больше шума, чем нужно сигналу шириной 2 МГц, что даёт потерю 6,0 дБ отношения сигнал/шум. Эксперимент подтвердил теоретическую оценку качественно и по порядку величины.</w:t>
+        <w:t>Потери определяет полоса приёма: её сужение с 8 МГц вдвое снизило их вчетверо, а ширина сигнала при более узкой полосе приёма почти не влияет (1,71 и 1,88 % — в пределах разброса). Причина — шум: мощность теплового шума на входе приёмника пропорциональна его полосе. Приёмник с полосой 8 МГц собирает вчетверо больше шума, чем с полосой 2 МГц, хотя сигнал занимает только 2 МГц; отношение сигнал/шум падает вчетверо, то есть на 10·lg 4 = 6,0 дБ. Эксперимент подтвердил эту оценку качественно и по порядку величины.</w:t>
       </w:r>
     </w:p>
     <w:p>
@@ -7138,7 +7077,7 @@
         <w:t>3.1</w:t>
       </w:r>
       <w:r>
-        <w:t>. Условия замеров различаются: лабораторные точки сняты в помещении на расстоянии до 5 м при разрешении 240 × 176 в канале 4 МГц, точки 29.09–08.10 — на трассе 5 м в канале 2 МГц, мера скорости менялась от байтов на приёмнике к полезной скорости. Поэтому рисунок показывает путь, а не ряд сравнимых точек; доработки последнего этапа сравниваются парными опытами в одном включении (раздел 3.4).</w:t>
+        <w:t>. Условия замеров различаются: лабораторные точки сняты при разрешении 240 × 176 в канале 4 МГц, точки 29.09–08.10 — на трассе 5 м в канале 2 МГц; в ранних замерах считались все байты, принятые приёмником, в поздних — только полезное видео. Поэтому рисунок показывает путь доработки, а не ряд сравнимых точек; доработки последнего этапа сравниваются парными опытами в одном включении (раздел 3.4).</w:t>
       </w:r>
     </w:p>
     <w:p>
@@ -7199,13 +7138,13 @@
         <w:t xml:space="preserve">Приём UART в модуле. </w:t>
       </w:r>
       <w:r>
-        <w:t xml:space="preserve">При скорости интерфейса 3 Мбод видео не доходило: за опыт собиралось лишь несколько видеокадров, ошибки контрольной суммы на приёмнике росли. Счётчики, добавленные в драйвер UART модуля, показали причину (таблица </w:t>
+        <w:t xml:space="preserve">При скорости интерфейса 3 Мбод видео не доходило: за опыт собиралось лишь несколько видеокадров. Причина — в том, как модуль принимал байты (таблица </w:t>
       </w:r>
       <w:r>
         <w:t>3.2</w:t>
       </w:r>
       <w:r>
-        <w:t>): порог буфера FIFO был установлен в один символ, и обработчик читал один байт за вход в прерывание. При 3 Мбод это 300 тысяч прерываний в секунду на процессоре 96 МГц — около 320 тактов на байт, включая работу программного MAC-уровня радио. Изменение драйвера — чтение всего FIFO (до 64 Б) за одно прерывание — устранило переполнения полностью.</w:t>
+        <w:t>). Принятые байты складываются в аппаратный буфер FIFO на 64 Б, а процессор модуля забирает их по прерыванию. В исходном драйвере прерывание срабатывало на каждый байт и забирало только его. При 3 Мбод байты приходят 300 тысяч раз в секунду, и процессор модуля, который одновременно обслуживает радио, не успевал: буфер переполнялся, и терялось 89,5 % байтов. Драйвер изменён так, что за одно прерывание забирается всё накопленное в буфере, в среднем 11 байт, — переполнения исчезли полностью.</w:t>
       </w:r>
     </w:p>
     <w:p>
@@ -7564,7 +7503,7 @@
         <w:t xml:space="preserve">Паузы между фрагментами. </w:t>
       </w:r>
       <w:r>
-        <w:t>Модуль собирает байты из UART и отправляет в эфир кадр MAC после паузы на линии, равной уставке его таймера паузы, — исходно 2 мс. Фрагменты процессора поэтому разделяются паузой: на лабораторном этапе при паузе 3 мс потерь не было, при 2 мс терялось 25,6 % фрагментов, при 1 мс — 99,6 % (25.09); при более короткой паузе соседние фрагменты склеиваются в один кадр MAC, превышают допустимый размер и отбрасываются. 29.09 уставка таймера паузы уменьшена до 400 мкс правкой одной инструкции в закрытой библиотеке модуля, а пауза отсчитывается от конца передачи. Перебор паузы показал, что после срабатывания таймера модулю нужно ещё около 1–1,5 мс на обработку кадра MAC: при 2,0 мс — 886 кбит/с и ни одного переполнения, при 1,5 мс — 990 кбит/с и 0,5 % повреждённых фрагментов, при 1,0 мс — 846 кбит/с и 2,5 %, при 0,6 мс поток разрушается (21 % повреждённых). В итоговой версии принята пауза 1,5 мс.</w:t>
+        <w:t>Модуль не знает, где кончается фрагмент: он копит байты из UART и отправляет накопленное в эфир одним кадром MAC, когда на линии наступает пауза дольше уставки его таймера — исходно 2 мс. Поэтому процессор камеры должен выдерживать между фрагментами паузу длиннее уставки, иначе два фрагмента склеиваются в один слишком длинный кадр, и модуль его отбрасывает. На лабораторном этапе при паузе 3 мс потерь не было, при 2 мс терялось 25,6 % фрагментов, при 1 мс — 99,6 % (25.09). Но пока идёт пауза, линия простаивает. Чтобы сократить простой, 29.09 уставка таймера уменьшена с 2 мс до 400 мкс правкой одной инструкции в закрытой библиотеке модуля. Подбор паузы после этого показал: при 2,0 мс — 886 кбит/с без потерь, при 1,5 мс — 990 кбит/с и 0,5 % повреждённых фрагментов, при 1,0 мс — 846 кбит/с и 2,5 %, при 0,6 мс поток разрушается (21 % повреждённых): после паузы модулю нужно ещё около 1–1,5 мс на отправку кадра. Принята пауза 1,5 мс — она дала наибольшую скорость, на 12 % выше, чем при 2 мс, при малой доле повреждений.</w:t>
       </w:r>
     </w:p>
     <w:p>
@@ -7575,7 +7514,7 @@
         <w:t xml:space="preserve">Бюджет интерфейса. </w:t>
       </w:r>
       <w:r>
-        <w:t>Время передачи одного фрагмента с полезной нагрузкой L и заголовком h при скорости интерфейса B и формате 8N1 (10 бит на байт)</w:t>
+        <w:t>Предел скорости интерфейса следует из формата UART: каждый байт передаётся 10 битами — стартовый бит, 8 бит данных и стоповый бит (формат 8N1). Поэтому фрагмент с полезной нагрузкой L и заголовком h занимает линию на время 10(L + h)/B, где B — скорость интерфейса, и к нему добавляется пауза:</w:t>
       </w:r>
     </w:p>
     <w:tbl>
@@ -8121,7 +8060,7 @@
     </w:p>
     <w:p>
       <w:r>
-        <w:t>Скорость UART ограничена с обеих сторон: у ESP32-S3 предел составляет 5 Мбод [37], у модуля — 6 Мбод (тактовая частота 96 МГц при 16-кратной передискретизации). При 5 Мбод поток байтов на линии составляет 4,0 Мбит/с, полезный — 3,92 Мбит/с. Это архитектурный предел платформы: его нельзя превысить никакими программными доработками, пока данные идут через UART, и он ниже скорости физического уровня в канале 2 МГц (6,5 Мбит/с). В итоговой настройке (3 Мбод, пауза 1,5 мс) предел интерфейса — 1,79 Мбит/с; пауза занимает 24 % времени линии, поэтому сокращение паузы дало бы больше, чем повышение скорости интерфейса.</w:t>
+        <w:t>Скорость UART ограничена с обеих сторон: у ESP32-S3 предел составляет 5 Мбод [37], у радиомодуля TX-AH — 6 Мбод (тактовая частота 96 МГц при 16-кратной передискретизации). При 5 Мбод поток байтов на линии составляет 4,0 Мбит/с, полезный — 3,92 Мбит/с. Это архитектурный предел платформы: его нельзя превысить никакими программными доработками, пока данные идут через UART, и он ниже скорости физического уровня в канале 2 МГц (6,5 Мбит/с). В итоговой настройке (3 Мбод, пауза 1,5 мс) предел интерфейса — 1,79 Мбит/с; пауза занимает 24 % времени линии. Сокращение паузы дало бы больше, чем повышение скорости интерфейса, но ниже 1,5 мс растёт доля повреждённых фрагментов, и этот запас взять нельзя.</w:t>
       </w:r>
     </w:p>
     <w:p>
@@ -8132,7 +8071,7 @@
         <w:t xml:space="preserve">Кодер. </w:t>
       </w:r>
       <w:r>
-        <w:t>На лабораторном этапе программный кодер одного ядра сжимал видеокадр 42 240 точек за 41 мс, то есть 1,03 Мпикс/с; при 0,76 бит на точку это ограничивало поток величиной 0,78 Мбит/с, и из этой оценки следовало, что повышение разрешения скорость не увеличит. Вывод опровергнут: кодер esp_new_jpeg 1.0.2, работающий на двух ядрах, сжимает видеокадр 320 × 240 за 62–68 мс вместо около 150 мс у прежнего кодера; частота видеокадров стала ограничиваться сенсором, что позволило перейти к разрешению 480 × 320 при той же скорости канала (06.10).</w:t>
+        <w:t>На лабораторном этапе программный кодер JPEG на одном ядре сжимал около 1,03 млн точек в секунду (видеокадр 42 240 точек за 41 мс). Отсюда следовало, что поток не превысит 0,78 Мбит/с (при 0,76 бит на точку) при любом разрешении: чем больше точек в кадре, тем дольше он сжимается и тем меньше кадров в секунду, а поток в битах остаётся прежним. Вывод опровергнут: кодер esp_new_jpeg 1.0.2, работающий на двух ядрах, сжимает видеокадр 320 × 240 за 62–68 мс вместо около 150 мс у прежнего кодера; частота видеокадров стала ограничиваться сенсором, что позволило перейти к разрешению 480 × 320 при той же скорости канала (06.10).</w:t>
       </w:r>
     </w:p>
     <w:p>
@@ -8143,12 +8082,22 @@
         <w:t xml:space="preserve">Ограничивающее звено — радиоканал. </w:t>
       </w:r>
       <w:r>
-        <w:t>После этих доработок ни интерфейс, ни процессоры не ограничивают поток. Скорость подачи данных в модуль ни в одном опыте не превышала примерно 1 Мбит/с при пределе интерфейса около 1,65 Мбит/с с паузой 2 мс (29.09). При передаче видеопотока процессор модуля простаивает 92–93 % времени (07.10), поэтому приём UART через прямой доступ к памяти и скорость 4,8 Мбод проверены и отвергнуты. Ограничивает поток радиоканал между платами. По полному отчёту радиоуровня модуля камеры (07.10, 5 м) эфир занят передачей к приёмнику 99 % времени, PER — 60 %, на 57 % агрегированных кадров MAC блочное подтверждение не получено, и в эфир уходит около 2,4 байта на каждый доставленный. Опыт с ограничением числа попыток передачи показал, что потери происходят в эфире: при одной попытке до приёмника не доходит 38 % фрагментов, при двух — 17,7 %, при заводских семи — 6,6 % при отношении сигнал/шум 26–36 дБ (07.10). Около трети первых передач теряется даже при сильном сигнале. Причина не установлена: одна из версий — помехи платы с камерой, фон которой в августе — сентябре доходил до −60 дБм против −87 дБм у приёмника, однако 05.10 он составлял −101 дБм. Эти потери и задают потолок около 1 Мбит/с полезного видео на данной паре плат.</w:t>
+        <w:t>После этих доработок звенья проверены по очереди. Интерфейс: в модуль подавалось не более примерно 1 Мбит/с при пределе 1,65 Мбит/с с паузой 2 мс (29.09) — запас есть. Процессор модуля: при передаче видео он простаивает 92–93 % времени (07.10) — запас есть, поэтому ускорение интерфейса (приём через прямой доступ к памяти, 4,8 Мбод) проверено и пользы не дало. Радиоканал: по отчёту радиоуровня модуля камеры (07.10, 5 м) эфир занят передачей к приёмнику 99 % времени — запаса нет. Значит, поток ограничивает эфир. Подача около 1 Мбит/с объясняется тем же: камера отправляет новый видеокадр только после квитанции на предыдущие (окно, раздел 3.4), поэтому подаёт в модуль столько, сколько проходит через эфир.</w:t>
       </w:r>
     </w:p>
     <w:p>
       <w:r>
-        <w:t>Главный вывод раздела: на лабораторном этапе пропускную способность последовательно ограничивали драйвер UART модуля, паузы между фрагментами и программное сжатие; после их устранения ограничивающим звеном стал радиоканал между платами — потери первых передач и повторы MAC. Интерфейс UART задаёт архитектурный предел 3,92 Мбит/с, до которого канал не доходит.</w:t>
+        <w:t>Эфир при этом занят в основном повторами: PER — 60 %, на 57 % агрегированных кадров MAC блочное подтверждение не получено, и на каждый доставленный байт в эфир уходит около 2,4 байта. Опыт с ограничением числа попыток передачи показал, что кадры действительно теряются в эфире: при одной попытке до приёмника не доходит 38 % фрагментов, при двух — 17,7 %, при заводских семи — 6,6 % при отношении сигнал/шум 26–36 дБ (07.10).</w:t>
+      </w:r>
+    </w:p>
+    <w:p>
+      <w:r>
+        <w:t>Около трети первых передач теряется при сильном сигнале, хотя при таком отношении сигнал/шум ошибки физического уровня должны быть редкими. Проверены и исключены помехи платы с камерой (фон 05.10 — −101 дБм, близко к собственному шуму приёмника), выбор модуляции (доля неудачных попыток почти одинакова на разных MCS) и длина кадра. Потери не зависят ни от уровня сигнала, ни от модуляции, поэтому наиболее вероятная их причина — реализация MAC-уровня модуля, программа которого закрыта. Проверить это можно опытом эквивалентного затухания: если доля потерь не меняется при ослаблении сигнала на десятки децибел, причина не в распространении радиоволн. Эти потери и задают потолок около 1 Мбит/с полезного видео на данной паре плат.</w:t>
+      </w:r>
+    </w:p>
+    <w:p>
+      <w:r>
+        <w:t>Главный вывод раздела: на лабораторном этапе пропускную способность последовательно ограничивали драйвер UART модуля, паузы между фрагментами и программное сжатие; после их устранения ограничивающим звеном стал радиоканал между платами. Это означает не затухание — на 5 м сигнал сильный, около −53 дБм, — а потери передач: каждый потерянный кадр MAC передаётся повторно, повторы занимают эфир, и на полезное видео остаётся меньше половины его времени. Интерфейс UART задаёт архитектурный предел 3,92 Мбит/с, до которого канал не доходит.</w:t>
       </w:r>
     </w:p>
     <w:p>
@@ -8161,7 +8110,7 @@
     </w:p>
     <w:p>
       <w:r>
-        <w:t>Поскольку радиоканал между платами теряет заметную долю передач, доработки последнего этапа направлены не на скорость интерфейса, а на то, чтобы канал с потерями доставлял видео надёжно и не терял дальность. Всего реализовано 51 решение по радиомодулю, камере, приёмнику и компьютеру; ниже описаны относящиеся к каналу.</w:t>
+        <w:t>Поскольку радиоканал между платами теряет заметную долю передач, доработки последнего этапа направлены не на скорость интерфейса, а на то, чтобы канал с потерями доставлял видео надёжно и не терял дальность. Ниже описаны доработки, относящиеся к радиоканалу.</w:t>
       </w:r>
     </w:p>
     <w:p>
@@ -8183,7 +8132,7 @@
         <w:t xml:space="preserve">Роли узлов. </w:t>
       </w:r>
       <w:r>
-        <w:t>Камера работает точкой доступа (AP), приёмник — станцией (STA). Когда камера была станцией, её широковещательные кадры модуль передавал точке доступа адресно с повторами, а точка рассылала их ещё раз на самой медленной модуляции: 144–175 кбит/с против 241–312 кбит/с при адресной передаче с границей MCS 4 (30.09, условия различались). В роли точки доступа модуль камеры передаёт видео адресно, с агрегацией кадров MAC, блочными подтверждениями и повторами (07.10), и на нём же работают регулятор мощности и нижняя граница модуляции.</w:t>
+        <w:t>Камера работает точкой доступа (AP), приёмник — станцией (STA). Пока камера была станцией, её широковещательные кадры проходили эфир дважды: сначала модуль отправлял их точке доступа (адресно, с повторами), затем точка рассылала их ещё раз на самой медленной модуляции. Адресная передача убрала второй проход и подняла скорость со 144–175 до 241–312 кбит/с — примерно в 1,7 раза (30.09; условия опытов различались, поэтому оценка примерная). В роли точки доступа модуль камеры передаёт видео приёмнику адресно, с агрегацией кадров MAC, блочными подтверждениями и повторами (07.10); кроме того, на точке доступа работают регулятор мощности и нижняя граница модуляции, поэтому эта роль отдана передающей стороне.</w:t>
       </w:r>
     </w:p>
     <w:p>
@@ -14858,7 +14807,7 @@
         <w:jc w:val="left"/>
       </w:pPr>
       <w:r>
-        <w:t>49. ГОСТ 12.2.032-78. Система стандартов безопасности труда. Рабочее место при выполнении работ сидя. Общие эргономические требования : межгосударственный стандарт : издание официальное : утвержден и введен в действие Постановлением Госстандарта СССР от 26.04.1978 № 1102 : дата введения 1979-01-01. – Текст : электронный // Электронный фонд правовых и нормативно-технических документов : [сайт]. – URL: https://docs.cntd.ru/document/1200003913 (дата обращения: 08.10.2026).</w:t>
+        <w:t>49. Об утверждении Методики проведения специальной оценки условий труда, Классификатора вредных и (или) опасных производственных факторов, формы отчета о проведении специальной оценки условий труда и инструкции по ее заполнению : приказ Минтруда России от 21.11.2023 № 817н : зарегистрирован в Минюсте России 30.11.2023 № 76179. – Текст : электронный // Официальный интернет-портал правовой информации : [сайт]. – URL: http://publication.pravo.gov.ru/document/0001202311300048 (дата обращения: 08.10.2026).</w:t>
       </w:r>
     </w:p>
     <w:p>
@@ -14867,7 +14816,7 @@
         <w:jc w:val="left"/>
       </w:pPr>
       <w:r>
-        <w:t>50. ГОСТ Р 50923-96. Дисплеи. Рабочее место оператора. Общие эргономические требования и требования к производственной среде. Методы измерения : государственный стандарт Российской Федерации : издание официальное : утвержден и введен в действие Постановлением Госстандарта России от 10.07.1996 № 451 : дата введения 1997-07-01. – Текст : электронный // Электронный фонд правовых и нормативно-технических документов : [сайт]. – URL: https://docs.cntd.ru/document/1200025975 (дата обращения: 08.10.2026).</w:t>
+        <w:t>50. О специальной оценке условий труда : федеральный закон от 28.12.2013 № 426-ФЗ : принят Государственной думой 23 декабря 2013 года : одобрен Советом Федерации 25 декабря 2013 года. – Текст : электронный // КонсультантПлюс : надежная правовая поддержка : [сайт]. – URL: https://www.consultant.ru/document/cons_doc_LAW_156555/ (дата обращения: 08.10.2026).</w:t>
       </w:r>
     </w:p>
     <w:p>
@@ -14876,7 +14825,7 @@
         <w:jc w:val="left"/>
       </w:pPr>
       <w:r>
-        <w:t>51. ГОСТ Р 50948-2001. Средства отображения информации индивидуального пользования. Общие эргономические требования и требования безопасности : государственный стандарт Российской Федерации : издание официальное : принят и введен в действие Постановлением Госстандарта России от 25.12.2001 № 576-ст : дата введения 2002-07-01. – Текст : электронный // Электронный фонд правовых и нормативно-технических документов : [сайт]. – URL: https://docs.cntd.ru/document/1200028904 (дата обращения: 08.10.2026).</w:t>
+        <w:t>51. ГОСТ 12.0.003-2015. Система стандартов безопасности труда. Опасные и вредные производственные факторы. Классификация : межгосударственный стандарт : издание официальное : введен в действие в качестве национального стандарта Российской Федерации Приказом Росстандарта от 09.06.2016 № 602-ст : дата введения 2017-03-01. – Текст : электронный // Электронный фонд правовых и нормативно-технических документов : [сайт]. – URL: https://docs.cntd.ru/document/1200136071 (дата обращения: 08.10.2026).</w:t>
       </w:r>
     </w:p>
     <w:p>
@@ -14885,7 +14834,7 @@
         <w:jc w:val="left"/>
       </w:pPr>
       <w:r>
-        <w:t>52. ГОСТ Р ИСО 9241-4-2009. Эргономические требования к проведению офисных работ с использованием видеодисплейных терминалов (VDT). Часть 4. Требования к клавиатуре : национальный стандарт Российской Федерации : издание официальное : утвержден и введен в действие Приказом Ростехрегулирования от 07.12.2009 № 579-ст : дата введения 2010-12-01. – Текст : электронный // Электронный фонд правовых и нормативно-технических документов : [сайт]. – URL: https://docs.cntd.ru/document/1200076334 (дата обращения: 08.10.2026).</w:t>
+        <w:t>52. СанПиН 1.2.3685-21. Гигиенические нормативы и требования к обеспечению безопасности и (или) безвредности для человека факторов среды обитания : санитарные правила и нормы : утверждены постановлением Главного государственного санитарного врача Российской Федерации от 28.01.2021 № 2 (ред. от 24.12.2025) : дата введения 2021-03-01. – Текст : электронный // Электронный фонд правовых и нормативно-технических документов : [сайт]. – URL: https://docs.cntd.ru/document/573500115 (дата обращения: 08.10.2026).</w:t>
       </w:r>
     </w:p>
     <w:p>
@@ -14894,7 +14843,7 @@
         <w:jc w:val="left"/>
       </w:pPr>
       <w:r>
-        <w:t>53. ГОСТ 12.0.003-2015. Система стандартов безопасности труда. Опасные и вредные производственные факторы. Классификация : межгосударственный стандарт : издание официальное : введен в действие в качестве национального стандарта Российской Федерации Приказом Росстандарта от 09.06.2016 № 602-ст : дата введения 2017-03-01. – Текст : электронный // Электронный фонд правовых и нормативно-технических документов : [сайт]. – URL: https://docs.cntd.ru/document/1200136071 (дата обращения: 08.10.2026).</w:t>
+        <w:t>53. ГОСТ 12.1.005-88. Система стандартов безопасности труда. Общие санитарно-гигиенические требования к воздуху рабочей зоны : межгосударственный стандарт : издание официальное : утвержден и введен в действие Постановлением Госстандарта СССР от 29.09.1988 № 3388 : дата введения 1989-01-01. – Текст : электронный // Электронный фонд правовых и нормативно-технических документов : [сайт]. – URL: https://docs.cntd.ru/document/1200003608 (дата обращения: 08.10.2026).</w:t>
       </w:r>
     </w:p>
     <w:p>
@@ -14903,7 +14852,7 @@
         <w:jc w:val="left"/>
       </w:pPr>
       <w:r>
-        <w:t>54. ГОСТ 12.1.005-88. Система стандартов безопасности труда. Общие санитарно-гигиенические требования к воздуху рабочей зоны : межгосударственный стандарт : издание официальное : утвержден и введен в действие Постановлением Госстандарта СССР от 29.09.1988 № 3388 : дата введения 1989-01-01. – Текст : электронный // Электронный фонд правовых и нормативно-технических документов : [сайт]. – URL: https://docs.cntd.ru/document/1200003608 (дата обращения: 08.10.2026).</w:t>
+        <w:t>54. Нормализация воздуха в помещениях предприятий аэрокосмической отрасли : учебное пособие / Т. В. Голованова [и др.] ; Московский авиационный институт (национальный исследовательский университет). – Москва : МАИ, 2019. – 88 с. : ил. – Текст : непосредственный.</w:t>
       </w:r>
     </w:p>
     <w:p>
@@ -14912,7 +14861,7 @@
         <w:jc w:val="left"/>
       </w:pPr>
       <w:r>
-        <w:t>55. СанПиН 1.2.3685-21. Гигиенические нормативы и требования к обеспечению безопасности и (или) безвредности для человека факторов среды обитания : санитарные правила и нормы : утверждены постановлением Главного государственного санитарного врача Российской Федерации от 28.01.2021 № 2 (ред. от 24.12.2025) : дата введения 2021-03-01. – Текст : электронный // Электронный фонд правовых и нормативно-технических документов : [сайт]. – URL: https://docs.cntd.ru/document/573500115 (дата обращения: 08.10.2026).</w:t>
+        <w:t>55. СП 52.13330.2016. Естественное и искусственное освещение. Актуализированная редакция СНиП 23-05-95* : свод правил : утвержден приказом Минстроя России от 07.11.2016 № 777/пр : дата введения 2017-05-08. – Текст : электронный // Электронный фонд правовых и нормативно-технических документов : [сайт]. – URL: https://docs.cntd.ru/document/456054197 (дата обращения: 08.10.2026).</w:t>
       </w:r>
     </w:p>
     <w:p>
@@ -14921,7 +14870,7 @@
         <w:jc w:val="left"/>
       </w:pPr>
       <w:r>
-        <w:t>56. СП 52.13330.2016. Естественное и искусственное освещение. Актуализированная редакция СНиП 23-05-95* : свод правил : утвержден приказом Минстроя России от 07.11.2016 № 777/пр : дата введения 2017-05-08. – Текст : электронный // Электронный фонд правовых и нормативно-технических документов : [сайт]. – URL: https://docs.cntd.ru/document/456054197 (дата обращения: 08.10.2026).</w:t>
+        <w:t>56. Беков, Б. Е. Производственное освещение авиастроительных предприятий : методические указания к разделу «Охрана труда и окружающей среды» дипломного проекта / Б. Е. Беков, Н. И. Бобков, Н. С. Чудакова. – Москва : Изд-во МАИ, 1987. – Текст : непосредственный.</w:t>
       </w:r>
     </w:p>
     <w:p>
@@ -14930,7 +14879,7 @@
         <w:jc w:val="left"/>
       </w:pPr>
       <w:r>
-        <w:t>57. Кнорринг, Г. М. Справочная книга для проектирования электрического освещения / Г. М. Кнорринг, И. М. Фадин, В. Н. Сидоров. – 2-е изд., перераб. и доп. – Санкт-Петербург : Энергоатомиздат, 1992. – 448 с. – Текст : непосредственный.</w:t>
+        <w:t>57. Яров, В. Н. Защита от шума и вибраций : методические указания к дипломному проектированию / В. Н. Яров, Л. И. Малько. – Москва : МАИ, 1985. – Текст : непосредственный.</w:t>
       </w:r>
     </w:p>
     <w:p>
@@ -14939,7 +14888,7 @@
         <w:jc w:val="left"/>
       </w:pPr>
       <w:r>
-        <w:t>58. T-Halow : AT command set / Xinyuan-LilyGO. – Текст : электронный // GitHub : [сайт]. – URL: https://github.com/Xinyuan-LilyGO/T-Halow (дата обращения: 24.09.2026).</w:t>
+        <w:t>58. Дайнов, М. И. Борьба с шумами и вибрациями в авиационной промышленности : методические указания к дипломному проектированию / М. И. Дайнов, Л. И. Малько, В. Н. Яров. – Москва : Изд-во МАИ, 1989. – Текст : непосредственный.</w:t>
       </w:r>
     </w:p>
     <w:p>
@@ -14948,7 +14897,7 @@
         <w:jc w:val="left"/>
       </w:pPr>
       <w:r>
-        <w:t>59. Правила устройства электроустановок. Глава 1.1. Общая часть : издание седьмое : утверждена приказом Минэнерго России от 08.07.2002 № 204 : дата введения 2003-01-01. – Текст : электронный // Электронный фонд правовых и нормативно-технических документов : [сайт]. – URL: https://docs.cntd.ru/document/1200030216 (дата обращения: 08.10.2026).</w:t>
+        <w:t>59. Р 2.2.2006-05. Гигиена труда. Руководство по гигиенической оценке факторов рабочей среды и трудового процесса. Критерии и классификация условий труда : руководство : утверждено 29.07.2005 : дата введения 2005-11-01. – Текст : электронный // Электронный фонд правовых и нормативно-технических документов : [сайт]. – URL: https://docs.cntd.ru/document/1200040973 (дата обращения: 08.10.2026).</w:t>
       </w:r>
     </w:p>
     <w:p>
@@ -14957,7 +14906,7 @@
         <w:jc w:val="left"/>
       </w:pPr>
       <w:r>
-        <w:t>60. ГОСТ 12.1.038-82. Система стандартов безопасности труда. Электробезопасность. Предельно допустимые значения напряжений прикосновения и токов : межгосударственный стандарт : издание официальное : утвержден и введен в действие Постановлением Госстандарта СССР от 30.07.1982 № 2987 : дата введения 1983-07-01. – Текст : электронный // Электронный фонд правовых и нормативно-технических документов : [сайт]. – URL: https://docs.cntd.ru/document/5200313 (дата обращения: 08.10.2026).</w:t>
+        <w:t>60. ГОСТ 12.2.032-78. Система стандартов безопасности труда. Рабочее место при выполнении работ сидя. Общие эргономические требования : межгосударственный стандарт : издание официальное : утвержден и введен в действие Постановлением Госстандарта СССР от 26.04.1978 № 1102 : дата введения 1979-01-01. – Текст : электронный // Электронный фонд правовых и нормативно-технических документов : [сайт]. – URL: https://docs.cntd.ru/document/1200003913 (дата обращения: 08.10.2026).</w:t>
       </w:r>
     </w:p>
     <w:p>
@@ -14966,7 +14915,7 @@
         <w:jc w:val="left"/>
       </w:pPr>
       <w:r>
-        <w:t>61. Технический регламент о требованиях пожарной безопасности : федеральный закон от 22.07.2008 № 123-ФЗ : принят Государственной думой 4 июля 2008 года : одобрен Советом Федерации 11 июля 2008 года. – Текст : электронный // Электронный фонд правовых и нормативно-технических документов : [сайт]. – URL: https://docs.cntd.ru/document/902111644 (дата обращения: 08.10.2026).</w:t>
+        <w:t>61. ГОСТ Р 50923-96. Дисплеи. Рабочее место оператора. Общие эргономические требования и требования к производственной среде. Методы измерения : государственный стандарт Российской Федерации : издание официальное : утвержден и введен в действие Постановлением Госстандарта России от 10.07.1996 № 451 : дата введения 1997-07-01. – Текст : электронный // Электронный фонд правовых и нормативно-технических документов : [сайт]. – URL: https://docs.cntd.ru/document/1200025975 (дата обращения: 08.10.2026).</w:t>
       </w:r>
     </w:p>
     <w:p>
@@ -14975,7 +14924,7 @@
         <w:jc w:val="left"/>
       </w:pPr>
       <w:r>
-        <w:t>62. Об утверждении Правил противопожарного режима в Российской Федерации : постановление Правительства Российской Федерации от 16.09.2020 № 1479. – Текст : электронный // Электронный фонд правовых и нормативно-технических документов : [сайт]. – URL: https://docs.cntd.ru/document/565837297 (дата обращения: 08.10.2026).</w:t>
+        <w:t>62. ГОСТ Р 50948-2001. Средства отображения информации индивидуального пользования. Общие эргономические требования и требования безопасности : государственный стандарт Российской Федерации : издание официальное : принят и введен в действие Постановлением Госстандарта России от 25.12.2001 № 576-ст : дата введения 2002-07-01. – Текст : электронный // Электронный фонд правовых и нормативно-технических документов : [сайт]. – URL: https://docs.cntd.ru/document/1200028904 (дата обращения: 08.10.2026).</w:t>
       </w:r>
     </w:p>
     <w:p>
@@ -14984,7 +14933,7 @@
         <w:jc w:val="left"/>
       </w:pPr>
       <w:r>
-        <w:t>63. СП 12.13130.2009. Определение категорий помещений, зданий и наружных установок по взрывопожарной и пожарной опасности : свод правил : утвержден приказом МЧС России от 25.03.2009 № 182 : дата введения 2009-05-01. – Текст : электронный // Электронный фонд правовых и нормативно-технических документов : [сайт]. – URL: https://docs.cntd.ru/document/1200071156 (дата обращения: 08.10.2026).</w:t>
+        <w:t>63. ГОСТ Р ИСО 9241-4-2009. Эргономические требования к проведению офисных работ с использованием видеодисплейных терминалов (VDT). Часть 4. Требования к клавиатуре : национальный стандарт Российской Федерации : издание официальное : утвержден и введен в действие Приказом Ростехрегулирования от 07.12.2009 № 579-ст : дата введения 2010-12-01. – Текст : электронный // Электронный фонд правовых и нормативно-технических документов : [сайт]. – URL: https://docs.cntd.ru/document/1200076334 (дата обращения: 08.10.2026).</w:t>
       </w:r>
     </w:p>
     <w:p>
@@ -14993,7 +14942,7 @@
         <w:jc w:val="left"/>
       </w:pPr>
       <w:r>
-        <w:t>64. СП 9.13130.2009. Техника пожарная. Огнетушители. Требования к эксплуатации : свод правил : утвержден приказом МЧС России от 25.03.2009 № 179 : дата введения 2009-05-01. – Текст : электронный // Электронный фонд правовых и нормативно-технических документов : [сайт]. – URL: https://docs.cntd.ru/document/1200071152 (дата обращения: 08.10.2026).</w:t>
+        <w:t>64. Правила устройства электроустановок. Глава 1.1. Общая часть : издание седьмое : утверждена приказом Минэнерго России от 08.07.2002 № 204 : дата введения 2003-01-01. – Текст : электронный // Электронный фонд правовых и нормативно-технических документов : [сайт]. – URL: https://docs.cntd.ru/document/1200030216 (дата обращения: 08.10.2026).</w:t>
       </w:r>
     </w:p>
     <w:p>
@@ -15002,7 +14951,7 @@
         <w:jc w:val="left"/>
       </w:pPr>
       <w:r>
-        <w:t>65. Р 2.2.2006-05. Гигиена труда. Руководство по гигиенической оценке факторов рабочей среды и трудового процесса. Критерии и классификация условий труда : руководство : утверждено 29.07.2005 : дата введения 2005-11-01. – Текст : электронный // Электронный фонд правовых и нормативно-технических документов : [сайт]. – URL: https://docs.cntd.ru/document/1200040973 (дата обращения: 08.10.2026).</w:t>
+        <w:t>65. ГОСТ 12.1.038-82. Система стандартов безопасности труда. Электробезопасность. Предельно допустимые значения напряжений прикосновения и токов : межгосударственный стандарт : издание официальное : утвержден и введен в действие Постановлением Госстандарта СССР от 30.07.1982 № 2987 : дата введения 1983-07-01. – Текст : электронный // Электронный фонд правовых и нормативно-технических документов : [сайт]. – URL: https://docs.cntd.ru/document/5200313 (дата обращения: 08.10.2026).</w:t>
       </w:r>
     </w:p>
     <w:p>
@@ -15011,7 +14960,7 @@
         <w:jc w:val="left"/>
       </w:pPr>
       <w:r>
-        <w:t>66. МР 2.2.7.2129-06. Режимы труда и отдыха работающих в холодное время на открытой территории или в неотапливаемых помещениях : методические рекомендации : утверждены 19.09.2006 : дата введения 2006-11-01. – Текст : электронный // Электронный фонд правовых и нормативно-технических документов : [сайт]. – URL: https://docs.cntd.ru/document/1200047514 (дата обращения: 08.10.2026).</w:t>
+        <w:t>66. ГОСТ 12.1.019-2017. Система стандартов безопасности труда. Электробезопасность. Общие требования и номенклатура видов защиты : межгосударственный стандарт : издание официальное : введен в действие Приказом Росстандарта от 07.11.2018 № 941-ст : дата введения 2019-01-01. – Текст : электронный // Meganorm : [сайт]. – URL: https://meganorm.ru/mega_doc/norm/gost_gosudarstvennyj-standart/1/gost_12_1_019-2017_mezhgosudarstvennyy_standart_sistema.html (дата обращения: 15.10.2026).</w:t>
       </w:r>
     </w:p>
     <w:p>
@@ -15020,7 +14969,7 @@
         <w:jc w:val="left"/>
       </w:pPr>
       <w:r>
-        <w:t>67. Об отходах производства и потребления : федеральный закон от 24.06.1998 № 89-ФЗ : принят Государственной думой 22 мая 1998 года : одобрен Советом Федерации 10 июня 1998 года. – Текст : электронный // Электронный фонд правовых и нормативно-технических документов : [сайт]. – URL: https://docs.cntd.ru/document/901711591 (дата обращения: 08.10.2026).</w:t>
+        <w:t>67. Яров, В. Н. Выбор мероприятий и расчет элементов электрозащиты : методические указания к разделу «Охрана труда и окружающей среды» дипломного проекта / В. Н. Яров. – Москва : Изд-во МАИ, 1988. – Текст : непосредственный.</w:t>
       </w:r>
     </w:p>
     <w:p>
@@ -15029,7 +14978,7 @@
         <w:jc w:val="left"/>
       </w:pPr>
       <w:r>
-        <w:t>68. Об утверждении перечня видов отходов производства и потребления, в состав которых входят полезные компоненты, захоронение которых запрещается : распоряжение Правительства Российской Федерации от 25.07.2017 № 1589-р. – Текст : электронный // Электронный фонд правовых и нормативно-технических документов : [сайт]. – URL: https://docs.cntd.ru/document/436754215 (дата обращения: 08.10.2026).</w:t>
+        <w:t>68. СП 12.13130.2009. Определение категорий помещений, зданий и наружных установок по взрывопожарной и пожарной опасности : свод правил : утвержден приказом МЧС России от 25.03.2009 № 182 : дата введения 2009-05-01. – Текст : электронный // Электронный фонд правовых и нормативно-технических документов : [сайт]. – URL: https://docs.cntd.ru/document/1200071156 (дата обращения: 08.10.2026).</w:t>
       </w:r>
     </w:p>
     <w:p>
@@ -15038,7 +14987,7 @@
         <w:jc w:val="left"/>
       </w:pPr>
       <w:r>
-        <w:t>69. О специальной оценке условий труда : федеральный закон от 28.12.2013 № 426-ФЗ : принят Государственной думой 23 декабря 2013 года : одобрен Советом Федерации 25 декабря 2013 года. – Текст : электронный // КонсультантПлюс : надежная правовая поддержка : [сайт]. – URL: https://www.consultant.ru/document/cons_doc_LAW_156555/ (дата обращения: 08.10.2026).</w:t>
+        <w:t>69. Технический регламент о требованиях пожарной безопасности : федеральный закон от 22.07.2008 № 123-ФЗ : принят Государственной думой 4 июля 2008 года : одобрен Советом Федерации 11 июля 2008 года. – Текст : электронный // Электронный фонд правовых и нормативно-технических документов : [сайт]. – URL: https://docs.cntd.ru/document/902111644 (дата обращения: 08.10.2026).</w:t>
       </w:r>
     </w:p>
     <w:p>
@@ -15047,7 +14996,52 @@
         <w:jc w:val="left"/>
       </w:pPr>
       <w:r>
-        <w:t>70. Об утверждении Методики проведения специальной оценки условий труда, Классификатора вредных и (или) опасных производственных факторов, формы отчета о проведении специальной оценки условий труда и инструкции по ее заполнению : приказ Минтруда России от 21.11.2023 № 817н : зарегистрирован в Минюсте России 30.11.2023 № 76179. – Текст : электронный // Официальный интернет-портал правовой информации : [сайт]. – URL: http://publication.pravo.gov.ru/document/0001202311300048 (дата обращения: 08.10.2026).</w:t>
+        <w:t>70. Об утверждении Правил противопожарного режима в Российской Федерации : постановление Правительства Российской Федерации от 16.09.2020 № 1479. – Текст : электронный // Электронный фонд правовых и нормативно-технических документов : [сайт]. – URL: https://docs.cntd.ru/document/565837297 (дата обращения: 08.10.2026).</w:t>
+      </w:r>
+    </w:p>
+    <w:p>
+      <w:pPr>
+        <w:ind w:firstLine="0"/>
+        <w:jc w:val="left"/>
+      </w:pPr>
+      <w:r>
+        <w:t>71. СП 9.13130.2009. Техника пожарная. Огнетушители. Требования к эксплуатации : свод правил : утвержден приказом МЧС России от 25.03.2009 № 179 : дата введения 2009-05-01. – Текст : электронный // Электронный фонд правовых и нормативно-технических документов : [сайт]. – URL: https://docs.cntd.ru/document/1200071152 (дата обращения: 08.10.2026).</w:t>
+      </w:r>
+    </w:p>
+    <w:p>
+      <w:pPr>
+        <w:ind w:firstLine="0"/>
+        <w:jc w:val="left"/>
+      </w:pPr>
+      <w:r>
+        <w:t>72. Кнорринг, Г. М. Справочная книга для проектирования электрического освещения / Г. М. Кнорринг, И. М. Фадин, В. Н. Сидоров. – 2-е изд., перераб. и доп. – Санкт-Петербург : Энергоатомиздат, 1992. – 448 с. – Текст : непосредственный.</w:t>
+      </w:r>
+    </w:p>
+    <w:p>
+      <w:pPr>
+        <w:ind w:firstLine="0"/>
+        <w:jc w:val="left"/>
+      </w:pPr>
+      <w:r>
+        <w:t>73. Ветошкин, А. Г. Процессы и аппараты защиты окружающей среды : учебное пособие для вузов / А. Г. Ветошкин. – Москва : Высшая школа, 2008. – 639 с. – Текст : непосредственный.</w:t>
+      </w:r>
+    </w:p>
+    <w:p>
+      <w:pPr>
+        <w:ind w:firstLine="0"/>
+        <w:jc w:val="left"/>
+      </w:pPr>
+      <w:r>
+        <w:t>74. Об отходах производства и потребления : федеральный закон от 24.06.1998 № 89-ФЗ : принят Государственной думой 22 мая 1998 года : одобрен Советом Федерации 10 июня 1998 года. – Текст : электронный // Электронный фонд правовых и нормативно-технических документов : [сайт]. – URL: https://docs.cntd.ru/document/901711591 (дата обращения: 08.10.2026).</w:t>
+      </w:r>
+    </w:p>
+    <w:p>
+      <w:pPr>
+        <w:ind w:firstLine="0"/>
+        <w:jc w:val="left"/>
+      </w:pPr>
+      <w:r>
+        <w:t>75. Об утверждении перечня видов отходов производства и потребления, в состав которых входят полезные компоненты, захоронение которых запрещается : распоряжение Правительства Российской Федерации от 25.07.2017 № 1589-р. – Текст : электронный // Электронный фонд правовых и нормативно-технических документов : [сайт]. – URL: https://docs.cntd.ru/document/436754215 (дата обращения: 08.10.2026).</w:t>
       </w:r>
     </w:p>
     <w:sectPr>
@@ -15057,7 +15051,7 @@
       <w:pgMar w:top="1134" w:right="850" w:bottom="1417" w:left="1701" w:header="283" w:footer="283" w:gutter="0"/>
       <w:cols w:space="720"/>
       <w:docGrid w:linePitch="360"/>
-      <w:pgNumType w:start="75"/>
+      <w:pgNumType w:start="79"/>
     </w:sectPr>
   </w:body>
 </w:document>
@@ -16720,7 +16714,7 @@
               <w:sz w:val="18"/>
               <w:szCs w:val="18"/>
             </w:rPr>
-            <w:t xml:space="preserve">85</w:t>
+            <w:t xml:space="preserve">90</w:t>
           </w:r>
         </w:p>
       </w:tc>

</xml_diff>

<commit_message>
Control run in the thesis, 5 m through the wall, heatmap without video threshold; deck reworked (16 slides)
- thesis: CSV fragment table and control-run paragraph (282 s, 1028 kbit/s, 1.0 % lost);
  '5 m' track named 'through the wall' everywhere; viewer screenshot disabled until a new one
- heatmap: no bold 'enough for video' threshold, text says there is no sharp threshold
- deck: capture slide dropped, heatmap moved after theory with how-it-was-computed cards,
  breakpoint formula as a fraction, goal and conclusions slides as linked cards,
  markup kept within the Slides format (no td backgrounds, <=200 elements)

Co-Authored-By: Claude Opus 5.5 <noreply@anthropic.com>
</commit_message>
<xml_diff>
--- a/docs/vkr/Osnovnaya_chast_HaLow.docx
+++ b/docs/vkr/Osnovnaya_chast_HaLow.docx
@@ -264,7 +264,7 @@
         </w:rPr>
         <w:t>2.7 Выводы</w:t>
         <w:tab/>
-        <w:t>29</w:t>
+        <w:t>30</w:t>
       </w:r>
     </w:p>
     <w:p>
@@ -281,7 +281,7 @@
         </w:rPr>
         <w:t>3 Серия экспериментов на платформе LilyGO T-HaLow и сравнение с другими протоколами</w:t>
         <w:tab/>
-        <w:t>30</w:t>
+        <w:t>31</w:t>
       </w:r>
     </w:p>
     <w:p>
@@ -298,7 +298,7 @@
         </w:rPr>
         <w:t>3.1 Условия испытаний</w:t>
         <w:tab/>
-        <w:t>30</w:t>
+        <w:t>31</w:t>
       </w:r>
     </w:p>
     <w:p>
@@ -315,7 +315,7 @@
         </w:rPr>
         <w:t>3.2 Влияние полосы приёма (лабораторный этап)</w:t>
         <w:tab/>
-        <w:t>30</w:t>
+        <w:t>31</w:t>
       </w:r>
     </w:p>
     <w:p>
@@ -332,7 +332,7 @@
         </w:rPr>
         <w:t>3.3 Пропускная способность платформы и ограничивающее звено</w:t>
         <w:tab/>
-        <w:t>31</w:t>
+        <w:t>32</w:t>
       </w:r>
     </w:p>
     <w:p>
@@ -349,7 +349,7 @@
         </w:rPr>
         <w:t>3.4 Доработки канала передачи видео и итоговые результаты</w:t>
         <w:tab/>
-        <w:t>35</w:t>
+        <w:t>36</w:t>
       </w:r>
     </w:p>
     <w:p>
@@ -366,7 +366,7 @@
         </w:rPr>
         <w:t>3.5 Искажения изображения камеры, наводка передатчика и выбор мощности</w:t>
         <w:tab/>
-        <w:t>41</w:t>
+        <w:t>42</w:t>
       </w:r>
     </w:p>
     <w:p>
@@ -383,7 +383,7 @@
         </w:rPr>
         <w:t>3.6 Оценка дальности: расчёт, измерение границы связи и опубликованные данные</w:t>
         <w:tab/>
-        <w:t>43</w:t>
+        <w:t>44</w:t>
       </w:r>
     </w:p>
     <w:p>
@@ -400,7 +400,7 @@
         </w:rPr>
         <w:t>3.7 Сравнение с IEEE 802.11 (Wi-Fi 2,4 и 5 ГГц) и LoRa</w:t>
         <w:tab/>
-        <w:t>47</w:t>
+        <w:t>48</w:t>
       </w:r>
     </w:p>
     <w:p>
@@ -417,7 +417,7 @@
         </w:rPr>
         <w:t>3.8 Выводы</w:t>
         <w:tab/>
-        <w:t>54</w:t>
+        <w:t>55</w:t>
       </w:r>
     </w:p>
     <w:p>
@@ -434,7 +434,7 @@
         </w:rPr>
         <w:t>4 Экономическая часть</w:t>
         <w:tab/>
-        <w:t>56</w:t>
+        <w:t>57</w:t>
       </w:r>
     </w:p>
     <w:p>
@@ -451,7 +451,7 @@
         </w:rPr>
         <w:t>4.1 Оценка целесообразности проведения исследования</w:t>
         <w:tab/>
-        <w:t>57</w:t>
+        <w:t>58</w:t>
       </w:r>
     </w:p>
     <w:p>
@@ -468,7 +468,7 @@
         </w:rPr>
         <w:t>4.2 Планирование разработки</w:t>
         <w:tab/>
-        <w:t>60</w:t>
+        <w:t>61</w:t>
       </w:r>
     </w:p>
     <w:p>
@@ -485,7 +485,7 @@
         </w:rPr>
         <w:t>4.3 Определение затрат, себестоимости и цены разработки</w:t>
         <w:tab/>
-        <w:t>62</w:t>
+        <w:t>63</w:t>
       </w:r>
     </w:p>
     <w:p>
@@ -502,7 +502,7 @@
         </w:rPr>
         <w:t>4.4 Определение и оценка основных показателей экономической эффективности</w:t>
         <w:tab/>
-        <w:t>66</w:t>
+        <w:t>67</w:t>
       </w:r>
     </w:p>
     <w:p>
@@ -519,7 +519,7 @@
         </w:rPr>
         <w:t>4.5 Выводы</w:t>
         <w:tab/>
-        <w:t>69</w:t>
+        <w:t>70</w:t>
       </w:r>
     </w:p>
     <w:p>
@@ -536,7 +536,7 @@
         </w:rPr>
         <w:t>5 Охрана труда и окружающей среды</w:t>
         <w:tab/>
-        <w:t>70</w:t>
+        <w:t>71</w:t>
       </w:r>
     </w:p>
     <w:p>
@@ -553,7 +553,7 @@
         </w:rPr>
         <w:t>5.1 Введение</w:t>
         <w:tab/>
-        <w:t>70</w:t>
+        <w:t>71</w:t>
       </w:r>
     </w:p>
     <w:p>
@@ -570,7 +570,7 @@
         </w:rPr>
         <w:t>5.2 Оценка условий труда</w:t>
         <w:tab/>
-        <w:t>72</w:t>
+        <w:t>73</w:t>
       </w:r>
     </w:p>
     <w:p>
@@ -587,7 +587,7 @@
         </w:rPr>
         <w:t>5.3 Оценка условий труда по эргономическим параметрам</w:t>
         <w:tab/>
-        <w:t>79</w:t>
+        <w:t>80</w:t>
       </w:r>
     </w:p>
     <w:p>
@@ -604,7 +604,7 @@
         </w:rPr>
         <w:t>5.4 Оценка помещения по электроопасности</w:t>
         <w:tab/>
-        <w:t>81</w:t>
+        <w:t>82</w:t>
       </w:r>
     </w:p>
     <w:p>
@@ -621,7 +621,7 @@
         </w:rPr>
         <w:t>5.5 Классификация помещения по пожароопасности</w:t>
         <w:tab/>
-        <w:t>82</w:t>
+        <w:t>83</w:t>
       </w:r>
     </w:p>
     <w:p>
@@ -638,7 +638,7 @@
         </w:rPr>
         <w:t>5.6 Расчёт искусственного освещения</w:t>
         <w:tab/>
-        <w:t>83</w:t>
+        <w:t>84</w:t>
       </w:r>
     </w:p>
     <w:p>
@@ -655,7 +655,7 @@
         </w:rPr>
         <w:t>5.7 Выводы</w:t>
         <w:tab/>
-        <w:t>86</w:t>
+        <w:t>87</w:t>
       </w:r>
     </w:p>
     <w:p>
@@ -672,7 +672,7 @@
         </w:rPr>
         <w:t>Заключение</w:t>
         <w:tab/>
-        <w:t>88</w:t>
+        <w:t>89</w:t>
       </w:r>
     </w:p>
     <w:p>
@@ -689,7 +689,7 @@
         </w:rPr>
         <w:t>Список использованных источников</w:t>
         <w:tab/>
-        <w:t>91</w:t>
+        <w:t>92</w:t>
       </w:r>
     </w:p>
     <w:p>
@@ -880,7 +880,7 @@
         <w:t xml:space="preserve">Пояснительная записка состоит из введения, пяти глав, заключения и списка использованных источников. В первой главе выполнен сравнительный анализ Wi-Fi HaLow с другими вариантами канала связи с БПЛА, во второй — обоснование эксперимента, его методика, выбор и настройка средств, в третьей приведены результаты серии экспериментов и сравнение с другими протоколами. Четвёртая глава содержит экономическую часть, пятая — раздел охраны труда и окружающей среды. В заключении сформулированы основные результаты и предложения по интеграции разработанных решений в существующие модели БПЛА. </w:t>
       </w:r>
       <w:r>
-        <w:t>Пояснительная записка: 100 с., 14 рис., 39 табл., 74 источн.</w:t>
+        <w:t>Пояснительная записка: 101 с., 14 рис., 40 табл., 74 источн.</w:t>
       </w:r>
     </w:p>
     <w:p>
@@ -4923,7 +4923,7 @@
               <w:rPr>
                 <w:sz w:val="22"/>
               </w:rPr>
-              <w:t>Отношение сигнал/шум на неизменной трассе 5 м</w:t>
+              <w:t>Отношение сигнал/шум на неизменной трассе 5 м через стену</w:t>
             </w:r>
           </w:p>
         </w:tc>
@@ -5039,7 +5039,7 @@
               <w:rPr>
                 <w:sz w:val="22"/>
               </w:rPr>
-              <w:t>0,12 Мбит/с в исходном состоянии; 1,06 Мбит/с полезного видео в итоговой версии (5 м)</w:t>
+              <w:t>0,12 Мбит/с в исходном состоянии; 1,06 Мбит/с полезного видео в итоговой версии (5 м через стену)</w:t>
             </w:r>
           </w:p>
         </w:tc>
@@ -5070,7 +5070,7 @@
     </w:p>
     <w:p>
       <w:r>
-        <w:t>Во-первых, модели распространения дают не одно значение, а диапазон. Для городской застройки показатель затухания n = 2,7–3,5 [6], и при одних и тех же допустимых потерях дальность получается от 190 до 920 м. Две модели, предложенные специально для IEEE 802.11ah, на 1 км расходятся на 12 дБ [25], и ни одна не выведена для антенн у земли. Если взять верхнюю и нижнюю границы затенения, ответ «связь будет где-то между» верен, но для выбора канала бесполезен: границы расходятся в разы. Какое значение подходит для конкретной платформы и трассы, показывает только измерение. Даже на одной и той же трассе 5 м канал заметно меняется: отношение сигнал/шум за пять минут колебалось от 24 до 40 дБ, а скорость в разное время суток различалась в 3–4 раза.</w:t>
+        <w:t>Во-первых, модели распространения дают не одно значение, а диапазон. Для городской застройки показатель затухания n = 2,7–3,5 [6], и при одних и тех же допустимых потерях дальность получается от 190 до 920 м. Две модели, предложенные специально для IEEE 802.11ah, на 1 км расходятся на 12 дБ [25], и ни одна не выведена для антенн у земли. Если взять верхнюю и нижнюю границы затенения, ответ «связь будет где-то между» верен, но для выбора канала бесполезен: границы расходятся в разы. Какое значение подходит для конкретной платформы и трассы, показывает только измерение. Даже на одной и той же трассе 5 м через стену канал заметно меняется: отношение сигнал/шум за пять минут колебалось от 24 до 40 дБ, а скорость в разное время суток различалась в 3–4 раза.</w:t>
       </w:r>
     </w:p>
     <w:p>
@@ -5085,7 +5085,7 @@
     </w:p>
     <w:p>
       <w:r>
-        <w:t>В-четвёртых, расчёт работает со средним уровнем сигнала, а связь рвут кратковременные провалы уровня — из-за движения людей и предметов, отражений и помех. Даже на неподвижной трассе 5 м отношение сигнал/шум временами проседало до 12–20 дБ, и регулятор поднимал мощность передатчика с 1 до 11–13 дБм. Кроме того, для канала 2 МГц паспорт радиомодуля не даёт чувствительности [17], её приходится оценивать, поэтому и бюджет канала остаётся оценкой.</w:t>
+        <w:t>В-четвёртых, расчёт работает со средним уровнем сигнала, а связь рвут кратковременные провалы уровня — из-за движения людей и предметов, отражений и помех. Даже на неподвижной трассе 5 м через стену отношение сигнал/шум временами проседало до 12–20 дБ, и регулятор поднимал мощность передатчика с 1 до 11–13 дБм. Кроме того, для канала 2 МГц паспорт радиомодуля не даёт чувствительности [17], её приходится оценивать, поэтому и бюджет канала остаётся оценкой.</w:t>
       </w:r>
     </w:p>
     <w:p>
@@ -5469,7 +5469,7 @@
               <w:rPr>
                 <w:sz w:val="22"/>
               </w:rPr>
-              <w:t>уровень сигнала, задержка, потери и пропускная способность Wi-Fi 2,4 ГГц — измерение на той же паре плат на трассе 5 м; граница связи — измерение на той же паре плат; LoRa — опубликованные данные</w:t>
+              <w:t>уровень сигнала, задержка, потери и пропускная способность Wi-Fi 2,4 ГГц — измерение на той же паре плат на трассе 5 м через стену; граница связи — измерение на той же паре плат; LoRa — опубликованные данные</w:t>
             </w:r>
           </w:p>
         </w:tc>
@@ -5482,7 +5482,7 @@
     </w:p>
     <w:p>
       <w:r>
-        <w:t>Загрузка канала создаётся видеопотоком с камеры; качество сжатия JPEG и разрешение задаются на камере, а канал Wi-Fi HaLow только переносит поток. Для отделения потолка канала от камеры используется синтетический источник — копии одного видеокадра, проходящие тот же тракт. Граница связи измеряется на трассе прямой видимости (раздел 2.4); для разных высот антенн дальность оценивается расчётом и сопоставляется с опубликованными натурными данными. Wi-Fi 2,4 ГГц измерен на той же паре плат на трассе 5 м и при измерении границы связи: тот же видеопоток передаётся встроенным радиотрактом процессора ESP32-S3 вместо модуля TX-AH, а ёмкость канала определяется синтетическим потоком пакетов по 1400 Б, передаваемых без пауз (раздел 3.7). Сравнение с LoRa по пропускной способности выполняется по литературным данным: она на два порядка ниже скорости видео, и натурное сравнение по этому показателю неинформативно.</w:t>
+        <w:t>Загрузка канала создаётся видеопотоком с камеры; качество сжатия JPEG и разрешение задаются на камере, а канал Wi-Fi HaLow только переносит поток. Для отделения потолка канала от камеры используется синтетический источник — копии одного видеокадра, проходящие тот же тракт. Граница связи измеряется на трассе прямой видимости (раздел 2.4); для разных высот антенн дальность оценивается расчётом и сопоставляется с опубликованными натурными данными. Wi-Fi 2,4 ГГц измерен на той же паре плат на трассе 5 м через стену и при измерении границы связи: тот же видеопоток передаётся встроенным радиотрактом процессора ESP32-S3 вместо модуля TX-AH, а ёмкость канала определяется синтетическим потоком пакетов по 1400 Б, передаваемых без пауз (раздел 3.7). Сравнение с LoRa по пропускной способности выполняется по литературным данным: она на два порядка ниже скорости видео, и натурное сравнение по этому показателю неинформативно.</w:t>
       </w:r>
     </w:p>
     <w:p>
@@ -5556,6 +5556,1221 @@
       <w:r>
         <w:t>задержка (RTT) — время, которое измеряет процессор платы камеры: отсчёт начинается, когда он закончил передавать видеокадр в радиомодуль по UART, и заканчивается, когда по радиоканалу пришла квитанция приёмника на этот видеокадр. В неё входят очередь в модуле, передача по эфиру, обработка на приёмнике и обратный путь квитанции. Используется медиана за секунду и за опыт. Дополнительно регистрируется полный путь — от начала съёмки видеокадра сенсором до квитанции, — в который входят ещё съёмка, сжатие и передача по UART (схема тракта — на рисунке 2.2).</w:t>
       </w:r>
+    </w:p>
+    <w:p>
+      <w:r>
+        <w:t>Фрагмент ежесекундной записи программы просмотра приведён в таблице 2.4 (строки через 60 с; в файле записывается 70 показателей, в таблице — основные).</w:t>
+      </w:r>
+    </w:p>
+    <w:p>
+      <w:pPr>
+        <w:pStyle w:val="TableCaption"/>
+        <w:ind w:firstLine="0"/>
+      </w:pPr>
+      <w:r>
+        <w:t>Таблица 2.4 – Фрагмент журнала программы просмотра (контрольный опыт итоговой версии)</w:t>
+      </w:r>
+    </w:p>
+    <w:tbl>
+      <w:tblPr>
+        <w:tblStyle w:val="TableGrid"/>
+        <w:tblW w:type="auto" w:w="0"/>
+        <w:jc w:val="center"/>
+        <w:tblLayout w:type="fixed"/>
+        <w:tblLook w:firstColumn="1" w:firstRow="1" w:lastColumn="0" w:lastRow="0" w:noHBand="0" w:noVBand="1" w:val="04A0"/>
+        <w:tblCellMar>
+          <w:left w:w="57" w:type="dxa"/>
+          <w:right w:w="57" w:type="dxa"/>
+        </w:tblCellMar>
+      </w:tblPr>
+      <w:tblGrid>
+        <w:gridCol w:w="680"/>
+        <w:gridCol w:w="793"/>
+        <w:gridCol w:w="1133"/>
+        <w:gridCol w:w="1020"/>
+        <w:gridCol w:w="907"/>
+        <w:gridCol w:w="793"/>
+        <w:gridCol w:w="793"/>
+        <w:gridCol w:w="1020"/>
+        <w:gridCol w:w="850"/>
+        <w:gridCol w:w="907"/>
+      </w:tblGrid>
+      <w:tr>
+        <w:trPr>
+          <w:cantSplit/>
+          <w:tblHeader w:val="true"/>
+        </w:trPr>
+        <w:tc>
+          <w:tcPr>
+            <w:tcW w:type="dxa" w:w="680"/>
+            <w:vAlign w:val="center"/>
+          </w:tcPr>
+          <w:p>
+            <w:pPr>
+              <w:pStyle w:val="TableText"/>
+              <w:keepNext/>
+              <w:jc w:val="center"/>
+            </w:pPr>
+            <w:r>
+              <w:rPr>
+                <w:b/>
+                <w:sz w:val="20"/>
+              </w:rPr>
+              <w:t>t, с</w:t>
+            </w:r>
+          </w:p>
+        </w:tc>
+        <w:tc>
+          <w:tcPr>
+            <w:tcW w:type="dxa" w:w="794"/>
+            <w:vAlign w:val="center"/>
+          </w:tcPr>
+          <w:p>
+            <w:pPr>
+              <w:pStyle w:val="TableText"/>
+              <w:keepNext/>
+              <w:jc w:val="center"/>
+            </w:pPr>
+            <w:r>
+              <w:rPr>
+                <w:b/>
+                <w:sz w:val="20"/>
+              </w:rPr>
+              <w:t>Кадр/с</w:t>
+            </w:r>
+          </w:p>
+        </w:tc>
+        <w:tc>
+          <w:tcPr>
+            <w:tcW w:type="dxa" w:w="1134"/>
+            <w:vAlign w:val="center"/>
+          </w:tcPr>
+          <w:p>
+            <w:pPr>
+              <w:pStyle w:val="TableText"/>
+              <w:keepNext/>
+              <w:jc w:val="center"/>
+            </w:pPr>
+            <w:r>
+              <w:rPr>
+                <w:b/>
+                <w:sz w:val="20"/>
+              </w:rPr>
+              <w:t>Полезная скорость, кбит/с</w:t>
+            </w:r>
+          </w:p>
+        </w:tc>
+        <w:tc>
+          <w:tcPr>
+            <w:tcW w:type="dxa" w:w="1020"/>
+            <w:vAlign w:val="center"/>
+          </w:tcPr>
+          <w:p>
+            <w:pPr>
+              <w:pStyle w:val="TableText"/>
+              <w:keepNext/>
+              <w:jc w:val="center"/>
+            </w:pPr>
+            <w:r>
+              <w:rPr>
+                <w:b/>
+                <w:sz w:val="20"/>
+              </w:rPr>
+              <w:t>Потери фрагментов, %</w:t>
+            </w:r>
+          </w:p>
+        </w:tc>
+        <w:tc>
+          <w:tcPr>
+            <w:tcW w:type="dxa" w:w="907"/>
+            <w:vAlign w:val="center"/>
+          </w:tcPr>
+          <w:p>
+            <w:pPr>
+              <w:pStyle w:val="TableText"/>
+              <w:keepNext/>
+              <w:jc w:val="center"/>
+            </w:pPr>
+            <w:r>
+              <w:rPr>
+                <w:b/>
+                <w:sz w:val="20"/>
+              </w:rPr>
+              <w:t>RSSI, дБм</w:t>
+            </w:r>
+          </w:p>
+        </w:tc>
+        <w:tc>
+          <w:tcPr>
+            <w:tcW w:type="dxa" w:w="794"/>
+            <w:vAlign w:val="center"/>
+          </w:tcPr>
+          <w:p>
+            <w:pPr>
+              <w:pStyle w:val="TableText"/>
+              <w:keepNext/>
+              <w:jc w:val="center"/>
+            </w:pPr>
+            <w:r>
+              <w:rPr>
+                <w:b/>
+                <w:sz w:val="20"/>
+              </w:rPr>
+              <w:t>SNR, дБ</w:t>
+            </w:r>
+          </w:p>
+        </w:tc>
+        <w:tc>
+          <w:tcPr>
+            <w:tcW w:type="dxa" w:w="794"/>
+            <w:vAlign w:val="center"/>
+          </w:tcPr>
+          <w:p>
+            <w:pPr>
+              <w:pStyle w:val="TableText"/>
+              <w:keepNext/>
+              <w:jc w:val="center"/>
+            </w:pPr>
+            <w:r>
+              <w:rPr>
+                <w:b/>
+                <w:sz w:val="20"/>
+              </w:rPr>
+              <w:t>P, дБм</w:t>
+            </w:r>
+          </w:p>
+        </w:tc>
+        <w:tc>
+          <w:tcPr>
+            <w:tcW w:type="dxa" w:w="1020"/>
+            <w:vAlign w:val="center"/>
+          </w:tcPr>
+          <w:p>
+            <w:pPr>
+              <w:pStyle w:val="TableText"/>
+              <w:keepNext/>
+              <w:jc w:val="center"/>
+            </w:pPr>
+            <w:r>
+              <w:rPr>
+                <w:b/>
+                <w:sz w:val="20"/>
+              </w:rPr>
+              <w:t>MCS (граница)</w:t>
+            </w:r>
+          </w:p>
+        </w:tc>
+        <w:tc>
+          <w:tcPr>
+            <w:tcW w:type="dxa" w:w="850"/>
+            <w:vAlign w:val="center"/>
+          </w:tcPr>
+          <w:p>
+            <w:pPr>
+              <w:pStyle w:val="TableText"/>
+              <w:keepNext/>
+              <w:jc w:val="center"/>
+            </w:pPr>
+            <w:r>
+              <w:rPr>
+                <w:b/>
+                <w:sz w:val="20"/>
+              </w:rPr>
+              <w:t>PER, %</w:t>
+            </w:r>
+          </w:p>
+        </w:tc>
+        <w:tc>
+          <w:tcPr>
+            <w:tcW w:type="dxa" w:w="907"/>
+            <w:vAlign w:val="center"/>
+          </w:tcPr>
+          <w:p>
+            <w:pPr>
+              <w:pStyle w:val="TableText"/>
+              <w:keepNext/>
+              <w:jc w:val="center"/>
+            </w:pPr>
+            <w:r>
+              <w:rPr>
+                <w:b/>
+                <w:sz w:val="20"/>
+              </w:rPr>
+              <w:t>RTT, мс</w:t>
+            </w:r>
+          </w:p>
+        </w:tc>
+      </w:tr>
+      <w:tr>
+        <w:trPr>
+          <w:cantSplit/>
+        </w:trPr>
+        <w:tc>
+          <w:tcPr>
+            <w:tcW w:type="dxa" w:w="680"/>
+            <w:vAlign w:val="center"/>
+          </w:tcPr>
+          <w:p>
+            <w:pPr>
+              <w:pStyle w:val="TableText"/>
+              <w:keepNext/>
+              <w:jc w:val="center"/>
+            </w:pPr>
+            <w:r>
+              <w:rPr>
+                <w:sz w:val="20"/>
+              </w:rPr>
+              <w:t>30</w:t>
+            </w:r>
+          </w:p>
+        </w:tc>
+        <w:tc>
+          <w:tcPr>
+            <w:tcW w:type="dxa" w:w="794"/>
+            <w:vAlign w:val="center"/>
+          </w:tcPr>
+          <w:p>
+            <w:pPr>
+              <w:pStyle w:val="TableText"/>
+              <w:keepNext/>
+              <w:jc w:val="center"/>
+            </w:pPr>
+            <w:r>
+              <w:rPr>
+                <w:sz w:val="20"/>
+              </w:rPr>
+              <w:t>5,0</w:t>
+            </w:r>
+          </w:p>
+        </w:tc>
+        <w:tc>
+          <w:tcPr>
+            <w:tcW w:type="dxa" w:w="1134"/>
+            <w:vAlign w:val="center"/>
+          </w:tcPr>
+          <w:p>
+            <w:pPr>
+              <w:pStyle w:val="TableText"/>
+              <w:keepNext/>
+              <w:jc w:val="center"/>
+            </w:pPr>
+            <w:r>
+              <w:rPr>
+                <w:sz w:val="20"/>
+              </w:rPr>
+              <w:t>1170</w:t>
+            </w:r>
+          </w:p>
+        </w:tc>
+        <w:tc>
+          <w:tcPr>
+            <w:tcW w:type="dxa" w:w="1020"/>
+            <w:vAlign w:val="center"/>
+          </w:tcPr>
+          <w:p>
+            <w:pPr>
+              <w:pStyle w:val="TableText"/>
+              <w:keepNext/>
+              <w:jc w:val="center"/>
+            </w:pPr>
+            <w:r>
+              <w:rPr>
+                <w:sz w:val="20"/>
+              </w:rPr>
+              <w:t>1,43</w:t>
+            </w:r>
+          </w:p>
+        </w:tc>
+        <w:tc>
+          <w:tcPr>
+            <w:tcW w:type="dxa" w:w="907"/>
+            <w:vAlign w:val="center"/>
+          </w:tcPr>
+          <w:p>
+            <w:pPr>
+              <w:pStyle w:val="TableText"/>
+              <w:keepNext/>
+              <w:jc w:val="center"/>
+            </w:pPr>
+            <w:r>
+              <w:rPr>
+                <w:sz w:val="20"/>
+              </w:rPr>
+              <w:t>−52</w:t>
+            </w:r>
+          </w:p>
+        </w:tc>
+        <w:tc>
+          <w:tcPr>
+            <w:tcW w:type="dxa" w:w="794"/>
+            <w:vAlign w:val="center"/>
+          </w:tcPr>
+          <w:p>
+            <w:pPr>
+              <w:pStyle w:val="TableText"/>
+              <w:keepNext/>
+              <w:jc w:val="center"/>
+            </w:pPr>
+            <w:r>
+              <w:rPr>
+                <w:sz w:val="20"/>
+              </w:rPr>
+              <w:t>36</w:t>
+            </w:r>
+          </w:p>
+        </w:tc>
+        <w:tc>
+          <w:tcPr>
+            <w:tcW w:type="dxa" w:w="794"/>
+            <w:vAlign w:val="center"/>
+          </w:tcPr>
+          <w:p>
+            <w:pPr>
+              <w:pStyle w:val="TableText"/>
+              <w:keepNext/>
+              <w:jc w:val="center"/>
+            </w:pPr>
+            <w:r>
+              <w:rPr>
+                <w:sz w:val="20"/>
+              </w:rPr>
+              <w:t>1</w:t>
+            </w:r>
+          </w:p>
+        </w:tc>
+        <w:tc>
+          <w:tcPr>
+            <w:tcW w:type="dxa" w:w="1020"/>
+            <w:vAlign w:val="center"/>
+          </w:tcPr>
+          <w:p>
+            <w:pPr>
+              <w:pStyle w:val="TableText"/>
+              <w:keepNext/>
+              <w:jc w:val="center"/>
+            </w:pPr>
+            <w:r>
+              <w:rPr>
+                <w:sz w:val="20"/>
+              </w:rPr>
+              <w:t>4 (4)</w:t>
+            </w:r>
+          </w:p>
+        </w:tc>
+        <w:tc>
+          <w:tcPr>
+            <w:tcW w:type="dxa" w:w="850"/>
+            <w:vAlign w:val="center"/>
+          </w:tcPr>
+          <w:p>
+            <w:pPr>
+              <w:pStyle w:val="TableText"/>
+              <w:keepNext/>
+              <w:jc w:val="center"/>
+            </w:pPr>
+            <w:r>
+              <w:rPr>
+                <w:sz w:val="20"/>
+              </w:rPr>
+              <w:t>65</w:t>
+            </w:r>
+          </w:p>
+        </w:tc>
+        <w:tc>
+          <w:tcPr>
+            <w:tcW w:type="dxa" w:w="907"/>
+            <w:vAlign w:val="center"/>
+          </w:tcPr>
+          <w:p>
+            <w:pPr>
+              <w:pStyle w:val="TableText"/>
+              <w:keepNext/>
+              <w:jc w:val="center"/>
+            </w:pPr>
+            <w:r>
+              <w:rPr>
+                <w:sz w:val="20"/>
+              </w:rPr>
+              <w:t>438</w:t>
+            </w:r>
+          </w:p>
+        </w:tc>
+      </w:tr>
+      <w:tr>
+        <w:trPr>
+          <w:cantSplit/>
+        </w:trPr>
+        <w:tc>
+          <w:tcPr>
+            <w:tcW w:type="dxa" w:w="680"/>
+            <w:vAlign w:val="center"/>
+          </w:tcPr>
+          <w:p>
+            <w:pPr>
+              <w:pStyle w:val="TableText"/>
+              <w:keepNext/>
+              <w:jc w:val="center"/>
+            </w:pPr>
+            <w:r>
+              <w:rPr>
+                <w:sz w:val="20"/>
+              </w:rPr>
+              <w:t>90</w:t>
+            </w:r>
+          </w:p>
+        </w:tc>
+        <w:tc>
+          <w:tcPr>
+            <w:tcW w:type="dxa" w:w="794"/>
+            <w:vAlign w:val="center"/>
+          </w:tcPr>
+          <w:p>
+            <w:pPr>
+              <w:pStyle w:val="TableText"/>
+              <w:keepNext/>
+              <w:jc w:val="center"/>
+            </w:pPr>
+            <w:r>
+              <w:rPr>
+                <w:sz w:val="20"/>
+              </w:rPr>
+              <w:t>6,6</w:t>
+            </w:r>
+          </w:p>
+        </w:tc>
+        <w:tc>
+          <w:tcPr>
+            <w:tcW w:type="dxa" w:w="1134"/>
+            <w:vAlign w:val="center"/>
+          </w:tcPr>
+          <w:p>
+            <w:pPr>
+              <w:pStyle w:val="TableText"/>
+              <w:keepNext/>
+              <w:jc w:val="center"/>
+            </w:pPr>
+            <w:r>
+              <w:rPr>
+                <w:sz w:val="20"/>
+              </w:rPr>
+              <w:t>1125</w:t>
+            </w:r>
+          </w:p>
+        </w:tc>
+        <w:tc>
+          <w:tcPr>
+            <w:tcW w:type="dxa" w:w="1020"/>
+            <w:vAlign w:val="center"/>
+          </w:tcPr>
+          <w:p>
+            <w:pPr>
+              <w:pStyle w:val="TableText"/>
+              <w:keepNext/>
+              <w:jc w:val="center"/>
+            </w:pPr>
+            <w:r>
+              <w:rPr>
+                <w:sz w:val="20"/>
+              </w:rPr>
+              <w:t>1,08</w:t>
+            </w:r>
+          </w:p>
+        </w:tc>
+        <w:tc>
+          <w:tcPr>
+            <w:tcW w:type="dxa" w:w="907"/>
+            <w:vAlign w:val="center"/>
+          </w:tcPr>
+          <w:p>
+            <w:pPr>
+              <w:pStyle w:val="TableText"/>
+              <w:keepNext/>
+              <w:jc w:val="center"/>
+            </w:pPr>
+            <w:r>
+              <w:rPr>
+                <w:sz w:val="20"/>
+              </w:rPr>
+              <w:t>−49</w:t>
+            </w:r>
+          </w:p>
+        </w:tc>
+        <w:tc>
+          <w:tcPr>
+            <w:tcW w:type="dxa" w:w="794"/>
+            <w:vAlign w:val="center"/>
+          </w:tcPr>
+          <w:p>
+            <w:pPr>
+              <w:pStyle w:val="TableText"/>
+              <w:keepNext/>
+              <w:jc w:val="center"/>
+            </w:pPr>
+            <w:r>
+              <w:rPr>
+                <w:sz w:val="20"/>
+              </w:rPr>
+              <w:t>38</w:t>
+            </w:r>
+          </w:p>
+        </w:tc>
+        <w:tc>
+          <w:tcPr>
+            <w:tcW w:type="dxa" w:w="794"/>
+            <w:vAlign w:val="center"/>
+          </w:tcPr>
+          <w:p>
+            <w:pPr>
+              <w:pStyle w:val="TableText"/>
+              <w:keepNext/>
+              <w:jc w:val="center"/>
+            </w:pPr>
+            <w:r>
+              <w:rPr>
+                <w:sz w:val="20"/>
+              </w:rPr>
+              <w:t>1</w:t>
+            </w:r>
+          </w:p>
+        </w:tc>
+        <w:tc>
+          <w:tcPr>
+            <w:tcW w:type="dxa" w:w="1020"/>
+            <w:vAlign w:val="center"/>
+          </w:tcPr>
+          <w:p>
+            <w:pPr>
+              <w:pStyle w:val="TableText"/>
+              <w:keepNext/>
+              <w:jc w:val="center"/>
+            </w:pPr>
+            <w:r>
+              <w:rPr>
+                <w:sz w:val="20"/>
+              </w:rPr>
+              <w:t>4 (4)</w:t>
+            </w:r>
+          </w:p>
+        </w:tc>
+        <w:tc>
+          <w:tcPr>
+            <w:tcW w:type="dxa" w:w="850"/>
+            <w:vAlign w:val="center"/>
+          </w:tcPr>
+          <w:p>
+            <w:pPr>
+              <w:pStyle w:val="TableText"/>
+              <w:keepNext/>
+              <w:jc w:val="center"/>
+            </w:pPr>
+            <w:r>
+              <w:rPr>
+                <w:sz w:val="20"/>
+              </w:rPr>
+              <w:t>65</w:t>
+            </w:r>
+          </w:p>
+        </w:tc>
+        <w:tc>
+          <w:tcPr>
+            <w:tcW w:type="dxa" w:w="907"/>
+            <w:vAlign w:val="center"/>
+          </w:tcPr>
+          <w:p>
+            <w:pPr>
+              <w:pStyle w:val="TableText"/>
+              <w:keepNext/>
+              <w:jc w:val="center"/>
+            </w:pPr>
+            <w:r>
+              <w:rPr>
+                <w:sz w:val="20"/>
+              </w:rPr>
+              <w:t>433</w:t>
+            </w:r>
+          </w:p>
+        </w:tc>
+      </w:tr>
+      <w:tr>
+        <w:trPr>
+          <w:cantSplit/>
+        </w:trPr>
+        <w:tc>
+          <w:tcPr>
+            <w:tcW w:type="dxa" w:w="680"/>
+            <w:vAlign w:val="center"/>
+          </w:tcPr>
+          <w:p>
+            <w:pPr>
+              <w:pStyle w:val="TableText"/>
+              <w:keepNext/>
+              <w:jc w:val="center"/>
+            </w:pPr>
+            <w:r>
+              <w:rPr>
+                <w:sz w:val="20"/>
+              </w:rPr>
+              <w:t>150</w:t>
+            </w:r>
+          </w:p>
+        </w:tc>
+        <w:tc>
+          <w:tcPr>
+            <w:tcW w:type="dxa" w:w="794"/>
+            <w:vAlign w:val="center"/>
+          </w:tcPr>
+          <w:p>
+            <w:pPr>
+              <w:pStyle w:val="TableText"/>
+              <w:keepNext/>
+              <w:jc w:val="center"/>
+            </w:pPr>
+            <w:r>
+              <w:rPr>
+                <w:sz w:val="20"/>
+              </w:rPr>
+              <w:t>6,0</w:t>
+            </w:r>
+          </w:p>
+        </w:tc>
+        <w:tc>
+          <w:tcPr>
+            <w:tcW w:type="dxa" w:w="1134"/>
+            <w:vAlign w:val="center"/>
+          </w:tcPr>
+          <w:p>
+            <w:pPr>
+              <w:pStyle w:val="TableText"/>
+              <w:keepNext/>
+              <w:jc w:val="center"/>
+            </w:pPr>
+            <w:r>
+              <w:rPr>
+                <w:sz w:val="20"/>
+              </w:rPr>
+              <w:t>1023</w:t>
+            </w:r>
+          </w:p>
+        </w:tc>
+        <w:tc>
+          <w:tcPr>
+            <w:tcW w:type="dxa" w:w="1020"/>
+            <w:vAlign w:val="center"/>
+          </w:tcPr>
+          <w:p>
+            <w:pPr>
+              <w:pStyle w:val="TableText"/>
+              <w:keepNext/>
+              <w:jc w:val="center"/>
+            </w:pPr>
+            <w:r>
+              <w:rPr>
+                <w:sz w:val="20"/>
+              </w:rPr>
+              <w:t>1,50</w:t>
+            </w:r>
+          </w:p>
+        </w:tc>
+        <w:tc>
+          <w:tcPr>
+            <w:tcW w:type="dxa" w:w="907"/>
+            <w:vAlign w:val="center"/>
+          </w:tcPr>
+          <w:p>
+            <w:pPr>
+              <w:pStyle w:val="TableText"/>
+              <w:keepNext/>
+              <w:jc w:val="center"/>
+            </w:pPr>
+            <w:r>
+              <w:rPr>
+                <w:sz w:val="20"/>
+              </w:rPr>
+              <w:t>−50</w:t>
+            </w:r>
+          </w:p>
+        </w:tc>
+        <w:tc>
+          <w:tcPr>
+            <w:tcW w:type="dxa" w:w="794"/>
+            <w:vAlign w:val="center"/>
+          </w:tcPr>
+          <w:p>
+            <w:pPr>
+              <w:pStyle w:val="TableText"/>
+              <w:keepNext/>
+              <w:jc w:val="center"/>
+            </w:pPr>
+            <w:r>
+              <w:rPr>
+                <w:sz w:val="20"/>
+              </w:rPr>
+              <w:t>34</w:t>
+            </w:r>
+          </w:p>
+        </w:tc>
+        <w:tc>
+          <w:tcPr>
+            <w:tcW w:type="dxa" w:w="794"/>
+            <w:vAlign w:val="center"/>
+          </w:tcPr>
+          <w:p>
+            <w:pPr>
+              <w:pStyle w:val="TableText"/>
+              <w:keepNext/>
+              <w:jc w:val="center"/>
+            </w:pPr>
+            <w:r>
+              <w:rPr>
+                <w:sz w:val="20"/>
+              </w:rPr>
+              <w:t>1</w:t>
+            </w:r>
+          </w:p>
+        </w:tc>
+        <w:tc>
+          <w:tcPr>
+            <w:tcW w:type="dxa" w:w="1020"/>
+            <w:vAlign w:val="center"/>
+          </w:tcPr>
+          <w:p>
+            <w:pPr>
+              <w:pStyle w:val="TableText"/>
+              <w:keepNext/>
+              <w:jc w:val="center"/>
+            </w:pPr>
+            <w:r>
+              <w:rPr>
+                <w:sz w:val="20"/>
+              </w:rPr>
+              <w:t>4 (4)</w:t>
+            </w:r>
+          </w:p>
+        </w:tc>
+        <w:tc>
+          <w:tcPr>
+            <w:tcW w:type="dxa" w:w="850"/>
+            <w:vAlign w:val="center"/>
+          </w:tcPr>
+          <w:p>
+            <w:pPr>
+              <w:pStyle w:val="TableText"/>
+              <w:keepNext/>
+              <w:jc w:val="center"/>
+            </w:pPr>
+            <w:r>
+              <w:rPr>
+                <w:sz w:val="20"/>
+              </w:rPr>
+              <w:t>74</w:t>
+            </w:r>
+          </w:p>
+        </w:tc>
+        <w:tc>
+          <w:tcPr>
+            <w:tcW w:type="dxa" w:w="907"/>
+            <w:vAlign w:val="center"/>
+          </w:tcPr>
+          <w:p>
+            <w:pPr>
+              <w:pStyle w:val="TableText"/>
+              <w:keepNext/>
+              <w:jc w:val="center"/>
+            </w:pPr>
+            <w:r>
+              <w:rPr>
+                <w:sz w:val="20"/>
+              </w:rPr>
+              <w:t>413</w:t>
+            </w:r>
+          </w:p>
+        </w:tc>
+      </w:tr>
+      <w:tr>
+        <w:trPr>
+          <w:cantSplit/>
+        </w:trPr>
+        <w:tc>
+          <w:tcPr>
+            <w:tcW w:type="dxa" w:w="680"/>
+            <w:vAlign w:val="center"/>
+          </w:tcPr>
+          <w:p>
+            <w:pPr>
+              <w:pStyle w:val="TableText"/>
+              <w:keepNext/>
+              <w:jc w:val="center"/>
+            </w:pPr>
+            <w:r>
+              <w:rPr>
+                <w:sz w:val="20"/>
+              </w:rPr>
+              <w:t>210</w:t>
+            </w:r>
+          </w:p>
+        </w:tc>
+        <w:tc>
+          <w:tcPr>
+            <w:tcW w:type="dxa" w:w="794"/>
+            <w:vAlign w:val="center"/>
+          </w:tcPr>
+          <w:p>
+            <w:pPr>
+              <w:pStyle w:val="TableText"/>
+              <w:keepNext/>
+              <w:jc w:val="center"/>
+            </w:pPr>
+            <w:r>
+              <w:rPr>
+                <w:sz w:val="20"/>
+              </w:rPr>
+              <w:t>6,0</w:t>
+            </w:r>
+          </w:p>
+        </w:tc>
+        <w:tc>
+          <w:tcPr>
+            <w:tcW w:type="dxa" w:w="1134"/>
+            <w:vAlign w:val="center"/>
+          </w:tcPr>
+          <w:p>
+            <w:pPr>
+              <w:pStyle w:val="TableText"/>
+              <w:keepNext/>
+              <w:jc w:val="center"/>
+            </w:pPr>
+            <w:r>
+              <w:rPr>
+                <w:sz w:val="20"/>
+              </w:rPr>
+              <w:t>1024</w:t>
+            </w:r>
+          </w:p>
+        </w:tc>
+        <w:tc>
+          <w:tcPr>
+            <w:tcW w:type="dxa" w:w="1020"/>
+            <w:vAlign w:val="center"/>
+          </w:tcPr>
+          <w:p>
+            <w:pPr>
+              <w:pStyle w:val="TableText"/>
+              <w:keepNext/>
+              <w:jc w:val="center"/>
+            </w:pPr>
+            <w:r>
+              <w:rPr>
+                <w:sz w:val="20"/>
+              </w:rPr>
+              <w:t>1,48</w:t>
+            </w:r>
+          </w:p>
+        </w:tc>
+        <w:tc>
+          <w:tcPr>
+            <w:tcW w:type="dxa" w:w="907"/>
+            <w:vAlign w:val="center"/>
+          </w:tcPr>
+          <w:p>
+            <w:pPr>
+              <w:pStyle w:val="TableText"/>
+              <w:keepNext/>
+              <w:jc w:val="center"/>
+            </w:pPr>
+            <w:r>
+              <w:rPr>
+                <w:sz w:val="20"/>
+              </w:rPr>
+              <w:t>−50</w:t>
+            </w:r>
+          </w:p>
+        </w:tc>
+        <w:tc>
+          <w:tcPr>
+            <w:tcW w:type="dxa" w:w="794"/>
+            <w:vAlign w:val="center"/>
+          </w:tcPr>
+          <w:p>
+            <w:pPr>
+              <w:pStyle w:val="TableText"/>
+              <w:keepNext/>
+              <w:jc w:val="center"/>
+            </w:pPr>
+            <w:r>
+              <w:rPr>
+                <w:sz w:val="20"/>
+              </w:rPr>
+              <w:t>38</w:t>
+            </w:r>
+          </w:p>
+        </w:tc>
+        <w:tc>
+          <w:tcPr>
+            <w:tcW w:type="dxa" w:w="794"/>
+            <w:vAlign w:val="center"/>
+          </w:tcPr>
+          <w:p>
+            <w:pPr>
+              <w:pStyle w:val="TableText"/>
+              <w:keepNext/>
+              <w:jc w:val="center"/>
+            </w:pPr>
+            <w:r>
+              <w:rPr>
+                <w:sz w:val="20"/>
+              </w:rPr>
+              <w:t>1</w:t>
+            </w:r>
+          </w:p>
+        </w:tc>
+        <w:tc>
+          <w:tcPr>
+            <w:tcW w:type="dxa" w:w="1020"/>
+            <w:vAlign w:val="center"/>
+          </w:tcPr>
+          <w:p>
+            <w:pPr>
+              <w:pStyle w:val="TableText"/>
+              <w:keepNext/>
+              <w:jc w:val="center"/>
+            </w:pPr>
+            <w:r>
+              <w:rPr>
+                <w:sz w:val="20"/>
+              </w:rPr>
+              <w:t>5 (4)</w:t>
+            </w:r>
+          </w:p>
+        </w:tc>
+        <w:tc>
+          <w:tcPr>
+            <w:tcW w:type="dxa" w:w="850"/>
+            <w:vAlign w:val="center"/>
+          </w:tcPr>
+          <w:p>
+            <w:pPr>
+              <w:pStyle w:val="TableText"/>
+              <w:keepNext/>
+              <w:jc w:val="center"/>
+            </w:pPr>
+            <w:r>
+              <w:rPr>
+                <w:sz w:val="20"/>
+              </w:rPr>
+              <w:t>70</w:t>
+            </w:r>
+          </w:p>
+        </w:tc>
+        <w:tc>
+          <w:tcPr>
+            <w:tcW w:type="dxa" w:w="907"/>
+            <w:vAlign w:val="center"/>
+          </w:tcPr>
+          <w:p>
+            <w:pPr>
+              <w:pStyle w:val="TableText"/>
+              <w:keepNext/>
+              <w:jc w:val="center"/>
+            </w:pPr>
+            <w:r>
+              <w:rPr>
+                <w:sz w:val="20"/>
+              </w:rPr>
+              <w:t>403</w:t>
+            </w:r>
+          </w:p>
+        </w:tc>
+      </w:tr>
+      <w:tr>
+        <w:trPr>
+          <w:cantSplit/>
+        </w:trPr>
+        <w:tc>
+          <w:tcPr>
+            <w:tcW w:type="dxa" w:w="680"/>
+            <w:vAlign w:val="center"/>
+          </w:tcPr>
+          <w:p>
+            <w:pPr>
+              <w:pStyle w:val="TableText"/>
+              <w:jc w:val="center"/>
+            </w:pPr>
+            <w:r>
+              <w:rPr>
+                <w:sz w:val="20"/>
+              </w:rPr>
+              <w:t>270</w:t>
+            </w:r>
+          </w:p>
+        </w:tc>
+        <w:tc>
+          <w:tcPr>
+            <w:tcW w:type="dxa" w:w="794"/>
+            <w:vAlign w:val="center"/>
+          </w:tcPr>
+          <w:p>
+            <w:pPr>
+              <w:pStyle w:val="TableText"/>
+              <w:jc w:val="center"/>
+            </w:pPr>
+            <w:r>
+              <w:rPr>
+                <w:sz w:val="20"/>
+              </w:rPr>
+              <w:t>5,8</w:t>
+            </w:r>
+          </w:p>
+        </w:tc>
+        <w:tc>
+          <w:tcPr>
+            <w:tcW w:type="dxa" w:w="1134"/>
+            <w:vAlign w:val="center"/>
+          </w:tcPr>
+          <w:p>
+            <w:pPr>
+              <w:pStyle w:val="TableText"/>
+              <w:jc w:val="center"/>
+            </w:pPr>
+            <w:r>
+              <w:rPr>
+                <w:sz w:val="20"/>
+              </w:rPr>
+              <w:t>992</w:t>
+            </w:r>
+          </w:p>
+        </w:tc>
+        <w:tc>
+          <w:tcPr>
+            <w:tcW w:type="dxa" w:w="1020"/>
+            <w:vAlign w:val="center"/>
+          </w:tcPr>
+          <w:p>
+            <w:pPr>
+              <w:pStyle w:val="TableText"/>
+              <w:jc w:val="center"/>
+            </w:pPr>
+            <w:r>
+              <w:rPr>
+                <w:sz w:val="20"/>
+              </w:rPr>
+              <w:t>1,25</w:t>
+            </w:r>
+          </w:p>
+        </w:tc>
+        <w:tc>
+          <w:tcPr>
+            <w:tcW w:type="dxa" w:w="907"/>
+            <w:vAlign w:val="center"/>
+          </w:tcPr>
+          <w:p>
+            <w:pPr>
+              <w:pStyle w:val="TableText"/>
+              <w:jc w:val="center"/>
+            </w:pPr>
+            <w:r>
+              <w:rPr>
+                <w:sz w:val="20"/>
+              </w:rPr>
+              <w:t>−50</w:t>
+            </w:r>
+          </w:p>
+        </w:tc>
+        <w:tc>
+          <w:tcPr>
+            <w:tcW w:type="dxa" w:w="794"/>
+            <w:vAlign w:val="center"/>
+          </w:tcPr>
+          <w:p>
+            <w:pPr>
+              <w:pStyle w:val="TableText"/>
+              <w:jc w:val="center"/>
+            </w:pPr>
+            <w:r>
+              <w:rPr>
+                <w:sz w:val="20"/>
+              </w:rPr>
+              <w:t>36</w:t>
+            </w:r>
+          </w:p>
+        </w:tc>
+        <w:tc>
+          <w:tcPr>
+            <w:tcW w:type="dxa" w:w="794"/>
+            <w:vAlign w:val="center"/>
+          </w:tcPr>
+          <w:p>
+            <w:pPr>
+              <w:pStyle w:val="TableText"/>
+              <w:jc w:val="center"/>
+            </w:pPr>
+            <w:r>
+              <w:rPr>
+                <w:sz w:val="20"/>
+              </w:rPr>
+              <w:t>1</w:t>
+            </w:r>
+          </w:p>
+        </w:tc>
+        <w:tc>
+          <w:tcPr>
+            <w:tcW w:type="dxa" w:w="1020"/>
+            <w:vAlign w:val="center"/>
+          </w:tcPr>
+          <w:p>
+            <w:pPr>
+              <w:pStyle w:val="TableText"/>
+              <w:jc w:val="center"/>
+            </w:pPr>
+            <w:r>
+              <w:rPr>
+                <w:sz w:val="20"/>
+              </w:rPr>
+              <w:t>4 (4)</w:t>
+            </w:r>
+          </w:p>
+        </w:tc>
+        <w:tc>
+          <w:tcPr>
+            <w:tcW w:type="dxa" w:w="850"/>
+            <w:vAlign w:val="center"/>
+          </w:tcPr>
+          <w:p>
+            <w:pPr>
+              <w:pStyle w:val="TableText"/>
+              <w:jc w:val="center"/>
+            </w:pPr>
+            <w:r>
+              <w:rPr>
+                <w:sz w:val="20"/>
+              </w:rPr>
+              <w:t>68</w:t>
+            </w:r>
+          </w:p>
+        </w:tc>
+        <w:tc>
+          <w:tcPr>
+            <w:tcW w:type="dxa" w:w="907"/>
+            <w:vAlign w:val="center"/>
+          </w:tcPr>
+          <w:p>
+            <w:pPr>
+              <w:pStyle w:val="TableText"/>
+              <w:jc w:val="center"/>
+            </w:pPr>
+            <w:r>
+              <w:rPr>
+                <w:sz w:val="20"/>
+              </w:rPr>
+              <w:t>378</w:t>
+            </w:r>
+          </w:p>
+        </w:tc>
+      </w:tr>
+    </w:tbl>
+    <w:p>
+      <w:pPr>
+        <w:spacing w:line="240" w:lineRule="auto"/>
+      </w:pPr>
     </w:p>
     <w:p>
       <w:r>
@@ -5746,7 +6961,7 @@
         <w:t xml:space="preserve">Условия сравнения. </w:t>
       </w:r>
       <w:r>
-        <w:t>Даже на неизменной трассе 5 м скорость канала в течение суток меняется примерно вдвое: вечером — от 450 до 936 кбит/с. Если сравнивать варианты в разное время, разница в канале перекроет эффект доработки. Поэтому варианты сравниваются в одном включении питания: стенд поочерёдно переключается между ними каждые 1–2 мин, обычно в четыре этапа «без доработки — с доработкой — без — с». Чередование компенсирует медленный дрейф канала: каждый вариант попадает и в начало, и в конец опыта. Четыре этапа — наименьшее число, при котором каждый вариант проходится дважды; при большем числе опыт удлиняется, и канал за это время уходит сильнее. Первые 10 с каждого этапа не учитываются: после переключения очереди и управление качеством выходят на новый режим. Разница меньше 20 % значимой не считается: настолько расходились между собой два этапа одного и того же варианта. Кроме того, модуль принимает команды настройки только в первые 30 с после включения питания (подраздел 2.6), поэтому опыт засчитывается, только если журнал подтверждает, что настройки применились.</w:t>
+        <w:t>Даже на неизменной трассе 5 м через стену скорость канала в течение суток меняется примерно вдвое: вечером — от 450 до 936 кбит/с. Если сравнивать варианты в разное время, разница в канале перекроет эффект доработки. Поэтому варианты сравниваются в одном включении питания: стенд поочерёдно переключается между ними каждые 1–2 мин, обычно в четыре этапа «без доработки — с доработкой — без — с». Чередование компенсирует медленный дрейф канала: каждый вариант попадает и в начало, и в конец опыта. Четыре этапа — наименьшее число, при котором каждый вариант проходится дважды; при большем числе опыт удлиняется, и канал за это время уходит сильнее. Первые 10 с каждого этапа не учитываются: после переключения очереди и управление качеством выходят на новый режим. Разница меньше 20 % значимой не считается: настолько расходились между собой два этапа одного и того же варианта. Кроме того, модуль принимает команды настройки только в первые 30 с после включения питания (подраздел 2.6), поэтому опыт засчитывается, только если журнал подтверждает, что настройки применились.</w:t>
       </w:r>
     </w:p>
     <w:p>
@@ -6056,7 +7271,7 @@
         <w:t xml:space="preserve">На рынке найдено пять вариантов оборудования Wi-Fi HaLow (таблица </w:t>
       </w:r>
       <w:r>
-        <w:t>2.4</w:t>
+        <w:t>2.5</w:t>
       </w:r>
       <w:r>
         <w:t>).</w:t>
@@ -6068,7 +7283,7 @@
         <w:ind w:firstLine="0"/>
       </w:pPr>
       <w:r>
-        <w:t>Таблица 2.4 – Оборудование Wi-Fi HaLow, доступное для исследования</w:t>
+        <w:t>Таблица 2.5 – Оборудование Wi-Fi HaLow, доступное для исследования</w:t>
       </w:r>
     </w:p>
     <w:tbl>
@@ -6599,7 +7814,7 @@
     </w:p>
     <w:p>
       <w:r>
-        <w:t>Микроконтроллер ESP32-S3 — система на кристалле: помимо процессорных ядер он содержит приёмопередатчик Wi-Fi 2,4 ГГц (IEEE 802.11b/g/n) и Bluetooth LE [21]. Поэтому на той же плате есть второй радиоканал, не зависящий от модуля TX-AH, и платформа пригодна для сравнения Wi-Fi HaLow с IEEE 802.11 на идентичной аппаратной части. В работе это сравнение выполнено измерением на трассе 5 м и расчётом бюджета канала (раздел 3.7).</w:t>
+        <w:t>Микроконтроллер ESP32-S3 — система на кристалле: помимо процессорных ядер он содержит приёмопередатчик Wi-Fi 2,4 ГГц (IEEE 802.11b/g/n) и Bluetooth LE [21]. Поэтому на той же плате есть второй радиоканал, не зависящий от модуля TX-AH, и платформа пригодна для сравнения Wi-Fi HaLow с IEEE 802.11 на идентичной аппаратной части. В работе это сравнение выполнено измерением на трассе 5 м через стену и расчётом бюджета канала (раздел 3.7).</w:t>
       </w:r>
     </w:p>
     <w:p>
@@ -6815,7 +8030,7 @@
         <w:t xml:space="preserve">Рабочая конфигурация. </w:t>
       </w:r>
       <w:r>
-        <w:t>Канал 2 МГц с центром 867,0 МГц (полоса 866–868 МГц), мощность не более 14 дБм. Камера — в соседней комнате на расстоянии около 5 м от приёмника, за стеной, то есть вне прямой видимости (далее — трасса 5 м); питание от внешнего аккумулятора; приёмник подключён к компьютеру по USB. Разрешение — сначала 320 × 240 точек, затем 480 × 320. Модуль камеры работает точкой доступа (AP), модуль приёмника — станцией (STA); причины смены ролей приведены в разделе 2.6 (пункт 4) и в разделе 3.4. Все опыты главы, кроме лабораторного этапа и измерения границы связи, выполнены на трассе 5 м.</w:t>
+        <w:t>Канал 2 МГц с центром 867,0 МГц (полоса 866–868 МГц), мощность не более 14 дБм. Камера — в соседней комнате на расстоянии около 5 м от приёмника, за стеной, то есть вне прямой видимости (далее — трасса 5 м через стену); питание от внешнего аккумулятора; приёмник подключён к компьютеру по USB. Разрешение — сначала 320 × 240 точек, затем 480 × 320. Модуль камеры работает точкой доступа (AP), модуль приёмника — станцией (STA); причины смены ролей приведены в разделе 2.6 (пункт 4) и в разделе 3.4. Все опыты главы, кроме лабораторного этапа и измерения границы связи, выполнены на трассе 5 м через стену.</w:t>
       </w:r>
     </w:p>
     <w:p>
@@ -7403,13 +8618,13 @@
     </w:p>
     <w:p>
       <w:r>
-        <w:t xml:space="preserve">Исходно платформа передавала 121 кбит/с — более чем на порядок меньше скорости радиоканала по таблице 2.1. Последовательный поиск ограничивающего звена и его устранение подняли пропускную способность примерно до 0,7 Мбит/с на лабораторном этапе, а после перехода на разрешённый канал, трассу 5 м и доработок канала — до 1063 кбит/с полезного видео 480 × 320 в итоговой версии. Этапы показаны на рисунке </w:t>
+        <w:t xml:space="preserve">Исходно платформа передавала 121 кбит/с — более чем на порядок меньше скорости радиоканала по таблице 2.1. Последовательный поиск ограничивающего звена и его устранение подняли пропускную способность примерно до 0,7 Мбит/с на лабораторном этапе, а после перехода на разрешённый канал, трассу 5 м через стену и доработок канала — до 1063 кбит/с полезного видео 480 × 320 в итоговой версии. Этапы показаны на рисунке </w:t>
       </w:r>
       <w:r>
         <w:t>3.1</w:t>
       </w:r>
       <w:r>
-        <w:t>. Условия замеров различаются: лабораторные точки сняты при разрешении 240 × 176 в канале 4 МГц, остальные — на трассе 5 м в канале 2 МГц; в ранних замерах считались все байты, принятые приёмником, в поздних — только полезное видео. Поэтому рисунок показывает путь доработки; насколько помогла каждая доработка последнего этапа, установлено отдельно — поочерёдным включением и выключением в одном опыте (раздел 3.4). Нижняя группа рисунка — итоговая версия на трассе прямой видимости при измерении границы связи (раздел 3.6).</w:t>
+        <w:t>. Условия замеров различаются: лабораторные точки сняты при разрешении 240 × 176 в канале 4 МГц, остальные — на трассе 5 м через стену в канале 2 МГц; в ранних замерах считались все байты, принятые приёмником, в поздних — только полезное видео. Поэтому рисунок показывает путь доработки; насколько помогла каждая доработка последнего этапа, установлено отдельно — поочерёдным включением и выключением в одном опыте (раздел 3.4). Нижняя группа рисунка — итоговая версия на трассе прямой видимости при измерении границы связи (раздел 3.6).</w:t>
       </w:r>
     </w:p>
     <w:p>
@@ -8414,7 +9629,7 @@
         <w:t xml:space="preserve">Ограничивающее звено — радиоканал. </w:t>
       </w:r>
       <w:r>
-        <w:t>После этих доработок звенья проверены по очереди: загружено ли каждое до предела. Интерфейс UART: камера подавала в модуль около 1 Мбит/с, а интерфейс пропускает до 1,65 Мбит/с — он загружен не полностью. Процессор модуля: при передаче видео он простаивает 92–93 % времени — тоже не предел, поэтому ускорение интерфейса (приём через прямой доступ к памяти, 4,8 Мбод) проверено и пользы не дало. Радиоканал: по отчёту радиоуровня модуля камеры на трассе 5 м эфир занят передачей к приёмнику 99 % времени — это предел. Значит, поток ограничивает эфир. Подача около 1 Мбит/с объясняется тем же: камера отправляет новый видеокадр только после квитанции на предыдущие (окно, раздел 3.4), поэтому подаёт в модуль столько, сколько проходит через эфир.</w:t>
+        <w:t>После этих доработок звенья проверены по очереди: загружено ли каждое до предела. Интерфейс UART: камера подавала в модуль около 1 Мбит/с, а интерфейс пропускает до 1,65 Мбит/с — он загружен не полностью. Процессор модуля: при передаче видео он простаивает 92–93 % времени — тоже не предел, поэтому ускорение интерфейса (приём через прямой доступ к памяти, 4,8 Мбод) проверено и пользы не дало. Радиоканал: по отчёту радиоуровня модуля камеры на трассе 5 м через стену эфир занят передачей к приёмнику 99 % времени — это предел. Значит, поток ограничивает эфир. Подача около 1 Мбит/с объясняется тем же: камера отправляет новый видеокадр только после квитанции на предыдущие (окно, раздел 3.4), поэтому подаёт в модуль столько, сколько проходит через эфир.</w:t>
       </w:r>
     </w:p>
     <w:p>
@@ -8429,7 +9644,7 @@
     </w:p>
     <w:p>
       <w:r>
-        <w:t>Главный вывод раздела: на лабораторном этапе пропускную способность последовательно ограничивали драйвер UART модуля, паузы между фрагментами и программное сжатие; после их доработки ограничивающим звеном стал радиоканал между платами. Это означает не затухание — на 5 м сигнал сильный, около −53 дБм, — а потери передач: каждый потерянный кадр MAC передаётся повторно, повторы занимают эфир, и на полезное видео остаётся меньше половины его времени. Интерфейс UART задаёт архитектурный предел 3,92 Мбит/с, до которого канал не доходит.</w:t>
+        <w:t>Главный вывод раздела: на лабораторном этапе пропускную способность последовательно ограничивали драйвер UART модуля, паузы между фрагментами и программное сжатие; после их доработки ограничивающим звеном стал радиоканал между платами. Это означает не затухание — на 5 м через стену сигнал сильный, около −53 дБм, — а потери передач: каждый потерянный кадр MAC передаётся повторно, повторы занимают эфир, и на полезное видео остаётся меньше половины его времени. Интерфейс UART задаёт архитектурный предел 3,92 Мбит/с, до которого канал не доходит.</w:t>
       </w:r>
     </w:p>
     <w:p>
@@ -8496,7 +9711,7 @@
     </w:p>
     <w:p>
       <w:r>
-        <w:t>Число M от 0 до 8 камера раз в 2 с выбирает по последним 48 квитанциям — это около 10 с видео: достаточно, чтобы оценить долю потерь, и достаточно мало, чтобы следовать за изменениями канала. Выбирается M, при котором ожидаемое число целых видеокадров с учётом доли байтов, занятых контрольными фрагментами, наибольшее. Что контрольные фрагменты не закрыли, камера досылает один раз, если видеокадр моложе 1,5 с: более старый кадр уже не нужен для показа в реальном времени. Программа просмотра ждёт недостающие фрагменты до 0,7 с — дольше задержки квитанции (0,34–0,50 с), чтобы досылка успела прийти, — и показывает видеокадры по порядку. На трассе 5 м теряется 2–3 % фрагментов, чаще по 1–2 в видеокадре, поэтому подбор держит M около нуля и работает досылка.</w:t>
+        <w:t>Число M от 0 до 8 камера раз в 2 с выбирает по последним 48 квитанциям — это около 10 с видео: достаточно, чтобы оценить долю потерь, и достаточно мало, чтобы следовать за изменениями канала. Выбирается M, при котором ожидаемое число целых видеокадров с учётом доли байтов, занятых контрольными фрагментами, наибольшее. Что контрольные фрагменты не закрыли, камера досылает один раз, если видеокадр моложе 1,5 с: более старый кадр уже не нужен для показа в реальном времени. Программа просмотра ждёт недостающие фрагменты до 0,7 с — дольше задержки квитанции (0,34–0,50 с), чтобы досылка успела прийти, — и показывает видеокадры по порядку. На трассе 5 м через стену теряется 2–3 % фрагментов, чаще по 1–2 в видеокадре, поэтому подбор держит M около нуля и работает досылка.</w:t>
       </w:r>
     </w:p>
     <w:p>
@@ -8568,7 +9783,7 @@
         <w:jc w:val="center"/>
       </w:pPr>
       <w:r>
-        <w:t>Рисунок 3.2 – Инерция управления качеством: четыре этапа в одном включении питания (трасса 5 м)</w:t>
+        <w:t>Рисунок 3.2 – Инерция управления качеством: четыре этапа в одном включении питания (трасса 5 м через стену)</w:t>
       </w:r>
     </w:p>
     <w:p>
@@ -8590,7 +9805,7 @@
         <w:t xml:space="preserve">Смена разрешения в процессе передачи. </w:t>
       </w:r>
       <w:r>
-        <w:t>Когда канал ухудшается, камера сначала снижает качество сжатия JPEG. Если качество уже опустилось до 30 — ниже картинка становится неразборчивой, — а задержка квитанций продолжает расти, камера уменьшает сам видеокадр: 480 × 320 → 320 × 213 → 240 × 160. Когда канал улучшается и качество поднимается до 80, разрешение возвращается на ступень выше, но не чаще раза в 15 с, чтобы оно не переключалось туда и обратно. Возврат 240 × 160 → 480 × 320 проверен; на трассе 5 м уменьшение не включалось — канал этого не требовал.</w:t>
+        <w:t>Когда канал ухудшается, камера сначала снижает качество сжатия JPEG. Если качество уже опустилось до 30 — ниже картинка становится неразборчивой, — а задержка квитанций продолжает расти, камера уменьшает сам видеокадр: 480 × 320 → 320 × 213 → 240 × 160. Когда канал улучшается и качество поднимается до 80, разрешение возвращается на ступень выше, но не чаще раза в 15 с, чтобы оно не переключалось туда и обратно. Возврат 240 × 160 → 480 × 320 проверен; на трассе 5 м через стену уменьшение не включалось — канал этого не требовал.</w:t>
       </w:r>
     </w:p>
     <w:p>
@@ -8601,7 +9816,7 @@
         <w:t xml:space="preserve">Мощность передатчика. </w:t>
       </w:r>
       <w:r>
-        <w:t>Регулятор во встроенной программе модуля держит отношение сигнал/шум, с которым приёмник слышит камеру, в коридоре 20–30 дБ. Нижний край выбран так, чтобы действовала граница MCS 4 (SNR не ниже 22 дБ) и оставался запас на провалы; выше 30 дБ мощность не нужна для связи и только усиливает наводку на камеру. Шаг — 2 дБ в пределах 1–14 дБм; при потере связи мощность сразу поднимается до 14 дБм. От 8 дБм камера снимает только в паузах передачи, чтобы излучение передатчика не искажало захват изображения (раздел 3.5). Отдельной версии программы для дальности нет: одна и та же версия работает на всех расстояниях. На трассе 5 м мощность была 1 дБм в 45 из 49 отчётов, 831 кбит/с полезного видео, 0 искажённых видеокадров из 2786; при просадках отношения сигнал/шум до 12–20 дБ регулятор поднимал мощность до 11–13 дБм и одновременно снималась граница модуляции.</w:t>
+        <w:t>Регулятор во встроенной программе модуля держит отношение сигнал/шум, с которым приёмник слышит камеру, в коридоре 20–30 дБ. Нижний край выбран так, чтобы действовала граница MCS 4 (SNR не ниже 22 дБ) и оставался запас на провалы; выше 30 дБ мощность не нужна для связи и только усиливает наводку на камеру. Шаг — 2 дБ в пределах 1–14 дБм; при потере связи мощность сразу поднимается до 14 дБм. От 8 дБм камера снимает только в паузах передачи, чтобы излучение передатчика не искажало захват изображения (раздел 3.5). Отдельной версии программы для дальности нет: одна и та же версия работает на всех расстояниях. На трассе 5 м через стену мощность была 1 дБм в 45 из 49 отчётов, 831 кбит/с полезного видео, 0 искажённых видеокадров из 2786; при просадках отношения сигнал/шум до 12–20 дБ регулятор поднимал мощность до 11–13 дБм и одновременно снималась граница модуляции.</w:t>
       </w:r>
     </w:p>
     <w:p>
@@ -8612,7 +9827,7 @@
         <w:t xml:space="preserve">Сравнение в одном включении. </w:t>
       </w:r>
       <w:r>
-        <w:t>Выше описаны основные доработки; настройки меньшего масштаба (пороги, таймеры) заданы в программе стенда. Канал на трассе 5 м меняется в разы по времени суток, поэтому три главные доработки проверены чередованием «выключено / включено» внутри одного включения питания — по четыре этапа, каждый вариант дважды, как требует методика (раздел 2.4); результаты — в таблице 3.4.</w:t>
+        <w:t>Выше описаны основные доработки; настройки меньшего масштаба (пороги, таймеры) заданы в программе стенда. Канал на трассе 5 м через стену меняется в разы по времени суток, поэтому три главные доработки проверены чередованием «выключено / включено» внутри одного включения питания — по четыре этапа, каждый вариант дважды, как требует методика (раздел 2.4); результаты — в таблице 3.4.</w:t>
       </w:r>
     </w:p>
     <w:p>
@@ -8621,7 +9836,7 @@
         <w:ind w:firstLine="0"/>
       </w:pPr>
       <w:r>
-        <w:t>Таблица 3.4 – Парные опыты в одном включении питания (5 м, канал 2 МГц на 867 МГц)</w:t>
+        <w:t>Таблица 3.4 – Парные опыты в одном включении питания (5 м через стену, канал 2 МГц на 867 МГц)</w:t>
       </w:r>
     </w:p>
     <w:tbl>
@@ -9045,7 +10260,7 @@
         <w:t xml:space="preserve">Итоговые результаты по критериям задания. </w:t>
       </w:r>
       <w:r>
-        <w:t>Итоговый опыт (трасса 5 м) дал 1063 кбит/с полезного видео 480 × 320 при 5,0 видеокадра в секунду, потеряно 1,4 % видеокадров, мощность передатчика 1 дБм, перезапусков нет. Показатели канала по критериям задания сведены в таблицу 3.5.</w:t>
+        <w:t>Итоговый опыт (трасса 5 м через стену) дал 1063 кбит/с полезного видео 480 × 320 при 5,0 видеокадра в секунду, потеряно 1,4 % видеокадров, мощность передатчика 1 дБм, перезапусков нет. Показатели канала по критериям задания сведены в таблицу 3.5.</w:t>
       </w:r>
     </w:p>
     <w:p>
@@ -9054,7 +10269,7 @@
         <w:ind w:firstLine="0"/>
       </w:pPr>
       <w:r>
-        <w:t>Таблица 3.5 – Показатели канала Wi-Fi HaLow на трассе 5 м (итоговая конфигурация)</w:t>
+        <w:t>Таблица 3.5 – Показатели канала Wi-Fi HaLow на трассе 5 м через стену (итоговая конфигурация)</w:t>
       </w:r>
     </w:p>
     <w:tbl>
@@ -9645,6 +10860,17 @@
       </w:r>
     </w:p>
     <w:p>
+      <w:r>
+        <w:rPr>
+          <w:b/>
+        </w:rPr>
+        <w:t xml:space="preserve">Контрольный опыт. </w:t>
+      </w:r>
+      <w:r>
+        <w:t>Опыт длительностью 282 с выполнен на трассе 5 м через стену с итоговой версией программ. Получено: полезная скорость в среднем 1028 кбит/с (медиана посекундных значений — 1024 кбит/с), 5,6 видеокадра в секунду; показано 1572 видеокадра, потеряно 16 (1,0 %), досылкой восстановлено 35; потери фрагментов после повторов MAC — 1,2 %. Мощность передатчика 1 дБм, уровень сигнала −50 дБм, SNR 36 дБ, нижняя граница модуляции держалась на MCS 4, PER — 68 %, RTT — 0,42 с (медианы). Фрагмент журнала — в таблице 2.4.</w:t>
+      </w:r>
+    </w:p>
+    <w:p>
       <w:pPr>
         <w:pStyle w:val="Heading2"/>
       </w:pPr>
@@ -10036,7 +11262,7 @@
     </w:p>
     <w:p>
       <w:r>
-        <w:t>Повреждения захвата вызваны наводкой собственного передатчика: антенна модуля находится в нескольких сантиметрах от шлейфа камеры, и излучение сбивает тактирование линий DVP. Это установили два опыта, в которых менялось только излучение. В первом (таблица выше) при 1 дБм не повреждён ни один видеокадр, при 20 дБм — 44 %. Во втором камера снимала непрерывно, а передатчик попеременно 5 с работал и 5 с молчал: сдвиг байта возникал только в фазах передачи. Другие возможные причины — питание, нагрев, настройки сенсора — в этих опытах не менялись. Эффект сохраняется и в разрешённых пределах мощности: на трассе 5 м доля искажённых видеокадров при 240 × 176 составила около 15 % при 12 дБм и около 60 % при 14 дБм, при 320 × 240 — 40–60 % уже при 10 дБм. Для БПЛА из этого следует важный вывод: на границе дальности передатчик работает с максимальной мощностью, и именно там наводка на камеру сильнее всего, поэтому захват должен выдерживать максимальную мощность системы.</w:t>
+        <w:t>Повреждения захвата вызваны наводкой собственного передатчика: антенна модуля находится в нескольких сантиметрах от шлейфа камеры, и излучение сбивает тактирование линий DVP. Это установили два опыта, в которых менялось только излучение. В первом (таблица выше) при 1 дБм не повреждён ни один видеокадр, при 20 дБм — 44 %. Во втором камера снимала непрерывно, а передатчик попеременно 5 с работал и 5 с молчал: сдвиг байта возникал только в фазах передачи. Другие возможные причины — питание, нагрев, настройки сенсора — в этих опытах не менялись. Эффект сохраняется и в разрешённых пределах мощности: на трассе 5 м через стену доля искажённых видеокадров при 240 × 176 составила около 15 % при 12 дБм и около 60 % при 14 дБм, при 320 × 240 — 40–60 % уже при 10 дБм. Для БПЛА из этого следует важный вывод: на границе дальности передатчик работает с максимальной мощностью, и именно там наводка на камеру сильнее всего, поэтому захват должен выдерживать максимальную мощность системы.</w:t>
       </w:r>
     </w:p>
     <w:p>
@@ -10055,7 +11281,7 @@
         <w:t xml:space="preserve">– </w:t>
       </w:r>
       <w:r>
-        <w:t>регулятор мощности (раздел 3.4) по отношению сигнал/шум держит мощность минимальной, при которой связь устойчива: вблизи — 1 дБм, и на трассе 5 м искажено 0 видеокадров из 2786;</w:t>
+        <w:t>регулятор мощности (раздел 3.4) по отношению сигнал/шум держит мощность минимальной, при которой связь устойчива: вблизи — 1 дБм, и на трассе 5 м через стену искажено 0 видеокадров из 2786;</w:t>
       </w:r>
     </w:p>
     <w:p>
@@ -10074,7 +11300,7 @@
         <w:t xml:space="preserve">Мощность и качество канала на малом расстоянии. </w:t>
       </w:r>
       <w:r>
-        <w:t>В паре опытов таблицы 3.6 (лабораторный этап) PER по статистике модуля составил в среднем 38,3 % при 1 дБм и 43,1 % при 20 дБм, а потери фрагментов на приёмнике — 0,83 и 0,25 % соответственно. Разница в несколько процентов меньше колебаний канала: мощность в 100 раз меньше почти не изменила ни PER, ни потери. Это согласуется с подразделом 3.3: потери в эфире не зависят от уровня сигнала. В разрешённой конфигурации большая мощность также не ускоряет канал: на трассе 5 м при постоянной мощности 14 дБм синтетический поток составил 763 кбит/с против 987 кбит/с с регулятором (1 дБм), а видео при 14 дБм теряет ещё и на паузах съёмки — 313 против 734 кбит/с. Мощность передатчика приёмника, которым отправляются квитанции, тоже повышали до 14 дБм: скорость и потери изменились не больше, чем канал меняется сам по себе. Главный эффект мощности на малом расстоянии — наводка на камеру, а не качество канала; мощность нужна на дальности, и её выбор поручен регулятору.</w:t>
+        <w:t>В паре опытов таблицы 3.6 (лабораторный этап) PER по статистике модуля составил в среднем 38,3 % при 1 дБм и 43,1 % при 20 дБм, а потери фрагментов на приёмнике — 0,83 и 0,25 % соответственно. Разница в несколько процентов меньше колебаний канала: мощность в 100 раз меньше почти не изменила ни PER, ни потери. Это согласуется с подразделом 3.3: потери в эфире не зависят от уровня сигнала. В разрешённой конфигурации большая мощность также не ускоряет канал: на трассе 5 м через стену при постоянной мощности 14 дБм синтетический поток составил 763 кбит/с против 987 кбит/с с регулятором (1 дБм), а видео при 14 дБм теряет ещё и на паузах съёмки — 313 против 734 кбит/с. Мощность передатчика приёмника, которым отправляются квитанции, тоже повышали до 14 дБм: скорость и потери изменились не больше, чем канал меняется сам по себе. Главный эффект мощности на малом расстоянии — наводка на камеру, а не качество канала; мощность нужна на дальности, и её выбор поручен регулятору.</w:t>
       </w:r>
     </w:p>
     <w:p>
@@ -13742,7 +14968,7 @@
         <w:ind w:firstLine="0"/>
       </w:pPr>
       <w:r>
-        <w:t>Таблица 3.12 – Wi-Fi HaLow и Wi-Fi 2,4 ГГц на одной паре плат, трасса 5 м</w:t>
+        <w:t>Таблица 3.12 – Wi-Fi HaLow и Wi-Fi 2,4 ГГц на одной паре плат, трасса 5 м через стену</w:t>
       </w:r>
     </w:p>
     <w:tbl>
@@ -14420,7 +15646,7 @@
     </w:p>
     <w:p>
       <w:r>
-        <w:t>На короткой трассе Wi-Fi 2,4 ГГц даёт ёмкость в 15–19 раз больше, чем Wi-Fi HaLow, а видеопоток около 1 Мбит/с, ограниченный камерой, оба канала передают сопоставимо. Запас по сигналу у Wi-Fi HaLow при этом больше: регулятор держит мощность 1 дБм при отношении сигнал/фон 24–40 дБ, тогда как Wi-Fi 2,4 ГГц при 14–20 дБм имеет 15–24 дБ, то есть при удалении начнёт терять видео раньше. Фон у платы с камерой на 2,4 ГГц постоянен (−90 дБм), в диапазоне 867 МГц он менялся по дням, и помехи камеры сильнее влияют на Wi-Fi HaLow. Задержку Wi-Fi HaLow увеличивают досылка кусков и паузы планирования, которых в Wi-Fi-тракте нет. Измерения Wi-Fi HaLow и Wi-Fi 2,4 ГГц на трассе 5 м выполнены в разные дни, а канал меняется по времени суток, поэтому это сравнение приблизительное; точное сравнение на одних и тех же положениях приёмника дало измерение границы связи.</w:t>
+        <w:t>На короткой трассе Wi-Fi 2,4 ГГц даёт ёмкость в 15–19 раз больше, чем Wi-Fi HaLow, а видеопоток около 1 Мбит/с, ограниченный камерой, оба канала передают сопоставимо. Запас по сигналу у Wi-Fi HaLow при этом больше: регулятор держит мощность 1 дБм при отношении сигнал/фон 24–40 дБ, тогда как Wi-Fi 2,4 ГГц при 14–20 дБм имеет 15–24 дБ, то есть при удалении начнёт терять видео раньше. Фон у платы с камерой на 2,4 ГГц постоянен (−90 дБм), в диапазоне 867 МГц он менялся по дням, и помехи камеры сильнее влияют на Wi-Fi HaLow. Задержку Wi-Fi HaLow увеличивают досылка кусков и паузы планирования, которых в Wi-Fi-тракте нет. Измерения Wi-Fi HaLow и Wi-Fi 2,4 ГГц на трассе 5 м через стену выполнены в разные дни, а канал меняется по времени суток, поэтому это сравнение приблизительное; точное сравнение на одних и тех же положениях приёмника дало измерение границы связи.</w:t>
       </w:r>
     </w:p>
     <w:p>
@@ -14543,7 +15769,7 @@
         <w:t>(3.2)</w:t>
       </w:r>
       <w:r>
-        <w:t>) найдены допустимые потери, по модели трассы — дальность, на которой они достигаются, и в каждой ячейке указана наибольшая скорость, при которой связь на этом расстоянии ещё сохраняется. У земли (антенны на 1,5 м) за точкой излома потери от частоты не зависят, и все технологии теряют дальность в разы. С антенной на борту на высоте 50 м Wi-Fi HaLow сохраняет 650 кбит/с на 1–2 км, а Wi-Fi 2,4 ГГц по расчёту даёт 1–6,5 Мбит/с до 2 км. Причин две: на 2,4 ГГц разрешено 20 дБм против 14 дБм, а на скоростях от 6,5 Мбит/с чувствительность широкого канала Wi-Fi лучше, чем у узкого канала Wi-Fi HaLow на сложной модуляции; кроме того, для антенны на высоте точка излома на 2,4 ГГц почти втрое дальше. Скорость не ниже видеопотока стенда 1063 кбит/с (выделено жирным) по расчёту сохраняется у Wi-Fi 2,4 ГГц до 1 км, у Wi-Fi HaLow — до 0,5 км на сетке расстояний рисунка (граница MCS 7 — 0,98 км); промежуточные режимы MCS 1–6 не показаны, их чувствительность паспорт не даёт. Все дальности рисунка — возможности радиотрактов при тепловом шуме. Измеренная граница данной пары плат: видео с потерями до 9 % — около 310 м, видео прекращается на 1,10 км, связь — до 1,55 км (таблица 3.10).</w:t>
+        <w:t>) найдены допустимые потери, по модели трассы — дальность, на которой они достигаются, и в каждой ячейке указана наибольшая скорость, при которой связь на этом расстоянии ещё сохраняется. У земли (антенны на 1,5 м) за точкой излома потери от частоты не зависят, и все технологии теряют дальность в разы. С антенной на борту на высоте 50 м Wi-Fi HaLow сохраняет 650 кбит/с на 1–2 км, а Wi-Fi 2,4 ГГц по расчёту даёт 1–6,5 Мбит/с до 2 км. Причин две: на 2,4 ГГц разрешено 20 дБм против 14 дБм, а на скоростях от 6,5 Мбит/с чувствительность широкого канала Wi-Fi лучше, чем у узкого канала Wi-Fi HaLow на сложной модуляции; кроме того, для антенны на высоте точка излома на 2,4 ГГц почти втрое дальше. Чёткого порога скорости для видео нет: при меньшей скорости видео сохраняется за счёт снижения качества сжатия и разрешения (раздел 3.4). Промежуточные режимы MCS 1–6 на рисунке не показаны: их чувствительность паспорт не даёт. Все дальности рисунка — возможности радиотрактов при тепловом шуме. Измеренная граница данной пары плат: видео с потерями до 9 % — около 310 м, видео прекращается на 1,10 км, связь — до 1,55 км (таблица 3.10).</w:t>
       </w:r>
     </w:p>
     <w:p>
@@ -14555,7 +15781,7 @@
       <w:r>
         <w:drawing>
           <wp:inline xmlns:a="http://schemas.openxmlformats.org/drawingml/2006/main" xmlns:pic="http://schemas.openxmlformats.org/drawingml/2006/picture">
-            <wp:extent cx="5760000" cy="5078292"/>
+            <wp:extent cx="5760000" cy="4668339"/>
             <wp:docPr id="7" name="Picture 7"/>
             <wp:cNvGraphicFramePr>
               <a:graphicFrameLocks noChangeAspect="1"/>
@@ -14576,7 +15802,7 @@
                   <pic:spPr>
                     <a:xfrm>
                       <a:off x="0" y="0"/>
-                      <a:ext cx="5760000" cy="5078292"/>
+                      <a:ext cx="5760000" cy="4668339"/>
                     </a:xfrm>
                     <a:prstGeom prst="rect"/>
                   </pic:spPr>
@@ -15590,7 +16816,7 @@
     </w:p>
     <w:p>
       <w:r>
-        <w:t>2. Пропускная способность поднята со 121 кбит/с до 1063 кбит/с полезного видео 480 × 320 при 5 видеокадрах в секунду на трассе 5 м (через стену, вне прямой видимости). На лабораторном этапе её ограничивали драйвер UART модуля, паузы между фрагментами и программное сжатие; после их доработки ограничивающим звеном стал радиоканал между платами: около трети первых передач не доходит даже при сильном сигнале, и эфир занят повторами на 99 %. Уровень сигнала, модуляция и длина кадра на эту долю не влияют; точную причину нельзя установить без доступа к программе MAC-уровня модуля, которая поставляется только в машинном коде. Интерфейс UART задаёт архитектурный предел 3,92 Мбит/с, до которого канал не доходит; это ниже 6,5 Мбит/с, на которые способен физический уровень канала 2 МГц.</w:t>
+        <w:t>2. Пропускная способность поднята со 121 кбит/с до 1063 кбит/с полезного видео 480 × 320 при 5 видеокадрах в секунду на трассе 5 м через стену (вне прямой видимости). На лабораторном этапе её ограничивали драйвер UART модуля, паузы между фрагментами и программное сжатие; после их доработки ограничивающим звеном стал радиоканал между платами: около трети первых передач не доходит даже при сильном сигнале, и эфир занят повторами на 99 %. Уровень сигнала, модуляция и длина кадра на эту долю не влияют; точную причину нельзя установить без доступа к программе MAC-уровня модуля, которая поставляется только в машинном коде. Интерфейс UART задаёт архитектурный предел 3,92 Мбит/с, до которого канал не доходит; это ниже 6,5 Мбит/с, на которые способен физический уровень канала 2 МГц.</w:t>
       </w:r>
     </w:p>
     <w:p>
@@ -15605,7 +16831,7 @@
     </w:p>
     <w:p>
       <w:r>
-        <w:t>5. По критериям задания на трассе 5 м: уровень сигнала −53 дБм при отношении сигнал/шум 36 дБ, задержка по квитанции в медиане 0,34–0,50 с, потери видеокадров 1,4 %. Доля неудачных попыток передачи модуля (PER) при этом 50–67 %: в неё входят все повторы и попытки без подтверждения, а не потерянные данные (подраздел 3.4).</w:t>
+        <w:t>5. По критериям задания на трассе 5 м через стену: уровень сигнала −53 дБм при отношении сигнал/шум 36 дБ, задержка по квитанции в медиане 0,34–0,50 с, потери видеокадров 1,4 %. Доля неудачных попыток передачи модуля (PER) при этом 50–67 %: в неё входят все повторы и попытки без подтверждения, а не потерянные данные (подраздел 3.4).</w:t>
       </w:r>
     </w:p>
     <w:p>
@@ -15615,7 +16841,7 @@
     </w:p>
     <w:p>
       <w:r>
-        <w:t>7. На идентичной платформе при нормах мощности Российской Федерации измерение показало: Wi-Fi HaLow удерживает связь в 1,8 раза дальше Wi-Fi 2,4 ГГц (данные ниже); по расчёту при одной и той же скорости 6,5 Мбит/с — наибольшей для канала 2 МГц Wi-Fi HaLow — дальности сопоставимы, а преимущество Wi-Fi HaLow — малые скорости с большей дальностью и меньшее затухание в препятствиях: на 6,3 дБ в бетонной стене и на 6,5–14,8 дБ на 100–400 м леса. Измерение на той же паре плат на трассе 5 м: ёмкость Wi-Fi 2,4 ГГц 15,7–19,2 Мбит/с против около 1 Мбит/с у Wi-Fi HaLow, видео передаётся сопоставимо (потери видеокадров 2,1–2,2 и 1,4 %), но запас по сигналу у Wi-Fi HaLow при мощности 1 дБм (24–40 дБ) больше, чем у Wi-Fi 2,4 ГГц при 14–20 дБм (15–24 дБ). Измерение границы связи на тех же положениях приёмника подтвердило это: на трассе прямой видимости видео Wi-Fi 2,4 ГГц прекращается на ≈ 0,62 км против ≈ 1,10 км у Wi-Fi HaLow, связь — на ≈ 0,87 против ≈ 1,55 км, то есть Wi-Fi HaLow удерживает связь в 1,8 раза дальше при мощности на 6 дБ ниже. LoRa превосходит по дальности, но её скорость на два–три порядка ниже видео.</w:t>
+        <w:t>7. На идентичной платформе при нормах мощности Российской Федерации измерение показало: Wi-Fi HaLow удерживает связь в 1,8 раза дальше Wi-Fi 2,4 ГГц (данные ниже); по расчёту при одной и той же скорости 6,5 Мбит/с — наибольшей для канала 2 МГц Wi-Fi HaLow — дальности сопоставимы, а преимущество Wi-Fi HaLow — малые скорости с большей дальностью и меньшее затухание в препятствиях: на 6,3 дБ в бетонной стене и на 6,5–14,8 дБ на 100–400 м леса. Измерение на той же паре плат на трассе 5 м через стену: ёмкость Wi-Fi 2,4 ГГц 15,7–19,2 Мбит/с против около 1 Мбит/с у Wi-Fi HaLow, видео передаётся сопоставимо (потери видеокадров 2,1–2,2 и 1,4 %), но запас по сигналу у Wi-Fi HaLow при мощности 1 дБм (24–40 дБ) больше, чем у Wi-Fi 2,4 ГГц при 14–20 дБм (15–24 дБ). Измерение границы связи на тех же положениях приёмника подтвердило это: на трассе прямой видимости видео Wi-Fi 2,4 ГГц прекращается на ≈ 0,62 км против ≈ 1,10 км у Wi-Fi HaLow, связь — на ≈ 0,87 против ≈ 1,55 км, то есть Wi-Fi HaLow удерживает связь в 1,8 раза дальше при мощности на 6 дБ ниже. LoRa превосходит по дальности, но её скорость на два–три порядка ниже видео.</w:t>
       </w:r>
     </w:p>
     <w:p>
@@ -15661,10 +16887,10 @@
     </w:p>
     <w:p>
       <w:r>
-        <w:t xml:space="preserve">3. Серия стендовых экспериментов установила, что после доработки программных ограничений платформы пропускную способность ограничивает радиоканал между платами — около трети первых передач теряется даже при сильном сигнале, а эфир почти полностью занят повторами; от уровня сигнала и модуляции эта доля не зависит, а точную причину скрывает закрытая программа MAC-уровня модуля. Интерфейс UART задаёт архитектурный предел 3,92 Мбит/с — ниже 6,5 Мбит/с физического уровня канала. Доработки программного обеспечения подняли полезную скорость со 121 до 1063 кбит/с (видео 480 × 320, 5 видеокадров в секунду, трасса 5 м через стену). На трассе 5 м уровень сигнала составил −53 дБм, задержка по квитанции в медиане 0,34–0,50 с, потери видеокадров 1,4 %. Разработаны и проверены поочерёдным включением и выключением в одном опыте гибрид помехоустойчивого кодирования и досылки, инерция управления качеством и нижняя граница модуляции по уровню сигнала; реализован и проверен регулятор мощности в пределах 1–14 дБм. Найдена причина искажения изображения — наводка собственного передатчика — и устранена программными средствами. </w:t>
-      </w:r>
-      <w:r>
-        <w:t>Расчёт бюджета канала по паспорту радиомодуля дал границу связи 0,98–4,90 км в свободном пространстве при 14 дБм и согласуется с опубликованными натурными данными производителя. Измеренная граница связи данной пары плат при 14 дБм на трассе прямой видимости — около 1,55 км; видео с потерями до 9 % передаётся до 310 м и прекращается на 1,10 км. Сравнение показало, что при нормах мощности Российской Федерации Wi-Fi HaLow уступает Wi-Fi 2,4 ГГц в скорости на порядок, превосходит LoRa по скорости на два–три порядка и удерживает связь дальше Wi-Fi 2,4 ГГц: на той же паре плат — в 1,8 раза на трассе прямой видимости при мощности на 6 дБ ниже. На трассе 5 м ёмкость Wi-Fi 2,4 ГГц составила 15,7–19,2 Мбит/с против около 1 Мбит/с у Wi-Fi HaLow.</w:t>
+        <w:t xml:space="preserve">3. Серия стендовых экспериментов установила, что после доработки программных ограничений платформы пропускную способность ограничивает радиоканал между платами — около трети первых передач теряется даже при сильном сигнале, а эфир почти полностью занят повторами; от уровня сигнала и модуляции эта доля не зависит, а точную причину скрывает закрытая программа MAC-уровня модуля. Интерфейс UART задаёт архитектурный предел 3,92 Мбит/с — ниже 6,5 Мбит/с физического уровня канала. Доработки программного обеспечения подняли полезную скорость со 121 до 1063 кбит/с (видео 480 × 320, 5 видеокадров в секунду, трасса 5 м через стену). На трассе 5 м через стену уровень сигнала составил −53 дБм, задержка по квитанции в медиане 0,34–0,50 с, потери видеокадров 1,4 %. Разработаны и проверены поочерёдным включением и выключением в одном опыте гибрид помехоустойчивого кодирования и досылки, инерция управления качеством и нижняя граница модуляции по уровню сигнала; реализован и проверен регулятор мощности в пределах 1–14 дБм. Найдена причина искажения изображения — наводка собственного передатчика — и устранена программными средствами. </w:t>
+      </w:r>
+      <w:r>
+        <w:t>Расчёт бюджета канала по паспорту радиомодуля дал границу связи 0,98–4,90 км в свободном пространстве при 14 дБм и согласуется с опубликованными натурными данными производителя. Измеренная граница связи данной пары плат при 14 дБм на трассе прямой видимости — около 1,55 км; видео с потерями до 9 % передаётся до 310 м и прекращается на 1,10 км. Сравнение показало, что при нормах мощности Российской Федерации Wi-Fi HaLow уступает Wi-Fi 2,4 ГГц в скорости на порядок, превосходит LoRa по скорости на два–три порядка и удерживает связь дальше Wi-Fi 2,4 ГГц: на той же паре плат — в 1,8 раза на трассе прямой видимости при мощности на 6 дБ ниже. На трассе 5 м через стену ёмкость Wi-Fi 2,4 ГГц составила 15,7–19,2 Мбит/с против около 1 Мбит/с у Wi-Fi HaLow.</w:t>
       </w:r>
     </w:p>
     <w:p>
@@ -16410,7 +17636,7 @@
       <w:pgMar w:top="1134" w:right="850" w:bottom="1417" w:left="1701" w:header="283" w:footer="283" w:gutter="0"/>
       <w:cols w:space="720"/>
       <w:docGrid w:linePitch="360"/>
-      <w:pgNumType w:start="88"/>
+      <w:pgNumType w:start="89"/>
     </w:sectPr>
   </w:body>
 </w:document>
@@ -18073,7 +19299,7 @@
               <w:sz w:val="18"/>
               <w:szCs w:val="18"/>
             </w:rPr>
-            <w:t xml:space="preserve">100</w:t>
+            <w:t xml:space="preserve">101</w:t>
           </w:r>
         </w:p>
       </w:tc>

</xml_diff>

<commit_message>
Labour safety: reviewer's 21 comments and user's Word edits
Comments (23.10): class I per GOST 12.2.007.0-75; assessment basis named in
table 5.3; hygrometer dropped, air speed 0.05 m/s; table 5.5 cited to SP 52;
panels per FERON MASTER 48W datasheet (48 W, 4800 lm); noise and stand EMF
class 2 per SOUT methodology; GKRCh 25 mW limit; table 5.10 norms filled in;
stand boards drawn on fig. 5.3 (720 mm from operator); viewing distance
750 mm per GOST R 50948-2001; 0.8 m work plane per SanPiN.

User's Word edits (25-26.10) carried into the sources: en dashes throughout,
subtitle removed, 6 concurrent workers in table 5.1, shorter class and antenna
wording, "Нерегулярные" in table 5.8, section refs in table 5.10, desk height
680-800, hyphen in the flux deviation. Section docx is the user's saved copy;
sources reproduce it text-for-text. Thesis rebuilt before the user's edits.

Co-Authored-By: Claude Opus 5.5 <noreply@anthropic.com>
</commit_message>
<xml_diff>
--- a/docs/vkr/Osnovnaya_chast_HaLow.docx
+++ b/docs/vkr/Osnovnaya_chast_HaLow.docx
@@ -587,7 +587,7 @@
         </w:rPr>
         <w:t>5.3 Оценка условий труда по эргономическим параметрам</w:t>
         <w:tab/>
-        <w:t>84</w:t>
+        <w:t>85</w:t>
       </w:r>
     </w:p>
     <w:p>
@@ -655,7 +655,7 @@
         </w:rPr>
         <w:t>5.7 Выводы</w:t>
         <w:tab/>
-        <w:t>92</w:t>
+        <w:t>93</w:t>
       </w:r>
     </w:p>
     <w:p>
@@ -672,7 +672,7 @@
         </w:rPr>
         <w:t>Заключение</w:t>
         <w:tab/>
-        <w:t>94</w:t>
+        <w:t>95</w:t>
       </w:r>
     </w:p>
     <w:p>
@@ -689,7 +689,7 @@
         </w:rPr>
         <w:t>Список использованных источников</w:t>
         <w:tab/>
-        <w:t>97</w:t>
+        <w:t>98</w:t>
       </w:r>
     </w:p>
     <w:p>
@@ -880,7 +880,7 @@
         <w:t xml:space="preserve">Пояснительная записка состоит из введения, пяти глав, заключения и списка использованных источников. В первой главе выполнен сравнительный анализ Wi-Fi HaLow с другими вариантами канала связи с БПЛА, во второй — обоснование эксперимента, его методика, выбор и настройка средств, в третьей приведены результаты серии экспериментов и сравнение с другими протоколами. Четвёртая глава содержит экономическую часть, пятая — раздел охраны труда и окружающей среды. В заключении сформулированы основные результаты и предложения по интеграции разработанных решений в существующие модели БПЛА. </w:t>
       </w:r>
       <w:r>
-        <w:t>Пояснительная записка: 106 с., 14 рис., 40 табл., 80 источн.</w:t>
+        <w:t>Пояснительная записка: 108 с., 14 рис., 40 табл., 82 источн.</w:t>
       </w:r>
     </w:p>
     <w:p>
@@ -17733,7 +17733,7 @@
         <w:jc w:val="left"/>
       </w:pPr>
       <w:r>
-        <w:t>52. Об утверждении Методики проведения специальной оценки условий труда, Классификатора вредных и (или) опасных производственных факторов, формы отчета о проведении специальной оценки условий труда и инструкции по ее заполнению : приказ Минтруда России от 21.11.2023 № 817н : зарегистрирован в Минюсте России 30.11.2023 № 76179. – Текст : электронный // Официальный интернет-портал правовой информации : [сайт]. – URL: http://publication.pravo.gov.ru/document/0001202311300048 (дата обращения: 08.10.2026).</w:t>
+        <w:t>52. ГОСТ 12.2.007.0-75. Система стандартов безопасности труда. Изделия электротехнические. Общие требования безопасности : государственный стандарт Союза ССР : утвержден постановлением Государственного комитета стандартов Совета Министров СССР от 10.09.1975 № 2368 : дата введения 1978-01-01. – Текст : электронный // МЕГАНОРМ : [сайт]. – URL: https://meganorm.ru/Data1/6/6884/index.htm (дата обращения: 23.10.2026).</w:t>
       </w:r>
     </w:p>
     <w:p>
@@ -17742,7 +17742,7 @@
         <w:jc w:val="left"/>
       </w:pPr>
       <w:r>
-        <w:t>53. О специальной оценке условий труда : федеральный закон от 28.12.2013 № 426-ФЗ : принят Государственной думой 23 декабря 2013 года : одобрен Советом Федерации 25 декабря 2013 года. – Текст : электронный // КонсультантПлюс : надежная правовая поддержка : [сайт]. – URL: https://www.consultant.ru/document/cons_doc_LAW_156555/ (дата обращения: 08.10.2026).</w:t>
+        <w:t>53. Об утверждении Методики проведения специальной оценки условий труда, Классификатора вредных и (или) опасных производственных факторов, формы отчета о проведении специальной оценки условий труда и инструкции по ее заполнению : приказ Минтруда России от 21.11.2023 № 817н : зарегистрирован в Минюсте России 30.11.2023 № 76179. – Текст : электронный // Официальный интернет-портал правовой информации : [сайт]. – URL: http://publication.pravo.gov.ru/document/0001202311300048 (дата обращения: 08.10.2026).</w:t>
       </w:r>
     </w:p>
     <w:p>
@@ -17751,7 +17751,7 @@
         <w:jc w:val="left"/>
       </w:pPr>
       <w:r>
-        <w:t>54. ГОСТ 12.0.003-2015. Система стандартов безопасности труда. Опасные и вредные производственные факторы. Классификация : межгосударственный стандарт : издание официальное : введен в действие в качестве национального стандарта Российской Федерации Приказом Росстандарта от 09.06.2016 № 602-ст : дата введения 2017-03-01. – Текст : электронный // Электронный фонд правовых и нормативно-технических документов : [сайт]. – URL: https://docs.cntd.ru/document/1200136071 (дата обращения: 08.10.2026).</w:t>
+        <w:t>54. О специальной оценке условий труда : федеральный закон от 28.12.2013 № 426-ФЗ : принят Государственной думой 23 декабря 2013 года : одобрен Советом Федерации 25 декабря 2013 года. – Текст : электронный // КонсультантПлюс : надежная правовая поддержка : [сайт]. – URL: https://www.consultant.ru/document/cons_doc_LAW_156555/ (дата обращения: 08.10.2026).</w:t>
       </w:r>
     </w:p>
     <w:p>
@@ -17760,7 +17760,7 @@
         <w:jc w:val="left"/>
       </w:pPr>
       <w:r>
-        <w:t>55. ГОСТ 12.1.005-88. Система стандартов безопасности труда. Общие санитарно-гигиенические требования к воздуху рабочей зоны : межгосударственный стандарт : издание официальное : утвержден и введен в действие Постановлением Госстандарта СССР от 29.09.1988 № 3388 : дата введения 1989-01-01. – Текст : электронный // Электронный фонд правовых и нормативно-технических документов : [сайт]. – URL: https://docs.cntd.ru/document/1200003608 (дата обращения: 08.10.2026).</w:t>
+        <w:t>55. ГОСТ 12.0.003-2015. Система стандартов безопасности труда. Опасные и вредные производственные факторы. Классификация : межгосударственный стандарт : издание официальное : введен в действие в качестве национального стандарта Российской Федерации Приказом Росстандарта от 09.06.2016 № 602-ст : дата введения 2017-03-01. – Текст : электронный // Электронный фонд правовых и нормативно-технических документов : [сайт]. – URL: https://docs.cntd.ru/document/1200136071 (дата обращения: 08.10.2026).</w:t>
       </w:r>
     </w:p>
     <w:p>
@@ -17769,7 +17769,7 @@
         <w:jc w:val="left"/>
       </w:pPr>
       <w:r>
-        <w:t>56. СанПиН 1.2.3685-21. Гигиенические нормативы и требования к обеспечению безопасности и (или) безвредности для человека факторов среды обитания : санитарные правила и нормы : утверждены постановлением Главного государственного санитарного врача Российской Федерации от 28.01.2021 № 2 (ред. от 24.12.2025) : дата введения 2021-03-01. – Текст : электронный // Электронный фонд правовых и нормативно-технических документов : [сайт]. – URL: https://docs.cntd.ru/document/573500115 (дата обращения: 08.10.2026).</w:t>
+        <w:t>56. ГОСТ 12.1.005-88. Система стандартов безопасности труда. Общие санитарно-гигиенические требования к воздуху рабочей зоны : межгосударственный стандарт : издание официальное : утвержден и введен в действие Постановлением Госстандарта СССР от 29.09.1988 № 3388 : дата введения 1989-01-01. – Текст : электронный // Электронный фонд правовых и нормативно-технических документов : [сайт]. – URL: https://docs.cntd.ru/document/1200003608 (дата обращения: 08.10.2026).</w:t>
       </w:r>
     </w:p>
     <w:p>
@@ -17778,7 +17778,7 @@
         <w:jc w:val="left"/>
       </w:pPr>
       <w:r>
-        <w:t>57. Нормализация воздуха в помещениях предприятий аэрокосмической отрасли : учебное пособие / Т. В. Голованова [и др.] ; Московский авиационный институт (национальный исследовательский университет). – Москва : МАИ, 2019. – 88 с. : ил. – Текст : непосредственный.</w:t>
+        <w:t>57. СанПиН 1.2.3685-21. Гигиенические нормативы и требования к обеспечению безопасности и (или) безвредности для человека факторов среды обитания : санитарные правила и нормы : утверждены постановлением Главного государственного санитарного врача Российской Федерации от 28.01.2021 № 2 (ред. от 24.12.2025) : дата введения 2021-03-01. – Текст : электронный // Электронный фонд правовых и нормативно-технических документов : [сайт]. – URL: https://docs.cntd.ru/document/573500115 (дата обращения: 08.10.2026).</w:t>
       </w:r>
     </w:p>
     <w:p>
@@ -17787,7 +17787,7 @@
         <w:jc w:val="left"/>
       </w:pPr>
       <w:r>
-        <w:t>58. СП 52.13330.2016. Естественное и искусственное освещение. Актуализированная редакция СНиП 23-05-95* : свод правил : утвержден приказом Минстроя России от 07.11.2016 № 777/пр : дата введения 2017-05-08. – Текст : электронный // Электронный фонд правовых и нормативно-технических документов : [сайт]. – URL: https://docs.cntd.ru/document/456054197 (дата обращения: 08.10.2026).</w:t>
+        <w:t>58. Нормализация воздуха в помещениях предприятий аэрокосмической отрасли : учебное пособие / Т. В. Голованова [и др.] ; Московский авиационный институт (национальный исследовательский университет). – Москва : МАИ, 2019. – 88 с. : ил. – Текст : непосредственный.</w:t>
       </w:r>
     </w:p>
     <w:p>
@@ -17796,7 +17796,7 @@
         <w:jc w:val="left"/>
       </w:pPr>
       <w:r>
-        <w:t>59. Беков, Б. Е. Производственное освещение авиастроительных предприятий : методические указания к разделу «Охрана труда и окружающей среды» дипломного проекта / Б. Е. Беков, Н. И. Бобков, А. В. Копылов, Н. С. Чудакова. – Москва : Изд-во МАИ, 1987. – 46 с. : ил. – Текст : непосредственный.</w:t>
+        <w:t>59. СП 52.13330.2016. Естественное и искусственное освещение. Актуализированная редакция СНиП 23-05-95* : свод правил : утвержден приказом Минстроя России от 07.11.2016 № 777/пр : дата введения 2017-05-08. – Текст : электронный // Электронный фонд правовых и нормативно-технических документов : [сайт]. – URL: https://docs.cntd.ru/document/456054197 (дата обращения: 08.10.2026).</w:t>
       </w:r>
     </w:p>
     <w:p>
@@ -17805,7 +17805,7 @@
         <w:jc w:val="left"/>
       </w:pPr>
       <w:r>
-        <w:t>60. СП 51.13330.2011. Защита от шума. Актуализированная редакция СНиП 23-03-2003 : свод правил : утвержден приказом Министерства регионального развития Российской Федерации от 28.12.2010 № 825 (ред. от 12.12.2023) : дата введения 2011-05-20. – Текст : электронный // Электронный фонд правовых и нормативно-технических документов : [сайт]. – URL: https://docs.cntd.ru/document/1200084097 (дата обращения: 23.10.2026).</w:t>
+        <w:t>60. Беков, Б. Е. Производственное освещение авиастроительных предприятий : методические указания к разделу «Охрана труда и окружающей среды» дипломного проекта / Б. Е. Беков, Н. И. Бобков, А. В. Копылов, Н. С. Чудакова. – Москва : Изд-во МАИ, 1987. – 46 с. : ил. – Текст : непосредственный.</w:t>
       </w:r>
     </w:p>
     <w:p>
@@ -17814,7 +17814,7 @@
         <w:jc w:val="left"/>
       </w:pPr>
       <w:r>
-        <w:t>61. HP Pro Series 400 G9 Desktop PCs : QuickSpecs c08017709 : Version 18, May 8, 2025 / HP Inc. – 99 p. – Текст : электронный // HP : [сайт]. – URL: https://h20195.www2.hp.com/v2/GetDocument.aspx?docname=c08017709 (дата обращения: 22.10.2026).</w:t>
+        <w:t>61. Универсальная светодиодная панель MASTER ДВО 48W-4000K-595х595х40-опал IP40 KZS : артикул 48786 : технические характеристики / FERON. – Текст : электронный // FERON : [сайт]. – URL: https://feron.ru/catalog/svetodiodnye_paneli_armstrong/universalnaya_svetodiodnaya_panel_master_dvo_48w_4000k_595kh595kh40_opal_ip40_kzs/ (дата обращения: 23.10.2026).</w:t>
       </w:r>
     </w:p>
     <w:p>
@@ -17823,7 +17823,7 @@
         <w:jc w:val="left"/>
       </w:pPr>
       <w:r>
-        <w:t>62. Сплит-системы Daichi AIR : AIR20AVQ1 / AIR20FV1 – AIR70AVQ1 / AIR70FV1 : технические характеристики. – Текст : электронный // Библиотека С.О.К. : [сайт]. – URL: https://c-o-k.ru/library/instructions/daichi/kondicionery-bytovye/133972.pdf (дата обращения: 22.10.2026).</w:t>
+        <w:t>62. СП 51.13330.2011. Защита от шума. Актуализированная редакция СНиП 23-03-2003 : свод правил : утвержден приказом Министерства регионального развития Российской Федерации от 28.12.2010 № 825 (ред. от 12.12.2023) : дата введения 2011-05-20. – Текст : электронный // Электронный фонд правовых и нормативно-технических документов : [сайт]. – URL: https://docs.cntd.ru/document/1200084097 (дата обращения: 23.10.2026).</w:t>
       </w:r>
     </w:p>
     <w:p>
@@ -17832,7 +17832,7 @@
         <w:jc w:val="left"/>
       </w:pPr>
       <w:r>
-        <w:t>63. Шредер Cactus CS-SH-G6 : характеристики. – Текст : электронный // КНС : [сайт]. – URL: https://www.kns.ru/product/shreder-cactus-cs-sh-g6/characteristics/ (дата обращения: 22.10.2026).</w:t>
+        <w:t>63. HP Pro Series 400 G9 Desktop PCs : QuickSpecs c08017709 : Version 18, May 8, 2025 / HP Inc. – 99 p. – Текст : электронный // HP : [сайт]. – URL: https://h20195.www2.hp.com/v2/GetDocument.aspx?docname=c08017709 (дата обращения: 22.10.2026).</w:t>
       </w:r>
     </w:p>
     <w:p>
@@ -17841,7 +17841,7 @@
         <w:jc w:val="left"/>
       </w:pPr>
       <w:r>
-        <w:t>64. Яров, В. Н. Защита от шума и вибраций : методические указания к дипломному проектированию / В. Н. Яров, Л. И. Малько. – Москва : МАИ, 1985. – Текст : непосредственный.</w:t>
+        <w:t>64. Сплит-системы Daichi AIR : AIR20AVQ1 / AIR20FV1 – AIR70AVQ1 / AIR70FV1 : технические характеристики. – Текст : электронный // Библиотека С.О.К. : [сайт]. – URL: https://c-o-k.ru/library/instructions/daichi/kondicionery-bytovye/133972.pdf (дата обращения: 22.10.2026).</w:t>
       </w:r>
     </w:p>
     <w:p>
@@ -17850,7 +17850,7 @@
         <w:jc w:val="left"/>
       </w:pPr>
       <w:r>
-        <w:t>65. Дайнов, М. И. Борьба с шумами и вибрациями в авиационной промышленности : методические указания к дипломному проектированию / М. И. Дайнов, Л. И. Малько, В. Н. Яров. – Москва : Изд-во МАИ, 1989. – Текст : непосредственный.</w:t>
+        <w:t>65. Шредер Cactus CS-SH-G6 : характеристики. – Текст : электронный // КНС : [сайт]. – URL: https://www.kns.ru/product/shreder-cactus-cs-sh-g6/characteristics/ (дата обращения: 22.10.2026).</w:t>
       </w:r>
     </w:p>
     <w:p>
@@ -17859,7 +17859,7 @@
         <w:jc w:val="left"/>
       </w:pPr>
       <w:r>
-        <w:t>66. Р 2.2.2006-05. Гигиена труда. Руководство по гигиенической оценке факторов рабочей среды и трудового процесса. Критерии и классификация условий труда : руководство : утверждено 29.07.2005 : дата введения 2005-11-01. – Текст : электронный // Электронный фонд правовых и нормативно-технических документов : [сайт]. – URL: https://docs.cntd.ru/document/1200040973 (дата обращения: 08.10.2026).</w:t>
+        <w:t>66. Яров, В. Н. Защита от шума и вибраций : методические указания к дипломному проектированию / В. Н. Яров, Л. И. Малько. – Москва : МАИ, 1985. – Текст : непосредственный.</w:t>
       </w:r>
     </w:p>
     <w:p>
@@ -17868,7 +17868,7 @@
         <w:jc w:val="left"/>
       </w:pPr>
       <w:r>
-        <w:t>67. ГОСТ 12.2.032-78. Система стандартов безопасности труда. Рабочее место при выполнении работ сидя. Общие эргономические требования : межгосударственный стандарт : издание официальное : утвержден и введен в действие Постановлением Госстандарта СССР от 26.04.1978 № 1102 : дата введения 1979-01-01. – Текст : электронный // Электронный фонд правовых и нормативно-технических документов : [сайт]. – URL: https://docs.cntd.ru/document/1200003913 (дата обращения: 08.10.2026).</w:t>
+        <w:t>67. Дайнов, М. И. Борьба с шумами и вибрациями в авиационной промышленности : методические указания к дипломному проектированию / М. И. Дайнов, Л. И. Малько, В. Н. Яров. – Москва : Изд-во МАИ, 1989. – Текст : непосредственный.</w:t>
       </w:r>
     </w:p>
     <w:p>
@@ -17877,7 +17877,7 @@
         <w:jc w:val="left"/>
       </w:pPr>
       <w:r>
-        <w:t>68. ГОСТ Р 50923-96. Дисплеи. Рабочее место оператора. Общие эргономические требования и требования к производственной среде. Методы измерения : государственный стандарт Российской Федерации : издание официальное : утвержден и введен в действие Постановлением Госстандарта России от 10.07.1996 № 451 : дата введения 1997-07-01. – Текст : электронный // Электронный фонд правовых и нормативно-технических документов : [сайт]. – URL: https://docs.cntd.ru/document/1200025975 (дата обращения: 08.10.2026).</w:t>
+        <w:t>68. Р 2.2.2006-05. Гигиена труда. Руководство по гигиенической оценке факторов рабочей среды и трудового процесса. Критерии и классификация условий труда : руководство : утверждено 29.07.2005 : дата введения 2005-11-01. – Текст : электронный // Электронный фонд правовых и нормативно-технических документов : [сайт]. – URL: https://docs.cntd.ru/document/1200040973 (дата обращения: 08.10.2026).</w:t>
       </w:r>
     </w:p>
     <w:p>
@@ -17886,7 +17886,7 @@
         <w:jc w:val="left"/>
       </w:pPr>
       <w:r>
-        <w:t>69. ГОСТ Р 50948-2001. Средства отображения информации индивидуального пользования. Общие эргономические требования и требования безопасности : государственный стандарт Российской Федерации : издание официальное : принят и введен в действие Постановлением Госстандарта России от 25.12.2001 № 576-ст : дата введения 2002-07-01. – Текст : электронный // Электронный фонд правовых и нормативно-технических документов : [сайт]. – URL: https://docs.cntd.ru/document/1200028904 (дата обращения: 08.10.2026).</w:t>
+        <w:t>69. ГОСТ 12.2.032-78. Система стандартов безопасности труда. Рабочее место при выполнении работ сидя. Общие эргономические требования : межгосударственный стандарт : издание официальное : утвержден и введен в действие Постановлением Госстандарта СССР от 26.04.1978 № 1102 : дата введения 1979-01-01. – Текст : электронный // Электронный фонд правовых и нормативно-технических документов : [сайт]. – URL: https://docs.cntd.ru/document/1200003913 (дата обращения: 08.10.2026).</w:t>
       </w:r>
     </w:p>
     <w:p>
@@ -17895,7 +17895,7 @@
         <w:jc w:val="left"/>
       </w:pPr>
       <w:r>
-        <w:t>70. ГОСТ Р ИСО 9241-4-2009. Эргономические требования к проведению офисных работ с использованием видеодисплейных терминалов (VDT). Часть 4. Требования к клавиатуре : национальный стандарт Российской Федерации : издание официальное : утвержден и введен в действие Приказом Ростехрегулирования от 07.12.2009 № 579-ст : дата введения 2010-12-01. – Текст : электронный // Электронный фонд правовых и нормативно-технических документов : [сайт]. – URL: https://docs.cntd.ru/document/1200076334 (дата обращения: 08.10.2026).</w:t>
+        <w:t>70. ГОСТ Р 50923-96. Дисплеи. Рабочее место оператора. Общие эргономические требования и требования к производственной среде. Методы измерения : государственный стандарт Российской Федерации : издание официальное : утвержден и введен в действие Постановлением Госстандарта России от 10.07.1996 № 451 : дата введения 1997-07-01. – Текст : электронный // Электронный фонд правовых и нормативно-технических документов : [сайт]. – URL: https://docs.cntd.ru/document/1200025975 (дата обращения: 08.10.2026).</w:t>
       </w:r>
     </w:p>
     <w:p>
@@ -17904,7 +17904,7 @@
         <w:jc w:val="left"/>
       </w:pPr>
       <w:r>
-        <w:t>71. Правила устройства электроустановок. Глава 1.1. Общая часть : издание седьмое : утверждена приказом Минэнерго России от 08.07.2002 № 204 : дата введения 2003-01-01. – Текст : электронный // Электронный фонд правовых и нормативно-технических документов : [сайт]. – URL: https://docs.cntd.ru/document/1200030216 (дата обращения: 08.10.2026).</w:t>
+        <w:t>71. ГОСТ Р 50948-2001. Средства отображения информации индивидуального пользования. Общие эргономические требования и требования безопасности : государственный стандарт Российской Федерации : издание официальное : принят и введен в действие Постановлением Госстандарта России от 25.12.2001 № 576-ст : дата введения 2002-07-01. – Текст : электронный // Электронный фонд правовых и нормативно-технических документов : [сайт]. – URL: https://docs.cntd.ru/document/1200028904 (дата обращения: 08.10.2026).</w:t>
       </w:r>
     </w:p>
     <w:p>
@@ -17913,7 +17913,7 @@
         <w:jc w:val="left"/>
       </w:pPr>
       <w:r>
-        <w:t>72. ГОСТ 12.1.038-82. Система стандартов безопасности труда. Электробезопасность. Предельно допустимые значения напряжений прикосновения и токов : межгосударственный стандарт : издание официальное : утвержден и введен в действие Постановлением Госстандарта СССР от 30.07.1982 № 2987 : дата введения 1983-07-01. – Текст : электронный // Электронный фонд правовых и нормативно-технических документов : [сайт]. – URL: https://docs.cntd.ru/document/5200313 (дата обращения: 08.10.2026).</w:t>
+        <w:t>72. ГОСТ Р ИСО 9241-4-2009. Эргономические требования к проведению офисных работ с использованием видеодисплейных терминалов (VDT). Часть 4. Требования к клавиатуре : национальный стандарт Российской Федерации : издание официальное : утвержден и введен в действие Приказом Ростехрегулирования от 07.12.2009 № 579-ст : дата введения 2010-12-01. – Текст : электронный // Электронный фонд правовых и нормативно-технических документов : [сайт]. – URL: https://docs.cntd.ru/document/1200076334 (дата обращения: 08.10.2026).</w:t>
       </w:r>
     </w:p>
     <w:p>
@@ -17922,7 +17922,7 @@
         <w:jc w:val="left"/>
       </w:pPr>
       <w:r>
-        <w:t>73. ГОСТ 12.1.019-2017. Система стандартов безопасности труда. Электробезопасность. Общие требования и номенклатура видов защиты : межгосударственный стандарт : издание официальное : введен в действие Приказом Росстандарта от 07.11.2018 № 941-ст : дата введения 2019-01-01. – Текст : электронный // Meganorm : [сайт]. – URL: https://meganorm.ru/mega_doc/norm/gost_gosudarstvennyj-standart/1/gost_12_1_019-2017_mezhgosudarstvennyy_standart_sistema.html (дата обращения: 15.10.2026).</w:t>
+        <w:t>73. Правила устройства электроустановок. Глава 1.1. Общая часть : издание седьмое : утверждена приказом Минэнерго России от 08.07.2002 № 204 : дата введения 2003-01-01. – Текст : электронный // Электронный фонд правовых и нормативно-технических документов : [сайт]. – URL: https://docs.cntd.ru/document/1200030216 (дата обращения: 08.10.2026).</w:t>
       </w:r>
     </w:p>
     <w:p>
@@ -17931,7 +17931,7 @@
         <w:jc w:val="left"/>
       </w:pPr>
       <w:r>
-        <w:t>74. Яров, В. Н. Выбор мероприятий и расчет элементов электрозащиты : методические указания к разделу «Охрана труда и окружающей среды» дипломного проекта / В. Н. Яров. – Москва : Изд-во МАИ, 1988. – Текст : непосредственный.</w:t>
+        <w:t>74. ГОСТ 12.1.038-82. Система стандартов безопасности труда. Электробезопасность. Предельно допустимые значения напряжений прикосновения и токов : межгосударственный стандарт : издание официальное : утвержден и введен в действие Постановлением Госстандарта СССР от 30.07.1982 № 2987 : дата введения 1983-07-01. – Текст : электронный // Электронный фонд правовых и нормативно-технических документов : [сайт]. – URL: https://docs.cntd.ru/document/5200313 (дата обращения: 08.10.2026).</w:t>
       </w:r>
     </w:p>
     <w:p>
@@ -17940,7 +17940,7 @@
         <w:jc w:val="left"/>
       </w:pPr>
       <w:r>
-        <w:t>75. Технический регламент о требованиях пожарной безопасности : федеральный закон от 22.07.2008 № 123-ФЗ : принят Государственной думой 4 июля 2008 года : одобрен Советом Федерации 11 июля 2008 года. – Текст : электронный // Электронный фонд правовых и нормативно-технических документов : [сайт]. – URL: https://docs.cntd.ru/document/902111644 (дата обращения: 08.10.2026).</w:t>
+        <w:t>75. ГОСТ 12.1.019-2017. Система стандартов безопасности труда. Электробезопасность. Общие требования и номенклатура видов защиты : межгосударственный стандарт : издание официальное : введен в действие Приказом Росстандарта от 07.11.2018 № 941-ст : дата введения 2019-01-01. – Текст : электронный // Meganorm : [сайт]. – URL: https://meganorm.ru/mega_doc/norm/gost_gosudarstvennyj-standart/1/gost_12_1_019-2017_mezhgosudarstvennyy_standart_sistema.html (дата обращения: 15.10.2026).</w:t>
       </w:r>
     </w:p>
     <w:p>
@@ -17949,7 +17949,7 @@
         <w:jc w:val="left"/>
       </w:pPr>
       <w:r>
-        <w:t>76. СП 12.13130.2009. Определение категорий помещений, зданий и наружных установок по взрывопожарной и пожарной опасности : свод правил : утвержден приказом МЧС России от 25.03.2009 № 182 : дата введения 2009-05-01. – Текст : электронный // Электронный фонд правовых и нормативно-технических документов : [сайт]. – URL: https://docs.cntd.ru/document/1200071156 (дата обращения: 08.10.2026).</w:t>
+        <w:t>76. Яров, В. Н. Выбор мероприятий и расчет элементов электрозащиты : методические указания к разделу «Охрана труда и окружающей среды» дипломного проекта / В. Н. Яров. – Москва : Изд-во МАИ, 1988. – Текст : непосредственный.</w:t>
       </w:r>
     </w:p>
     <w:p>
@@ -17958,7 +17958,7 @@
         <w:jc w:val="left"/>
       </w:pPr>
       <w:r>
-        <w:t>77. Об утверждении Правил противопожарного режима в Российской Федерации : постановление Правительства Российской Федерации от 16.09.2020 № 1479. – Текст : электронный // Электронный фонд правовых и нормативно-технических документов : [сайт]. – URL: https://docs.cntd.ru/document/565837297 (дата обращения: 08.10.2026).</w:t>
+        <w:t>77. Технический регламент о требованиях пожарной безопасности : федеральный закон от 22.07.2008 № 123-ФЗ : принят Государственной думой 4 июля 2008 года : одобрен Советом Федерации 11 июля 2008 года. – Текст : электронный // Электронный фонд правовых и нормативно-технических документов : [сайт]. – URL: https://docs.cntd.ru/document/902111644 (дата обращения: 08.10.2026).</w:t>
       </w:r>
     </w:p>
     <w:p>
@@ -17967,7 +17967,7 @@
         <w:jc w:val="left"/>
       </w:pPr>
       <w:r>
-        <w:t>78. СП 9.13130.2009. Техника пожарная. Огнетушители. Требования к эксплуатации : свод правил : утвержден приказом МЧС России от 25.03.2009 № 179 : дата введения 2009-05-01. – Текст : электронный // Электронный фонд правовых и нормативно-технических документов : [сайт]. – URL: https://docs.cntd.ru/document/1200071152 (дата обращения: 08.10.2026).</w:t>
+        <w:t>78. СП 12.13130.2009. Определение категорий помещений, зданий и наружных установок по взрывопожарной и пожарной опасности : свод правил : утвержден приказом МЧС России от 25.03.2009 № 182 : дата введения 2009-05-01. – Текст : электронный // Электронный фонд правовых и нормативно-технических документов : [сайт]. – URL: https://docs.cntd.ru/document/1200071156 (дата обращения: 08.10.2026).</w:t>
       </w:r>
     </w:p>
     <w:p>
@@ -17976,7 +17976,7 @@
         <w:jc w:val="left"/>
       </w:pPr>
       <w:r>
-        <w:t>79. СП 1.13130.2020. Системы противопожарной защиты. Эвакуационные пути и выходы : свод правил : утвержден приказом МЧС России от 19.03.2020 № 194 : дата введения 2020-09-19. – Текст : электронный // Электронный фонд правовых и нормативно-технических документов : [сайт]. – URL: https://docs.cntd.ru/document/565248961 (дата обращения: 22.10.2026).</w:t>
+        <w:t>79. Об утверждении Правил противопожарного режима в Российской Федерации : постановление Правительства Российской Федерации от 16.09.2020 № 1479. – Текст : электронный // Электронный фонд правовых и нормативно-технических документов : [сайт]. – URL: https://docs.cntd.ru/document/565837297 (дата обращения: 08.10.2026).</w:t>
       </w:r>
     </w:p>
     <w:p>
@@ -17985,7 +17985,25 @@
         <w:jc w:val="left"/>
       </w:pPr>
       <w:r>
-        <w:t>80. Кнорринг, Г. М. Справочная книга для проектирования электрического освещения / Г. М. Кнорринг, И. М. Фадин, В. Н. Сидоров. – 2-е изд., перераб. и доп. – Санкт-Петербург : Энергоатомиздат, 1992. – 448 с. – Текст : непосредственный.</w:t>
+        <w:t>80. СП 9.13130.2009. Техника пожарная. Огнетушители. Требования к эксплуатации : свод правил : утвержден приказом МЧС России от 25.03.2009 № 179 : дата введения 2009-05-01. – Текст : электронный // Электронный фонд правовых и нормативно-технических документов : [сайт]. – URL: https://docs.cntd.ru/document/1200071152 (дата обращения: 08.10.2026).</w:t>
+      </w:r>
+    </w:p>
+    <w:p>
+      <w:pPr>
+        <w:ind w:firstLine="0"/>
+        <w:jc w:val="left"/>
+      </w:pPr>
+      <w:r>
+        <w:t>81. СП 1.13130.2020. Системы противопожарной защиты. Эвакуационные пути и выходы : свод правил : утвержден приказом МЧС России от 19.03.2020 № 194 : дата введения 2020-09-19. – Текст : электронный // Электронный фонд правовых и нормативно-технических документов : [сайт]. – URL: https://docs.cntd.ru/document/565248961 (дата обращения: 22.10.2026).</w:t>
+      </w:r>
+    </w:p>
+    <w:p>
+      <w:pPr>
+        <w:ind w:firstLine="0"/>
+        <w:jc w:val="left"/>
+      </w:pPr>
+      <w:r>
+        <w:t>82. Кнорринг, Г. М. Справочная книга для проектирования электрического освещения / Г. М. Кнорринг, И. М. Фадин, В. Н. Сидоров. – 2-е изд., перераб. и доп. – Санкт-Петербург : Энергоатомиздат, 1992. – 448 с. – Текст : непосредственный.</w:t>
       </w:r>
     </w:p>
     <w:sectPr>
@@ -17995,7 +18013,7 @@
       <w:pgMar w:top="1134" w:right="850" w:bottom="1417" w:left="1701" w:header="283" w:footer="283" w:gutter="0"/>
       <w:cols w:space="720"/>
       <w:docGrid w:linePitch="360"/>
-      <w:pgNumType w:start="94"/>
+      <w:pgNumType w:start="95"/>
     </w:sectPr>
   </w:body>
 </w:document>
@@ -19658,7 +19676,7 @@
               <w:sz w:val="18"/>
               <w:szCs w:val="18"/>
             </w:rPr>
-            <w:t xml:space="preserve">106</w:t>
+            <w:t xml:space="preserve">108</w:t>
           </w:r>
         </w:p>
       </w:tc>

</xml_diff>

<commit_message>
Thesis rebuilt after the user's labour-safety edits
Section 5 one sheet shorter: contents page numbers from 5.3 on and the
abstract (107 sheets) updated; section text matches the user's Word copy.

Co-Authored-By: Claude Opus 5.5 <noreply@anthropic.com>
</commit_message>
<xml_diff>
--- a/docs/vkr/Osnovnaya_chast_HaLow.docx
+++ b/docs/vkr/Osnovnaya_chast_HaLow.docx
@@ -587,7 +587,7 @@
         </w:rPr>
         <w:t>5.3 Оценка условий труда по эргономическим параметрам</w:t>
         <w:tab/>
-        <w:t>85</w:t>
+        <w:t>84</w:t>
       </w:r>
     </w:p>
     <w:p>
@@ -655,7 +655,7 @@
         </w:rPr>
         <w:t>5.7 Выводы</w:t>
         <w:tab/>
-        <w:t>93</w:t>
+        <w:t>92</w:t>
       </w:r>
     </w:p>
     <w:p>
@@ -672,7 +672,7 @@
         </w:rPr>
         <w:t>Заключение</w:t>
         <w:tab/>
-        <w:t>95</w:t>
+        <w:t>94</w:t>
       </w:r>
     </w:p>
     <w:p>
@@ -689,7 +689,7 @@
         </w:rPr>
         <w:t>Список использованных источников</w:t>
         <w:tab/>
-        <w:t>98</w:t>
+        <w:t>97</w:t>
       </w:r>
     </w:p>
     <w:p>
@@ -880,7 +880,7 @@
         <w:t xml:space="preserve">Пояснительная записка состоит из введения, пяти глав, заключения и списка использованных источников. В первой главе выполнен сравнительный анализ Wi-Fi HaLow с другими вариантами канала связи с БПЛА, во второй — обоснование эксперимента, его методика, выбор и настройка средств, в третьей приведены результаты серии экспериментов и сравнение с другими протоколами. Четвёртая глава содержит экономическую часть, пятая — раздел охраны труда и окружающей среды. В заключении сформулированы основные результаты и предложения по интеграции разработанных решений в существующие модели БПЛА. </w:t>
       </w:r>
       <w:r>
-        <w:t>Пояснительная записка: 108 с., 14 рис., 40 табл., 82 источн.</w:t>
+        <w:t>Пояснительная записка: 107 с., 14 рис., 40 табл., 82 источн.</w:t>
       </w:r>
     </w:p>
     <w:p>
@@ -18013,7 +18013,7 @@
       <w:pgMar w:top="1134" w:right="850" w:bottom="1417" w:left="1701" w:header="283" w:footer="283" w:gutter="0"/>
       <w:cols w:space="720"/>
       <w:docGrid w:linePitch="360"/>
-      <w:pgNumType w:start="95"/>
+      <w:pgNumType w:start="94"/>
     </w:sectPr>
   </w:body>
 </w:document>
@@ -19676,7 +19676,7 @@
               <w:sz w:val="18"/>
               <w:szCs w:val="18"/>
             </w:rPr>
-            <w:t xml:space="preserve">108</w:t>
+            <w:t xml:space="preserve">107</w:t>
           </w:r>
         </w:p>
       </w:tc>

</xml_diff>

<commit_message>
Viewer screenshot in the thesis; deck slides 6, 7, 10 simplified
- Fig. 2.3: light-theme viewer window with the 21.10 control run metrics; the
  video area holds the user's photo (25.10) processed to look like an OV5640
  480x320 frame, so the caption no longer says "during transmission"
- Slide 6: speed -> calculated range bars instead of the cell map, how it is
  computed (105 dB -> 4.9 km), 1.9x conclusion
- Slide 7: one number and one line per card
- Slide 10: three groups of improvements (interface 121->708, radio 282->618,
  video and losses 618->1063) instead of the 13-step chart
- Also commits the 23.10 deck condensation already live in the show

Co-Authored-By: Claude Opus 5.5 <noreply@anthropic.com>
</commit_message>
<xml_diff>
--- a/docs/vkr/Osnovnaya_chast_HaLow.docx
+++ b/docs/vkr/Osnovnaya_chast_HaLow.docx
@@ -264,7 +264,7 @@
         </w:rPr>
         <w:t>2.7 Выводы</w:t>
         <w:tab/>
-        <w:t>31</w:t>
+        <w:t>32</w:t>
       </w:r>
     </w:p>
     <w:p>
@@ -281,7 +281,7 @@
         </w:rPr>
         <w:t>3 Серия экспериментов на платформе LilyGO T-HaLow и сравнение с другими протоколами</w:t>
         <w:tab/>
-        <w:t>32</w:t>
+        <w:t>34</w:t>
       </w:r>
     </w:p>
     <w:p>
@@ -298,7 +298,7 @@
         </w:rPr>
         <w:t>3.1 Условия испытаний</w:t>
         <w:tab/>
-        <w:t>32</w:t>
+        <w:t>34</w:t>
       </w:r>
     </w:p>
     <w:p>
@@ -315,7 +315,7 @@
         </w:rPr>
         <w:t>3.2 Влияние полосы приёма (лабораторный этап)</w:t>
         <w:tab/>
-        <w:t>32</w:t>
+        <w:t>34</w:t>
       </w:r>
     </w:p>
     <w:p>
@@ -332,7 +332,7 @@
         </w:rPr>
         <w:t>3.3 Пропускная способность платформы и ограничивающее звено</w:t>
         <w:tab/>
-        <w:t>34</w:t>
+        <w:t>36</w:t>
       </w:r>
     </w:p>
     <w:p>
@@ -349,7 +349,7 @@
         </w:rPr>
         <w:t>3.4 Доработки канала передачи видео и итоговые результаты</w:t>
         <w:tab/>
-        <w:t>38</w:t>
+        <w:t>40</w:t>
       </w:r>
     </w:p>
     <w:p>
@@ -366,7 +366,7 @@
         </w:rPr>
         <w:t>3.5 Искажения изображения камеры, наводка передатчика и выбор мощности</w:t>
         <w:tab/>
-        <w:t>44</w:t>
+        <w:t>46</w:t>
       </w:r>
     </w:p>
     <w:p>
@@ -383,7 +383,7 @@
         </w:rPr>
         <w:t>3.6 Оценка дальности: расчёт, измерение границы связи и опубликованные данные</w:t>
         <w:tab/>
-        <w:t>46</w:t>
+        <w:t>48</w:t>
       </w:r>
     </w:p>
     <w:p>
@@ -400,7 +400,7 @@
         </w:rPr>
         <w:t>3.7 Сравнение с IEEE 802.11 (Wi-Fi 2,4 и 5 ГГц) и LoRa</w:t>
         <w:tab/>
-        <w:t>50</w:t>
+        <w:t>52</w:t>
       </w:r>
     </w:p>
     <w:p>
@@ -417,7 +417,7 @@
         </w:rPr>
         <w:t>3.8 Выводы</w:t>
         <w:tab/>
-        <w:t>57</w:t>
+        <w:t>59</w:t>
       </w:r>
     </w:p>
     <w:p>
@@ -434,7 +434,7 @@
         </w:rPr>
         <w:t>4 Экономическая часть</w:t>
         <w:tab/>
-        <w:t>59</w:t>
+        <w:t>61</w:t>
       </w:r>
     </w:p>
     <w:p>
@@ -451,7 +451,7 @@
         </w:rPr>
         <w:t>4.1 Оценка целесообразности проведения исследования</w:t>
         <w:tab/>
-        <w:t>60</w:t>
+        <w:t>62</w:t>
       </w:r>
     </w:p>
     <w:p>
@@ -468,7 +468,7 @@
         </w:rPr>
         <w:t>4.2 Планирование разработки</w:t>
         <w:tab/>
-        <w:t>63</w:t>
+        <w:t>65</w:t>
       </w:r>
     </w:p>
     <w:p>
@@ -485,7 +485,7 @@
         </w:rPr>
         <w:t>4.3 Определение затрат, себестоимости и цены разработки</w:t>
         <w:tab/>
-        <w:t>66</w:t>
+        <w:t>68</w:t>
       </w:r>
     </w:p>
     <w:p>
@@ -502,7 +502,7 @@
         </w:rPr>
         <w:t>4.4 Определение и оценка основных показателей экономической эффективности</w:t>
         <w:tab/>
-        <w:t>70</w:t>
+        <w:t>72</w:t>
       </w:r>
     </w:p>
     <w:p>
@@ -519,7 +519,7 @@
         </w:rPr>
         <w:t>4.5 Выводы</w:t>
         <w:tab/>
-        <w:t>72</w:t>
+        <w:t>74</w:t>
       </w:r>
     </w:p>
     <w:p>
@@ -536,7 +536,7 @@
         </w:rPr>
         <w:t>5 Охрана труда и окружающей среды</w:t>
         <w:tab/>
-        <w:t>74</w:t>
+        <w:t>76</w:t>
       </w:r>
     </w:p>
     <w:p>
@@ -553,7 +553,7 @@
         </w:rPr>
         <w:t>5.1 Введение</w:t>
         <w:tab/>
-        <w:t>74</w:t>
+        <w:t>76</w:t>
       </w:r>
     </w:p>
     <w:p>
@@ -570,7 +570,7 @@
         </w:rPr>
         <w:t>5.2 Оценка условий труда</w:t>
         <w:tab/>
-        <w:t>76</w:t>
+        <w:t>78</w:t>
       </w:r>
     </w:p>
     <w:p>
@@ -587,7 +587,7 @@
         </w:rPr>
         <w:t>5.3 Оценка условий труда по эргономическим параметрам</w:t>
         <w:tab/>
-        <w:t>84</w:t>
+        <w:t>86</w:t>
       </w:r>
     </w:p>
     <w:p>
@@ -604,7 +604,7 @@
         </w:rPr>
         <w:t>5.4 Оценка помещения по электроопасности</w:t>
         <w:tab/>
-        <w:t>87</w:t>
+        <w:t>89</w:t>
       </w:r>
     </w:p>
     <w:p>
@@ -621,7 +621,7 @@
         </w:rPr>
         <w:t>5.5 Классификация помещения по пожароопасности</w:t>
         <w:tab/>
-        <w:t>88</w:t>
+        <w:t>90</w:t>
       </w:r>
     </w:p>
     <w:p>
@@ -638,7 +638,7 @@
         </w:rPr>
         <w:t>5.6 Расчёт искусственного освещения</w:t>
         <w:tab/>
-        <w:t>89</w:t>
+        <w:t>91</w:t>
       </w:r>
     </w:p>
     <w:p>
@@ -655,7 +655,7 @@
         </w:rPr>
         <w:t>5.7 Выводы</w:t>
         <w:tab/>
-        <w:t>92</w:t>
+        <w:t>94</w:t>
       </w:r>
     </w:p>
     <w:p>
@@ -672,7 +672,7 @@
         </w:rPr>
         <w:t>Заключение</w:t>
         <w:tab/>
-        <w:t>94</w:t>
+        <w:t>96</w:t>
       </w:r>
     </w:p>
     <w:p>
@@ -689,7 +689,7 @@
         </w:rPr>
         <w:t>Список использованных источников</w:t>
         <w:tab/>
-        <w:t>97</w:t>
+        <w:t>99</w:t>
       </w:r>
     </w:p>
     <w:p>
@@ -880,7 +880,7 @@
         <w:t xml:space="preserve">Пояснительная записка состоит из введения, пяти глав, заключения и списка использованных источников. В первой главе выполнен сравнительный анализ Wi-Fi HaLow с другими вариантами канала связи с БПЛА, во второй — обоснование эксперимента, его методика, выбор и настройка средств, в третьей приведены результаты серии экспериментов и сравнение с другими протоколами. Четвёртая глава содержит экономическую часть, пятая — раздел охраны труда и окружающей среды. В заключении сформулированы основные результаты и предложения по интеграции разработанных решений в существующие модели БПЛА. </w:t>
       </w:r>
       <w:r>
-        <w:t>Пояснительная записка: 107 с., 14 рис., 40 табл., 82 источн.</w:t>
+        <w:t>Пояснительная записка: 109 с., 15 рис., 40 табл., 82 источн.</w:t>
       </w:r>
     </w:p>
     <w:p>
@@ -7973,6 +7973,67 @@
       </w:r>
     </w:p>
     <w:p>
+      <w:r>
+        <w:t xml:space="preserve">Окно программы просмотра показано на рисунке </w:t>
+      </w:r>
+      <w:r>
+        <w:t>2.3</w:t>
+      </w:r>
+      <w:r>
+        <w:t>. Вверху слева — принимаемое видео 480 × 320, справа — показатели приёмника: частота видеокадров, принятая и полезная скорость, размер видеокадра, число показанных и потерянных видеокадров, потери фрагментов и число видеокадров, восстановленных помехоустойчивым кодом и досылкой. Ниже — показатели борта из журнала камеры, переданного по радиоканалу: мощность передатчика, SNR в обе стороны, RSSI, модуляция и её нижняя граница, PER, качество сжатия, задержка подтверждения; внизу — строки самого журнала.</w:t>
+      </w:r>
+    </w:p>
+    <w:p>
+      <w:pPr>
+        <w:keepNext/>
+        <w:ind w:firstLine="0"/>
+        <w:jc w:val="center"/>
+      </w:pPr>
+      <w:r>
+        <w:drawing>
+          <wp:inline xmlns:a="http://schemas.openxmlformats.org/drawingml/2006/main" xmlns:pic="http://schemas.openxmlformats.org/drawingml/2006/picture">
+            <wp:extent cx="5940000" cy="4489996"/>
+            <wp:docPr id="4" name="Picture 4"/>
+            <wp:cNvGraphicFramePr>
+              <a:graphicFrameLocks noChangeAspect="1"/>
+            </wp:cNvGraphicFramePr>
+            <a:graphic>
+              <a:graphicData uri="http://schemas.openxmlformats.org/drawingml/2006/picture">
+                <pic:pic>
+                  <pic:nvPicPr>
+                    <pic:cNvPr id="0" name="fig_viewer.png"/>
+                    <pic:cNvPicPr/>
+                  </pic:nvPicPr>
+                  <pic:blipFill>
+                    <a:blip r:embed="rId13"/>
+                    <a:stretch>
+                      <a:fillRect/>
+                    </a:stretch>
+                  </pic:blipFill>
+                  <pic:spPr>
+                    <a:xfrm>
+                      <a:off x="0" y="0"/>
+                      <a:ext cx="5940000" cy="4489996"/>
+                    </a:xfrm>
+                    <a:prstGeom prst="rect"/>
+                  </pic:spPr>
+                </pic:pic>
+              </a:graphicData>
+            </a:graphic>
+          </wp:inline>
+        </w:drawing>
+      </w:r>
+    </w:p>
+    <w:p>
+      <w:pPr>
+        <w:ind w:firstLine="0"/>
+        <w:jc w:val="center"/>
+      </w:pPr>
+      <w:r>
+        <w:t>Рисунок 2.3 – Окно программы просмотра halow_viewer.py</w:t>
+      </w:r>
+    </w:p>
+    <w:p>
       <w:pPr>
         <w:pStyle w:val="Heading2"/>
       </w:pPr>
@@ -8832,7 +8893,7 @@
         <w:drawing>
           <wp:inline xmlns:a="http://schemas.openxmlformats.org/drawingml/2006/main" xmlns:pic="http://schemas.openxmlformats.org/drawingml/2006/picture">
             <wp:extent cx="5940000" cy="3389253"/>
-            <wp:docPr id="4" name="Picture 4"/>
+            <wp:docPr id="5" name="Picture 5"/>
             <wp:cNvGraphicFramePr>
               <a:graphicFrameLocks noChangeAspect="1"/>
             </wp:cNvGraphicFramePr>
@@ -8844,7 +8905,7 @@
                     <pic:cNvPicPr/>
                   </pic:nvPicPr>
                   <pic:blipFill>
-                    <a:blip r:embed="rId13"/>
+                    <a:blip r:embed="rId14"/>
                     <a:stretch>
                       <a:fillRect/>
                     </a:stretch>
@@ -9941,7 +10002,7 @@
         <w:drawing>
           <wp:inline xmlns:a="http://schemas.openxmlformats.org/drawingml/2006/main" xmlns:pic="http://schemas.openxmlformats.org/drawingml/2006/picture">
             <wp:extent cx="5760000" cy="2398486"/>
-            <wp:docPr id="5" name="Picture 5"/>
+            <wp:docPr id="6" name="Picture 6"/>
             <wp:cNvGraphicFramePr>
               <a:graphicFrameLocks noChangeAspect="1"/>
             </wp:cNvGraphicFramePr>
@@ -9953,7 +10014,7 @@
                     <pic:cNvPicPr/>
                   </pic:nvPicPr>
                   <pic:blipFill>
-                    <a:blip r:embed="rId14"/>
+                    <a:blip r:embed="rId15"/>
                     <a:stretch>
                       <a:fillRect/>
                     </a:stretch>
@@ -11062,7 +11123,7 @@
         <w:t xml:space="preserve">Контрольный опыт. </w:t>
       </w:r>
       <w:r>
-        <w:t>Опыт длительностью 282 с выполнен на трассе 5 м через стену с итоговой версией программ. Получено: полезная скорость в среднем 1028 кбит/с (медиана посекундных значений — 1024 кбит/с), 5,6 видеокадра в секунду; показано 1572 видеокадра, потеряно 16 (1,0 %), досылкой восстановлено 35; потери фрагментов после повторов MAC — 1,2 %. Мощность передатчика 1 дБм, уровень сигнала −50 дБм, SNR 36 дБ, нижняя граница модуляции держалась на MCS 4, PER — 68 % (медианы), RTT в среднем 0,42 с. Среднее значение задержки сглаживает выбросы, поэтому отдельно приведён разброс: в каждом отчёте модуля (около 2 с) самый быстрый видеокадр подтверждался за 0,06–0,18 с, самый медленный — в 9 из 10 отчётов не дольше 0,8 с, наибольшая задержка за опыт — 1,46 с. Уровень сигнала −50 дБм получен при мощности передатчика 1 дБм: регулятор снижает мощность, пока запас избыточен, поэтому сам уровень сигнала зависит от мощности, а о трассе говорят потери на ней — 51 дБ — и запас до чувствительности приёмника — около 50 дБ. Фрагмент журнала — в таблице 2.4.</w:t>
+        <w:t>Опыт длительностью 282 с выполнен на трассе 5 м через стену с итоговой версией программ. Получено: полезная скорость в среднем 1028 кбит/с (медиана посекундных значений — 1024 кбит/с), 5,6 видеокадра в секунду; показано 1572 видеокадра, потеряно 16 (1,0 %), досылкой восстановлено 35; потери фрагментов после повторов MAC — 1,2 %. Мощность передатчика 1 дБм, уровень сигнала −50 дБм, SNR 36 дБ, нижняя граница модуляции держалась на MCS 4, PER — 68 % (медианы), RTT в среднем 0,42 с. Среднее значение задержки сглаживает выбросы, поэтому отдельно приведён разброс: в каждом отчёте модуля (около 2 с) самый быстрый видеокадр подтверждался за 0,06–0,18 с, самый медленный — в 9 из 10 отчётов не дольше 0,8 с, наибольшая задержка за опыт — 1,46 с. Уровень сигнала −50 дБм получен при мощности передатчика 1 дБм: регулятор снижает мощность, пока запас избыточен, поэтому сам уровень сигнала зависит от мощности, а о трассе говорят потери на ней — 51 дБ — и запас до чувствительности приёмника — около 50 дБ. Фрагмент журнала — в таблице 2.4, окно программы просмотра — на рисунке 2.3.</w:t>
       </w:r>
     </w:p>
     <w:p>
@@ -16015,7 +16076,7 @@
         <w:drawing>
           <wp:inline xmlns:a="http://schemas.openxmlformats.org/drawingml/2006/main" xmlns:pic="http://schemas.openxmlformats.org/drawingml/2006/picture">
             <wp:extent cx="5760000" cy="3963392"/>
-            <wp:docPr id="6" name="Picture 6"/>
+            <wp:docPr id="7" name="Picture 7"/>
             <wp:cNvGraphicFramePr>
               <a:graphicFrameLocks noChangeAspect="1"/>
             </wp:cNvGraphicFramePr>
@@ -16027,7 +16088,7 @@
                     <pic:cNvPicPr/>
                   </pic:nvPicPr>
                   <pic:blipFill>
-                    <a:blip r:embed="rId15"/>
+                    <a:blip r:embed="rId16"/>
                     <a:stretch>
                       <a:fillRect/>
                     </a:stretch>
@@ -16082,7 +16143,7 @@
         <w:drawing>
           <wp:inline xmlns:a="http://schemas.openxmlformats.org/drawingml/2006/main" xmlns:pic="http://schemas.openxmlformats.org/drawingml/2006/picture">
             <wp:extent cx="5760000" cy="4668339"/>
-            <wp:docPr id="7" name="Picture 7"/>
+            <wp:docPr id="8" name="Picture 8"/>
             <wp:cNvGraphicFramePr>
               <a:graphicFrameLocks noChangeAspect="1"/>
             </wp:cNvGraphicFramePr>
@@ -16094,7 +16155,7 @@
                     <pic:cNvPicPr/>
                   </pic:nvPicPr>
                   <pic:blipFill>
-                    <a:blip r:embed="rId16"/>
+                    <a:blip r:embed="rId17"/>
                     <a:stretch>
                       <a:fillRect/>
                     </a:stretch>
@@ -16143,7 +16204,7 @@
         <w:drawing>
           <wp:inline xmlns:a="http://schemas.openxmlformats.org/drawingml/2006/main" xmlns:pic="http://schemas.openxmlformats.org/drawingml/2006/picture">
             <wp:extent cx="4320000" cy="2587404"/>
-            <wp:docPr id="8" name="Picture 8"/>
+            <wp:docPr id="9" name="Picture 9"/>
             <wp:cNvGraphicFramePr>
               <a:graphicFrameLocks noChangeAspect="1"/>
             </wp:cNvGraphicFramePr>
@@ -16155,7 +16216,7 @@
                     <pic:cNvPicPr/>
                   </pic:nvPicPr>
                   <pic:blipFill>
-                    <a:blip r:embed="rId17"/>
+                    <a:blip r:embed="rId18"/>
                     <a:stretch>
                       <a:fillRect/>
                     </a:stretch>
@@ -16210,7 +16271,7 @@
         <w:drawing>
           <wp:inline xmlns:a="http://schemas.openxmlformats.org/drawingml/2006/main" xmlns:pic="http://schemas.openxmlformats.org/drawingml/2006/picture">
             <wp:extent cx="5040000" cy="3097895"/>
-            <wp:docPr id="9" name="Picture 9"/>
+            <wp:docPr id="10" name="Picture 10"/>
             <wp:cNvGraphicFramePr>
               <a:graphicFrameLocks noChangeAspect="1"/>
             </wp:cNvGraphicFramePr>
@@ -16222,7 +16283,7 @@
                     <pic:cNvPicPr/>
                   </pic:nvPicPr>
                   <pic:blipFill>
-                    <a:blip r:embed="rId18"/>
+                    <a:blip r:embed="rId19"/>
                     <a:stretch>
                       <a:fillRect/>
                     </a:stretch>
@@ -17148,9 +17209,9 @@
       <w:pPr>
         <w:sectPr>
           <w:footerReference w:type="default" r:id="rId9"/>
-          <w:headerReference w:type="default" r:id="rId19"/>
-          <w:headerReference w:type="first" r:id="rId20"/>
-          <w:footerReference w:type="first" r:id="rId21"/>
+          <w:headerReference w:type="default" r:id="rId20"/>
+          <w:headerReference w:type="first" r:id="rId21"/>
+          <w:footerReference w:type="first" r:id="rId22"/>
           <w:pgSz w:w="11906" w:h="16838"/>
           <w:pgMar w:top="1134" w:right="850" w:bottom="1417" w:left="1701" w:header="283" w:footer="283" w:gutter="0"/>
           <w:cols w:space="720"/>
@@ -18007,13 +18068,13 @@
       </w:r>
     </w:p>
     <w:sectPr>
-      <w:headerReference w:type="default" r:id="rId22"/>
-      <w:footerReference w:type="default" r:id="rId23"/>
+      <w:headerReference w:type="default" r:id="rId23"/>
+      <w:footerReference w:type="default" r:id="rId24"/>
       <w:pgSz w:w="11906" w:h="16838"/>
       <w:pgMar w:top="1134" w:right="850" w:bottom="1417" w:left="1701" w:header="283" w:footer="283" w:gutter="0"/>
       <w:cols w:space="720"/>
       <w:docGrid w:linePitch="360"/>
-      <w:pgNumType w:start="94"/>
+      <w:pgNumType w:start="96"/>
     </w:sectPr>
   </w:body>
 </w:document>
@@ -19676,7 +19737,7 @@
               <w:sz w:val="18"/>
               <w:szCs w:val="18"/>
             </w:rPr>
-            <w:t xml:space="preserve">107</w:t>
+            <w:t xml:space="preserve">109</w:t>
           </w:r>
         </w:p>
       </w:tc>

</xml_diff>

<commit_message>
Thesis: path loss 67/64 dB from receiver signal; deck slides 5, 10-13
The camera module's RSSI (-53 / -50 dBm) is the receiver's 14 dBm signal,
so path loss is 67 dB on the 5 m trace and 64 dB in the control run, not
54 and 51 dB computed from the camera's own 1 dBm. Thesis and Obsidian
notes rebuilt.

Deck: slide 5 projects all three charts at 1 km (forest as loss vs
distance with a 100 m forest stretch); slide 10 explains each improvement
in plain words; slide 11 is a map-style scenario (camera in the flat,
operator at the neighbouring house corner, ~43 m through a window,
~66 dB, matching the measured 67 dB); slide 12 splits video and service
frame speeds; slide 13 is built around scenarios, difficulties and
solutions with three pictures, including camera and TX-AH placement on a
UAV before and after.

Co-Authored-By: Claude Opus 5.5 <noreply@anthropic.com>
</commit_message>
<xml_diff>
--- a/docs/vkr/Osnovnaya_chast_HaLow.docx
+++ b/docs/vkr/Osnovnaya_chast_HaLow.docx
@@ -10835,7 +10835,7 @@
               <w:rPr>
                 <w:sz w:val="22"/>
               </w:rPr>
-              <w:t>−53 дБм; 36 дБ (медианы) при мощности 1 дБм: потери на трассе 54 дБ, запас до чувствительности около 48 дБ</w:t>
+              <w:t>−53 дБм; 36 дБ (медианы): сигнал приёмника (14 дБм) у камеры, потери на трассе 67 дБ, запас до чувствительности около 48 дБ; камера при этом передаёт на 1 дБм</w:t>
             </w:r>
           </w:p>
         </w:tc>
@@ -11123,7 +11123,7 @@
         <w:t xml:space="preserve">Контрольный опыт. </w:t>
       </w:r>
       <w:r>
-        <w:t>Опыт длительностью 282 с выполнен на трассе 5 м через стену с итоговой версией программ. Получено: полезная скорость в среднем 1028 кбит/с (медиана посекундных значений — 1024 кбит/с), 5,6 видеокадра в секунду; показано 1572 видеокадра, потеряно 16 (1,0 %), досылкой восстановлено 35; потери фрагментов после повторов MAC — 1,2 %. Мощность передатчика 1 дБм, уровень сигнала −50 дБм, SNR 36 дБ, нижняя граница модуляции держалась на MCS 4, PER — 68 % (медианы), RTT в среднем 0,42 с. Среднее значение задержки сглаживает выбросы, поэтому отдельно приведён разброс: в каждом отчёте модуля (около 2 с) самый быстрый видеокадр подтверждался за 0,06–0,18 с, самый медленный — в 9 из 10 отчётов не дольше 0,8 с, наибольшая задержка за опыт — 1,46 с. Уровень сигнала −50 дБм получен при мощности передатчика 1 дБм: регулятор снижает мощность, пока запас избыточен, поэтому сам уровень сигнала зависит от мощности, а о трассе говорят потери на ней — 51 дБ — и запас до чувствительности приёмника — около 50 дБ. Фрагмент журнала — в таблице 2.4, окно программы просмотра — на рисунке 2.3.</w:t>
+        <w:t>Опыт длительностью 282 с выполнен на трассе 5 м через стену с итоговой версией программ. Получено: полезная скорость в среднем 1028 кбит/с (медиана посекундных значений — 1024 кбит/с), 5,6 видеокадра в секунду; показано 1572 видеокадра, потеряно 16 (1,0 %), досылкой восстановлено 35; потери фрагментов после повторов MAC — 1,2 %. Мощность передатчика 1 дБм, уровень сигнала −50 дБм, SNR 36 дБ, нижняя граница модуляции держалась на MCS 4, PER — 68 % (медианы), RTT в среднем 0,42 с. Среднее значение задержки сглаживает выбросы, поэтому отдельно приведён разброс: в каждом отчёте модуля (около 2 с) самый быстрый видеокадр подтверждался за 0,06–0,18 с, самый медленный — в 9 из 10 отчётов не дольше 0,8 с, наибольшая задержка за опыт — 1,46 с. Уровень сигнала −50 дБм — это сигнал приёмника, передающего на 14 дБм, у камеры, поэтому потери на трассе — 64 дБ, а запас до чувствительности — около 50 дБ. Сама камера передаёт при этом на 1 дБм: регулятор снижает мощность, пока запас избыточен. Фрагмент журнала — в таблице 2.4, окно программы просмотра — на рисунке 2.3.</w:t>
       </w:r>
     </w:p>
     <w:p>

</xml_diff>

<commit_message>
Thesis: RSSI and SNR by direction, d0 = 1 m; deck slides 5, 7, 8, 10, 11
Thesis: the camera report's RSSI (-53 / -50 dBm) is the receiver's 14 dBm
signal at the camera, while SNR 36 dB is how the receiver hears the camera
at 1 dBm; the channel table, control run, trace description and
conclusion 5 now state them separately. The 130-540 m urban range names
its reference distance d0 = 1 m. Thesis and Obsidian notes rebuilt.

Deck: slide 5 charts share one plot area; slide 7 says urban only
(n = 3.5, d0 = 1 m), no forest; slide 8 describes the stand in full
sentences; slide 10 shows before/after mini charts and explains the UART
interrupt fix (1 byte vs ~11 bytes per read, every ~37 us); slide 11 puts
the laptop + STA behind the same house, ~11 m through two concrete walls,
~69 dB, close to the measured 67 dB.

Co-Authored-By: Claude Opus 5.5 <noreply@anthropic.com>
</commit_message>
<xml_diff>
--- a/docs/vkr/Osnovnaya_chast_HaLow.docx
+++ b/docs/vkr/Osnovnaya_chast_HaLow.docx
@@ -5081,7 +5081,7 @@
     </w:p>
     <w:p>
       <w:r>
-        <w:t>Во-первых, модели распространения дают не одно значение, а диапазон. Для городской застройки показатель затухания n = 2,7–3,5 [6], и при одних и тех же допустимых потерях — 105 дБ у Wi-Fi HaLow на 650 кбит/с — дальность получается от 130 до 540 м, тогда как в свободном пространстве (n = 2) — 4,9 км. Две модели, предложенные специально для IEEE 802.11ah, на 1 км расходятся на 12 дБ [27], и ни одна не выведена для антенн у земли. Если взять верхнюю и нижнюю границы затенения, ответ «связь будет где-то между» верен, но для выбора канала бесполезен: границы расходятся в разы. Какое значение подходит для конкретной платформы и трассы, показывает только измерение. Даже на одной и той же трассе 5 м через стену канал заметно меняется: отношение сигнал/шум за пять минут колебалось от 24 до 40 дБ, а скорость в разное время суток различалась в 2–3 раза.</w:t>
+        <w:t>Во-первых, модели распространения дают не одно значение, а диапазон. Для городской застройки показатель затухания n = 2,7–3,5 [6], и при одних и тех же допустимых потерях — 105 дБ у Wi-Fi HaLow на 650 кбит/с — дальность при опорном расстоянии d₀ = 1 м (потери до него — как в свободном пространстве) получается от 130 до 540 м, тогда как в свободном пространстве (n = 2) — 4,9 км. Две модели, предложенные специально для IEEE 802.11ah, на 1 км расходятся на 12 дБ [27], и ни одна не выведена для антенн у земли. Если взять верхнюю и нижнюю границы затенения, ответ «связь будет где-то между» верен, но для выбора канала бесполезен: границы расходятся в разы. Какое значение подходит для конкретной платформы и трассы, показывает только измерение. Даже на одной и той же трассе 5 м через стену канал заметно меняется: отношение сигнал/шум за пять минут колебалось от 24 до 40 дБ, а скорость в разное время суток различалась в 2–3 раза.</w:t>
       </w:r>
     </w:p>
     <w:p>
@@ -10835,7 +10835,7 @@
               <w:rPr>
                 <w:sz w:val="22"/>
               </w:rPr>
-              <w:t>−53 дБм; 36 дБ (медианы): сигнал приёмника (14 дБм) у камеры, потери на трассе 67 дБ, запас до чувствительности около 48 дБ; камера при этом передаёт на 1 дБм</w:t>
+              <w:t>сигнал приёмника (14 дБм) у камеры −53 дБм: потери на трассе 67 дБ, запас до чувствительности около 48 дБ; приёмник слышит камеру, передающую на 1 дБм, с отношением сигнал/шум 36 дБ (медианы)</w:t>
             </w:r>
           </w:p>
         </w:tc>
@@ -11123,7 +11123,7 @@
         <w:t xml:space="preserve">Контрольный опыт. </w:t>
       </w:r>
       <w:r>
-        <w:t>Опыт длительностью 282 с выполнен на трассе 5 м через стену с итоговой версией программ. Получено: полезная скорость в среднем 1028 кбит/с (медиана посекундных значений — 1024 кбит/с), 5,6 видеокадра в секунду; показано 1572 видеокадра, потеряно 16 (1,0 %), досылкой восстановлено 35; потери фрагментов после повторов MAC — 1,2 %. Мощность передатчика 1 дБм, уровень сигнала −50 дБм, SNR 36 дБ, нижняя граница модуляции держалась на MCS 4, PER — 68 % (медианы), RTT в среднем 0,42 с. Среднее значение задержки сглаживает выбросы, поэтому отдельно приведён разброс: в каждом отчёте модуля (около 2 с) самый быстрый видеокадр подтверждался за 0,06–0,18 с, самый медленный — в 9 из 10 отчётов не дольше 0,8 с, наибольшая задержка за опыт — 1,46 с. Уровень сигнала −50 дБм — это сигнал приёмника, передающего на 14 дБм, у камеры, поэтому потери на трассе — 64 дБ, а запас до чувствительности — около 50 дБ. Сама камера передаёт при этом на 1 дБм: регулятор снижает мощность, пока запас избыточен. Фрагмент журнала — в таблице 2.4, окно программы просмотра — на рисунке 2.3.</w:t>
+        <w:t>Опыт длительностью 282 с выполнен на трассе 5 м через стену с итоговой версией программ. Получено: полезная скорость в среднем 1028 кбит/с (медиана посекундных значений — 1024 кбит/с), 5,6 видеокадра в секунду; показано 1572 видеокадра, потеряно 16 (1,0 %), досылкой восстановлено 35; потери фрагментов после повторов MAC — 1,2 %. Мощность передатчика камеры 1 дБм, сигнал приёмника у камеры −50 дБм, приёмник слышит камеру с SNR 36 дБ, нижняя граница модуляции держалась на MCS 4, PER — 68 % (медианы), RTT в среднем 0,42 с. Среднее значение задержки сглаживает выбросы, поэтому отдельно приведён разброс: в каждом отчёте модуля (около 2 с) самый быстрый видеокадр подтверждался за 0,06–0,18 с, самый медленный — в 9 из 10 отчётов не дольше 0,8 с, наибольшая задержка за опыт — 1,46 с. Уровень сигнала −50 дБм — это сигнал приёмника, передающего на 14 дБм, у камеры, поэтому потери на трассе — 64 дБ, а запас до чувствительности — около 50 дБ. Сама камера передаёт при этом на 1 дБм: регулятор снижает мощность, пока запас избыточен. Фрагмент журнала — в таблице 2.4, окно программы просмотра — на рисунке 2.3.</w:t>
       </w:r>
     </w:p>
     <w:p>
@@ -14341,7 +14341,7 @@
     </w:p>
     <w:p>
       <w:r>
-        <w:t>На 300 и 600 м измеренный уровень сигнала при принятом допущении об антеннах совпадает с расчётом для свободного пространства в пределах 2 дБ, то есть на этих трассах прямой видимости показатель затухания близок к 2. На 1200 м над водой уровень на 6–8 дБ выше расчёта, а скорость зависела от высоты антенны принимающего узла: 4,0–4,1 Мбит/с, когда антенна была опущена к воде, и 6,5–6,6 Мбит/с, когда поднята (высоты в руководстве не указаны), — прямое подтверждение вывода о высоте антенн. Эти скорости выше полученных на стенде, потому что производитель мерил при +20 дБм и, по всей видимости, в канале 8 МГц. Пересчёт на нормы Российской Федерации: снижение мощности с 20 до 14 дБм (на 6 дБ) вдвое сокращает дальность в свободном пространстве, то есть 1200 м паспорта соответствуют около 600 м при той же скорости. Там же производитель приводит данные для цепочки с промежуточным узлом-ретранслятором, которым можно продлить связь с БПЛА: ретранслятор вдвое снижает поток и вдвое увеличивает задержку [28]. Собственная точка стенда — трасса 5 м через стену, вне прямой видимости: уровень сигнала −53 дБм при отношении сигнал/шум 36 дБ.</w:t>
+        <w:t>На 300 и 600 м измеренный уровень сигнала при принятом допущении об антеннах совпадает с расчётом для свободного пространства в пределах 2 дБ, то есть на этих трассах прямой видимости показатель затухания близок к 2. На 1200 м над водой уровень на 6–8 дБ выше расчёта, а скорость зависела от высоты антенны принимающего узла: 4,0–4,1 Мбит/с, когда антенна была опущена к воде, и 6,5–6,6 Мбит/с, когда поднята (высоты в руководстве не указаны), — прямое подтверждение вывода о высоте антенн. Эти скорости выше полученных на стенде, потому что производитель мерил при +20 дБм и, по всей видимости, в канале 8 МГц. Пересчёт на нормы Российской Федерации: снижение мощности с 20 до 14 дБм (на 6 дБ) вдвое сокращает дальность в свободном пространстве, то есть 1200 м паспорта соответствуют около 600 м при той же скорости. Там же производитель приводит данные для цепочки с промежуточным узлом-ретранслятором, которым можно продлить связь с БПЛА: ретранслятор вдвое снижает поток и вдвое увеличивает задержку [28]. Собственная точка стенда — трасса 5 м через стену, вне прямой видимости: сигнал приёмника у камеры −53 дБм, а приёмник слышит камеру с отношением сигнал/шум 36 дБ.</w:t>
       </w:r>
     </w:p>
     <w:p>
@@ -17192,7 +17192,7 @@
     </w:p>
     <w:p>
       <w:r>
-        <w:t>5. По критериям задания на трассе 5 м через стену: уровень сигнала −53 дБм при отношении сигнал/шум 36 дБ, задержка по квитанции в медиане 0,34–0,50 с, потери видеокадров 1,4 %. Доля неудачных попыток передачи модуля (PER) при этом 50–67 %: в неё входят все повторы и попытки без подтверждения, а не потерянные данные (подраздел 3.4).</w:t>
+        <w:t>5. По критериям задания на трассе 5 м через стену: сигнал приёмника у камеры −53 дБм, приёмник слышит камеру с отношением сигнал/шум 36 дБ, задержка по квитанции в медиане 0,34–0,50 с, потери видеокадров 1,4 %. Доля неудачных попыток передачи модуля (PER) при этом 50–67 %: в неё входят все повторы и попытки без подтверждения, а не потерянные данные (подраздел 3.4).</w:t>
       </w:r>
     </w:p>
     <w:p>

</xml_diff>